<commit_message>
[T05 2026-10-15] docs: redistribute open tasks by effort (E-23)
Open tasks are split so that each member has about four hours left.
Sequence diagrams now go to the person who presents them; slides 2,
12, 14, 16 and 20, doc chapter 1, TODO.md, team roles, decision log
and UML README are aligned.

Co-Authored-By: Claude Opus 5.5 <noreply@anthropic.com>
Claude-Session: https://claude.ai/code/session_01H2bGsFaySUqsEjJ1PXuxUw
</commit_message>
<xml_diff>
--- a/3_doku/Projektdokumentation.docx
+++ b/3_doku/Projektdokumentation.docx
@@ -174,7 +174,7 @@
           <w:rFonts w:ascii="Calibri" w:hAnsi="Calibri"/>
           <w:sz w:val="20"/>
         </w:rPr>
-        <w:t>Bearbeitungsstand: 12. Oktober 2026</w:t>
+        <w:t>Bearbeitungsstand: 15. Oktober 2026</w:t>
       </w:r>
     </w:p>
     <w:p>
@@ -807,7 +807,7 @@
           <w:sz w:val="22"/>
           <w:szCs w:val="22"/>
         </w:rPr>
-        <w:t>Die Fallstudie bearbeiten sechs Studierende des Kurses WWI25B4. Beim ersten Gruppentermin am 02.09.2026 haben wir die Rollen nach dem Scrum-Vorgehen verteilt (Kapitel 4). Jedes Artefakt hat eine verantwortliche Person (Tabelle 1), und jedes Diagramm prüft eine zweite Person.</w:t>
+        <w:t>Die Fallstudie bearbeiten sechs Studierende des Kurses WWI25B4. Beim ersten Gruppentermin am 02.09.2026 haben wir die Rollen nach dem Scrum-Vorgehen verteilt (Kapitel 4). Am 15.10.2026 haben wir die offenen Aufgaben neu verteilt, sodass der Aufwand je Person ungefähr gleich ist (E-23). Jedes Artefakt hat eine verantwortliche Person (Tabelle 1), und jedes Diagramm prüft eine zweite Person.</w:t>
       </w:r>
     </w:p>
     <w:tbl>
@@ -1016,7 +1016,7 @@
                 <w:sz w:val="19"/>
                 <w:szCs w:val="19"/>
               </w:rPr>
-              <w:t>Gesamtplanung, Termine, Abgabe-Archiv</w:t>
+              <w:t>Gesamtplanung und Termine, Fertigstellung der Projektdokumentation, Präsentations-PDF und Abgabe-Archiv</w:t>
             </w:r>
           </w:p>
         </w:tc>
@@ -1111,7 +1111,7 @@
                 <w:sz w:val="19"/>
                 <w:szCs w:val="19"/>
               </w:rPr>
-              <w:t>Sicherung von Git-Repository und VP-Server, Abgabe-Check; Sequenzdiagramme SD2, SD4, SD5 und SD6 in Visual Paradigm</w:t>
+              <w:t>Sicherung von Git-Repository und VP-Server; Use-Case-Diagramm sowie SD2 und SD4 in Visual Paradigm</w:t>
             </w:r>
           </w:p>
         </w:tc>
@@ -1206,7 +1206,7 @@
                 <w:sz w:val="19"/>
                 <w:szCs w:val="19"/>
               </w:rPr>
-              <w:t>Fachliche Entscheidungen zu Umfang, Prioritäten und KI-Sofortdiagnose; Abnahme im Sprint Review</w:t>
+              <w:t>Fachliche Entscheidungen zu Umfang, Prioritäten und KI-Sofortdiagnose, Abnahme im Sprint Review; SD5 und SD6 in Visual Paradigm</w:t>
             </w:r>
           </w:p>
         </w:tc>
@@ -1301,7 +1301,7 @@
                 <w:sz w:val="19"/>
                 <w:szCs w:val="19"/>
               </w:rPr>
-              <w:t>Sprint-Rituale und Trello-Board; Use-Case- und Klassendiagramm, SD1 und SD3 in Visual Paradigm</w:t>
+              <w:t>Sprint-Rituale und Trello-Board; Klassendiagramm, Konsistenz der UML-Modelle und Visual-Paradigm-Projekt</w:t>
             </w:r>
           </w:p>
         </w:tc>
@@ -1396,7 +1396,7 @@
                 <w:sz w:val="19"/>
                 <w:szCs w:val="19"/>
               </w:rPr>
-              <w:t>Die zehn Kollaborationsdiagramme im Camunda Modeler und ihr Export</w:t>
+              <w:t>Die zehn Kollaborationsdiagramme im Camunda Modeler und ihr Export; SD1 in Visual Paradigm</w:t>
             </w:r>
           </w:p>
         </w:tc>
@@ -1491,7 +1491,7 @@
                 <w:sz w:val="19"/>
                 <w:szCs w:val="19"/>
               </w:rPr>
-              <w:t>Reviews gegen die Anforderungen, Konsistenz von BPMN, UML und Dokumentation, Präsentation, Abgabe-Check</w:t>
+              <w:t>Reviews gegen die Anforderungen, Konsistenz von BPMN, UML und Dokumentation; SD3 in Visual Paradigm</w:t>
             </w:r>
           </w:p>
         </w:tc>
@@ -1525,7 +1525,7 @@
           <w:sz w:val="22"/>
           <w:szCs w:val="22"/>
         </w:rPr>
-        <w:t>Die Gruppenmitglieder haben folgende Beiträge erarbeitet. Grundlage sind die Aufgabenverteilungen vom 02.09. und 05.10.2026 und die Historie des Repositories.</w:t>
+        <w:t>Die Gruppenmitglieder haben folgende Beiträge erarbeitet. Grundlage sind die Aufgabenverteilungen vom 02.09., 05.10. und 15.10.2026 und die Historie des Repositories.</w:t>
       </w:r>
     </w:p>
     <w:p>
@@ -1553,7 +1553,7 @@
           <w:sz w:val="22"/>
           <w:szCs w:val="22"/>
         </w:rPr>
-        <w:t>Prüfung der BPMN-Diagramme 07 und 08 in Sprint 1, Gesamtplanung, Folien 1–2 und 18–19.</w:t>
+        <w:t>Prüfung der BPMN-Diagramme 07 und 08 in Sprint 1, Gesamtplanung, Fertigstellung der Projektdokumentation mit Abbildungen und Kapitel 7.1, Präsentations-PDF und Abgabe-Archiv, Folien 1–2 und 18–19.</w:t>
       </w:r>
     </w:p>
     <w:p>
@@ -1581,7 +1581,7 @@
           <w:sz w:val="22"/>
           <w:szCs w:val="22"/>
         </w:rPr>
-        <w:t>Prüfung der BPMN-Diagramme 03 und 04, Abgleich der Use Cases und Sequenzdiagramme mit den Prozessen (E-18), Überarbeitung der Prozesse 05 und 06 (E-20), Abgleich der Dokumentation mit dem Modellstand, Folien 3 und 16.</w:t>
+        <w:t>Prüfung der BPMN-Diagramme 03 und 04, Abgleich der Use Cases und Sequenzdiagramme mit den Prozessen (E-18), Überarbeitung der Prozesse 05 und 06 (E-20), Abgleich der Dokumentation mit dem Modellstand, Überarbeitung des Use-Case-Diagramms sowie SD2 und SD4 in Visual Paradigm, Folien 3 und 12.</w:t>
       </w:r>
     </w:p>
     <w:p>
@@ -1609,7 +1609,7 @@
           <w:sz w:val="22"/>
           <w:szCs w:val="22"/>
         </w:rPr>
-        <w:t>Prüfung der BPMN-Diagramme 05 und 06, fachliche Abnahme, zuständig für die Bestätigung der Prozessänderungen E-19, E-20 und E-22 durch die Gruppe, Folien 4–6 und 11.</w:t>
+        <w:t>Prüfung der BPMN-Diagramme 05 und 06, fachliche Abnahme, Bestätigung der Prozessänderungen E-19, E-20 und E-22 durch die Gruppe, Kapitel 6 (Herausforderungen), SD5 und SD6 in Visual Paradigm, Folien 4–6 und 11.</w:t>
       </w:r>
     </w:p>
     <w:p>
@@ -1637,7 +1637,7 @@
           <w:sz w:val="22"/>
           <w:szCs w:val="22"/>
         </w:rPr>
-        <w:t>eigener Entwurf V2 und dessen Zusammenführung mit dem Solution-Provider-Entwurf gemeinsam mit David (E-10), Gesamtprüfungen vom 26.09. und 05.10.2026 (E-15, E-17), Abschluss der QA-Befunde (E-22), Use-Case-Diagramm in Visual Paradigm, Folien 12–14.</w:t>
+        <w:t>eigener Entwurf V2 und dessen Zusammenführung mit dem Solution-Provider-Entwurf gemeinsam mit David (E-10), Gesamtprüfungen vom 26.09. und 05.10.2026 (E-15, E-17), Abschluss der QA-Befunde (E-22), erste Fassung des Use-Case-Diagramms und Klassendiagramm in Visual Paradigm, Konsistenzprüfung der Sequenzdiagramme gegen das Klassendiagramm, Visual-Paradigm-Projekt, Folien 13 und 16.</w:t>
       </w:r>
     </w:p>
     <w:p>
@@ -1665,7 +1665,7 @@
           <w:sz w:val="22"/>
           <w:szCs w:val="22"/>
         </w:rPr>
-        <w:t>Prüfung der BPMN-Diagramme 01 und 02, verantwortlich für alle zehn BPMN-Dateien, ihre Prüfung im Camunda Modeler und den Export (E-21), Folien 7–10.</w:t>
+        <w:t>Prüfung der BPMN-Diagramme 01 und 02, verantwortlich für alle zehn BPMN-Dateien, ihre Prüfung im Camunda Modeler und den Export (E-21), SD1 in Visual Paradigm, Folien 7–10 und 14.</w:t>
       </w:r>
     </w:p>
     <w:p>
@@ -1693,7 +1693,7 @@
           <w:sz w:val="22"/>
           <w:szCs w:val="22"/>
         </w:rPr>
-        <w:t>Review der Prozesse 09 und 10, Behebung der Logikfehler in den Prozessen 07 und 08 (E-19), QA-Checkliste, Folien 15 und 17.</w:t>
+        <w:t>Review der Prozesse 09 und 10, Behebung der Logikfehler in den Prozessen 07 und 08 (E-19), QA-Checkliste und Review der Pull Requests, SD3 in Visual Paradigm, Folien 15 und 17.</w:t>
       </w:r>
     </w:p>
     <w:p>
@@ -1709,7 +1709,7 @@
           <w:szCs w:val="22"/>
           <w:shd w:val="clear" w:color="auto" w:fill="FFF2A8"/>
         </w:rPr>
-        <w:t>[Gruppe: Jede Person prüft ihre Zeile in Tabelle 1 und in der Liste und ergänzt fehlende Beiträge. Danach diesen Hinweis löschen.]</w:t>
+        <w:t>[Gruppe: Die Liste gibt die Verteilung vom 15.10.2026 wieder (E-23). Vor der Abgabe prüft jede Person ihre Zeile in Tabelle 1 und in der Liste: Stehen bleibt nur, was sie tatsächlich gemacht hat. Danach diesen Hinweis löschen.]</w:t>
       </w:r>
     </w:p>
     <w:p>
@@ -3571,7 +3571,7 @@
                 <w:sz w:val="19"/>
                 <w:szCs w:val="19"/>
               </w:rPr>
-              <w:t xml:space="preserve">QA-Befunde behoben (E-22), Use-Case-Diagramm in Visual Paradigm. </w:t>
+              <w:t xml:space="preserve">QA-Befunde behoben (E-22), Use-Case-Diagramm in Visual Paradigm, offene Aufgaben nach Aufwand neu verteilt (E-23). </w:t>
             </w:r>
             <w:r>
               <w:rPr>

</xml_diff>

<commit_message>
[T05 2026-10-15] feat: one role per use case (E-24), responsibilities for completion (E-23)
Use-case diagram rebuilt after the lecturer's feedback: 15 employee
roles, each tied to exactly one use case, customer and supplier drawn
several times, UC08 without actor. New grid-layout template
(usecase_layout.py), modell.xmi updated and modell-usecase.xmi added
for re-import into Visual Paradigm. Sequence diagrams use the role
names. Documentation (1, 3.1, 5.3 with role table, 5.5, 5.6, 7.1),
slides 2, 12, 16, 18, 20 and speaker notes, decision log (E-23, E-24),
lecturer feedback and TODO.md (tasks without names) aligned.

Co-Authored-By: Claude Fable 5.1 <noreply@anthropic.com>
Claude-Session: https://claude.ai/code/session_01H2bGsFaySUqsEjJ1PXuxUw
</commit_message>
<xml_diff>
--- a/3_doku/Projektdokumentation.docx
+++ b/3_doku/Projektdokumentation.docx
@@ -649,7 +649,7 @@
         </w:rPr>
         <w:t>5.4 Klassendiagramm</w:t>
         <w:tab/>
-        <w:t>12</w:t>
+        <w:t>13</w:t>
       </w:r>
     </w:p>
     <w:p>
@@ -670,7 +670,7 @@
         </w:rPr>
         <w:t>5.5 Sequenzdiagramme</w:t>
         <w:tab/>
-        <w:t>13</w:t>
+        <w:t>14</w:t>
       </w:r>
     </w:p>
     <w:p>
@@ -691,7 +691,7 @@
         </w:rPr>
         <w:t>5.6 Konsistenz zwischen den Modellen</w:t>
         <w:tab/>
-        <w:t>15</w:t>
+        <w:t>16</w:t>
       </w:r>
     </w:p>
     <w:p>
@@ -712,7 +712,7 @@
         </w:rPr>
         <w:t>6 Probleme und Herausforderungen</w:t>
         <w:tab/>
-        <w:t>16</w:t>
+        <w:t>17</w:t>
       </w:r>
     </w:p>
     <w:p>
@@ -733,7 +733,7 @@
         </w:rPr>
         <w:t>7 Feedback</w:t>
         <w:tab/>
-        <w:t>16</w:t>
+        <w:t>18</w:t>
       </w:r>
     </w:p>
     <w:p>
@@ -754,7 +754,7 @@
         </w:rPr>
         <w:t>7.1 Feedback des Dozenten und Umsetzung</w:t>
         <w:tab/>
-        <w:t>16</w:t>
+        <w:t>18</w:t>
       </w:r>
     </w:p>
     <w:p>
@@ -775,7 +775,7 @@
         </w:rPr>
         <w:t>7.2 Unser Feedback zur Fallstudie</w:t>
         <w:tab/>
-        <w:t>17</w:t>
+        <w:t>18</w:t>
       </w:r>
     </w:p>
     <w:p>
@@ -807,7 +807,7 @@
           <w:sz w:val="22"/>
           <w:szCs w:val="22"/>
         </w:rPr>
-        <w:t>Die Fallstudie bearbeiten sechs Studierende des Kurses WWI25B4. Beim ersten Gruppentermin am 02.09.2026 haben wir die Rollen nach dem Scrum-Vorgehen verteilt (Kapitel 4). Am 15.10.2026 haben wir die offenen Aufgaben neu verteilt, sodass der Aufwand je Person ungefähr gleich ist (E-23). Jedes Artefakt hat eine verantwortliche Person (Tabelle 1), und jedes Diagramm prüft eine zweite Person.</w:t>
+        <w:t>Die Fallstudie bearbeiten sechs Studierende des Kurses WWI25B4. Beim ersten Gruppentermin am 02.09.2026 haben wir die Rollen nach dem Scrum-Vorgehen verteilt (Kapitel 4) und am 15.10.2026 die Zuständigkeiten für die Fertigstellung festgelegt (E-23). Jedes Artefakt hat eine verantwortliche Person (Tabelle 1), und jedes Diagramm prüft eine zweite Person.</w:t>
       </w:r>
     </w:p>
     <w:tbl>
@@ -1016,7 +1016,7 @@
                 <w:sz w:val="19"/>
                 <w:szCs w:val="19"/>
               </w:rPr>
-              <w:t>Gesamtplanung und Termine, Fertigstellung der Projektdokumentation, Präsentations-PDF und Abgabe-Archiv</w:t>
+              <w:t>Gesamtplanung und Termine; Redaktion der Projektdokumentation (Kapitel 1, 4 und 7, Abbildungen, PDF); Abgabe-Archiv</w:t>
             </w:r>
           </w:p>
         </w:tc>
@@ -1111,7 +1111,7 @@
                 <w:sz w:val="19"/>
                 <w:szCs w:val="19"/>
               </w:rPr>
-              <w:t>Sicherung von Git-Repository und VP-Server; Use-Case-Diagramm sowie SD2 und SD4 in Visual Paradigm</w:t>
+              <w:t>Sicherung von Git-Repository und VP-Server; Use-Case-Diagramm und Sequenzdiagramme SD2, SD3, SD5 und SD6 in Visual Paradigm</w:t>
             </w:r>
           </w:p>
         </w:tc>
@@ -1206,7 +1206,7 @@
                 <w:sz w:val="19"/>
                 <w:szCs w:val="19"/>
               </w:rPr>
-              <w:t>Fachliche Entscheidungen zu Umfang, Prioritäten und KI-Sofortdiagnose, Abnahme im Sprint Review; SD5 und SD6 in Visual Paradigm</w:t>
+              <w:t>Fachkonzept (Kapitel 2) und Produktentscheidungen; Entscheidungslog; Automatisierungspotential (5.2) und Kapitel 6</w:t>
             </w:r>
           </w:p>
         </w:tc>
@@ -1301,7 +1301,7 @@
                 <w:sz w:val="19"/>
                 <w:szCs w:val="19"/>
               </w:rPr>
-              <w:t>Sprint-Rituale und Trello-Board; Klassendiagramm, Konsistenz der UML-Modelle und Visual-Paradigm-Projekt</w:t>
+              <w:t>Sprint-Rituale und Trello-Board; Klassendiagramm, SD1 und SD4, Visual-Paradigm-Projekt und Konsistenz der UML-Modelle</w:t>
             </w:r>
           </w:p>
         </w:tc>
@@ -1396,7 +1396,7 @@
                 <w:sz w:val="19"/>
                 <w:szCs w:val="19"/>
               </w:rPr>
-              <w:t>Die zehn Kollaborationsdiagramme im Camunda Modeler und ihr Export; SD1 in Visual Paradigm</w:t>
+              <w:t>Die zehn Kollaborationsdiagramme im Camunda Modeler, Prozesskennzahlen und Export; Abschnitt 5.1</w:t>
             </w:r>
           </w:p>
         </w:tc>
@@ -1491,7 +1491,7 @@
                 <w:sz w:val="19"/>
                 <w:szCs w:val="19"/>
               </w:rPr>
-              <w:t>Reviews gegen die Anforderungen, Konsistenz von BPMN, UML und Dokumentation; SD3 in Visual Paradigm</w:t>
+              <w:t>QA-Checkliste und Review aller Pull Requests; Konsistenz von BPMN, UML und Dokumentation (3.2, 5.6); Präsentations-PDF</w:t>
             </w:r>
           </w:p>
         </w:tc>
@@ -1553,7 +1553,7 @@
           <w:sz w:val="22"/>
           <w:szCs w:val="22"/>
         </w:rPr>
-        <w:t>Prüfung der BPMN-Diagramme 07 und 08 in Sprint 1, Gesamtplanung, Fertigstellung der Projektdokumentation mit Abbildungen und Kapitel 7.1, Präsentations-PDF und Abgabe-Archiv, Folien 1–2 und 18–19.</w:t>
+        <w:t>Gesamtplanung und Terminsteuerung, Prüfung der BPMN-Diagramme 07 und 08 in Sprint 1, Redaktion der Projektdokumentation (Kapitel 1, 4 und 7, Abbildungen, Inhaltsverzeichnis, PDF), Zusammenstellung des Abgabe-Archivs, Folien 1–2 und 18–19.</w:t>
       </w:r>
     </w:p>
     <w:p>
@@ -1581,7 +1581,7 @@
           <w:sz w:val="22"/>
           <w:szCs w:val="22"/>
         </w:rPr>
-        <w:t>Prüfung der BPMN-Diagramme 03 und 04, Abgleich der Use Cases und Sequenzdiagramme mit den Prozessen (E-18), Überarbeitung der Prozesse 05 und 06 (E-20), Abgleich der Dokumentation mit dem Modellstand, Überarbeitung des Use-Case-Diagramms sowie SD2 und SD4 in Visual Paradigm, Folien 3 und 12.</w:t>
+        <w:t>Prüfung der BPMN-Diagramme 03 und 04, Abgleich der Use Cases und Sequenzdiagramme mit den Prozessen (E-18), Überarbeitung der Prozesse 05 und 06 (E-20), Use-Case-Diagramm mit Rollenstruktur (E-24) sowie SD2, SD3, SD5 und SD6 in Visual Paradigm, Folien 3, 12 und 15.</w:t>
       </w:r>
     </w:p>
     <w:p>
@@ -1609,7 +1609,7 @@
           <w:sz w:val="22"/>
           <w:szCs w:val="22"/>
         </w:rPr>
-        <w:t>Prüfung der BPMN-Diagramme 05 und 06, fachliche Abnahme, Bestätigung der Prozessänderungen E-19, E-20 und E-22 durch die Gruppe, Kapitel 6 (Herausforderungen), SD5 und SD6 in Visual Paradigm, Folien 4–6 und 11.</w:t>
+        <w:t>Prüfung der BPMN-Diagramme 05 und 06, Fachkonzept in Kapitel 2 (Ausgangslage, Solution Provider, Systemkontext, Zustandsautomat, KI-Sofortdiagnose), Pflege des Entscheidungslogs und Bestätigung der Prozessänderungen E-19, E-20 und E-22 durch die Gruppe, Abschnitt 5.2 und Kapitel 6, Folien 4–6 und 11.</w:t>
       </w:r>
     </w:p>
     <w:p>
@@ -1637,7 +1637,7 @@
           <w:sz w:val="22"/>
           <w:szCs w:val="22"/>
         </w:rPr>
-        <w:t>eigener Entwurf V2 und dessen Zusammenführung mit dem Solution-Provider-Entwurf gemeinsam mit David (E-10), Gesamtprüfungen vom 26.09. und 05.10.2026 (E-15, E-17), Abschluss der QA-Befunde (E-22), erste Fassung des Use-Case-Diagramms und Klassendiagramm in Visual Paradigm, Konsistenzprüfung der Sequenzdiagramme gegen das Klassendiagramm, Visual-Paradigm-Projekt, Folien 13 und 16.</w:t>
+        <w:t>eigener Entwurf V2 und dessen Zusammenführung mit dem Solution-Provider-Entwurf (E-10), Gesamtprüfungen vom 26.09. und 05.10.2026 (E-15, E-17), Klassendiagramm, SD1 und SD4 in Visual Paradigm, Visual-Paradigm-Projekt und Konsistenzprüfung der Sequenzdiagramme gegen das Klassendiagramm, Folien 13, 14 und 16.</w:t>
       </w:r>
     </w:p>
     <w:p>
@@ -1665,7 +1665,7 @@
           <w:sz w:val="22"/>
           <w:szCs w:val="22"/>
         </w:rPr>
-        <w:t>Prüfung der BPMN-Diagramme 01 und 02, verantwortlich für alle zehn BPMN-Dateien, ihre Prüfung im Camunda Modeler und den Export (E-21), SD1 in Visual Paradigm, Folien 7–10 und 14.</w:t>
+        <w:t>Prüfung der BPMN-Diagramme 01 und 02, alle zehn BPMN-Dateien im Camunda Modeler (Anreicherung für Camunda 8, Prüfung im Problems-Panel, PNG-Export, E-21), Prozesskennzahlen und Abschnitt 5.1, Folien 7, 9 und 10.</w:t>
       </w:r>
     </w:p>
     <w:p>
@@ -1693,7 +1693,7 @@
           <w:sz w:val="22"/>
           <w:szCs w:val="22"/>
         </w:rPr>
-        <w:t>Review der Prozesse 09 und 10, Behebung der Logikfehler in den Prozessen 07 und 08 (E-19), QA-Checkliste und Review der Pull Requests, SD3 in Visual Paradigm, Folien 15 und 17.</w:t>
+        <w:t>Review der Prozesse 09 und 10, Behebung der Logikfehler in den Prozessen 07 und 08 (E-19), QA-Checkliste und Review aller Pull Requests, Abschnitte 3.2 und 5.6, Export der Präsentation als PDF, Folien 8 und 17.</w:t>
       </w:r>
     </w:p>
     <w:p>
@@ -1709,7 +1709,7 @@
           <w:szCs w:val="22"/>
           <w:shd w:val="clear" w:color="auto" w:fill="FFF2A8"/>
         </w:rPr>
-        <w:t>[Gruppe: Die Liste gibt die Verteilung vom 15.10.2026 wieder (E-23). Vor der Abgabe prüft jede Person ihre Zeile in Tabelle 1 und in der Liste: Stehen bleibt nur, was sie tatsächlich gemacht hat. Danach diesen Hinweis löschen.]</w:t>
+        <w:t>[Gruppe: Vor der Abgabe prüft jede Person ihre Zeile in Tabelle 1 und in der Liste. Stehen bleibt nur, was sie tatsächlich gemacht hat. Danach diesen Hinweis löschen.]</w:t>
       </w:r>
     </w:p>
     <w:p>
@@ -2908,7 +2908,7 @@
           <w:sz w:val="22"/>
           <w:szCs w:val="22"/>
         </w:rPr>
-        <w:t>Die Rollen erscheinen in BPMN als Pool (Kunde) oder Lane (Service / Annahme für den Servicemitarbeiter, Techniker, Ersatzteil-Disposition für den Disponenten, Werkstattleitung für den Werkstattleiter), im Use-Case-Diagramm und in den Sequenzdiagrammen als Akteure und im Klassendiagramm als Klassen.</w:t>
+        <w:t>Die Beteiligten erscheinen in BPMN als Pool (Kunde) oder Lane (Service / Annahme, Techniker, Ersatzteil-Disposition, Werkstattleitung), im Use-Case-Diagramm als Rollen mit genau einem Use Case je Rolle (Tabelle 7), in den Sequenzdiagrammen als Akteure mit demselben Rollennamen und im Klassendiagramm als Unterklassen von Mitarbeiter. Welche Rolle zu welcher Klasse und Lane gehört, legt Tabelle 7 fest.</w:t>
       </w:r>
     </w:p>
     <w:p>
@@ -3571,7 +3571,7 @@
                 <w:sz w:val="19"/>
                 <w:szCs w:val="19"/>
               </w:rPr>
-              <w:t xml:space="preserve">QA-Befunde behoben (E-22), Use-Case-Diagramm in Visual Paradigm, offene Aufgaben nach Aufwand neu verteilt (E-23). </w:t>
+              <w:t xml:space="preserve">QA-Befunde behoben (E-22), Zuständigkeiten für die Fertigstellung festgelegt (E-23), Use-Case-Diagramm nach dem Dozentenhinweis auf Rollen umgestellt (E-24). </w:t>
             </w:r>
             <w:r>
               <w:rPr>
@@ -7902,7 +7902,2423 @@
           <w:sz w:val="22"/>
           <w:szCs w:val="22"/>
         </w:rPr>
-        <w:t>Das Use-Case-Diagramm (Abbildung 4) zeigt, was RepairFlow aus Sicht seiner Benutzer leistet. Es enthält 19 Use Cases und acht Akteure. Primäre Akteure sind Kunde, Servicemitarbeiter, Techniker, Disponent, Werkstattleiter und Werkstattinhaber, sekundäre der Lieferant und der KI-Diagnosedienst. Jede Lane der Prozessmodelle hat damit einen Akteur.</w:t>
+        <w:t>Das Use-Case-Diagramm (Abbildung 4) zeigt, was RepairFlow aus Sicht seiner Benutzer leistet. Es enthält 19 Use Cases und 18 Akteure: den Kunden, 15 Mitarbeiterrollen und die externen Akteure Lieferant und KI-Diagnosedienst. Jeder Use Case hat genau eine Rolle als primären Akteur. Diese Struktur geht auf einen Hinweis des Dozenten vom 15.10.2026 zurück: Unsere erste Fassung hatte sechs Akteure mit bis zu acht Verbindungen, etwa den Techniker an Diagnose, KVA, Reparatur, Fertigmeldung und Reklamation. Statt eines Akteurs mit vielen Linien gibt es jetzt je Use Case eine Rolle, zum Beispiel Diagnoseprüfer, Diagnostiker, Kalkulator, Reparateur und Endkontrolleur anstelle des Technikers. Welche Person eine Rolle ausfüllt, regelt das Organigramm des Werkstattbetriebs; im Modell sind das die Unterklassen von Mitarbeiter (Tabelle 7). Kunde und Lieferant sind mehrfach dargestellt, damit sich keine Linien kreuzen. UC08 „Ersatzteil-Verfügbarkeit prüfen“ wird nur über include erreicht und hat deshalb keinen eigenen Akteur.</w:t>
+      </w:r>
+    </w:p>
+    <w:tbl>
+      <w:tblPr>
+        <w:tblW w:type="dxa" w:w="9360"/>
+        <w:tblBorders>
+          <w:top w:val="single" w:color="BFBFBF" w:sz="4"/>
+          <w:left w:val="single" w:color="BFBFBF" w:sz="4"/>
+          <w:bottom w:val="single" w:color="BFBFBF" w:sz="4"/>
+          <w:right w:val="single" w:color="BFBFBF" w:sz="4"/>
+          <w:insideH w:val="single" w:color="BFBFBF" w:sz="4"/>
+          <w:insideV w:val="single" w:color="BFBFBF" w:sz="4"/>
+        </w:tblBorders>
+      </w:tblPr>
+      <w:tblGrid>
+        <w:gridCol w:w="2381"/>
+        <w:gridCol w:w="1474"/>
+        <w:gridCol w:w="2608"/>
+        <w:gridCol w:w="2608"/>
+      </w:tblGrid>
+      <w:tr>
+        <w:trPr>
+          <w:tblHeader/>
+          <w:cantSplit/>
+        </w:trPr>
+        <w:tc>
+          <w:tcPr>
+            <w:tcW w:type="dxa" w:w="2381"/>
+            <w:shd w:fill="1F3864" w:color="auto" w:val="clear"/>
+            <w:tcMar>
+              <w:top w:type="dxa" w:w="50"/>
+              <w:left w:type="dxa" w:w="90"/>
+              <w:bottom w:type="dxa" w:w="50"/>
+              <w:right w:type="dxa" w:w="90"/>
+            </w:tcMar>
+            <w:vAlign w:val="top"/>
+          </w:tcPr>
+          <w:p>
+            <w:pPr>
+              <w:keepNext/>
+              <w:spacing w:after="40" w:line="252"/>
+              <w:jc w:val="left"/>
+            </w:pPr>
+            <w:r>
+              <w:rPr>
+                <w:rFonts w:ascii="Calibri" w:cs="Calibri" w:eastAsia="Calibri" w:hAnsi="Calibri"/>
+                <w:b/>
+                <w:bCs/>
+                <w:color w:val="FFFFFF"/>
+                <w:sz w:val="19"/>
+                <w:szCs w:val="19"/>
+              </w:rPr>
+              <w:t>Rolle (Akteur)</w:t>
+            </w:r>
+          </w:p>
+        </w:tc>
+        <w:tc>
+          <w:tcPr>
+            <w:tcW w:type="dxa" w:w="1474"/>
+            <w:shd w:fill="1F3864" w:color="auto" w:val="clear"/>
+            <w:tcMar>
+              <w:top w:type="dxa" w:w="50"/>
+              <w:left w:type="dxa" w:w="90"/>
+              <w:bottom w:type="dxa" w:w="50"/>
+              <w:right w:type="dxa" w:w="90"/>
+            </w:tcMar>
+            <w:vAlign w:val="top"/>
+          </w:tcPr>
+          <w:p>
+            <w:pPr>
+              <w:keepNext/>
+              <w:spacing w:after="40" w:line="252"/>
+              <w:jc w:val="left"/>
+            </w:pPr>
+            <w:r>
+              <w:rPr>
+                <w:rFonts w:ascii="Calibri" w:cs="Calibri" w:eastAsia="Calibri" w:hAnsi="Calibri"/>
+                <w:b/>
+                <w:bCs/>
+                <w:color w:val="FFFFFF"/>
+                <w:sz w:val="19"/>
+                <w:szCs w:val="19"/>
+              </w:rPr>
+              <w:t>Use Case</w:t>
+            </w:r>
+          </w:p>
+        </w:tc>
+        <w:tc>
+          <w:tcPr>
+            <w:tcW w:type="dxa" w:w="2608"/>
+            <w:shd w:fill="1F3864" w:color="auto" w:val="clear"/>
+            <w:tcMar>
+              <w:top w:type="dxa" w:w="50"/>
+              <w:left w:type="dxa" w:w="90"/>
+              <w:bottom w:type="dxa" w:w="50"/>
+              <w:right w:type="dxa" w:w="90"/>
+            </w:tcMar>
+            <w:vAlign w:val="top"/>
+          </w:tcPr>
+          <w:p>
+            <w:pPr>
+              <w:keepNext/>
+              <w:spacing w:after="40" w:line="252"/>
+              <w:jc w:val="left"/>
+            </w:pPr>
+            <w:r>
+              <w:rPr>
+                <w:rFonts w:ascii="Calibri" w:cs="Calibri" w:eastAsia="Calibri" w:hAnsi="Calibri"/>
+                <w:b/>
+                <w:bCs/>
+                <w:color w:val="FFFFFF"/>
+                <w:sz w:val="19"/>
+                <w:szCs w:val="19"/>
+              </w:rPr>
+              <w:t>Klasse im Klassendiagramm</w:t>
+            </w:r>
+          </w:p>
+        </w:tc>
+        <w:tc>
+          <w:tcPr>
+            <w:tcW w:type="dxa" w:w="2608"/>
+            <w:shd w:fill="1F3864" w:color="auto" w:val="clear"/>
+            <w:tcMar>
+              <w:top w:type="dxa" w:w="50"/>
+              <w:left w:type="dxa" w:w="90"/>
+              <w:bottom w:type="dxa" w:w="50"/>
+              <w:right w:type="dxa" w:w="90"/>
+            </w:tcMar>
+            <w:vAlign w:val="top"/>
+          </w:tcPr>
+          <w:p>
+            <w:pPr>
+              <w:keepNext/>
+              <w:spacing w:after="40" w:line="252"/>
+              <w:jc w:val="left"/>
+            </w:pPr>
+            <w:r>
+              <w:rPr>
+                <w:rFonts w:ascii="Calibri" w:cs="Calibri" w:eastAsia="Calibri" w:hAnsi="Calibri"/>
+                <w:b/>
+                <w:bCs/>
+                <w:color w:val="FFFFFF"/>
+                <w:sz w:val="19"/>
+                <w:szCs w:val="19"/>
+              </w:rPr>
+              <w:t>Lane / Pool in BPMN</w:t>
+            </w:r>
+          </w:p>
+        </w:tc>
+      </w:tr>
+      <w:tr>
+        <w:trPr>
+          <w:cantSplit/>
+        </w:trPr>
+        <w:tc>
+          <w:tcPr>
+            <w:tcW w:type="dxa" w:w="2381"/>
+            <w:tcMar>
+              <w:top w:type="dxa" w:w="50"/>
+              <w:left w:type="dxa" w:w="90"/>
+              <w:bottom w:type="dxa" w:w="50"/>
+              <w:right w:type="dxa" w:w="90"/>
+            </w:tcMar>
+            <w:vAlign w:val="top"/>
+          </w:tcPr>
+          <w:p>
+            <w:pPr>
+              <w:keepNext/>
+              <w:spacing w:after="40" w:line="252"/>
+              <w:jc w:val="left"/>
+            </w:pPr>
+            <w:r>
+              <w:rPr>
+                <w:rFonts w:ascii="Calibri" w:cs="Calibri" w:eastAsia="Calibri" w:hAnsi="Calibri"/>
+                <w:b w:val="false"/>
+                <w:bCs w:val="false"/>
+                <w:color w:val="000000"/>
+                <w:sz w:val="19"/>
+                <w:szCs w:val="19"/>
+              </w:rPr>
+              <w:t>Kunde</w:t>
+            </w:r>
+          </w:p>
+        </w:tc>
+        <w:tc>
+          <w:tcPr>
+            <w:tcW w:type="dxa" w:w="1474"/>
+            <w:tcMar>
+              <w:top w:type="dxa" w:w="50"/>
+              <w:left w:type="dxa" w:w="90"/>
+              <w:bottom w:type="dxa" w:w="50"/>
+              <w:right w:type="dxa" w:w="90"/>
+            </w:tcMar>
+            <w:vAlign w:val="top"/>
+          </w:tcPr>
+          <w:p>
+            <w:pPr>
+              <w:keepNext/>
+              <w:spacing w:after="40" w:line="252"/>
+              <w:jc w:val="left"/>
+            </w:pPr>
+            <w:r>
+              <w:rPr>
+                <w:rFonts w:ascii="Calibri" w:cs="Calibri" w:eastAsia="Calibri" w:hAnsi="Calibri"/>
+                <w:b w:val="false"/>
+                <w:bCs w:val="false"/>
+                <w:color w:val="000000"/>
+                <w:sz w:val="19"/>
+                <w:szCs w:val="19"/>
+              </w:rPr>
+              <w:t>UC01, UC02, UC07</w:t>
+            </w:r>
+          </w:p>
+        </w:tc>
+        <w:tc>
+          <w:tcPr>
+            <w:tcW w:type="dxa" w:w="2608"/>
+            <w:tcMar>
+              <w:top w:type="dxa" w:w="50"/>
+              <w:left w:type="dxa" w:w="90"/>
+              <w:bottom w:type="dxa" w:w="50"/>
+              <w:right w:type="dxa" w:w="90"/>
+            </w:tcMar>
+            <w:vAlign w:val="top"/>
+          </w:tcPr>
+          <w:p>
+            <w:pPr>
+              <w:keepNext/>
+              <w:spacing w:after="40" w:line="252"/>
+              <w:jc w:val="left"/>
+            </w:pPr>
+            <w:r>
+              <w:rPr>
+                <w:rFonts w:ascii="Calibri" w:cs="Calibri" w:eastAsia="Calibri" w:hAnsi="Calibri"/>
+                <w:b w:val="false"/>
+                <w:bCs w:val="false"/>
+                <w:color w:val="000000"/>
+                <w:sz w:val="19"/>
+                <w:szCs w:val="19"/>
+              </w:rPr>
+              <w:t>Kunde</w:t>
+            </w:r>
+          </w:p>
+        </w:tc>
+        <w:tc>
+          <w:tcPr>
+            <w:tcW w:type="dxa" w:w="2608"/>
+            <w:tcMar>
+              <w:top w:type="dxa" w:w="50"/>
+              <w:left w:type="dxa" w:w="90"/>
+              <w:bottom w:type="dxa" w:w="50"/>
+              <w:right w:type="dxa" w:w="90"/>
+            </w:tcMar>
+            <w:vAlign w:val="top"/>
+          </w:tcPr>
+          <w:p>
+            <w:pPr>
+              <w:keepNext/>
+              <w:spacing w:after="40" w:line="252"/>
+              <w:jc w:val="left"/>
+            </w:pPr>
+            <w:r>
+              <w:rPr>
+                <w:rFonts w:ascii="Calibri" w:cs="Calibri" w:eastAsia="Calibri" w:hAnsi="Calibri"/>
+                <w:b w:val="false"/>
+                <w:bCs w:val="false"/>
+                <w:color w:val="000000"/>
+                <w:sz w:val="19"/>
+                <w:szCs w:val="19"/>
+              </w:rPr>
+              <w:t>Pool Kunde</w:t>
+            </w:r>
+          </w:p>
+        </w:tc>
+      </w:tr>
+      <w:tr>
+        <w:trPr>
+          <w:cantSplit/>
+        </w:trPr>
+        <w:tc>
+          <w:tcPr>
+            <w:tcW w:type="dxa" w:w="2381"/>
+            <w:tcMar>
+              <w:top w:type="dxa" w:w="50"/>
+              <w:left w:type="dxa" w:w="90"/>
+              <w:bottom w:type="dxa" w:w="50"/>
+              <w:right w:type="dxa" w:w="90"/>
+            </w:tcMar>
+            <w:vAlign w:val="top"/>
+          </w:tcPr>
+          <w:p>
+            <w:pPr>
+              <w:keepNext/>
+              <w:spacing w:after="40" w:line="252"/>
+              <w:jc w:val="left"/>
+            </w:pPr>
+            <w:r>
+              <w:rPr>
+                <w:rFonts w:ascii="Calibri" w:cs="Calibri" w:eastAsia="Calibri" w:hAnsi="Calibri"/>
+                <w:b w:val="false"/>
+                <w:bCs w:val="false"/>
+                <w:color w:val="000000"/>
+                <w:sz w:val="19"/>
+                <w:szCs w:val="19"/>
+              </w:rPr>
+              <w:t>Serviceannahme</w:t>
+            </w:r>
+          </w:p>
+        </w:tc>
+        <w:tc>
+          <w:tcPr>
+            <w:tcW w:type="dxa" w:w="1474"/>
+            <w:tcMar>
+              <w:top w:type="dxa" w:w="50"/>
+              <w:left w:type="dxa" w:w="90"/>
+              <w:bottom w:type="dxa" w:w="50"/>
+              <w:right w:type="dxa" w:w="90"/>
+            </w:tcMar>
+            <w:vAlign w:val="top"/>
+          </w:tcPr>
+          <w:p>
+            <w:pPr>
+              <w:keepNext/>
+              <w:spacing w:after="40" w:line="252"/>
+              <w:jc w:val="left"/>
+            </w:pPr>
+            <w:r>
+              <w:rPr>
+                <w:rFonts w:ascii="Calibri" w:cs="Calibri" w:eastAsia="Calibri" w:hAnsi="Calibri"/>
+                <w:b w:val="false"/>
+                <w:bCs w:val="false"/>
+                <w:color w:val="000000"/>
+                <w:sz w:val="19"/>
+                <w:szCs w:val="19"/>
+              </w:rPr>
+              <w:t>UC03</w:t>
+            </w:r>
+          </w:p>
+        </w:tc>
+        <w:tc>
+          <w:tcPr>
+            <w:tcW w:type="dxa" w:w="2608"/>
+            <w:tcMar>
+              <w:top w:type="dxa" w:w="50"/>
+              <w:left w:type="dxa" w:w="90"/>
+              <w:bottom w:type="dxa" w:w="50"/>
+              <w:right w:type="dxa" w:w="90"/>
+            </w:tcMar>
+            <w:vAlign w:val="top"/>
+          </w:tcPr>
+          <w:p>
+            <w:pPr>
+              <w:keepNext/>
+              <w:spacing w:after="40" w:line="252"/>
+              <w:jc w:val="left"/>
+            </w:pPr>
+            <w:r>
+              <w:rPr>
+                <w:rFonts w:ascii="Calibri" w:cs="Calibri" w:eastAsia="Calibri" w:hAnsi="Calibri"/>
+                <w:b w:val="false"/>
+                <w:bCs w:val="false"/>
+                <w:color w:val="000000"/>
+                <w:sz w:val="19"/>
+                <w:szCs w:val="19"/>
+              </w:rPr>
+              <w:t>Servicemitarbeiter</w:t>
+            </w:r>
+          </w:p>
+        </w:tc>
+        <w:tc>
+          <w:tcPr>
+            <w:tcW w:type="dxa" w:w="2608"/>
+            <w:tcMar>
+              <w:top w:type="dxa" w:w="50"/>
+              <w:left w:type="dxa" w:w="90"/>
+              <w:bottom w:type="dxa" w:w="50"/>
+              <w:right w:type="dxa" w:w="90"/>
+            </w:tcMar>
+            <w:vAlign w:val="top"/>
+          </w:tcPr>
+          <w:p>
+            <w:pPr>
+              <w:keepNext/>
+              <w:spacing w:after="40" w:line="252"/>
+              <w:jc w:val="left"/>
+            </w:pPr>
+            <w:r>
+              <w:rPr>
+                <w:rFonts w:ascii="Calibri" w:cs="Calibri" w:eastAsia="Calibri" w:hAnsi="Calibri"/>
+                <w:b w:val="false"/>
+                <w:bCs w:val="false"/>
+                <w:color w:val="000000"/>
+                <w:sz w:val="19"/>
+                <w:szCs w:val="19"/>
+              </w:rPr>
+              <w:t>Service / Annahme</w:t>
+            </w:r>
+          </w:p>
+        </w:tc>
+      </w:tr>
+      <w:tr>
+        <w:trPr>
+          <w:cantSplit/>
+        </w:trPr>
+        <w:tc>
+          <w:tcPr>
+            <w:tcW w:type="dxa" w:w="2381"/>
+            <w:tcMar>
+              <w:top w:type="dxa" w:w="50"/>
+              <w:left w:type="dxa" w:w="90"/>
+              <w:bottom w:type="dxa" w:w="50"/>
+              <w:right w:type="dxa" w:w="90"/>
+            </w:tcMar>
+            <w:vAlign w:val="top"/>
+          </w:tcPr>
+          <w:p>
+            <w:pPr>
+              <w:keepNext/>
+              <w:spacing w:after="40" w:line="252"/>
+              <w:jc w:val="left"/>
+            </w:pPr>
+            <w:r>
+              <w:rPr>
+                <w:rFonts w:ascii="Calibri" w:cs="Calibri" w:eastAsia="Calibri" w:hAnsi="Calibri"/>
+                <w:b w:val="false"/>
+                <w:bCs w:val="false"/>
+                <w:color w:val="000000"/>
+                <w:sz w:val="19"/>
+                <w:szCs w:val="19"/>
+              </w:rPr>
+              <w:t>Geräteausgabe</w:t>
+            </w:r>
+          </w:p>
+        </w:tc>
+        <w:tc>
+          <w:tcPr>
+            <w:tcW w:type="dxa" w:w="1474"/>
+            <w:tcMar>
+              <w:top w:type="dxa" w:w="50"/>
+              <w:left w:type="dxa" w:w="90"/>
+              <w:bottom w:type="dxa" w:w="50"/>
+              <w:right w:type="dxa" w:w="90"/>
+            </w:tcMar>
+            <w:vAlign w:val="top"/>
+          </w:tcPr>
+          <w:p>
+            <w:pPr>
+              <w:keepNext/>
+              <w:spacing w:after="40" w:line="252"/>
+              <w:jc w:val="left"/>
+            </w:pPr>
+            <w:r>
+              <w:rPr>
+                <w:rFonts w:ascii="Calibri" w:cs="Calibri" w:eastAsia="Calibri" w:hAnsi="Calibri"/>
+                <w:b w:val="false"/>
+                <w:bCs w:val="false"/>
+                <w:color w:val="000000"/>
+                <w:sz w:val="19"/>
+                <w:szCs w:val="19"/>
+              </w:rPr>
+              <w:t>UC15</w:t>
+            </w:r>
+          </w:p>
+        </w:tc>
+        <w:tc>
+          <w:tcPr>
+            <w:tcW w:type="dxa" w:w="2608"/>
+            <w:tcMar>
+              <w:top w:type="dxa" w:w="50"/>
+              <w:left w:type="dxa" w:w="90"/>
+              <w:bottom w:type="dxa" w:w="50"/>
+              <w:right w:type="dxa" w:w="90"/>
+            </w:tcMar>
+            <w:vAlign w:val="top"/>
+          </w:tcPr>
+          <w:p>
+            <w:pPr>
+              <w:keepNext/>
+              <w:spacing w:after="40" w:line="252"/>
+              <w:jc w:val="left"/>
+            </w:pPr>
+            <w:r>
+              <w:rPr>
+                <w:rFonts w:ascii="Calibri" w:cs="Calibri" w:eastAsia="Calibri" w:hAnsi="Calibri"/>
+                <w:b w:val="false"/>
+                <w:bCs w:val="false"/>
+                <w:color w:val="000000"/>
+                <w:sz w:val="19"/>
+                <w:szCs w:val="19"/>
+              </w:rPr>
+              <w:t>Servicemitarbeiter</w:t>
+            </w:r>
+          </w:p>
+        </w:tc>
+        <w:tc>
+          <w:tcPr>
+            <w:tcW w:type="dxa" w:w="2608"/>
+            <w:tcMar>
+              <w:top w:type="dxa" w:w="50"/>
+              <w:left w:type="dxa" w:w="90"/>
+              <w:bottom w:type="dxa" w:w="50"/>
+              <w:right w:type="dxa" w:w="90"/>
+            </w:tcMar>
+            <w:vAlign w:val="top"/>
+          </w:tcPr>
+          <w:p>
+            <w:pPr>
+              <w:keepNext/>
+              <w:spacing w:after="40" w:line="252"/>
+              <w:jc w:val="left"/>
+            </w:pPr>
+            <w:r>
+              <w:rPr>
+                <w:rFonts w:ascii="Calibri" w:cs="Calibri" w:eastAsia="Calibri" w:hAnsi="Calibri"/>
+                <w:b w:val="false"/>
+                <w:bCs w:val="false"/>
+                <w:color w:val="000000"/>
+                <w:sz w:val="19"/>
+                <w:szCs w:val="19"/>
+              </w:rPr>
+              <w:t>Service / Annahme</w:t>
+            </w:r>
+          </w:p>
+        </w:tc>
+      </w:tr>
+      <w:tr>
+        <w:trPr>
+          <w:cantSplit/>
+        </w:trPr>
+        <w:tc>
+          <w:tcPr>
+            <w:tcW w:type="dxa" w:w="2381"/>
+            <w:tcMar>
+              <w:top w:type="dxa" w:w="50"/>
+              <w:left w:type="dxa" w:w="90"/>
+              <w:bottom w:type="dxa" w:w="50"/>
+              <w:right w:type="dxa" w:w="90"/>
+            </w:tcMar>
+            <w:vAlign w:val="top"/>
+          </w:tcPr>
+          <w:p>
+            <w:pPr>
+              <w:keepNext/>
+              <w:spacing w:after="40" w:line="252"/>
+              <w:jc w:val="left"/>
+            </w:pPr>
+            <w:r>
+              <w:rPr>
+                <w:rFonts w:ascii="Calibri" w:cs="Calibri" w:eastAsia="Calibri" w:hAnsi="Calibri"/>
+                <w:b w:val="false"/>
+                <w:bCs w:val="false"/>
+                <w:color w:val="000000"/>
+                <w:sz w:val="19"/>
+                <w:szCs w:val="19"/>
+              </w:rPr>
+              <w:t>Reklamationsbearbeiter</w:t>
+            </w:r>
+          </w:p>
+        </w:tc>
+        <w:tc>
+          <w:tcPr>
+            <w:tcW w:type="dxa" w:w="1474"/>
+            <w:tcMar>
+              <w:top w:type="dxa" w:w="50"/>
+              <w:left w:type="dxa" w:w="90"/>
+              <w:bottom w:type="dxa" w:w="50"/>
+              <w:right w:type="dxa" w:w="90"/>
+            </w:tcMar>
+            <w:vAlign w:val="top"/>
+          </w:tcPr>
+          <w:p>
+            <w:pPr>
+              <w:keepNext/>
+              <w:spacing w:after="40" w:line="252"/>
+              <w:jc w:val="left"/>
+            </w:pPr>
+            <w:r>
+              <w:rPr>
+                <w:rFonts w:ascii="Calibri" w:cs="Calibri" w:eastAsia="Calibri" w:hAnsi="Calibri"/>
+                <w:b w:val="false"/>
+                <w:bCs w:val="false"/>
+                <w:color w:val="000000"/>
+                <w:sz w:val="19"/>
+                <w:szCs w:val="19"/>
+              </w:rPr>
+              <w:t>UC16</w:t>
+            </w:r>
+          </w:p>
+        </w:tc>
+        <w:tc>
+          <w:tcPr>
+            <w:tcW w:type="dxa" w:w="2608"/>
+            <w:tcMar>
+              <w:top w:type="dxa" w:w="50"/>
+              <w:left w:type="dxa" w:w="90"/>
+              <w:bottom w:type="dxa" w:w="50"/>
+              <w:right w:type="dxa" w:w="90"/>
+            </w:tcMar>
+            <w:vAlign w:val="top"/>
+          </w:tcPr>
+          <w:p>
+            <w:pPr>
+              <w:keepNext/>
+              <w:spacing w:after="40" w:line="252"/>
+              <w:jc w:val="left"/>
+            </w:pPr>
+            <w:r>
+              <w:rPr>
+                <w:rFonts w:ascii="Calibri" w:cs="Calibri" w:eastAsia="Calibri" w:hAnsi="Calibri"/>
+                <w:b w:val="false"/>
+                <w:bCs w:val="false"/>
+                <w:color w:val="000000"/>
+                <w:sz w:val="19"/>
+                <w:szCs w:val="19"/>
+              </w:rPr>
+              <w:t>Servicemitarbeiter</w:t>
+            </w:r>
+          </w:p>
+        </w:tc>
+        <w:tc>
+          <w:tcPr>
+            <w:tcW w:type="dxa" w:w="2608"/>
+            <w:tcMar>
+              <w:top w:type="dxa" w:w="50"/>
+              <w:left w:type="dxa" w:w="90"/>
+              <w:bottom w:type="dxa" w:w="50"/>
+              <w:right w:type="dxa" w:w="90"/>
+            </w:tcMar>
+            <w:vAlign w:val="top"/>
+          </w:tcPr>
+          <w:p>
+            <w:pPr>
+              <w:keepNext/>
+              <w:spacing w:after="40" w:line="252"/>
+              <w:jc w:val="left"/>
+            </w:pPr>
+            <w:r>
+              <w:rPr>
+                <w:rFonts w:ascii="Calibri" w:cs="Calibri" w:eastAsia="Calibri" w:hAnsi="Calibri"/>
+                <w:b w:val="false"/>
+                <w:bCs w:val="false"/>
+                <w:color w:val="000000"/>
+                <w:sz w:val="19"/>
+                <w:szCs w:val="19"/>
+              </w:rPr>
+              <w:t>Service / Annahme</w:t>
+            </w:r>
+          </w:p>
+        </w:tc>
+      </w:tr>
+      <w:tr>
+        <w:trPr>
+          <w:cantSplit/>
+        </w:trPr>
+        <w:tc>
+          <w:tcPr>
+            <w:tcW w:type="dxa" w:w="2381"/>
+            <w:tcMar>
+              <w:top w:type="dxa" w:w="50"/>
+              <w:left w:type="dxa" w:w="90"/>
+              <w:bottom w:type="dxa" w:w="50"/>
+              <w:right w:type="dxa" w:w="90"/>
+            </w:tcMar>
+            <w:vAlign w:val="top"/>
+          </w:tcPr>
+          <w:p>
+            <w:pPr>
+              <w:keepNext/>
+              <w:spacing w:after="40" w:line="252"/>
+              <w:jc w:val="left"/>
+            </w:pPr>
+            <w:r>
+              <w:rPr>
+                <w:rFonts w:ascii="Calibri" w:cs="Calibri" w:eastAsia="Calibri" w:hAnsi="Calibri"/>
+                <w:b w:val="false"/>
+                <w:bCs w:val="false"/>
+                <w:color w:val="000000"/>
+                <w:sz w:val="19"/>
+                <w:szCs w:val="19"/>
+              </w:rPr>
+              <w:t>Diagnoseprüfer</w:t>
+            </w:r>
+          </w:p>
+        </w:tc>
+        <w:tc>
+          <w:tcPr>
+            <w:tcW w:type="dxa" w:w="1474"/>
+            <w:tcMar>
+              <w:top w:type="dxa" w:w="50"/>
+              <w:left w:type="dxa" w:w="90"/>
+              <w:bottom w:type="dxa" w:w="50"/>
+              <w:right w:type="dxa" w:w="90"/>
+            </w:tcMar>
+            <w:vAlign w:val="top"/>
+          </w:tcPr>
+          <w:p>
+            <w:pPr>
+              <w:keepNext/>
+              <w:spacing w:after="40" w:line="252"/>
+              <w:jc w:val="left"/>
+            </w:pPr>
+            <w:r>
+              <w:rPr>
+                <w:rFonts w:ascii="Calibri" w:cs="Calibri" w:eastAsia="Calibri" w:hAnsi="Calibri"/>
+                <w:b w:val="false"/>
+                <w:bCs w:val="false"/>
+                <w:color w:val="000000"/>
+                <w:sz w:val="19"/>
+                <w:szCs w:val="19"/>
+              </w:rPr>
+              <w:t>UC04</w:t>
+            </w:r>
+          </w:p>
+        </w:tc>
+        <w:tc>
+          <w:tcPr>
+            <w:tcW w:type="dxa" w:w="2608"/>
+            <w:tcMar>
+              <w:top w:type="dxa" w:w="50"/>
+              <w:left w:type="dxa" w:w="90"/>
+              <w:bottom w:type="dxa" w:w="50"/>
+              <w:right w:type="dxa" w:w="90"/>
+            </w:tcMar>
+            <w:vAlign w:val="top"/>
+          </w:tcPr>
+          <w:p>
+            <w:pPr>
+              <w:keepNext/>
+              <w:spacing w:after="40" w:line="252"/>
+              <w:jc w:val="left"/>
+            </w:pPr>
+            <w:r>
+              <w:rPr>
+                <w:rFonts w:ascii="Calibri" w:cs="Calibri" w:eastAsia="Calibri" w:hAnsi="Calibri"/>
+                <w:b w:val="false"/>
+                <w:bCs w:val="false"/>
+                <w:color w:val="000000"/>
+                <w:sz w:val="19"/>
+                <w:szCs w:val="19"/>
+              </w:rPr>
+              <w:t>Techniker</w:t>
+            </w:r>
+          </w:p>
+        </w:tc>
+        <w:tc>
+          <w:tcPr>
+            <w:tcW w:type="dxa" w:w="2608"/>
+            <w:tcMar>
+              <w:top w:type="dxa" w:w="50"/>
+              <w:left w:type="dxa" w:w="90"/>
+              <w:bottom w:type="dxa" w:w="50"/>
+              <w:right w:type="dxa" w:w="90"/>
+            </w:tcMar>
+            <w:vAlign w:val="top"/>
+          </w:tcPr>
+          <w:p>
+            <w:pPr>
+              <w:keepNext/>
+              <w:spacing w:after="40" w:line="252"/>
+              <w:jc w:val="left"/>
+            </w:pPr>
+            <w:r>
+              <w:rPr>
+                <w:rFonts w:ascii="Calibri" w:cs="Calibri" w:eastAsia="Calibri" w:hAnsi="Calibri"/>
+                <w:b w:val="false"/>
+                <w:bCs w:val="false"/>
+                <w:color w:val="000000"/>
+                <w:sz w:val="19"/>
+                <w:szCs w:val="19"/>
+              </w:rPr>
+              <w:t>Techniker</w:t>
+            </w:r>
+          </w:p>
+        </w:tc>
+      </w:tr>
+      <w:tr>
+        <w:trPr>
+          <w:cantSplit/>
+        </w:trPr>
+        <w:tc>
+          <w:tcPr>
+            <w:tcW w:type="dxa" w:w="2381"/>
+            <w:tcMar>
+              <w:top w:type="dxa" w:w="50"/>
+              <w:left w:type="dxa" w:w="90"/>
+              <w:bottom w:type="dxa" w:w="50"/>
+              <w:right w:type="dxa" w:w="90"/>
+            </w:tcMar>
+            <w:vAlign w:val="top"/>
+          </w:tcPr>
+          <w:p>
+            <w:pPr>
+              <w:keepNext/>
+              <w:spacing w:after="40" w:line="252"/>
+              <w:jc w:val="left"/>
+            </w:pPr>
+            <w:r>
+              <w:rPr>
+                <w:rFonts w:ascii="Calibri" w:cs="Calibri" w:eastAsia="Calibri" w:hAnsi="Calibri"/>
+                <w:b w:val="false"/>
+                <w:bCs w:val="false"/>
+                <w:color w:val="000000"/>
+                <w:sz w:val="19"/>
+                <w:szCs w:val="19"/>
+              </w:rPr>
+              <w:t>Diagnostiker</w:t>
+            </w:r>
+          </w:p>
+        </w:tc>
+        <w:tc>
+          <w:tcPr>
+            <w:tcW w:type="dxa" w:w="1474"/>
+            <w:tcMar>
+              <w:top w:type="dxa" w:w="50"/>
+              <w:left w:type="dxa" w:w="90"/>
+              <w:bottom w:type="dxa" w:w="50"/>
+              <w:right w:type="dxa" w:w="90"/>
+            </w:tcMar>
+            <w:vAlign w:val="top"/>
+          </w:tcPr>
+          <w:p>
+            <w:pPr>
+              <w:keepNext/>
+              <w:spacing w:after="40" w:line="252"/>
+              <w:jc w:val="left"/>
+            </w:pPr>
+            <w:r>
+              <w:rPr>
+                <w:rFonts w:ascii="Calibri" w:cs="Calibri" w:eastAsia="Calibri" w:hAnsi="Calibri"/>
+                <w:b w:val="false"/>
+                <w:bCs w:val="false"/>
+                <w:color w:val="000000"/>
+                <w:sz w:val="19"/>
+                <w:szCs w:val="19"/>
+              </w:rPr>
+              <w:t>UC05</w:t>
+            </w:r>
+          </w:p>
+        </w:tc>
+        <w:tc>
+          <w:tcPr>
+            <w:tcW w:type="dxa" w:w="2608"/>
+            <w:tcMar>
+              <w:top w:type="dxa" w:w="50"/>
+              <w:left w:type="dxa" w:w="90"/>
+              <w:bottom w:type="dxa" w:w="50"/>
+              <w:right w:type="dxa" w:w="90"/>
+            </w:tcMar>
+            <w:vAlign w:val="top"/>
+          </w:tcPr>
+          <w:p>
+            <w:pPr>
+              <w:keepNext/>
+              <w:spacing w:after="40" w:line="252"/>
+              <w:jc w:val="left"/>
+            </w:pPr>
+            <w:r>
+              <w:rPr>
+                <w:rFonts w:ascii="Calibri" w:cs="Calibri" w:eastAsia="Calibri" w:hAnsi="Calibri"/>
+                <w:b w:val="false"/>
+                <w:bCs w:val="false"/>
+                <w:color w:val="000000"/>
+                <w:sz w:val="19"/>
+                <w:szCs w:val="19"/>
+              </w:rPr>
+              <w:t>Techniker</w:t>
+            </w:r>
+          </w:p>
+        </w:tc>
+        <w:tc>
+          <w:tcPr>
+            <w:tcW w:type="dxa" w:w="2608"/>
+            <w:tcMar>
+              <w:top w:type="dxa" w:w="50"/>
+              <w:left w:type="dxa" w:w="90"/>
+              <w:bottom w:type="dxa" w:w="50"/>
+              <w:right w:type="dxa" w:w="90"/>
+            </w:tcMar>
+            <w:vAlign w:val="top"/>
+          </w:tcPr>
+          <w:p>
+            <w:pPr>
+              <w:keepNext/>
+              <w:spacing w:after="40" w:line="252"/>
+              <w:jc w:val="left"/>
+            </w:pPr>
+            <w:r>
+              <w:rPr>
+                <w:rFonts w:ascii="Calibri" w:cs="Calibri" w:eastAsia="Calibri" w:hAnsi="Calibri"/>
+                <w:b w:val="false"/>
+                <w:bCs w:val="false"/>
+                <w:color w:val="000000"/>
+                <w:sz w:val="19"/>
+                <w:szCs w:val="19"/>
+              </w:rPr>
+              <w:t>Techniker</w:t>
+            </w:r>
+          </w:p>
+        </w:tc>
+      </w:tr>
+      <w:tr>
+        <w:trPr>
+          <w:cantSplit/>
+        </w:trPr>
+        <w:tc>
+          <w:tcPr>
+            <w:tcW w:type="dxa" w:w="2381"/>
+            <w:tcMar>
+              <w:top w:type="dxa" w:w="50"/>
+              <w:left w:type="dxa" w:w="90"/>
+              <w:bottom w:type="dxa" w:w="50"/>
+              <w:right w:type="dxa" w:w="90"/>
+            </w:tcMar>
+            <w:vAlign w:val="top"/>
+          </w:tcPr>
+          <w:p>
+            <w:pPr>
+              <w:keepNext/>
+              <w:spacing w:after="40" w:line="252"/>
+              <w:jc w:val="left"/>
+            </w:pPr>
+            <w:r>
+              <w:rPr>
+                <w:rFonts w:ascii="Calibri" w:cs="Calibri" w:eastAsia="Calibri" w:hAnsi="Calibri"/>
+                <w:b w:val="false"/>
+                <w:bCs w:val="false"/>
+                <w:color w:val="000000"/>
+                <w:sz w:val="19"/>
+                <w:szCs w:val="19"/>
+              </w:rPr>
+              <w:t>Kalkulator</w:t>
+            </w:r>
+          </w:p>
+        </w:tc>
+        <w:tc>
+          <w:tcPr>
+            <w:tcW w:type="dxa" w:w="1474"/>
+            <w:tcMar>
+              <w:top w:type="dxa" w:w="50"/>
+              <w:left w:type="dxa" w:w="90"/>
+              <w:bottom w:type="dxa" w:w="50"/>
+              <w:right w:type="dxa" w:w="90"/>
+            </w:tcMar>
+            <w:vAlign w:val="top"/>
+          </w:tcPr>
+          <w:p>
+            <w:pPr>
+              <w:keepNext/>
+              <w:spacing w:after="40" w:line="252"/>
+              <w:jc w:val="left"/>
+            </w:pPr>
+            <w:r>
+              <w:rPr>
+                <w:rFonts w:ascii="Calibri" w:cs="Calibri" w:eastAsia="Calibri" w:hAnsi="Calibri"/>
+                <w:b w:val="false"/>
+                <w:bCs w:val="false"/>
+                <w:color w:val="000000"/>
+                <w:sz w:val="19"/>
+                <w:szCs w:val="19"/>
+              </w:rPr>
+              <w:t>UC06</w:t>
+            </w:r>
+          </w:p>
+        </w:tc>
+        <w:tc>
+          <w:tcPr>
+            <w:tcW w:type="dxa" w:w="2608"/>
+            <w:tcMar>
+              <w:top w:type="dxa" w:w="50"/>
+              <w:left w:type="dxa" w:w="90"/>
+              <w:bottom w:type="dxa" w:w="50"/>
+              <w:right w:type="dxa" w:w="90"/>
+            </w:tcMar>
+            <w:vAlign w:val="top"/>
+          </w:tcPr>
+          <w:p>
+            <w:pPr>
+              <w:keepNext/>
+              <w:spacing w:after="40" w:line="252"/>
+              <w:jc w:val="left"/>
+            </w:pPr>
+            <w:r>
+              <w:rPr>
+                <w:rFonts w:ascii="Calibri" w:cs="Calibri" w:eastAsia="Calibri" w:hAnsi="Calibri"/>
+                <w:b w:val="false"/>
+                <w:bCs w:val="false"/>
+                <w:color w:val="000000"/>
+                <w:sz w:val="19"/>
+                <w:szCs w:val="19"/>
+              </w:rPr>
+              <w:t>Techniker</w:t>
+            </w:r>
+          </w:p>
+        </w:tc>
+        <w:tc>
+          <w:tcPr>
+            <w:tcW w:type="dxa" w:w="2608"/>
+            <w:tcMar>
+              <w:top w:type="dxa" w:w="50"/>
+              <w:left w:type="dxa" w:w="90"/>
+              <w:bottom w:type="dxa" w:w="50"/>
+              <w:right w:type="dxa" w:w="90"/>
+            </w:tcMar>
+            <w:vAlign w:val="top"/>
+          </w:tcPr>
+          <w:p>
+            <w:pPr>
+              <w:keepNext/>
+              <w:spacing w:after="40" w:line="252"/>
+              <w:jc w:val="left"/>
+            </w:pPr>
+            <w:r>
+              <w:rPr>
+                <w:rFonts w:ascii="Calibri" w:cs="Calibri" w:eastAsia="Calibri" w:hAnsi="Calibri"/>
+                <w:b w:val="false"/>
+                <w:bCs w:val="false"/>
+                <w:color w:val="000000"/>
+                <w:sz w:val="19"/>
+                <w:szCs w:val="19"/>
+              </w:rPr>
+              <w:t>Techniker</w:t>
+            </w:r>
+          </w:p>
+        </w:tc>
+      </w:tr>
+      <w:tr>
+        <w:trPr>
+          <w:cantSplit/>
+        </w:trPr>
+        <w:tc>
+          <w:tcPr>
+            <w:tcW w:type="dxa" w:w="2381"/>
+            <w:tcMar>
+              <w:top w:type="dxa" w:w="50"/>
+              <w:left w:type="dxa" w:w="90"/>
+              <w:bottom w:type="dxa" w:w="50"/>
+              <w:right w:type="dxa" w:w="90"/>
+            </w:tcMar>
+            <w:vAlign w:val="top"/>
+          </w:tcPr>
+          <w:p>
+            <w:pPr>
+              <w:keepNext/>
+              <w:spacing w:after="40" w:line="252"/>
+              <w:jc w:val="left"/>
+            </w:pPr>
+            <w:r>
+              <w:rPr>
+                <w:rFonts w:ascii="Calibri" w:cs="Calibri" w:eastAsia="Calibri" w:hAnsi="Calibri"/>
+                <w:b w:val="false"/>
+                <w:bCs w:val="false"/>
+                <w:color w:val="000000"/>
+                <w:sz w:val="19"/>
+                <w:szCs w:val="19"/>
+              </w:rPr>
+              <w:t>Reparateur</w:t>
+            </w:r>
+          </w:p>
+        </w:tc>
+        <w:tc>
+          <w:tcPr>
+            <w:tcW w:type="dxa" w:w="1474"/>
+            <w:tcMar>
+              <w:top w:type="dxa" w:w="50"/>
+              <w:left w:type="dxa" w:w="90"/>
+              <w:bottom w:type="dxa" w:w="50"/>
+              <w:right w:type="dxa" w:w="90"/>
+            </w:tcMar>
+            <w:vAlign w:val="top"/>
+          </w:tcPr>
+          <w:p>
+            <w:pPr>
+              <w:keepNext/>
+              <w:spacing w:after="40" w:line="252"/>
+              <w:jc w:val="left"/>
+            </w:pPr>
+            <w:r>
+              <w:rPr>
+                <w:rFonts w:ascii="Calibri" w:cs="Calibri" w:eastAsia="Calibri" w:hAnsi="Calibri"/>
+                <w:b w:val="false"/>
+                <w:bCs w:val="false"/>
+                <w:color w:val="000000"/>
+                <w:sz w:val="19"/>
+                <w:szCs w:val="19"/>
+              </w:rPr>
+              <w:t>UC13</w:t>
+            </w:r>
+          </w:p>
+        </w:tc>
+        <w:tc>
+          <w:tcPr>
+            <w:tcW w:type="dxa" w:w="2608"/>
+            <w:tcMar>
+              <w:top w:type="dxa" w:w="50"/>
+              <w:left w:type="dxa" w:w="90"/>
+              <w:bottom w:type="dxa" w:w="50"/>
+              <w:right w:type="dxa" w:w="90"/>
+            </w:tcMar>
+            <w:vAlign w:val="top"/>
+          </w:tcPr>
+          <w:p>
+            <w:pPr>
+              <w:keepNext/>
+              <w:spacing w:after="40" w:line="252"/>
+              <w:jc w:val="left"/>
+            </w:pPr>
+            <w:r>
+              <w:rPr>
+                <w:rFonts w:ascii="Calibri" w:cs="Calibri" w:eastAsia="Calibri" w:hAnsi="Calibri"/>
+                <w:b w:val="false"/>
+                <w:bCs w:val="false"/>
+                <w:color w:val="000000"/>
+                <w:sz w:val="19"/>
+                <w:szCs w:val="19"/>
+              </w:rPr>
+              <w:t>Techniker</w:t>
+            </w:r>
+          </w:p>
+        </w:tc>
+        <w:tc>
+          <w:tcPr>
+            <w:tcW w:type="dxa" w:w="2608"/>
+            <w:tcMar>
+              <w:top w:type="dxa" w:w="50"/>
+              <w:left w:type="dxa" w:w="90"/>
+              <w:bottom w:type="dxa" w:w="50"/>
+              <w:right w:type="dxa" w:w="90"/>
+            </w:tcMar>
+            <w:vAlign w:val="top"/>
+          </w:tcPr>
+          <w:p>
+            <w:pPr>
+              <w:keepNext/>
+              <w:spacing w:after="40" w:line="252"/>
+              <w:jc w:val="left"/>
+            </w:pPr>
+            <w:r>
+              <w:rPr>
+                <w:rFonts w:ascii="Calibri" w:cs="Calibri" w:eastAsia="Calibri" w:hAnsi="Calibri"/>
+                <w:b w:val="false"/>
+                <w:bCs w:val="false"/>
+                <w:color w:val="000000"/>
+                <w:sz w:val="19"/>
+                <w:szCs w:val="19"/>
+              </w:rPr>
+              <w:t>Techniker</w:t>
+            </w:r>
+          </w:p>
+        </w:tc>
+      </w:tr>
+      <w:tr>
+        <w:trPr>
+          <w:cantSplit/>
+        </w:trPr>
+        <w:tc>
+          <w:tcPr>
+            <w:tcW w:type="dxa" w:w="2381"/>
+            <w:tcMar>
+              <w:top w:type="dxa" w:w="50"/>
+              <w:left w:type="dxa" w:w="90"/>
+              <w:bottom w:type="dxa" w:w="50"/>
+              <w:right w:type="dxa" w:w="90"/>
+            </w:tcMar>
+            <w:vAlign w:val="top"/>
+          </w:tcPr>
+          <w:p>
+            <w:pPr>
+              <w:keepNext/>
+              <w:spacing w:after="40" w:line="252"/>
+              <w:jc w:val="left"/>
+            </w:pPr>
+            <w:r>
+              <w:rPr>
+                <w:rFonts w:ascii="Calibri" w:cs="Calibri" w:eastAsia="Calibri" w:hAnsi="Calibri"/>
+                <w:b w:val="false"/>
+                <w:bCs w:val="false"/>
+                <w:color w:val="000000"/>
+                <w:sz w:val="19"/>
+                <w:szCs w:val="19"/>
+              </w:rPr>
+              <w:t>Endkontrolleur</w:t>
+            </w:r>
+          </w:p>
+        </w:tc>
+        <w:tc>
+          <w:tcPr>
+            <w:tcW w:type="dxa" w:w="1474"/>
+            <w:tcMar>
+              <w:top w:type="dxa" w:w="50"/>
+              <w:left w:type="dxa" w:w="90"/>
+              <w:bottom w:type="dxa" w:w="50"/>
+              <w:right w:type="dxa" w:w="90"/>
+            </w:tcMar>
+            <w:vAlign w:val="top"/>
+          </w:tcPr>
+          <w:p>
+            <w:pPr>
+              <w:keepNext/>
+              <w:spacing w:after="40" w:line="252"/>
+              <w:jc w:val="left"/>
+            </w:pPr>
+            <w:r>
+              <w:rPr>
+                <w:rFonts w:ascii="Calibri" w:cs="Calibri" w:eastAsia="Calibri" w:hAnsi="Calibri"/>
+                <w:b w:val="false"/>
+                <w:bCs w:val="false"/>
+                <w:color w:val="000000"/>
+                <w:sz w:val="19"/>
+                <w:szCs w:val="19"/>
+              </w:rPr>
+              <w:t>UC14</w:t>
+            </w:r>
+          </w:p>
+        </w:tc>
+        <w:tc>
+          <w:tcPr>
+            <w:tcW w:type="dxa" w:w="2608"/>
+            <w:tcMar>
+              <w:top w:type="dxa" w:w="50"/>
+              <w:left w:type="dxa" w:w="90"/>
+              <w:bottom w:type="dxa" w:w="50"/>
+              <w:right w:type="dxa" w:w="90"/>
+            </w:tcMar>
+            <w:vAlign w:val="top"/>
+          </w:tcPr>
+          <w:p>
+            <w:pPr>
+              <w:keepNext/>
+              <w:spacing w:after="40" w:line="252"/>
+              <w:jc w:val="left"/>
+            </w:pPr>
+            <w:r>
+              <w:rPr>
+                <w:rFonts w:ascii="Calibri" w:cs="Calibri" w:eastAsia="Calibri" w:hAnsi="Calibri"/>
+                <w:b w:val="false"/>
+                <w:bCs w:val="false"/>
+                <w:color w:val="000000"/>
+                <w:sz w:val="19"/>
+                <w:szCs w:val="19"/>
+              </w:rPr>
+              <w:t>Techniker</w:t>
+            </w:r>
+          </w:p>
+        </w:tc>
+        <w:tc>
+          <w:tcPr>
+            <w:tcW w:type="dxa" w:w="2608"/>
+            <w:tcMar>
+              <w:top w:type="dxa" w:w="50"/>
+              <w:left w:type="dxa" w:w="90"/>
+              <w:bottom w:type="dxa" w:w="50"/>
+              <w:right w:type="dxa" w:w="90"/>
+            </w:tcMar>
+            <w:vAlign w:val="top"/>
+          </w:tcPr>
+          <w:p>
+            <w:pPr>
+              <w:keepNext/>
+              <w:spacing w:after="40" w:line="252"/>
+              <w:jc w:val="left"/>
+            </w:pPr>
+            <w:r>
+              <w:rPr>
+                <w:rFonts w:ascii="Calibri" w:cs="Calibri" w:eastAsia="Calibri" w:hAnsi="Calibri"/>
+                <w:b w:val="false"/>
+                <w:bCs w:val="false"/>
+                <w:color w:val="000000"/>
+                <w:sz w:val="19"/>
+                <w:szCs w:val="19"/>
+              </w:rPr>
+              <w:t>Techniker</w:t>
+            </w:r>
+          </w:p>
+        </w:tc>
+      </w:tr>
+      <w:tr>
+        <w:trPr>
+          <w:cantSplit/>
+        </w:trPr>
+        <w:tc>
+          <w:tcPr>
+            <w:tcW w:type="dxa" w:w="2381"/>
+            <w:tcMar>
+              <w:top w:type="dxa" w:w="50"/>
+              <w:left w:type="dxa" w:w="90"/>
+              <w:bottom w:type="dxa" w:w="50"/>
+              <w:right w:type="dxa" w:w="90"/>
+            </w:tcMar>
+            <w:vAlign w:val="top"/>
+          </w:tcPr>
+          <w:p>
+            <w:pPr>
+              <w:keepNext/>
+              <w:spacing w:after="40" w:line="252"/>
+              <w:jc w:val="left"/>
+            </w:pPr>
+            <w:r>
+              <w:rPr>
+                <w:rFonts w:ascii="Calibri" w:cs="Calibri" w:eastAsia="Calibri" w:hAnsi="Calibri"/>
+                <w:b w:val="false"/>
+                <w:bCs w:val="false"/>
+                <w:color w:val="000000"/>
+                <w:sz w:val="19"/>
+                <w:szCs w:val="19"/>
+              </w:rPr>
+              <w:t>Teiledisponent</w:t>
+            </w:r>
+          </w:p>
+        </w:tc>
+        <w:tc>
+          <w:tcPr>
+            <w:tcW w:type="dxa" w:w="1474"/>
+            <w:tcMar>
+              <w:top w:type="dxa" w:w="50"/>
+              <w:left w:type="dxa" w:w="90"/>
+              <w:bottom w:type="dxa" w:w="50"/>
+              <w:right w:type="dxa" w:w="90"/>
+            </w:tcMar>
+            <w:vAlign w:val="top"/>
+          </w:tcPr>
+          <w:p>
+            <w:pPr>
+              <w:keepNext/>
+              <w:spacing w:after="40" w:line="252"/>
+              <w:jc w:val="left"/>
+            </w:pPr>
+            <w:r>
+              <w:rPr>
+                <w:rFonts w:ascii="Calibri" w:cs="Calibri" w:eastAsia="Calibri" w:hAnsi="Calibri"/>
+                <w:b w:val="false"/>
+                <w:bCs w:val="false"/>
+                <w:color w:val="000000"/>
+                <w:sz w:val="19"/>
+                <w:szCs w:val="19"/>
+              </w:rPr>
+              <w:t>UC09</w:t>
+            </w:r>
+          </w:p>
+        </w:tc>
+        <w:tc>
+          <w:tcPr>
+            <w:tcW w:type="dxa" w:w="2608"/>
+            <w:tcMar>
+              <w:top w:type="dxa" w:w="50"/>
+              <w:left w:type="dxa" w:w="90"/>
+              <w:bottom w:type="dxa" w:w="50"/>
+              <w:right w:type="dxa" w:w="90"/>
+            </w:tcMar>
+            <w:vAlign w:val="top"/>
+          </w:tcPr>
+          <w:p>
+            <w:pPr>
+              <w:keepNext/>
+              <w:spacing w:after="40" w:line="252"/>
+              <w:jc w:val="left"/>
+            </w:pPr>
+            <w:r>
+              <w:rPr>
+                <w:rFonts w:ascii="Calibri" w:cs="Calibri" w:eastAsia="Calibri" w:hAnsi="Calibri"/>
+                <w:b w:val="false"/>
+                <w:bCs w:val="false"/>
+                <w:color w:val="000000"/>
+                <w:sz w:val="19"/>
+                <w:szCs w:val="19"/>
+              </w:rPr>
+              <w:t>Disponent</w:t>
+            </w:r>
+          </w:p>
+        </w:tc>
+        <w:tc>
+          <w:tcPr>
+            <w:tcW w:type="dxa" w:w="2608"/>
+            <w:tcMar>
+              <w:top w:type="dxa" w:w="50"/>
+              <w:left w:type="dxa" w:w="90"/>
+              <w:bottom w:type="dxa" w:w="50"/>
+              <w:right w:type="dxa" w:w="90"/>
+            </w:tcMar>
+            <w:vAlign w:val="top"/>
+          </w:tcPr>
+          <w:p>
+            <w:pPr>
+              <w:keepNext/>
+              <w:spacing w:after="40" w:line="252"/>
+              <w:jc w:val="left"/>
+            </w:pPr>
+            <w:r>
+              <w:rPr>
+                <w:rFonts w:ascii="Calibri" w:cs="Calibri" w:eastAsia="Calibri" w:hAnsi="Calibri"/>
+                <w:b w:val="false"/>
+                <w:bCs w:val="false"/>
+                <w:color w:val="000000"/>
+                <w:sz w:val="19"/>
+                <w:szCs w:val="19"/>
+              </w:rPr>
+              <w:t>Ersatzteil-Disposition</w:t>
+            </w:r>
+          </w:p>
+        </w:tc>
+      </w:tr>
+      <w:tr>
+        <w:trPr>
+          <w:cantSplit/>
+        </w:trPr>
+        <w:tc>
+          <w:tcPr>
+            <w:tcW w:type="dxa" w:w="2381"/>
+            <w:tcMar>
+              <w:top w:type="dxa" w:w="50"/>
+              <w:left w:type="dxa" w:w="90"/>
+              <w:bottom w:type="dxa" w:w="50"/>
+              <w:right w:type="dxa" w:w="90"/>
+            </w:tcMar>
+            <w:vAlign w:val="top"/>
+          </w:tcPr>
+          <w:p>
+            <w:pPr>
+              <w:keepNext/>
+              <w:spacing w:after="40" w:line="252"/>
+              <w:jc w:val="left"/>
+            </w:pPr>
+            <w:r>
+              <w:rPr>
+                <w:rFonts w:ascii="Calibri" w:cs="Calibri" w:eastAsia="Calibri" w:hAnsi="Calibri"/>
+                <w:b w:val="false"/>
+                <w:bCs w:val="false"/>
+                <w:color w:val="000000"/>
+                <w:sz w:val="19"/>
+                <w:szCs w:val="19"/>
+              </w:rPr>
+              <w:t>Bestandsplaner</w:t>
+            </w:r>
+          </w:p>
+        </w:tc>
+        <w:tc>
+          <w:tcPr>
+            <w:tcW w:type="dxa" w:w="1474"/>
+            <w:tcMar>
+              <w:top w:type="dxa" w:w="50"/>
+              <w:left w:type="dxa" w:w="90"/>
+              <w:bottom w:type="dxa" w:w="50"/>
+              <w:right w:type="dxa" w:w="90"/>
+            </w:tcMar>
+            <w:vAlign w:val="top"/>
+          </w:tcPr>
+          <w:p>
+            <w:pPr>
+              <w:keepNext/>
+              <w:spacing w:after="40" w:line="252"/>
+              <w:jc w:val="left"/>
+            </w:pPr>
+            <w:r>
+              <w:rPr>
+                <w:rFonts w:ascii="Calibri" w:cs="Calibri" w:eastAsia="Calibri" w:hAnsi="Calibri"/>
+                <w:b w:val="false"/>
+                <w:bCs w:val="false"/>
+                <w:color w:val="000000"/>
+                <w:sz w:val="19"/>
+                <w:szCs w:val="19"/>
+              </w:rPr>
+              <w:t>UC12</w:t>
+            </w:r>
+          </w:p>
+        </w:tc>
+        <w:tc>
+          <w:tcPr>
+            <w:tcW w:type="dxa" w:w="2608"/>
+            <w:tcMar>
+              <w:top w:type="dxa" w:w="50"/>
+              <w:left w:type="dxa" w:w="90"/>
+              <w:bottom w:type="dxa" w:w="50"/>
+              <w:right w:type="dxa" w:w="90"/>
+            </w:tcMar>
+            <w:vAlign w:val="top"/>
+          </w:tcPr>
+          <w:p>
+            <w:pPr>
+              <w:keepNext/>
+              <w:spacing w:after="40" w:line="252"/>
+              <w:jc w:val="left"/>
+            </w:pPr>
+            <w:r>
+              <w:rPr>
+                <w:rFonts w:ascii="Calibri" w:cs="Calibri" w:eastAsia="Calibri" w:hAnsi="Calibri"/>
+                <w:b w:val="false"/>
+                <w:bCs w:val="false"/>
+                <w:color w:val="000000"/>
+                <w:sz w:val="19"/>
+                <w:szCs w:val="19"/>
+              </w:rPr>
+              <w:t>Disponent</w:t>
+            </w:r>
+          </w:p>
+        </w:tc>
+        <w:tc>
+          <w:tcPr>
+            <w:tcW w:type="dxa" w:w="2608"/>
+            <w:tcMar>
+              <w:top w:type="dxa" w:w="50"/>
+              <w:left w:type="dxa" w:w="90"/>
+              <w:bottom w:type="dxa" w:w="50"/>
+              <w:right w:type="dxa" w:w="90"/>
+            </w:tcMar>
+            <w:vAlign w:val="top"/>
+          </w:tcPr>
+          <w:p>
+            <w:pPr>
+              <w:keepNext/>
+              <w:spacing w:after="40" w:line="252"/>
+              <w:jc w:val="left"/>
+            </w:pPr>
+            <w:r>
+              <w:rPr>
+                <w:rFonts w:ascii="Calibri" w:cs="Calibri" w:eastAsia="Calibri" w:hAnsi="Calibri"/>
+                <w:b w:val="false"/>
+                <w:bCs w:val="false"/>
+                <w:color w:val="000000"/>
+                <w:sz w:val="19"/>
+                <w:szCs w:val="19"/>
+              </w:rPr>
+              <w:t>Ersatzteil-Disposition</w:t>
+            </w:r>
+          </w:p>
+        </w:tc>
+      </w:tr>
+      <w:tr>
+        <w:trPr>
+          <w:cantSplit/>
+        </w:trPr>
+        <w:tc>
+          <w:tcPr>
+            <w:tcW w:type="dxa" w:w="2381"/>
+            <w:tcMar>
+              <w:top w:type="dxa" w:w="50"/>
+              <w:left w:type="dxa" w:w="90"/>
+              <w:bottom w:type="dxa" w:w="50"/>
+              <w:right w:type="dxa" w:w="90"/>
+            </w:tcMar>
+            <w:vAlign w:val="top"/>
+          </w:tcPr>
+          <w:p>
+            <w:pPr>
+              <w:keepNext/>
+              <w:spacing w:after="40" w:line="252"/>
+              <w:jc w:val="left"/>
+            </w:pPr>
+            <w:r>
+              <w:rPr>
+                <w:rFonts w:ascii="Calibri" w:cs="Calibri" w:eastAsia="Calibri" w:hAnsi="Calibri"/>
+                <w:b w:val="false"/>
+                <w:bCs w:val="false"/>
+                <w:color w:val="000000"/>
+                <w:sz w:val="19"/>
+                <w:szCs w:val="19"/>
+              </w:rPr>
+              <w:t>Einkäufer</w:t>
+            </w:r>
+          </w:p>
+        </w:tc>
+        <w:tc>
+          <w:tcPr>
+            <w:tcW w:type="dxa" w:w="1474"/>
+            <w:tcMar>
+              <w:top w:type="dxa" w:w="50"/>
+              <w:left w:type="dxa" w:w="90"/>
+              <w:bottom w:type="dxa" w:w="50"/>
+              <w:right w:type="dxa" w:w="90"/>
+            </w:tcMar>
+            <w:vAlign w:val="top"/>
+          </w:tcPr>
+          <w:p>
+            <w:pPr>
+              <w:keepNext/>
+              <w:spacing w:after="40" w:line="252"/>
+              <w:jc w:val="left"/>
+            </w:pPr>
+            <w:r>
+              <w:rPr>
+                <w:rFonts w:ascii="Calibri" w:cs="Calibri" w:eastAsia="Calibri" w:hAnsi="Calibri"/>
+                <w:b w:val="false"/>
+                <w:bCs w:val="false"/>
+                <w:color w:val="000000"/>
+                <w:sz w:val="19"/>
+                <w:szCs w:val="19"/>
+              </w:rPr>
+              <w:t>UC10</w:t>
+            </w:r>
+          </w:p>
+        </w:tc>
+        <w:tc>
+          <w:tcPr>
+            <w:tcW w:type="dxa" w:w="2608"/>
+            <w:tcMar>
+              <w:top w:type="dxa" w:w="50"/>
+              <w:left w:type="dxa" w:w="90"/>
+              <w:bottom w:type="dxa" w:w="50"/>
+              <w:right w:type="dxa" w:w="90"/>
+            </w:tcMar>
+            <w:vAlign w:val="top"/>
+          </w:tcPr>
+          <w:p>
+            <w:pPr>
+              <w:keepNext/>
+              <w:spacing w:after="40" w:line="252"/>
+              <w:jc w:val="left"/>
+            </w:pPr>
+            <w:r>
+              <w:rPr>
+                <w:rFonts w:ascii="Calibri" w:cs="Calibri" w:eastAsia="Calibri" w:hAnsi="Calibri"/>
+                <w:b w:val="false"/>
+                <w:bCs w:val="false"/>
+                <w:color w:val="000000"/>
+                <w:sz w:val="19"/>
+                <w:szCs w:val="19"/>
+              </w:rPr>
+              <w:t>Disponent</w:t>
+            </w:r>
+          </w:p>
+        </w:tc>
+        <w:tc>
+          <w:tcPr>
+            <w:tcW w:type="dxa" w:w="2608"/>
+            <w:tcMar>
+              <w:top w:type="dxa" w:w="50"/>
+              <w:left w:type="dxa" w:w="90"/>
+              <w:bottom w:type="dxa" w:w="50"/>
+              <w:right w:type="dxa" w:w="90"/>
+            </w:tcMar>
+            <w:vAlign w:val="top"/>
+          </w:tcPr>
+          <w:p>
+            <w:pPr>
+              <w:keepNext/>
+              <w:spacing w:after="40" w:line="252"/>
+              <w:jc w:val="left"/>
+            </w:pPr>
+            <w:r>
+              <w:rPr>
+                <w:rFonts w:ascii="Calibri" w:cs="Calibri" w:eastAsia="Calibri" w:hAnsi="Calibri"/>
+                <w:b w:val="false"/>
+                <w:bCs w:val="false"/>
+                <w:color w:val="000000"/>
+                <w:sz w:val="19"/>
+                <w:szCs w:val="19"/>
+              </w:rPr>
+              <w:t>Ersatzteil-Disposition</w:t>
+            </w:r>
+          </w:p>
+        </w:tc>
+      </w:tr>
+      <w:tr>
+        <w:trPr>
+          <w:cantSplit/>
+        </w:trPr>
+        <w:tc>
+          <w:tcPr>
+            <w:tcW w:type="dxa" w:w="2381"/>
+            <w:tcMar>
+              <w:top w:type="dxa" w:w="50"/>
+              <w:left w:type="dxa" w:w="90"/>
+              <w:bottom w:type="dxa" w:w="50"/>
+              <w:right w:type="dxa" w:w="90"/>
+            </w:tcMar>
+            <w:vAlign w:val="top"/>
+          </w:tcPr>
+          <w:p>
+            <w:pPr>
+              <w:keepNext/>
+              <w:spacing w:after="40" w:line="252"/>
+              <w:jc w:val="left"/>
+            </w:pPr>
+            <w:r>
+              <w:rPr>
+                <w:rFonts w:ascii="Calibri" w:cs="Calibri" w:eastAsia="Calibri" w:hAnsi="Calibri"/>
+                <w:b w:val="false"/>
+                <w:bCs w:val="false"/>
+                <w:color w:val="000000"/>
+                <w:sz w:val="19"/>
+                <w:szCs w:val="19"/>
+              </w:rPr>
+              <w:t>Wareneingang</w:t>
+            </w:r>
+          </w:p>
+        </w:tc>
+        <w:tc>
+          <w:tcPr>
+            <w:tcW w:type="dxa" w:w="1474"/>
+            <w:tcMar>
+              <w:top w:type="dxa" w:w="50"/>
+              <w:left w:type="dxa" w:w="90"/>
+              <w:bottom w:type="dxa" w:w="50"/>
+              <w:right w:type="dxa" w:w="90"/>
+            </w:tcMar>
+            <w:vAlign w:val="top"/>
+          </w:tcPr>
+          <w:p>
+            <w:pPr>
+              <w:keepNext/>
+              <w:spacing w:after="40" w:line="252"/>
+              <w:jc w:val="left"/>
+            </w:pPr>
+            <w:r>
+              <w:rPr>
+                <w:rFonts w:ascii="Calibri" w:cs="Calibri" w:eastAsia="Calibri" w:hAnsi="Calibri"/>
+                <w:b w:val="false"/>
+                <w:bCs w:val="false"/>
+                <w:color w:val="000000"/>
+                <w:sz w:val="19"/>
+                <w:szCs w:val="19"/>
+              </w:rPr>
+              <w:t>UC11</w:t>
+            </w:r>
+          </w:p>
+        </w:tc>
+        <w:tc>
+          <w:tcPr>
+            <w:tcW w:type="dxa" w:w="2608"/>
+            <w:tcMar>
+              <w:top w:type="dxa" w:w="50"/>
+              <w:left w:type="dxa" w:w="90"/>
+              <w:bottom w:type="dxa" w:w="50"/>
+              <w:right w:type="dxa" w:w="90"/>
+            </w:tcMar>
+            <w:vAlign w:val="top"/>
+          </w:tcPr>
+          <w:p>
+            <w:pPr>
+              <w:keepNext/>
+              <w:spacing w:after="40" w:line="252"/>
+              <w:jc w:val="left"/>
+            </w:pPr>
+            <w:r>
+              <w:rPr>
+                <w:rFonts w:ascii="Calibri" w:cs="Calibri" w:eastAsia="Calibri" w:hAnsi="Calibri"/>
+                <w:b w:val="false"/>
+                <w:bCs w:val="false"/>
+                <w:color w:val="000000"/>
+                <w:sz w:val="19"/>
+                <w:szCs w:val="19"/>
+              </w:rPr>
+              <w:t>Disponent</w:t>
+            </w:r>
+          </w:p>
+        </w:tc>
+        <w:tc>
+          <w:tcPr>
+            <w:tcW w:type="dxa" w:w="2608"/>
+            <w:tcMar>
+              <w:top w:type="dxa" w:w="50"/>
+              <w:left w:type="dxa" w:w="90"/>
+              <w:bottom w:type="dxa" w:w="50"/>
+              <w:right w:type="dxa" w:w="90"/>
+            </w:tcMar>
+            <w:vAlign w:val="top"/>
+          </w:tcPr>
+          <w:p>
+            <w:pPr>
+              <w:keepNext/>
+              <w:spacing w:after="40" w:line="252"/>
+              <w:jc w:val="left"/>
+            </w:pPr>
+            <w:r>
+              <w:rPr>
+                <w:rFonts w:ascii="Calibri" w:cs="Calibri" w:eastAsia="Calibri" w:hAnsi="Calibri"/>
+                <w:b w:val="false"/>
+                <w:bCs w:val="false"/>
+                <w:color w:val="000000"/>
+                <w:sz w:val="19"/>
+                <w:szCs w:val="19"/>
+              </w:rPr>
+              <w:t>Ersatzteil-Disposition</w:t>
+            </w:r>
+          </w:p>
+        </w:tc>
+      </w:tr>
+      <w:tr>
+        <w:trPr>
+          <w:cantSplit/>
+        </w:trPr>
+        <w:tc>
+          <w:tcPr>
+            <w:tcW w:type="dxa" w:w="2381"/>
+            <w:tcMar>
+              <w:top w:type="dxa" w:w="50"/>
+              <w:left w:type="dxa" w:w="90"/>
+              <w:bottom w:type="dxa" w:w="50"/>
+              <w:right w:type="dxa" w:w="90"/>
+            </w:tcMar>
+            <w:vAlign w:val="top"/>
+          </w:tcPr>
+          <w:p>
+            <w:pPr>
+              <w:keepNext/>
+              <w:spacing w:after="40" w:line="252"/>
+              <w:jc w:val="left"/>
+            </w:pPr>
+            <w:r>
+              <w:rPr>
+                <w:rFonts w:ascii="Calibri" w:cs="Calibri" w:eastAsia="Calibri" w:hAnsi="Calibri"/>
+                <w:b w:val="false"/>
+                <w:bCs w:val="false"/>
+                <w:color w:val="000000"/>
+                <w:sz w:val="19"/>
+                <w:szCs w:val="19"/>
+              </w:rPr>
+              <w:t>Retourenbearbeiter</w:t>
+            </w:r>
+          </w:p>
+        </w:tc>
+        <w:tc>
+          <w:tcPr>
+            <w:tcW w:type="dxa" w:w="1474"/>
+            <w:tcMar>
+              <w:top w:type="dxa" w:w="50"/>
+              <w:left w:type="dxa" w:w="90"/>
+              <w:bottom w:type="dxa" w:w="50"/>
+              <w:right w:type="dxa" w:w="90"/>
+            </w:tcMar>
+            <w:vAlign w:val="top"/>
+          </w:tcPr>
+          <w:p>
+            <w:pPr>
+              <w:keepNext/>
+              <w:spacing w:after="40" w:line="252"/>
+              <w:jc w:val="left"/>
+            </w:pPr>
+            <w:r>
+              <w:rPr>
+                <w:rFonts w:ascii="Calibri" w:cs="Calibri" w:eastAsia="Calibri" w:hAnsi="Calibri"/>
+                <w:b w:val="false"/>
+                <w:bCs w:val="false"/>
+                <w:color w:val="000000"/>
+                <w:sz w:val="19"/>
+                <w:szCs w:val="19"/>
+              </w:rPr>
+              <w:t>UC19</w:t>
+            </w:r>
+          </w:p>
+        </w:tc>
+        <w:tc>
+          <w:tcPr>
+            <w:tcW w:type="dxa" w:w="2608"/>
+            <w:tcMar>
+              <w:top w:type="dxa" w:w="50"/>
+              <w:left w:type="dxa" w:w="90"/>
+              <w:bottom w:type="dxa" w:w="50"/>
+              <w:right w:type="dxa" w:w="90"/>
+            </w:tcMar>
+            <w:vAlign w:val="top"/>
+          </w:tcPr>
+          <w:p>
+            <w:pPr>
+              <w:keepNext/>
+              <w:spacing w:after="40" w:line="252"/>
+              <w:jc w:val="left"/>
+            </w:pPr>
+            <w:r>
+              <w:rPr>
+                <w:rFonts w:ascii="Calibri" w:cs="Calibri" w:eastAsia="Calibri" w:hAnsi="Calibri"/>
+                <w:b w:val="false"/>
+                <w:bCs w:val="false"/>
+                <w:color w:val="000000"/>
+                <w:sz w:val="19"/>
+                <w:szCs w:val="19"/>
+              </w:rPr>
+              <w:t>Disponent</w:t>
+            </w:r>
+          </w:p>
+        </w:tc>
+        <w:tc>
+          <w:tcPr>
+            <w:tcW w:type="dxa" w:w="2608"/>
+            <w:tcMar>
+              <w:top w:type="dxa" w:w="50"/>
+              <w:left w:type="dxa" w:w="90"/>
+              <w:bottom w:type="dxa" w:w="50"/>
+              <w:right w:type="dxa" w:w="90"/>
+            </w:tcMar>
+            <w:vAlign w:val="top"/>
+          </w:tcPr>
+          <w:p>
+            <w:pPr>
+              <w:keepNext/>
+              <w:spacing w:after="40" w:line="252"/>
+              <w:jc w:val="left"/>
+            </w:pPr>
+            <w:r>
+              <w:rPr>
+                <w:rFonts w:ascii="Calibri" w:cs="Calibri" w:eastAsia="Calibri" w:hAnsi="Calibri"/>
+                <w:b w:val="false"/>
+                <w:bCs w:val="false"/>
+                <w:color w:val="000000"/>
+                <w:sz w:val="19"/>
+                <w:szCs w:val="19"/>
+              </w:rPr>
+              <w:t>Ersatzteil-Disposition</w:t>
+            </w:r>
+          </w:p>
+        </w:tc>
+      </w:tr>
+      <w:tr>
+        <w:trPr>
+          <w:cantSplit/>
+        </w:trPr>
+        <w:tc>
+          <w:tcPr>
+            <w:tcW w:type="dxa" w:w="2381"/>
+            <w:tcMar>
+              <w:top w:type="dxa" w:w="50"/>
+              <w:left w:type="dxa" w:w="90"/>
+              <w:bottom w:type="dxa" w:w="50"/>
+              <w:right w:type="dxa" w:w="90"/>
+            </w:tcMar>
+            <w:vAlign w:val="top"/>
+          </w:tcPr>
+          <w:p>
+            <w:pPr>
+              <w:keepNext/>
+              <w:spacing w:after="40" w:line="252"/>
+              <w:jc w:val="left"/>
+            </w:pPr>
+            <w:r>
+              <w:rPr>
+                <w:rFonts w:ascii="Calibri" w:cs="Calibri" w:eastAsia="Calibri" w:hAnsi="Calibri"/>
+                <w:b w:val="false"/>
+                <w:bCs w:val="false"/>
+                <w:color w:val="000000"/>
+                <w:sz w:val="19"/>
+                <w:szCs w:val="19"/>
+              </w:rPr>
+              <w:t>Werkstattplaner</w:t>
+            </w:r>
+          </w:p>
+        </w:tc>
+        <w:tc>
+          <w:tcPr>
+            <w:tcW w:type="dxa" w:w="1474"/>
+            <w:tcMar>
+              <w:top w:type="dxa" w:w="50"/>
+              <w:left w:type="dxa" w:w="90"/>
+              <w:bottom w:type="dxa" w:w="50"/>
+              <w:right w:type="dxa" w:w="90"/>
+            </w:tcMar>
+            <w:vAlign w:val="top"/>
+          </w:tcPr>
+          <w:p>
+            <w:pPr>
+              <w:keepNext/>
+              <w:spacing w:after="40" w:line="252"/>
+              <w:jc w:val="left"/>
+            </w:pPr>
+            <w:r>
+              <w:rPr>
+                <w:rFonts w:ascii="Calibri" w:cs="Calibri" w:eastAsia="Calibri" w:hAnsi="Calibri"/>
+                <w:b w:val="false"/>
+                <w:bCs w:val="false"/>
+                <w:color w:val="000000"/>
+                <w:sz w:val="19"/>
+                <w:szCs w:val="19"/>
+              </w:rPr>
+              <w:t>UC17</w:t>
+            </w:r>
+          </w:p>
+        </w:tc>
+        <w:tc>
+          <w:tcPr>
+            <w:tcW w:type="dxa" w:w="2608"/>
+            <w:tcMar>
+              <w:top w:type="dxa" w:w="50"/>
+              <w:left w:type="dxa" w:w="90"/>
+              <w:bottom w:type="dxa" w:w="50"/>
+              <w:right w:type="dxa" w:w="90"/>
+            </w:tcMar>
+            <w:vAlign w:val="top"/>
+          </w:tcPr>
+          <w:p>
+            <w:pPr>
+              <w:keepNext/>
+              <w:spacing w:after="40" w:line="252"/>
+              <w:jc w:val="left"/>
+            </w:pPr>
+            <w:r>
+              <w:rPr>
+                <w:rFonts w:ascii="Calibri" w:cs="Calibri" w:eastAsia="Calibri" w:hAnsi="Calibri"/>
+                <w:b w:val="false"/>
+                <w:bCs w:val="false"/>
+                <w:color w:val="000000"/>
+                <w:sz w:val="19"/>
+                <w:szCs w:val="19"/>
+              </w:rPr>
+              <w:t>Werkstattleiter</w:t>
+            </w:r>
+          </w:p>
+        </w:tc>
+        <w:tc>
+          <w:tcPr>
+            <w:tcW w:type="dxa" w:w="2608"/>
+            <w:tcMar>
+              <w:top w:type="dxa" w:w="50"/>
+              <w:left w:type="dxa" w:w="90"/>
+              <w:bottom w:type="dxa" w:w="50"/>
+              <w:right w:type="dxa" w:w="90"/>
+            </w:tcMar>
+            <w:vAlign w:val="top"/>
+          </w:tcPr>
+          <w:p>
+            <w:pPr>
+              <w:keepNext/>
+              <w:spacing w:after="40" w:line="252"/>
+              <w:jc w:val="left"/>
+            </w:pPr>
+            <w:r>
+              <w:rPr>
+                <w:rFonts w:ascii="Calibri" w:cs="Calibri" w:eastAsia="Calibri" w:hAnsi="Calibri"/>
+                <w:b w:val="false"/>
+                <w:bCs w:val="false"/>
+                <w:color w:val="000000"/>
+                <w:sz w:val="19"/>
+                <w:szCs w:val="19"/>
+              </w:rPr>
+              <w:t>Werkstattleitung</w:t>
+            </w:r>
+          </w:p>
+        </w:tc>
+      </w:tr>
+      <w:tr>
+        <w:trPr>
+          <w:cantSplit/>
+        </w:trPr>
+        <w:tc>
+          <w:tcPr>
+            <w:tcW w:type="dxa" w:w="2381"/>
+            <w:tcMar>
+              <w:top w:type="dxa" w:w="50"/>
+              <w:left w:type="dxa" w:w="90"/>
+              <w:bottom w:type="dxa" w:w="50"/>
+              <w:right w:type="dxa" w:w="90"/>
+            </w:tcMar>
+            <w:vAlign w:val="top"/>
+          </w:tcPr>
+          <w:p>
+            <w:pPr>
+              <w:keepNext/>
+              <w:spacing w:after="40" w:line="252"/>
+              <w:jc w:val="left"/>
+            </w:pPr>
+            <w:r>
+              <w:rPr>
+                <w:rFonts w:ascii="Calibri" w:cs="Calibri" w:eastAsia="Calibri" w:hAnsi="Calibri"/>
+                <w:b w:val="false"/>
+                <w:bCs w:val="false"/>
+                <w:color w:val="000000"/>
+                <w:sz w:val="19"/>
+                <w:szCs w:val="19"/>
+              </w:rPr>
+              <w:t>Betriebsadministrator</w:t>
+            </w:r>
+          </w:p>
+        </w:tc>
+        <w:tc>
+          <w:tcPr>
+            <w:tcW w:type="dxa" w:w="1474"/>
+            <w:tcMar>
+              <w:top w:type="dxa" w:w="50"/>
+              <w:left w:type="dxa" w:w="90"/>
+              <w:bottom w:type="dxa" w:w="50"/>
+              <w:right w:type="dxa" w:w="90"/>
+            </w:tcMar>
+            <w:vAlign w:val="top"/>
+          </w:tcPr>
+          <w:p>
+            <w:pPr>
+              <w:keepNext/>
+              <w:spacing w:after="40" w:line="252"/>
+              <w:jc w:val="left"/>
+            </w:pPr>
+            <w:r>
+              <w:rPr>
+                <w:rFonts w:ascii="Calibri" w:cs="Calibri" w:eastAsia="Calibri" w:hAnsi="Calibri"/>
+                <w:b w:val="false"/>
+                <w:bCs w:val="false"/>
+                <w:color w:val="000000"/>
+                <w:sz w:val="19"/>
+                <w:szCs w:val="19"/>
+              </w:rPr>
+              <w:t>UC18</w:t>
+            </w:r>
+          </w:p>
+        </w:tc>
+        <w:tc>
+          <w:tcPr>
+            <w:tcW w:type="dxa" w:w="2608"/>
+            <w:tcMar>
+              <w:top w:type="dxa" w:w="50"/>
+              <w:left w:type="dxa" w:w="90"/>
+              <w:bottom w:type="dxa" w:w="50"/>
+              <w:right w:type="dxa" w:w="90"/>
+            </w:tcMar>
+            <w:vAlign w:val="top"/>
+          </w:tcPr>
+          <w:p>
+            <w:pPr>
+              <w:keepNext/>
+              <w:spacing w:after="40" w:line="252"/>
+              <w:jc w:val="left"/>
+            </w:pPr>
+            <w:r>
+              <w:rPr>
+                <w:rFonts w:ascii="Calibri" w:cs="Calibri" w:eastAsia="Calibri" w:hAnsi="Calibri"/>
+                <w:b w:val="false"/>
+                <w:bCs w:val="false"/>
+                <w:color w:val="000000"/>
+                <w:sz w:val="19"/>
+                <w:szCs w:val="19"/>
+              </w:rPr>
+              <w:t>Werkstattbetrieb («mandant»)</w:t>
+            </w:r>
+          </w:p>
+        </w:tc>
+        <w:tc>
+          <w:tcPr>
+            <w:tcW w:type="dxa" w:w="2608"/>
+            <w:tcMar>
+              <w:top w:type="dxa" w:w="50"/>
+              <w:left w:type="dxa" w:w="90"/>
+              <w:bottom w:type="dxa" w:w="50"/>
+              <w:right w:type="dxa" w:w="90"/>
+            </w:tcMar>
+            <w:vAlign w:val="top"/>
+          </w:tcPr>
+          <w:p>
+            <w:pPr>
+              <w:keepNext/>
+              <w:spacing w:after="40" w:line="252"/>
+              <w:jc w:val="left"/>
+            </w:pPr>
+            <w:r>
+              <w:rPr>
+                <w:rFonts w:ascii="Calibri" w:cs="Calibri" w:eastAsia="Calibri" w:hAnsi="Calibri"/>
+                <w:b w:val="false"/>
+                <w:bCs w:val="false"/>
+                <w:color w:val="000000"/>
+                <w:sz w:val="19"/>
+                <w:szCs w:val="19"/>
+              </w:rPr>
+              <w:t>außerhalb der zehn Prozesse</w:t>
+            </w:r>
+          </w:p>
+        </w:tc>
+      </w:tr>
+      <w:tr>
+        <w:trPr>
+          <w:cantSplit/>
+        </w:trPr>
+        <w:tc>
+          <w:tcPr>
+            <w:tcW w:type="dxa" w:w="2381"/>
+            <w:tcMar>
+              <w:top w:type="dxa" w:w="50"/>
+              <w:left w:type="dxa" w:w="90"/>
+              <w:bottom w:type="dxa" w:w="50"/>
+              <w:right w:type="dxa" w:w="90"/>
+            </w:tcMar>
+            <w:vAlign w:val="top"/>
+          </w:tcPr>
+          <w:p>
+            <w:pPr>
+              <w:keepNext/>
+              <w:spacing w:after="40" w:line="252"/>
+              <w:jc w:val="left"/>
+            </w:pPr>
+            <w:r>
+              <w:rPr>
+                <w:rFonts w:ascii="Calibri" w:cs="Calibri" w:eastAsia="Calibri" w:hAnsi="Calibri"/>
+                <w:b w:val="false"/>
+                <w:bCs w:val="false"/>
+                <w:color w:val="000000"/>
+                <w:sz w:val="19"/>
+                <w:szCs w:val="19"/>
+              </w:rPr>
+              <w:t>Lieferant (extern)</w:t>
+            </w:r>
+          </w:p>
+        </w:tc>
+        <w:tc>
+          <w:tcPr>
+            <w:tcW w:type="dxa" w:w="1474"/>
+            <w:tcMar>
+              <w:top w:type="dxa" w:w="50"/>
+              <w:left w:type="dxa" w:w="90"/>
+              <w:bottom w:type="dxa" w:w="50"/>
+              <w:right w:type="dxa" w:w="90"/>
+            </w:tcMar>
+            <w:vAlign w:val="top"/>
+          </w:tcPr>
+          <w:p>
+            <w:pPr>
+              <w:keepNext/>
+              <w:spacing w:after="40" w:line="252"/>
+              <w:jc w:val="left"/>
+            </w:pPr>
+            <w:r>
+              <w:rPr>
+                <w:rFonts w:ascii="Calibri" w:cs="Calibri" w:eastAsia="Calibri" w:hAnsi="Calibri"/>
+                <w:b w:val="false"/>
+                <w:bCs w:val="false"/>
+                <w:color w:val="000000"/>
+                <w:sz w:val="19"/>
+                <w:szCs w:val="19"/>
+              </w:rPr>
+              <w:t>UC10, UC11, UC19</w:t>
+            </w:r>
+          </w:p>
+        </w:tc>
+        <w:tc>
+          <w:tcPr>
+            <w:tcW w:type="dxa" w:w="2608"/>
+            <w:tcMar>
+              <w:top w:type="dxa" w:w="50"/>
+              <w:left w:type="dxa" w:w="90"/>
+              <w:bottom w:type="dxa" w:w="50"/>
+              <w:right w:type="dxa" w:w="90"/>
+            </w:tcMar>
+            <w:vAlign w:val="top"/>
+          </w:tcPr>
+          <w:p>
+            <w:pPr>
+              <w:keepNext/>
+              <w:spacing w:after="40" w:line="252"/>
+              <w:jc w:val="left"/>
+            </w:pPr>
+            <w:r>
+              <w:rPr>
+                <w:rFonts w:ascii="Calibri" w:cs="Calibri" w:eastAsia="Calibri" w:hAnsi="Calibri"/>
+                <w:b w:val="false"/>
+                <w:bCs w:val="false"/>
+                <w:color w:val="000000"/>
+                <w:sz w:val="19"/>
+                <w:szCs w:val="19"/>
+              </w:rPr>
+              <w:t>Lieferant</w:t>
+            </w:r>
+          </w:p>
+        </w:tc>
+        <w:tc>
+          <w:tcPr>
+            <w:tcW w:type="dxa" w:w="2608"/>
+            <w:tcMar>
+              <w:top w:type="dxa" w:w="50"/>
+              <w:left w:type="dxa" w:w="90"/>
+              <w:bottom w:type="dxa" w:w="50"/>
+              <w:right w:type="dxa" w:w="90"/>
+            </w:tcMar>
+            <w:vAlign w:val="top"/>
+          </w:tcPr>
+          <w:p>
+            <w:pPr>
+              <w:keepNext/>
+              <w:spacing w:after="40" w:line="252"/>
+              <w:jc w:val="left"/>
+            </w:pPr>
+            <w:r>
+              <w:rPr>
+                <w:rFonts w:ascii="Calibri" w:cs="Calibri" w:eastAsia="Calibri" w:hAnsi="Calibri"/>
+                <w:b w:val="false"/>
+                <w:bCs w:val="false"/>
+                <w:color w:val="000000"/>
+                <w:sz w:val="19"/>
+                <w:szCs w:val="19"/>
+              </w:rPr>
+              <w:t>Pool Lieferant</w:t>
+            </w:r>
+          </w:p>
+        </w:tc>
+      </w:tr>
+      <w:tr>
+        <w:trPr>
+          <w:cantSplit/>
+        </w:trPr>
+        <w:tc>
+          <w:tcPr>
+            <w:tcW w:type="dxa" w:w="2381"/>
+            <w:tcMar>
+              <w:top w:type="dxa" w:w="50"/>
+              <w:left w:type="dxa" w:w="90"/>
+              <w:bottom w:type="dxa" w:w="50"/>
+              <w:right w:type="dxa" w:w="90"/>
+            </w:tcMar>
+            <w:vAlign w:val="top"/>
+          </w:tcPr>
+          <w:p>
+            <w:pPr>
+              <w:keepNext/>
+              <w:spacing w:after="40" w:line="252"/>
+              <w:jc w:val="left"/>
+            </w:pPr>
+            <w:r>
+              <w:rPr>
+                <w:rFonts w:ascii="Calibri" w:cs="Calibri" w:eastAsia="Calibri" w:hAnsi="Calibri"/>
+                <w:b w:val="false"/>
+                <w:bCs w:val="false"/>
+                <w:color w:val="000000"/>
+                <w:sz w:val="19"/>
+                <w:szCs w:val="19"/>
+              </w:rPr>
+              <w:t>KI-Diagnosedienst (extern)</w:t>
+            </w:r>
+          </w:p>
+        </w:tc>
+        <w:tc>
+          <w:tcPr>
+            <w:tcW w:type="dxa" w:w="1474"/>
+            <w:tcMar>
+              <w:top w:type="dxa" w:w="50"/>
+              <w:left w:type="dxa" w:w="90"/>
+              <w:bottom w:type="dxa" w:w="50"/>
+              <w:right w:type="dxa" w:w="90"/>
+            </w:tcMar>
+            <w:vAlign w:val="top"/>
+          </w:tcPr>
+          <w:p>
+            <w:pPr>
+              <w:keepNext/>
+              <w:spacing w:after="40" w:line="252"/>
+              <w:jc w:val="left"/>
+            </w:pPr>
+            <w:r>
+              <w:rPr>
+                <w:rFonts w:ascii="Calibri" w:cs="Calibri" w:eastAsia="Calibri" w:hAnsi="Calibri"/>
+                <w:b w:val="false"/>
+                <w:bCs w:val="false"/>
+                <w:color w:val="000000"/>
+                <w:sz w:val="19"/>
+                <w:szCs w:val="19"/>
+              </w:rPr>
+              <w:t>UC01</w:t>
+            </w:r>
+          </w:p>
+        </w:tc>
+        <w:tc>
+          <w:tcPr>
+            <w:tcW w:type="dxa" w:w="2608"/>
+            <w:tcMar>
+              <w:top w:type="dxa" w:w="50"/>
+              <w:left w:type="dxa" w:w="90"/>
+              <w:bottom w:type="dxa" w:w="50"/>
+              <w:right w:type="dxa" w:w="90"/>
+            </w:tcMar>
+            <w:vAlign w:val="top"/>
+          </w:tcPr>
+          <w:p>
+            <w:pPr>
+              <w:keepNext/>
+              <w:spacing w:after="40" w:line="252"/>
+              <w:jc w:val="left"/>
+            </w:pPr>
+            <w:r>
+              <w:rPr>
+                <w:rFonts w:ascii="Calibri" w:cs="Calibri" w:eastAsia="Calibri" w:hAnsi="Calibri"/>
+                <w:b w:val="false"/>
+                <w:bCs w:val="false"/>
+                <w:color w:val="000000"/>
+                <w:sz w:val="19"/>
+                <w:szCs w:val="19"/>
+              </w:rPr>
+              <w:t>KIDiagnosevorschlag</w:t>
+            </w:r>
+          </w:p>
+        </w:tc>
+        <w:tc>
+          <w:tcPr>
+            <w:tcW w:type="dxa" w:w="2608"/>
+            <w:tcMar>
+              <w:top w:type="dxa" w:w="50"/>
+              <w:left w:type="dxa" w:w="90"/>
+              <w:bottom w:type="dxa" w:w="50"/>
+              <w:right w:type="dxa" w:w="90"/>
+            </w:tcMar>
+            <w:vAlign w:val="top"/>
+          </w:tcPr>
+          <w:p>
+            <w:pPr>
+              <w:keepNext/>
+              <w:spacing w:after="40" w:line="252"/>
+              <w:jc w:val="left"/>
+            </w:pPr>
+            <w:r>
+              <w:rPr>
+                <w:rFonts w:ascii="Calibri" w:cs="Calibri" w:eastAsia="Calibri" w:hAnsi="Calibri"/>
+                <w:b w:val="false"/>
+                <w:bCs w:val="false"/>
+                <w:color w:val="000000"/>
+                <w:sz w:val="19"/>
+                <w:szCs w:val="19"/>
+              </w:rPr>
+              <w:t>Nachrichtenfluss in Prozess 01</w:t>
+            </w:r>
+          </w:p>
+        </w:tc>
+      </w:tr>
+    </w:tbl>
+    <w:p>
+      <w:pPr>
+        <w:spacing w:after="200" w:before="60"/>
+        <w:jc w:val="center"/>
+      </w:pPr>
+      <w:r>
+        <w:rPr>
+          <w:rFonts w:ascii="Calibri" w:cs="Calibri" w:eastAsia="Calibri" w:hAnsi="Calibri"/>
+          <w:i/>
+          <w:iCs/>
+          <w:color w:val="595959"/>
+          <w:sz w:val="18"/>
+          <w:szCs w:val="18"/>
+        </w:rPr>
+        <w:t>Tabelle 7: Rollen des Use-Case-Diagramms und ihre Entsprechung in Klassen- und Prozessmodell</w:t>
       </w:r>
     </w:p>
     <w:p>
@@ -8128,7 +10544,7 @@
           <w:sz w:val="22"/>
           <w:szCs w:val="22"/>
         </w:rPr>
-        <w:t>Der Werkstattbetrieb steht als Mandant über Filialen und Mitarbeitern. Die Unterklassen von Mitarbeiter (Servicemitarbeiter, Techniker, Disponent, Werkstattleiter) entsprechen den Lanes und Akteuren und tragen die Operationen ihrer Rolle.</w:t>
+        <w:t>Der Werkstattbetrieb steht als Mandant über Filialen und Mitarbeitern. Die Unterklassen von Mitarbeiter (Servicemitarbeiter, Techniker, Disponent, Werkstattleiter) entsprechen den Lanes, bündeln die Rollen des Use-Case-Diagramms (Tabelle 7) und tragen die Operationen dieser Rollen.</w:t>
       </w:r>
     </w:p>
     <w:p>
@@ -8256,7 +10672,7 @@
           <w:sz w:val="22"/>
           <w:szCs w:val="22"/>
         </w:rPr>
-        <w:t>Für sechs Use Cases haben wir Sequenzdiagramme erstellt, gefordert waren fünf (Tabelle 7). Jedes folgt einem Prozess. Die Lebenslinien sind Akteure und Objekte der Klassen, Botschaften an Objekte sind Operationen des Klassendiagramms. Kombinierte Fragmente bilden Verzweigungen (alt, opt), Schleifen (loop), parallele Prüfungen (par) und Verweise auf andere Use Cases (ref) ab.</w:t>
+        <w:t>Für sechs Use Cases haben wir Sequenzdiagramme erstellt, gefordert waren fünf (Tabelle 8). Jedes folgt einem Prozess. Die erste Lebenslinie ist die Rolle des Use Case aus Abbildung 4; weitere beteiligte Rollen tragen ihren Namen aus dem Use-Case-Diagramm oder, wenn sie dort nicht vorkommen, den Mitarbeitertyp (Werkstattleiter). Die übrigen Lebenslinien sind Objekte der Klassen, Botschaften an Objekte sind Operationen des Klassendiagramms. Kombinierte Fragmente bilden Verzweigungen (alt, opt), Schleifen (loop), parallele Prüfungen (par) und Verweise auf andere Use Cases (ref) ab.</w:t>
       </w:r>
     </w:p>
     <w:tbl>
@@ -9172,7 +11588,7 @@
           <w:sz w:val="18"/>
           <w:szCs w:val="18"/>
         </w:rPr>
-        <w:t>Tabelle 7: Die sechs Sequenzdiagramme</w:t>
+        <w:t>Tabelle 8: Die sechs Sequenzdiagramme</w:t>
       </w:r>
     </w:p>
     <w:p>
@@ -9359,7 +11775,7 @@
           <w:sz w:val="22"/>
           <w:szCs w:val="22"/>
         </w:rPr>
-        <w:t>Tabelle 8 ordnet jedem Prozess seine Use Cases, zentralen Klassen und Sequenzdiagramme zu. BPMN-Datenobjekte tragen die Klassennamen, Pools und Lanes entsprechen den Akteuren und Rollenklassen, und die Zustände des Reparaturauftrags folgen in allen Modellen AuftragStatus.</w:t>
+        <w:t>Tabelle 9 ordnet jedem Prozess seine Use Cases, zentralen Klassen und Sequenzdiagramme zu. BPMN-Datenobjekte tragen die Klassennamen, jede Rolle des Use-Case-Diagramms gehört zu genau einer Lane und einer Mitarbeiterklasse (Tabelle 7), und die Zustände des Reparaturauftrags folgen in allen Modellen AuftragStatus.</w:t>
       </w:r>
     </w:p>
     <w:tbl>
@@ -10775,7 +13191,7 @@
           <w:sz w:val="18"/>
           <w:szCs w:val="18"/>
         </w:rPr>
-        <w:t>Tabelle 8: Zuordnung von Prozessen, Use Cases, Klassen und Sequenzdiagrammen</w:t>
+        <w:t>Tabelle 9: Zuordnung von Prozessen, Use Cases, Klassen und Sequenzdiagrammen</w:t>
       </w:r>
     </w:p>
     <w:p>
@@ -11039,12 +13455,26 @@
       <w:r>
         <w:rPr>
           <w:rFonts w:ascii="Calibri" w:cs="Calibri" w:eastAsia="Calibri" w:hAnsi="Calibri"/>
+          <w:sz w:val="22"/>
+          <w:szCs w:val="22"/>
+        </w:rPr>
+        <w:t>Im Coaching am 15.10.2026 sah der Dozent das Use-Case-Diagramm als zu verbunden an: Einzelne Akteure hingen an bis zu acht Use Cases. Sein Vorschlag war, je Use Case eine Rolle anzustreben, Akteure bei Bedarf mehrfach darzustellen und die Zuordnung der Rollen zu Personen einem Organigramm zu überlassen. Wir haben das Diagramm auf 15 Mitarbeiterrollen umgebaut und die Rollen in Tabelle 7 den Klassen und Lanes zugeordnet (Abschnitt 5.3, E-24).</w:t>
+      </w:r>
+    </w:p>
+    <w:p>
+      <w:pPr>
+        <w:spacing w:after="120" w:line="276"/>
+        <w:jc w:val="both"/>
+      </w:pPr>
+      <w:r>
+        <w:rPr>
+          <w:rFonts w:ascii="Calibri" w:cs="Calibri" w:eastAsia="Calibri" w:hAnsi="Calibri"/>
           <w:i/>
           <w:sz w:val="22"/>
           <w:szCs w:val="22"/>
           <w:shd w:val="clear" w:color="auto" w:fill="FFF2A8"/>
         </w:rPr>
-        <w:t>[Gruppe: Hinweise aus den Coachings am 15.10. und 22.10. mit ihrer Umsetzung ergänzen, sonst diesen Hinweis löschen.]</w:t>
+        <w:t>[Gruppe: Hinweise aus dem Coaching am 22.10. mit ihrer Umsetzung ergänzen, sonst diesen Hinweis löschen.]</w:t>
       </w:r>
     </w:p>
     <w:p>

</xml_diff>

<commit_message>
[T05 2026-10-15] feat: presentation as pitch and summary with speaker texts (E-25)
Rebuilt the final presentation without diagram images: pitch (problem,
solution, benefits, order journey, AI diagnosis), result summary
(figures, processes, roles and use cases, data model, approach,
quality, challenges), business model and outlook. Generator
4_praesentation/tools/pres.js plus sprechtext.py with per-slide
speaker texts in notes and Sprechtext_Abschlusspraesentation.docx.
Slide references in documentation chapter 1, team roles, decision
log, TODO.md and submission README aligned.

Co-Authored-By: Claude Fable 5.1 <noreply@anthropic.com>
Claude-Session: https://claude.ai/code/session_01H2bGsFaySUqsEjJ1PXuxUw
</commit_message>
<xml_diff>
--- a/3_doku/Projektdokumentation.docx
+++ b/3_doku/Projektdokumentation.docx
@@ -1553,7 +1553,7 @@
           <w:sz w:val="22"/>
           <w:szCs w:val="22"/>
         </w:rPr>
-        <w:t>Gesamtplanung und Terminsteuerung, Prüfung der BPMN-Diagramme 07 und 08 in Sprint 1, Redaktion der Projektdokumentation (Kapitel 1, 4 und 7, Abbildungen, Inhaltsverzeichnis, PDF), Zusammenstellung des Abgabe-Archivs, Folien 1–2 und 18–19.</w:t>
+        <w:t>Gesamtplanung und Terminsteuerung, Prüfung der BPMN-Diagramme 07 und 08 in Sprint 1, Redaktion der Projektdokumentation (Kapitel 1, 4 und 7, Abbildungen, Inhaltsverzeichnis, PDF), Zusammenstellung des Abgabe-Archivs, Folien 1–2 und 16–17.</w:t>
       </w:r>
     </w:p>
     <w:p>
@@ -1581,7 +1581,7 @@
           <w:sz w:val="22"/>
           <w:szCs w:val="22"/>
         </w:rPr>
-        <w:t>Prüfung der BPMN-Diagramme 03 und 04, Abgleich der Use Cases und Sequenzdiagramme mit den Prozessen (E-18), Überarbeitung der Prozesse 05 und 06 (E-20), Use-Case-Diagramm mit Rollenstruktur (E-24) sowie SD2, SD3, SD5 und SD6 in Visual Paradigm, Folien 3, 12 und 15.</w:t>
+        <w:t>Prüfung der BPMN-Diagramme 03 und 04, Abgleich der Use Cases und Sequenzdiagramme mit den Prozessen (E-18), Überarbeitung der Prozesse 05 und 06 (E-20), Use-Case-Diagramm mit Rollenstruktur (E-24) sowie SD2, SD3, SD5 und SD6 in Visual Paradigm, Folien 3, 6 und 11.</w:t>
       </w:r>
     </w:p>
     <w:p>
@@ -1609,7 +1609,7 @@
           <w:sz w:val="22"/>
           <w:szCs w:val="22"/>
         </w:rPr>
-        <w:t>Prüfung der BPMN-Diagramme 05 und 06, Fachkonzept in Kapitel 2 (Ausgangslage, Solution Provider, Systemkontext, Zustandsautomat, KI-Sofortdiagnose), Pflege des Entscheidungslogs und Bestätigung der Prozessänderungen E-19, E-20 und E-22 durch die Gruppe, Abschnitt 5.2 und Kapitel 6, Folien 4–6 und 11.</w:t>
+        <w:t>Prüfung der BPMN-Diagramme 05 und 06, Fachkonzept in Kapitel 2 (Ausgangslage, Solution Provider, Systemkontext, Zustandsautomat, KI-Sofortdiagnose), Pflege des Entscheidungslogs und Bestätigung der Prozessänderungen E-19, E-20 und E-22 durch die Gruppe, Abschnitt 5.2 und Kapitel 6, Folien 4, 5 und 7.</w:t>
       </w:r>
     </w:p>
     <w:p>
@@ -1637,7 +1637,7 @@
           <w:sz w:val="22"/>
           <w:szCs w:val="22"/>
         </w:rPr>
-        <w:t>eigener Entwurf V2 und dessen Zusammenführung mit dem Solution-Provider-Entwurf (E-10), Gesamtprüfungen vom 26.09. und 05.10.2026 (E-15, E-17), Klassendiagramm, SD1 und SD4 in Visual Paradigm, Visual-Paradigm-Projekt und Konsistenzprüfung der Sequenzdiagramme gegen das Klassendiagramm, Folien 13, 14 und 16.</w:t>
+        <w:t>eigener Entwurf V2 und dessen Zusammenführung mit dem Solution-Provider-Entwurf (E-10), Gesamtprüfungen vom 26.09. und 05.10.2026 (E-15, E-17), Klassendiagramm, SD1 und SD4 in Visual Paradigm, Visual-Paradigm-Projekt und Konsistenzprüfung der Sequenzdiagramme gegen das Klassendiagramm, Folien 12 und 13.</w:t>
       </w:r>
     </w:p>
     <w:p>
@@ -1665,7 +1665,7 @@
           <w:sz w:val="22"/>
           <w:szCs w:val="22"/>
         </w:rPr>
-        <w:t>Prüfung der BPMN-Diagramme 01 und 02, alle zehn BPMN-Dateien im Camunda Modeler (Anreicherung für Camunda 8, Prüfung im Problems-Panel, PNG-Export, E-21), Prozesskennzahlen und Abschnitt 5.1, Folien 7, 9 und 10.</w:t>
+        <w:t>Prüfung der BPMN-Diagramme 01 und 02, alle zehn BPMN-Dateien im Camunda Modeler (Anreicherung für Camunda 8, Prüfung im Problems-Panel, PNG-Export, E-21), Prozesskennzahlen und Abschnitt 5.1, Folien 8–10.</w:t>
       </w:r>
     </w:p>
     <w:p>
@@ -1693,7 +1693,7 @@
           <w:sz w:val="22"/>
           <w:szCs w:val="22"/>
         </w:rPr>
-        <w:t>Review der Prozesse 09 und 10, Behebung der Logikfehler in den Prozessen 07 und 08 (E-19), QA-Checkliste und Review aller Pull Requests, Abschnitte 3.2 und 5.6, Export der Präsentation als PDF, Folien 8 und 17.</w:t>
+        <w:t>Review der Prozesse 09 und 10, Behebung der Logikfehler in den Prozessen 07 und 08 (E-19), QA-Checkliste und Review aller Pull Requests, Abschnitte 3.2 und 5.6, Export der Präsentation als PDF, Folien 14 und 15.</w:t>
       </w:r>
     </w:p>
     <w:p>

</xml_diff>

<commit_message>
[T05 2026-10-16] docs: fix findings 1,2,4,6,7,8,14,15,16 in Projektdokumentation, add figures 2 and 3
Co-Authored-By: Claude Fable 5.1 <noreply@anthropic.com>
Claude-Session: https://claude.ai/code/session_01H2bGsFaySUqsEjJ1PXuxUw
</commit_message>
<xml_diff>
--- a/3_doku/Projektdokumentation.docx
+++ b/3_doku/Projektdokumentation.docx
@@ -1047,7 +1047,7 @@
                 <w:sz w:val="19"/>
                 <w:szCs w:val="19"/>
               </w:rPr>
-              <w:t>Gesamtplanung und Termine; Redaktion der Projektdokumentation (Kapitel 1, 4 und 7, Abbildungen, PDF); Abgabe-Archiv</w:t>
+              <w:t>Gesamtplanung und Termine; Redaktion der gesamten Projektdokumentation (Kapitel 1, 4 und 7, Abbildungen, PDF); Abgabe-Archiv</w:t>
             </w:r>
           </w:p>
         </w:tc>
@@ -1540,7 +1540,7 @@
         <w:t>(Kapitel 1, 4 und 7, Abbildungen, Inhaltsverzeichnis, PDF)</w:t>
       </w:r>
       <w:r>
-        <w:t>, Zusammenstellung des Abgabe-Archivs, Folien 1–2 und 18–19.</w:t>
+        <w:t>, Zusammenstellung des Abgabe-Archivs, Folien 1–2 und 16–17.</w:t>
       </w:r>
     </w:p>
     <w:p>
@@ -1560,7 +1560,7 @@
         <w:t xml:space="preserve">David Leismann: </w:t>
       </w:r>
       <w:r>
-        <w:t>Prüfung der BPMN-Diagramme 03 und 04, Abgleich der Use Cases und Sequenzdiagramme mit den Prozessen (E-18), Überarbeitung der Prozesse 05 und 06 (E-20), Use-Case-Diagramm mit Rollenstruktur (E-24) sowie SD2, SD3, SD5 und SD6 in Visual Paradigm, Folien 3, 12 und 15.</w:t>
+        <w:t>Prüfung der BPMN-Diagramme 03 und 04, Abgleich der Use Cases und Sequenzdiagramme mit den Prozessen (E-18), Überarbeitung der Prozesse 05 und 06 (E-20), Use-Case-Diagramm mit Rollenstruktur (E-24) sowie SD2, SD3, SD5 und SD6 in Visual Paradigm, Folien 3, 6 und 11.</w:t>
       </w:r>
     </w:p>
     <w:p>
@@ -1580,7 +1580,7 @@
         <w:t xml:space="preserve">Adrian Wenzler: </w:t>
       </w:r>
       <w:r>
-        <w:t>Prüfung der BPMN-Diagramme 05 und 06, Fachkonzept in Kapitel 2 (Ausgangslage, Solution Provider, Systemkontext, Zustandsautomat, KI-Sofortdiagnose), Pflege des Entscheidungslogs und Bestätigung der Prozessänderungen E-19, E-20 und E-22 durch die Gruppe, Abschnitt 5.2 und Kapitel 6, Folien 4–6 und 11.</w:t>
+        <w:t>Prüfung der BPMN-Diagramme 05 und 06, Fachkonzept in Kapitel 2 (Ausgangslage, Solution Provider, Systemkontext, Zustandsautomat, KI-Sofortdiagnose), Pflege des Entscheidungslogs und Bestätigung der Prozessänderungen E-19, E-20 und E-22 durch die Gruppe, Überarbeitung von Prozess 06 (E-27), Abschnitt 5.2 und Kapitel 6, Folien 4, 5 und 7.</w:t>
       </w:r>
     </w:p>
     <w:p>
@@ -1600,7 +1600,7 @@
         <w:t xml:space="preserve">Kilian Platter: </w:t>
       </w:r>
       <w:r>
-        <w:t>eigener Entwurf V2 und dessen Zusammenführung mit dem Solution-Provider-Entwurf (E-10), Gesamtprüfungen vom 26.09. und 05.10.2026 (E-15, E-17), Klassendiagramm, SD1 und SD4 in Visual Paradigm, Visual-Paradigm-Projekt und Konsistenzprüfung der Sequenzdiagramme gegen das Klassendiagramm, Folien 13, 14 und 16.</w:t>
+        <w:t>eigener Entwurf V2 und dessen Zusammenführung mit dem Solution-Provider-Entwurf (E-10), Gesamtprüfungen vom 26.09. und 05.10.2026 (E-15, E-17), Klassendiagramm, SD1 und SD4 in Visual Paradigm, Visual-Paradigm-Projekt und Konsistenzprüfung der Sequenzdiagramme gegen das Klassendiagramm, Folien 12 und 13.</w:t>
       </w:r>
     </w:p>
     <w:p>
@@ -1620,7 +1620,7 @@
         <w:t xml:space="preserve">Maximilian Ewald: </w:t>
       </w:r>
       <w:r>
-        <w:t>Prüfung der BPMN-Diagramme 01 und 02, alle zehn BPMN-Dateien im Camunda Modeler (Anreicherung für Camunda 8, Prüfung im Problems-Panel, PNG-Export, E-21), Prozesskennzahlen und Abschnitt 5.1, Folien 7, 9 und 10.</w:t>
+        <w:t>Prüfung der BPMN-Diagramme 01 und 02, alle zehn BPMN-Dateien im Camunda Modeler (Anreicherung für Camunda 8, Prüfung im Problems-Panel, PNG-Export, E-21), Prozesskennzahlen und Abschnitt 5.1, Folien 8–10.</w:t>
       </w:r>
     </w:p>
     <w:p>
@@ -1641,7 +1641,7 @@
         <w:t xml:space="preserve">Jakob Schwan: </w:t>
       </w:r>
       <w:r>
-        <w:t>Review der Prozesse 09 und 10, Behebung der Logikfehler in den Prozessen 07 und 08 (E-19), QA-Checkliste und Review aller Pull Requests, Abschnitte 3.2 und 5.6, Export der Präsentation als PDF, Folien 8 und 17.</w:t>
+        <w:t>Review der Prozesse 09 und 10, Behebung der Logikfehler in den Prozessen 07 und 08 (E-19), Fehleranalyse und Korrektur der Prozesse 01 bis 05 (E-26) sowie der Logikfehler in Prozess 06 (E-27), QA-Checkliste und Review aller Pull Requests, Abschnitte 3.2 und 5.6, Export der Präsentation als PDF, Folien 14 und 15.</w:t>
       </w:r>
     </w:p>
     <w:p>
@@ -2736,97 +2736,42 @@
         <w:jc w:val="both"/>
       </w:pPr>
       <w:r>
-        <w:t>Bis zum 0</w:t>
-      </w:r>
-      <w:r>
-        <w:t>5</w:t>
-      </w:r>
-      <w:r>
-        <w:t xml:space="preserve">.10.2026 gab es </w:t>
-      </w:r>
-      <w:r>
-        <w:t>mehrere Prüfrunden</w:t>
-      </w:r>
-      <w:r>
-        <w:t xml:space="preserve">. In Sprint 1 haben wir die Diagramme </w:t>
-      </w:r>
-      <w:r>
-        <w:t>(E-15 bis E-20)</w:t>
-      </w:r>
+        <w:t>Bis zum 05.10.2026 gab es mehrere Prüfrunden. In Sprint 1 haben wir die Diagramme im Zweierteam erstellt und gegenseitig geprüft. Bei der Gesamtprüfung am 26.09.2026 fanden wir fachliche Fehler, die wir gegenseitig überarbeitet haben. Die zweite Prüfrunde am 05.10.2026, bei der wir in der Gesamtgruppe alles auf Korrektheit überprüft haben, ergab nur noch kleinere Fehler in den Details. Die Korrekturen aus beiden Runden sind im Entscheidungslog als E-15 bis E-20 festgehalten.</w:t>
+      </w:r>
+      <w:r/>
+      <w:r/>
+      <w:r/>
+      <w:r/>
+      <w:r/>
       <w:r>
         <w:rPr>
           <w:color w:val="000000"/>
           <w:sz w:val="19"/>
           <w:szCs w:val="19"/>
         </w:rPr>
-        <w:t xml:space="preserve"> </w:t>
-      </w:r>
-      <w:r>
-        <w:t xml:space="preserve">im Zweierteam </w:t>
-      </w:r>
-      <w:r>
-        <w:t>erstellt</w:t>
-      </w:r>
-      <w:r>
-        <w:t xml:space="preserve">. </w:t>
-      </w:r>
-      <w:r>
-        <w:t>Bei der Überprüfung</w:t>
-      </w:r>
-      <w:r>
-        <w:t xml:space="preserve"> </w:t>
-      </w:r>
-      <w:r>
-        <w:t xml:space="preserve">dieser Diagramme </w:t>
-      </w:r>
-      <w:r>
-        <w:t>am 26.09.2026</w:t>
-      </w:r>
-      <w:r>
-        <w:t xml:space="preserve"> </w:t>
-      </w:r>
-      <w:r>
-        <w:t>fand</w:t>
-      </w:r>
-      <w:r>
-        <w:t>en wir</w:t>
-      </w:r>
-      <w:r>
-        <w:t xml:space="preserve"> fachliche Fehler</w:t>
-      </w:r>
-      <w:r>
-        <w:t>,</w:t>
-      </w:r>
-      <w:r>
-        <w:t xml:space="preserve"> </w:t>
-      </w:r>
-      <w:r>
-        <w:t>die wir gegenseitig überarbeitet haben. Der Gesamt</w:t>
-      </w:r>
-      <w:r>
-        <w:t>check</w:t>
-      </w:r>
-      <w:r>
-        <w:t xml:space="preserve"> am </w:t>
-      </w:r>
-      <w:r>
-        <w:t>05.10.2026</w:t>
-      </w:r>
-      <w:r>
-        <w:t>, bei dem wir in der Gesamtgruppe alles auf Korrektheit überprüft haben</w:t>
-      </w:r>
-      <w:r>
-        <w:t>,</w:t>
-      </w:r>
-      <w:r>
-        <w:t xml:space="preserve"> ergab</w:t>
-      </w:r>
-      <w:r>
-        <w:t xml:space="preserve"> </w:t>
-      </w:r>
-      <w:r>
-        <w:t>nur noch kleinere Fehler, die die Details anbelangt haben.</w:t>
-      </w:r>
+      </w:r>
+      <w:r/>
+      <w:r/>
+      <w:r/>
+      <w:r/>
+      <w:r/>
+      <w:r/>
+      <w:r/>
+      <w:r/>
+      <w:r/>
+      <w:r/>
+      <w:r/>
+      <w:r/>
+      <w:r/>
+      <w:r/>
+      <w:r/>
+      <w:r/>
+      <w:r/>
+      <w:r/>
+      <w:r/>
+      <w:r/>
+      <w:r/>
+      <w:r/>
     </w:p>
     <w:p>
       <w:pPr>
@@ -3611,7 +3556,7 @@
         <w:jc w:val="both"/>
       </w:pPr>
       <w:r>
-        <w:t>Das Trello-Board hat eine Liste je Termin. Jede Karte nennt eine verantwortliche Person und, wo ein Diagramm entsteht, den Teampartner als Prüfer. Änderungen am Repository laufen über einen festen Git-Ablauf: aktuellen Stand holen, eigener Branch je Aufgabe, Pull Request, Review durch eine zweite Person und Merge. Commit-Nachrichten tragen einen Termin-Stempel mit Terminnummer und Datum, etwa [T04 2026-10-05] für den Gruppentermin am 05.10.2026. Entscheidungen, die mehrere Personen betreffen, halten wir im Entscheidungslog fest (E-01 bis E-22). Word- und PowerPoint-Dateien lassen sich nicht automatisch zusammenführen, deshalb kündigen wir ihre Bearbeitung vorher in der WhatsApp-Gruppe an.</w:t>
+        <w:t>Das Trello-Board hat eine Liste je Termin. Jede Karte nennt eine verantwortliche Person und, wo ein Diagramm entsteht, den Teampartner als Prüfer. Änderungen am Repository laufen über einen festen Git-Ablauf: aktuellen Stand holen, eigener Branch je Aufgabe, Pull Request, Review durch eine zweite Person und Merge. Commit-Nachrichten tragen einen Termin-Stempel mit Terminnummer und Datum, etwa [T04 2026-10-05] für den Gruppentermin am 05.10.2026. Entscheidungen, die mehrere Personen betreffen, halten wir im Entscheidungslog fest (E-01 bis E-29). Word- und PowerPoint-Dateien lassen sich nicht automatisch zusammenführen, deshalb kündigen wir ihre Bearbeitung vorher in der WhatsApp-Gruppe an.</w:t>
       </w:r>
     </w:p>
     <w:p>
@@ -4505,7 +4450,7 @@
         <w:jc w:val="both"/>
       </w:pPr>
       <w:r>
-        <w:t>Wir haben zehn Soll-Prozesse unseres Pilotkunden als Kollaborationsdiagramme modelliert (Tabelle 6). Zusammen enthalten sie 131 Aktivitäten im Werkstatt-Pool, im Schnitt 13,1 je Diagramm. Hinzu kommen 26 Aktivitäten in den Abläufen des Kunden, 41 Nachrichtenflüsse sowie 48 Datenobjekte und 12 Datenspeicher.</w:t>
+        <w:t>Wir haben zehn Soll-Prozesse unseres Pilotkunden als Kollaborationsdiagramme modelliert (Tabelle 6). Zusammen enthalten sie 133 Aktivitäten im Werkstatt-Pool, im Schnitt 13,3 je Diagramm. Hinzu kommen 26 Aktivitäten in den Abläufen des Kunden, 42 Nachrichtenflüsse sowie 51 Datenobjekte und 12 Datenspeicher.</w:t>
       </w:r>
     </w:p>
     <w:tbl>
@@ -5642,7 +5587,7 @@
                 <w:sz w:val="19"/>
                 <w:szCs w:val="19"/>
               </w:rPr>
-              <w:t>14</w:t>
+              <w:t>15</w:t>
             </w:r>
           </w:p>
         </w:tc>
@@ -5667,7 +5612,7 @@
                 <w:sz w:val="19"/>
                 <w:szCs w:val="19"/>
               </w:rPr>
-              <w:t>11 (79 %)</w:t>
+              <w:t>12 (80 %)</w:t>
             </w:r>
           </w:p>
         </w:tc>
@@ -5828,7 +5773,7 @@
                 <w:sz w:val="19"/>
                 <w:szCs w:val="19"/>
               </w:rPr>
-              <w:t>14</w:t>
+              <w:t>15</w:t>
             </w:r>
           </w:p>
         </w:tc>
@@ -5853,7 +5798,7 @@
                 <w:sz w:val="19"/>
                 <w:szCs w:val="19"/>
               </w:rPr>
-              <w:t>8 (57 %)</w:t>
+              <w:t>9 (60 %)</w:t>
             </w:r>
           </w:p>
         </w:tc>
@@ -6848,69 +6793,45 @@
         <w:t>Defekte Lieferantenteile werden angemeldet und zurückgesendet. Danach folgt eine Gutschrift oder eine Ersatzlieferung, ohne Antwort nach der Eskalation wird das Teil abgeschrieben.</w:t>
       </w:r>
     </w:p>
-    <w:tbl>
-      <w:tblPr>
-        <w:tblW w:w="9070" w:type="dxa"/>
+    <w:p>
+      <w:pPr>
         <w:jc w:val="center"/>
-        <w:tblBorders>
-          <w:top w:val="dashed" w:sz="8" w:space="0" w:color="B8860B"/>
-          <w:left w:val="dashed" w:sz="8" w:space="0" w:color="B8860B"/>
-          <w:bottom w:val="dashed" w:sz="8" w:space="0" w:color="B8860B"/>
-          <w:right w:val="dashed" w:sz="8" w:space="0" w:color="B8860B"/>
-        </w:tblBorders>
-        <w:tblCellMar>
-          <w:left w:w="10" w:type="dxa"/>
-          <w:right w:w="10" w:type="dxa"/>
-        </w:tblCellMar>
-        <w:tblLook w:val="04A0" w:firstRow="1" w:lastRow="0" w:firstColumn="1" w:lastColumn="0" w:noHBand="0" w:noVBand="1"/>
-      </w:tblPr>
-      <w:tblGrid>
-        <w:gridCol w:w="9070"/>
-      </w:tblGrid>
-      <w:tr>
-        <w:tblPrEx>
-          <w:tblCellMar>
-            <w:top w:w="0" w:type="dxa"/>
-            <w:bottom w:w="0" w:type="dxa"/>
-          </w:tblCellMar>
-        </w:tblPrEx>
-        <w:trPr>
-          <w:cantSplit/>
-          <w:trHeight w:hRule="exact" w:val="3685"/>
-          <w:jc w:val="center"/>
-        </w:trPr>
-        <w:tc>
-          <w:tcPr>
-            <w:tcW w:w="9106" w:type="dxa"/>
-            <w:shd w:val="clear" w:color="auto" w:fill="FFF8D6"/>
-            <w:vAlign w:val="center"/>
-          </w:tcPr>
-          <w:p>
-            <w:pPr>
-              <w:jc w:val="center"/>
-            </w:pPr>
-            <w:r>
-              <w:rPr>
-                <w:b/>
-              </w:rPr>
-              <w:t>Abbildung einfügen: Prozess 01 KI-Sofortdiagnose und Voranmeldung</w:t>
-            </w:r>
-          </w:p>
-          <w:p>
-            <w:pPr>
-              <w:jc w:val="center"/>
-            </w:pPr>
-            <w:r>
-              <w:rPr>
-                <w:i/>
-                <w:sz w:val="19"/>
-              </w:rPr>
-              <w:t>Camunda Modeler: 1_bpmn/p01-sofortdiagnose.bpmn öffnen → File → Export as Image → PNG. Einfügen mit 16 cm Breite, dann diesen Kasten löschen.</w:t>
-            </w:r>
-          </w:p>
-        </w:tc>
-      </w:tr>
-    </w:tbl>
+      </w:pPr>
+      <w:r>
+        <w:drawing>
+          <wp:inline xmlns:a="http://schemas.openxmlformats.org/drawingml/2006/main" xmlns:pic="http://schemas.openxmlformats.org/drawingml/2006/picture">
+            <wp:extent cx="5760000" cy="2096305"/>
+            <wp:docPr id="3" name="Picture 3"/>
+            <wp:cNvGraphicFramePr>
+              <a:graphicFrameLocks noChangeAspect="1"/>
+            </wp:cNvGraphicFramePr>
+            <a:graphic>
+              <a:graphicData uri="http://schemas.openxmlformats.org/drawingml/2006/picture">
+                <pic:pic>
+                  <pic:nvPicPr>
+                    <pic:cNvPr id="0" name="p01-sofortdiagnose.png"/>
+                    <pic:cNvPicPr/>
+                  </pic:nvPicPr>
+                  <pic:blipFill>
+                    <a:blip r:embed="rId13"/>
+                    <a:stretch>
+                      <a:fillRect/>
+                    </a:stretch>
+                  </pic:blipFill>
+                  <pic:spPr>
+                    <a:xfrm>
+                      <a:off x="0" y="0"/>
+                      <a:ext cx="5760000" cy="2096305"/>
+                    </a:xfrm>
+                    <a:prstGeom prst="rect"/>
+                  </pic:spPr>
+                </pic:pic>
+              </a:graphicData>
+            </a:graphic>
+          </wp:inline>
+        </w:drawing>
+      </w:r>
+    </w:p>
     <w:p>
       <w:pPr>
         <w:spacing w:before="60" w:after="200"/>
@@ -6927,69 +6848,45 @@
         <w:t>Abbildung 2: Prozess 01 KI-Sofortdiagnose und Voranmeldung</w:t>
       </w:r>
     </w:p>
-    <w:tbl>
-      <w:tblPr>
-        <w:tblW w:w="9070" w:type="dxa"/>
+    <w:p>
+      <w:pPr>
         <w:jc w:val="center"/>
-        <w:tblBorders>
-          <w:top w:val="dashed" w:sz="8" w:space="0" w:color="B8860B"/>
-          <w:left w:val="dashed" w:sz="8" w:space="0" w:color="B8860B"/>
-          <w:bottom w:val="dashed" w:sz="8" w:space="0" w:color="B8860B"/>
-          <w:right w:val="dashed" w:sz="8" w:space="0" w:color="B8860B"/>
-        </w:tblBorders>
-        <w:tblCellMar>
-          <w:left w:w="10" w:type="dxa"/>
-          <w:right w:w="10" w:type="dxa"/>
-        </w:tblCellMar>
-        <w:tblLook w:val="04A0" w:firstRow="1" w:lastRow="0" w:firstColumn="1" w:lastColumn="0" w:noHBand="0" w:noVBand="1"/>
-      </w:tblPr>
-      <w:tblGrid>
-        <w:gridCol w:w="9070"/>
-      </w:tblGrid>
-      <w:tr>
-        <w:tblPrEx>
-          <w:tblCellMar>
-            <w:top w:w="0" w:type="dxa"/>
-            <w:bottom w:w="0" w:type="dxa"/>
-          </w:tblCellMar>
-        </w:tblPrEx>
-        <w:trPr>
-          <w:cantSplit/>
-          <w:trHeight w:hRule="exact" w:val="3685"/>
-          <w:jc w:val="center"/>
-        </w:trPr>
-        <w:tc>
-          <w:tcPr>
-            <w:tcW w:w="9106" w:type="dxa"/>
-            <w:shd w:val="clear" w:color="auto" w:fill="FFF8D6"/>
-            <w:vAlign w:val="center"/>
-          </w:tcPr>
-          <w:p>
-            <w:pPr>
-              <w:jc w:val="center"/>
-            </w:pPr>
-            <w:r>
-              <w:rPr>
-                <w:b/>
-              </w:rPr>
-              <w:t>Abbildung einfügen: Prozess 04 Kostenvoranschlag und Kundenfreigabe</w:t>
-            </w:r>
-          </w:p>
-          <w:p>
-            <w:pPr>
-              <w:jc w:val="center"/>
-            </w:pPr>
-            <w:r>
-              <w:rPr>
-                <w:i/>
-                <w:sz w:val="19"/>
-              </w:rPr>
-              <w:t>Camunda Modeler: 1_bpmn/p04-kostenvoranschlag.bpmn öffnen → File → Export as Image → PNG. Einfügen mit 16 cm Breite, dann diesen Kasten löschen.</w:t>
-            </w:r>
-          </w:p>
-        </w:tc>
-      </w:tr>
-    </w:tbl>
+      </w:pPr>
+      <w:r>
+        <w:drawing>
+          <wp:inline xmlns:a="http://schemas.openxmlformats.org/drawingml/2006/main" xmlns:pic="http://schemas.openxmlformats.org/drawingml/2006/picture">
+            <wp:extent cx="5760000" cy="2364632"/>
+            <wp:docPr id="2" name="Picture 2"/>
+            <wp:cNvGraphicFramePr>
+              <a:graphicFrameLocks noChangeAspect="1"/>
+            </wp:cNvGraphicFramePr>
+            <a:graphic>
+              <a:graphicData uri="http://schemas.openxmlformats.org/drawingml/2006/picture">
+                <pic:pic>
+                  <pic:nvPicPr>
+                    <pic:cNvPr id="0" name="p04-kostenvoranschlag.png"/>
+                    <pic:cNvPicPr/>
+                  </pic:nvPicPr>
+                  <pic:blipFill>
+                    <a:blip r:embed="rId12"/>
+                    <a:stretch>
+                      <a:fillRect/>
+                    </a:stretch>
+                  </pic:blipFill>
+                  <pic:spPr>
+                    <a:xfrm>
+                      <a:off x="0" y="0"/>
+                      <a:ext cx="5760000" cy="2364632"/>
+                    </a:xfrm>
+                    <a:prstGeom prst="rect"/>
+                  </pic:spPr>
+                </pic:pic>
+              </a:graphicData>
+            </a:graphic>
+          </wp:inline>
+        </w:drawing>
+      </w:r>
+    </w:p>
     <w:p>
       <w:pPr>
         <w:spacing w:before="60" w:after="200"/>
@@ -7021,7 +6918,7 @@
         <w:jc w:val="both"/>
       </w:pPr>
       <w:r>
-        <w:t>Von den 131 Aktivitäten sind 79 automatisiert, regelbasiert oder Nachrichten der Plattform, also rund 60 Prozent. 33 weitere sind Benutzer-Aktivitäten in der Plattform. Neun manuelle Aktivitäten liegen außerhalb der Software, neun rufen einen anderen Prozess auf, und eine ist der Mehrfach-Teilprozess für die Prüfung je Ersatzteil. Die Software automatisiert vor allem:</w:t>
+        <w:t>Von den 133 Aktivitäten sind 81 automatisiert, regelbasiert oder Nachrichten der Plattform, also rund 61 Prozent. 33 weitere sind Benutzer-Aktivitäten in der Plattform. Neun manuelle Aktivitäten liegen außerhalb der Software, neun rufen einen anderen Prozess auf, und eine ist der Mehrfach-Teilprozess für die Prüfung je Ersatzteil. Die Software automatisiert vor allem:</w:t>
       </w:r>
     </w:p>
     <w:p>
@@ -7105,7 +7002,7 @@
         <w:jc w:val="both"/>
       </w:pPr>
       <w:r>
-        <w:t>Das Use-Case-Diagramm (Abbildung 4) zeigt, was RepairFlow aus Sicht seiner Benutzer leistet. Es enthält 19 Use Cases und 18 Akteure: den Kunden, 15 Mitarbeiterrollen und die externen Akteure Lieferant und KI-Diagnosedienst. Jeder Use Case hat genau eine Rolle als primären Akteur. Diese Struktur geht auf einen Hinweis des Dozenten vom 15.10.2026 zurück: Unsere erste Fassung hatte sechs Akteure mit bis zu acht Verbindungen, etwa den Techniker an Diagnose, KVA, Reparatur, Fertigmeldung und Reklamation. Statt eines Akteurs mit vielen Linien gibt es jetzt je Use Case eine Rolle, zum Beispiel Diagnoseprüfer, Diagnostiker, Kalkulator, Reparateur und Endkontrolleur anstelle des Technikers. Welche Person eine Rolle ausfüllt, regelt das Organigramm des Werkstattbetriebs; im Modell sind das die Unterklassen von Mitarbeiter (Tabelle 7). Kunde und Lieferant sind mehrfach dargestellt, damit sich keine Linien kreuzen. UC08 „Ersatzteil-Verfügbarkeit prüfen“ wird nur über include erreicht und hat deshalb keinen eigenen Akteur.</w:t>
+        <w:t>Das Use-Case-Diagramm (Abbildung 4) zeigt, was RepairFlow aus Sicht seiner Benutzer leistet. Es enthält 19 Use Cases und 17 Akteure: den Kunden, 15 Mitarbeiterrollen und den KI-Diagnosedienst als externes System. Der Lieferant ist kein Akteur, sondern eine Black Box ohne Zugang zu RepairFlow; wie in den Prozessmodellen kommt er nur über Nachrichten vor. Jeder Use Case hat genau eine Rolle als primären Akteur. Diese Struktur geht auf einen Hinweis des Dozenten vom 15.10.2026 zurück: Unsere erste Fassung hatte acht Akteure mit bis zu acht Verbindungen, etwa den Techniker an Diagnose, KVA, Reparatur, Fertigmeldung und Reklamation. Statt eines Akteurs mit vielen Linien gibt es jetzt je Use Case eine Rolle, zum Beispiel Diagnoseprüfer, Diagnostiker, Kalkulator, Reparateur und Endkontrolleur anstelle des Technikers. Welche Person eine Rolle ausfüllt, regelt das Organigramm des Werkstattbetriebs; im Modell sind das die Unterklassen von Mitarbeiter (Tabelle 7). Der Kunde ist einmal dargestellt und mit UC01, UC02 und UC07 verbunden. UC08 „Ersatzteil-Verfügbarkeit prüfen“ wird nur über include erreicht und hat deshalb keinen eigenen Akteur.</w:t>
       </w:r>
     </w:p>
     <w:tbl>
@@ -9062,117 +8959,6 @@
                 <w:sz w:val="19"/>
                 <w:szCs w:val="19"/>
               </w:rPr>
-              <w:t>Lieferant (extern)</w:t>
-            </w:r>
-          </w:p>
-        </w:tc>
-        <w:tc>
-          <w:tcPr>
-            <w:tcW w:w="1474" w:type="dxa"/>
-            <w:tcMar>
-              <w:top w:w="50" w:type="dxa"/>
-              <w:left w:w="90" w:type="dxa"/>
-              <w:bottom w:w="50" w:type="dxa"/>
-              <w:right w:w="90" w:type="dxa"/>
-            </w:tcMar>
-          </w:tcPr>
-          <w:p>
-            <w:pPr>
-              <w:keepNext/>
-              <w:spacing w:after="40" w:line="252" w:lineRule="auto"/>
-            </w:pPr>
-            <w:r>
-              <w:rPr>
-                <w:color w:val="000000"/>
-                <w:sz w:val="19"/>
-                <w:szCs w:val="19"/>
-              </w:rPr>
-              <w:t>UC10, UC11, UC19</w:t>
-            </w:r>
-          </w:p>
-        </w:tc>
-        <w:tc>
-          <w:tcPr>
-            <w:tcW w:w="2608" w:type="dxa"/>
-            <w:tcMar>
-              <w:top w:w="50" w:type="dxa"/>
-              <w:left w:w="90" w:type="dxa"/>
-              <w:bottom w:w="50" w:type="dxa"/>
-              <w:right w:w="90" w:type="dxa"/>
-            </w:tcMar>
-          </w:tcPr>
-          <w:p>
-            <w:pPr>
-              <w:keepNext/>
-              <w:spacing w:after="40" w:line="252" w:lineRule="auto"/>
-            </w:pPr>
-            <w:r>
-              <w:rPr>
-                <w:color w:val="000000"/>
-                <w:sz w:val="19"/>
-                <w:szCs w:val="19"/>
-              </w:rPr>
-              <w:t>Lieferant</w:t>
-            </w:r>
-          </w:p>
-        </w:tc>
-        <w:tc>
-          <w:tcPr>
-            <w:tcW w:w="2608" w:type="dxa"/>
-            <w:tcMar>
-              <w:top w:w="50" w:type="dxa"/>
-              <w:left w:w="90" w:type="dxa"/>
-              <w:bottom w:w="50" w:type="dxa"/>
-              <w:right w:w="90" w:type="dxa"/>
-            </w:tcMar>
-          </w:tcPr>
-          <w:p>
-            <w:pPr>
-              <w:keepNext/>
-              <w:spacing w:after="40" w:line="252" w:lineRule="auto"/>
-            </w:pPr>
-            <w:r>
-              <w:rPr>
-                <w:color w:val="000000"/>
-                <w:sz w:val="19"/>
-                <w:szCs w:val="19"/>
-              </w:rPr>
-              <w:t>Pool Lieferant</w:t>
-            </w:r>
-          </w:p>
-        </w:tc>
-      </w:tr>
-      <w:tr>
-        <w:tblPrEx>
-          <w:tblCellMar>
-            <w:top w:w="0" w:type="dxa"/>
-            <w:bottom w:w="0" w:type="dxa"/>
-          </w:tblCellMar>
-        </w:tblPrEx>
-        <w:trPr>
-          <w:cantSplit/>
-        </w:trPr>
-        <w:tc>
-          <w:tcPr>
-            <w:tcW w:w="2381" w:type="dxa"/>
-            <w:tcMar>
-              <w:top w:w="50" w:type="dxa"/>
-              <w:left w:w="90" w:type="dxa"/>
-              <w:bottom w:w="50" w:type="dxa"/>
-              <w:right w:w="90" w:type="dxa"/>
-            </w:tcMar>
-          </w:tcPr>
-          <w:p>
-            <w:pPr>
-              <w:keepNext/>
-              <w:spacing w:after="40" w:line="252" w:lineRule="auto"/>
-            </w:pPr>
-            <w:r>
-              <w:rPr>
-                <w:color w:val="000000"/>
-                <w:sz w:val="19"/>
-                <w:szCs w:val="19"/>
-              </w:rPr>
               <w:t>KI-Diagnosedienst (extern)</w:t>
             </w:r>
           </w:p>
@@ -9572,7 +9358,7 @@
         <w:jc w:val="both"/>
       </w:pPr>
       <w:r>
-        <w:t>Für sechs Use Cases haben wir Sequenzdiagramme erstellt, gefordert waren fünf (Tabelle 8). Jedes folgt einem Prozess. Die erste Lebenslinie ist die Rolle des Use Case aus Abbildung 4; weitere beteiligte Rollen tragen ihren Namen aus dem Use-Case-Diagramm oder, wenn sie dort nicht vorkommen, den Mitarbeitertyp (Werkstattleiter). Die übrigen Lebenslinien sind Objekte der Klassen, Botschaften an Objekte sind Operationen des Klassendiagramms. Kombinierte Fragmente bilden Verzweigungen (alt, opt), Schleifen (loop), parallele Prüfungen (par) und Verweise auf andere Use Cases (ref) ab.</w:t>
+        <w:t>Für sechs Use Cases haben wir Sequenzdiagramme erstellt, gefordert waren fünf (Tabelle 8). Jedes folgt einem Prozess. Die erste Lebenslinie ist die Rolle des Use Case aus Abbildung 4; weitere beteiligte Rollen tragen ihren Namen aus dem Use-Case-Diagramm; der Werkstattleiter, der dort keine Rolle hat, erscheint als Objekt seiner Klasse (: Werkstattleiter) mit seinen Operationen. Der Lieferant liegt außerhalb des Systems, Nachrichten an ihn sind in SD6 Lost bzw. Found Messages. Die übrigen Lebenslinien sind Objekte der Klassen, Botschaften an Objekte sind Operationen des Klassendiagramms. Kombinierte Fragmente bilden Verzweigungen (alt, opt), Schleifen (loop), Abbrüche (break) und Verweise auf andere Use Cases (ref) ab.</w:t>
       </w:r>
     </w:p>
     <w:tbl>
@@ -10051,7 +9837,7 @@
                 <w:sz w:val="19"/>
                 <w:szCs w:val="19"/>
               </w:rPr>
-              <w:t>Parallele Prüfung je Teil über eigene und andere Filialen, Umlagerung oder Fehlteil, Meldebestand</w:t>
+              <w:t>Prüfung je Teil in einer Schleife: eigener Bestand, andere Filiale oder Fehlteil; Vorreservierung aus der Sofortdiagnose; Meldebestand; Fehlteile führen zu UC10</w:t>
             </w:r>
           </w:p>
         </w:tc>
@@ -10384,7 +10170,7 @@
                 <w:sz w:val="19"/>
                 <w:szCs w:val="19"/>
               </w:rPr>
-              <w:t>Bündelung, Freigabegrenze, Bestätigung oder Storno, zwei Mahnungen, Wareneingang</w:t>
+              <w:t>Bündelung, Freigabe durch den Werkstattleiter ab Freigabegrenze, Bestellung, Bestätigung oder Storno nach zwei Mahnungen; Nachrichten an den Lieferanten als Lost Messages</w:t>
             </w:r>
           </w:p>
         </w:tc>

</xml_diff>

<commit_message>
[T05 2026-10-19] docs: decisions E-19 to E-29 settled (E-30), TODO updated, state diagram and slide generator removed
Co-Authored-By: Claude Opus 5.5 <noreply@anthropic.com>
Claude-Session: https://claude.ai/code/session_01H2bGsFaySUqsEjJ1PXuxUw
</commit_message>
<xml_diff>
--- a/3_doku/Projektdokumentation.docx
+++ b/3_doku/Projektdokumentation.docx
@@ -3556,7 +3556,7 @@
         <w:jc w:val="both"/>
       </w:pPr>
       <w:r>
-        <w:t>Das Trello-Board hat eine Liste je Termin. Jede Karte nennt eine verantwortliche Person und, wo ein Diagramm entsteht, den Teampartner als Prüfer. Änderungen am Repository laufen über einen festen Git-Ablauf: aktuellen Stand holen, eigener Branch je Aufgabe, Pull Request, Review durch eine zweite Person und Merge. Commit-Nachrichten tragen einen Termin-Stempel mit Terminnummer und Datum, etwa [T04 2026-10-05] für den Gruppentermin am 05.10.2026. Entscheidungen, die mehrere Personen betreffen, halten wir im Entscheidungslog fest (E-01 bis E-29). Word- und PowerPoint-Dateien lassen sich nicht automatisch zusammenführen, deshalb kündigen wir ihre Bearbeitung vorher in der WhatsApp-Gruppe an.</w:t>
+        <w:t>Das Trello-Board hat eine Liste je Termin. Jede Karte nennt eine verantwortliche Person und, wo ein Diagramm entsteht, den Teampartner als Prüfer. Änderungen am Repository laufen über einen festen Git-Ablauf: aktuellen Stand holen, eigener Branch je Aufgabe, Pull Request, Review durch eine zweite Person und Merge. Commit-Nachrichten tragen einen Termin-Stempel mit Terminnummer und Datum, etwa [T04 2026-10-05] für den Gruppentermin am 05.10.2026. Entscheidungen, die mehrere Personen betreffen, halten wir im Entscheidungslog fest (E-01 bis E-30). Word- und PowerPoint-Dateien lassen sich nicht automatisch zusammenführen, deshalb kündigen wir ihre Bearbeitung vorher in der WhatsApp-Gruppe an.</w:t>
       </w:r>
     </w:p>
     <w:p>
@@ -6649,7 +6649,7 @@
         <w:t xml:space="preserve">03 Fehlerdiagnose. </w:t>
       </w:r>
       <w:r>
-        <w:t>Der Techniker prüft den KI-Vorschlag, misst und dokumentiert den Befund. Ist die Reparatur nicht wirtschaftlich, etwa bei Totalschaden, wird der Auftrag abgelehnt, und das Gerät geht über Prozess 08 mit Diagnosepauschale zurück.</w:t>
+        <w:t>Der Techniker sichtet den KI-Vorschlag, sofern eine Voranmeldung vorliegt, misst und dokumentiert den Befund. Findet er keinen Fehler oder ist die Reparatur nicht wirtschaftlich, etwa bei Totalschaden, wird der Auftrag abgelehnt, und das Gerät geht über Prozess 08 mit Diagnosepauschale zurück.</w:t>
       </w:r>
     </w:p>
     <w:p>
@@ -6689,7 +6689,7 @@
         <w:t xml:space="preserve">05 Ersatzteil-Verfügbarkeit und Reservierung. </w:t>
       </w:r>
       <w:r>
-        <w:t>Je Teil wird zuerst die eigene, dann jede andere Filiale geprüft. Teile werden reserviert oder umgelagert, Fehlteile gehen an Prozess 06.</w:t>
+        <w:t>Vorreservierungen aus der Sofortdiagnose werden zuerst übernommen. Je offenem Teil wird danach die eigene, dann jede andere Filiale geprüft. Teile werden reserviert oder umgelagert, Fehlteile gehen an Prozess 06.</w:t>
       </w:r>
     </w:p>
     <w:p>
@@ -11660,10 +11660,8 @@
       <w:r>
         <w:rPr>
           <w:i/>
-          <w:shd w:val="clear" w:color="auto" w:fill="FFF2A8"/>
         </w:rPr>
-        <w:lastRenderedPageBreak/>
-        <w:t>[Von der Gruppe zu bestätigen: Fristen aus E-19, E-20 und E-22 sowie die Frage, ob verwertete Geräte einen eigenen Wert in AuftragStatus brauchen. Danach diesen Hinweis löschen oder das Ergebnis hier in einem Satz nennen.]</w:t>
+        <w:t>Die Fristen aus E-19, E-20 und E-22 sind festgelegt: Ein nicht abgeholtes Gerät wird nach der vierten Erinnerung verwertet, eine offene Rechnung nach der dritten erfolglosen Mahnung an das Inkasso übergeben und eine Bestellung nach der zweiten erfolglosen Liefermahnung storniert. Verwertete Geräte erhalten keinen eigenen Wert in AuftragStatus, weil die Verwertung ein Prozessende in Prozess 08 ist und kein Zustand des Auftrags.</w:t>
       </w:r>
     </w:p>
     <w:p>

</xml_diff>

<commit_message>
[T05 2026-10-19] docs: Abb. 4–7 in der Projektdokumentation
- Abb. 4 Use-Case-Diagramm, Abb. 5 Klassendiagramm (Querformatseite), Abb. 6 SD1, Abb. 7 SD3 aus den VP-Exporten
- gelber Hinweis in 3.1 entfernt (VPP und Unterdiagramme liegen vor)
- Bearbeitungsstand 19.10.2026, Inhaltsverzeichnis an die neuen Seiten angepasst, PDF neu erzeugt
- TODO.md Abschnitt C aktualisiert

Co-Authored-By: Claude Opus 5.5 <noreply@anthropic.com>
Claude-Session: https://claude.ai/code/session_01H2bGsFaySUqsEjJ1PXuxUw
</commit_message>
<xml_diff>
--- a/3_doku/Projektdokumentation.docx
+++ b/3_doku/Projektdokumentation.docx
@@ -160,7 +160,7 @@
         <w:rPr>
           <w:sz w:val="20"/>
         </w:rPr>
-        <w:t>Bearbeitungsstand: 15. Oktober 2026</w:t>
+        <w:t>Bearbeitungsstand: 19. Oktober 2026</w:t>
       </w:r>
     </w:p>
     <w:p>
@@ -219,12 +219,6 @@
           <w:bCs/>
         </w:rPr>
         <w:t>1 Mitglieder der Gruppe und Rollen</w:t>
-      </w:r>
-      <w:r>
-        <w:rPr>
-          <w:b/>
-          <w:bCs/>
-        </w:rPr>
         <w:tab/>
         <w:t>2</w:t>
       </w:r>
@@ -242,12 +236,6 @@
           <w:bCs/>
         </w:rPr>
         <w:t>2 Das Projekt RepairFlow</w:t>
-      </w:r>
-      <w:r>
-        <w:rPr>
-          <w:b/>
-          <w:bCs/>
-        </w:rPr>
         <w:tab/>
         <w:t>3</w:t>
       </w:r>
@@ -266,12 +254,6 @@
           <w:szCs w:val="20"/>
         </w:rPr>
         <w:t>2.1 Ausgangslage und Problem</w:t>
-      </w:r>
-      <w:r>
-        <w:rPr>
-          <w:sz w:val="20"/>
-          <w:szCs w:val="20"/>
-        </w:rPr>
         <w:tab/>
         <w:t>3</w:t>
       </w:r>
@@ -290,12 +272,6 @@
           <w:szCs w:val="20"/>
         </w:rPr>
         <w:t>2.2 RepairFlow als Solution Provider</w:t>
-      </w:r>
-      <w:r>
-        <w:rPr>
-          <w:sz w:val="20"/>
-          <w:szCs w:val="20"/>
-        </w:rPr>
         <w:tab/>
         <w:t>3</w:t>
       </w:r>
@@ -314,12 +290,6 @@
           <w:szCs w:val="20"/>
         </w:rPr>
         <w:t>2.3 Systemkontext und Systemgrenze</w:t>
-      </w:r>
-      <w:r>
-        <w:rPr>
-          <w:sz w:val="20"/>
-          <w:szCs w:val="20"/>
-        </w:rPr>
         <w:tab/>
         <w:t>3</w:t>
       </w:r>
@@ -338,12 +308,6 @@
           <w:szCs w:val="20"/>
         </w:rPr>
         <w:t>2.4 Der Reparaturauftrag als roter Faden</w:t>
-      </w:r>
-      <w:r>
-        <w:rPr>
-          <w:sz w:val="20"/>
-          <w:szCs w:val="20"/>
-        </w:rPr>
         <w:tab/>
         <w:t>4</w:t>
       </w:r>
@@ -362,12 +326,6 @@
           <w:szCs w:val="20"/>
         </w:rPr>
         <w:t>2.5 Alleinstellungsmerkmal: die KI-Sofortdiagnose</w:t>
-      </w:r>
-      <w:r>
-        <w:rPr>
-          <w:sz w:val="20"/>
-          <w:szCs w:val="20"/>
-        </w:rPr>
         <w:tab/>
         <w:t>4</w:t>
       </w:r>
@@ -385,12 +343,6 @@
           <w:bCs/>
         </w:rPr>
         <w:t>3 Vorgehen bei der Umsetzung</w:t>
-      </w:r>
-      <w:r>
-        <w:rPr>
-          <w:b/>
-          <w:bCs/>
-        </w:rPr>
         <w:tab/>
         <w:t>5</w:t>
       </w:r>
@@ -409,12 +361,6 @@
           <w:szCs w:val="20"/>
         </w:rPr>
         <w:t>3.1 Werkzeuge und Konventionen</w:t>
-      </w:r>
-      <w:r>
-        <w:rPr>
-          <w:sz w:val="20"/>
-          <w:szCs w:val="20"/>
-        </w:rPr>
         <w:tab/>
         <w:t>5</w:t>
       </w:r>
@@ -433,12 +379,6 @@
           <w:szCs w:val="20"/>
         </w:rPr>
         <w:t>3.2 Qualitätssicherung</w:t>
-      </w:r>
-      <w:r>
-        <w:rPr>
-          <w:sz w:val="20"/>
-          <w:szCs w:val="20"/>
-        </w:rPr>
         <w:tab/>
         <w:t>6</w:t>
       </w:r>
@@ -456,12 +396,6 @@
           <w:bCs/>
         </w:rPr>
         <w:t>4 Projektmanagement</w:t>
-      </w:r>
-      <w:r>
-        <w:rPr>
-          <w:b/>
-          <w:bCs/>
-        </w:rPr>
         <w:tab/>
         <w:t>6</w:t>
       </w:r>
@@ -480,12 +414,6 @@
           <w:szCs w:val="20"/>
         </w:rPr>
         <w:t>4.1 Vorgehensmodell und Kommunikation</w:t>
-      </w:r>
-      <w:r>
-        <w:rPr>
-          <w:sz w:val="20"/>
-          <w:szCs w:val="20"/>
-        </w:rPr>
         <w:tab/>
         <w:t>6</w:t>
       </w:r>
@@ -504,14 +432,8 @@
           <w:szCs w:val="20"/>
         </w:rPr>
         <w:t>4.2 Sprintplan und Verlauf</w:t>
-      </w:r>
-      <w:r>
-        <w:rPr>
-          <w:sz w:val="20"/>
-          <w:szCs w:val="20"/>
-        </w:rPr>
         <w:tab/>
-        <w:t>7</w:t>
+        <w:t>6</w:t>
       </w:r>
     </w:p>
     <w:p>
@@ -528,12 +450,6 @@
           <w:szCs w:val="20"/>
         </w:rPr>
         <w:t>4.3 Aufgabensteuerung und Repository</w:t>
-      </w:r>
-      <w:r>
-        <w:rPr>
-          <w:sz w:val="20"/>
-          <w:szCs w:val="20"/>
-        </w:rPr>
         <w:tab/>
         <w:t>7</w:t>
       </w:r>
@@ -552,12 +468,6 @@
           <w:szCs w:val="20"/>
         </w:rPr>
         <w:t>4.4 Risiken</w:t>
-      </w:r>
-      <w:r>
-        <w:rPr>
-          <w:sz w:val="20"/>
-          <w:szCs w:val="20"/>
-        </w:rPr>
         <w:tab/>
         <w:t>7</w:t>
       </w:r>
@@ -575,14 +485,8 @@
           <w:bCs/>
         </w:rPr>
         <w:t>5 Überblick über die erstellten Artefakte</w:t>
-      </w:r>
-      <w:r>
-        <w:rPr>
-          <w:b/>
-          <w:bCs/>
-        </w:rPr>
         <w:tab/>
-        <w:t>8</w:t>
+        <w:t>7</w:t>
       </w:r>
     </w:p>
     <w:p>
@@ -599,14 +503,8 @@
           <w:szCs w:val="20"/>
         </w:rPr>
         <w:t>5.1 Geschäftsprozessmodell (BPMN)</w:t>
-      </w:r>
-      <w:r>
-        <w:rPr>
-          <w:sz w:val="20"/>
-          <w:szCs w:val="20"/>
-        </w:rPr>
         <w:tab/>
-        <w:t>8</w:t>
+        <w:t>7</w:t>
       </w:r>
     </w:p>
     <w:p>
@@ -623,14 +521,8 @@
           <w:szCs w:val="20"/>
         </w:rPr>
         <w:t>5.2 Automatisierungspotential</w:t>
-      </w:r>
-      <w:r>
-        <w:rPr>
-          <w:sz w:val="20"/>
-          <w:szCs w:val="20"/>
-        </w:rPr>
         <w:tab/>
-        <w:t>11</w:t>
+        <w:t>10</w:t>
       </w:r>
     </w:p>
     <w:p>
@@ -647,14 +539,8 @@
           <w:szCs w:val="20"/>
         </w:rPr>
         <w:t>5.3 Use-Case-Diagramm</w:t>
-      </w:r>
-      <w:r>
-        <w:rPr>
-          <w:sz w:val="20"/>
-          <w:szCs w:val="20"/>
-        </w:rPr>
         <w:tab/>
-        <w:t>11</w:t>
+        <w:t>10</w:t>
       </w:r>
     </w:p>
     <w:p>
@@ -671,14 +557,8 @@
           <w:szCs w:val="20"/>
         </w:rPr>
         <w:t>5.4 Klassendiagramm</w:t>
-      </w:r>
-      <w:r>
-        <w:rPr>
-          <w:sz w:val="20"/>
-          <w:szCs w:val="20"/>
-        </w:rPr>
         <w:tab/>
-        <w:t>13</w:t>
+        <w:t>12</w:t>
       </w:r>
     </w:p>
     <w:p>
@@ -695,14 +575,8 @@
           <w:szCs w:val="20"/>
         </w:rPr>
         <w:t>5.5 Sequenzdiagramme</w:t>
-      </w:r>
-      <w:r>
-        <w:rPr>
-          <w:sz w:val="20"/>
-          <w:szCs w:val="20"/>
-        </w:rPr>
         <w:tab/>
-        <w:t>14</w:t>
+        <w:t>15</w:t>
       </w:r>
     </w:p>
     <w:p>
@@ -719,14 +593,8 @@
           <w:szCs w:val="20"/>
         </w:rPr>
         <w:t>5.6 Konsistenz zwischen den Modellen</w:t>
-      </w:r>
-      <w:r>
-        <w:rPr>
-          <w:sz w:val="20"/>
-          <w:szCs w:val="20"/>
-        </w:rPr>
         <w:tab/>
-        <w:t>16</w:t>
+        <w:t>17</w:t>
       </w:r>
     </w:p>
     <w:p>
@@ -742,14 +610,8 @@
           <w:bCs/>
         </w:rPr>
         <w:t>6 Probleme und Herausforderungen</w:t>
-      </w:r>
-      <w:r>
-        <w:rPr>
-          <w:b/>
-          <w:bCs/>
-        </w:rPr>
         <w:tab/>
-        <w:t>17</w:t>
+        <w:t>18</w:t>
       </w:r>
     </w:p>
     <w:p>
@@ -765,14 +627,8 @@
           <w:bCs/>
         </w:rPr>
         <w:t>7 Feedback</w:t>
-      </w:r>
-      <w:r>
-        <w:rPr>
-          <w:b/>
-          <w:bCs/>
-        </w:rPr>
         <w:tab/>
-        <w:t>18</w:t>
+        <w:t>19</w:t>
       </w:r>
     </w:p>
     <w:p>
@@ -789,14 +645,8 @@
           <w:szCs w:val="20"/>
         </w:rPr>
         <w:t>7.1 Feedback des Dozenten und Umsetzung</w:t>
-      </w:r>
-      <w:r>
-        <w:rPr>
-          <w:sz w:val="20"/>
-          <w:szCs w:val="20"/>
-        </w:rPr>
         <w:tab/>
-        <w:t>18</w:t>
+        <w:t>19</w:t>
       </w:r>
     </w:p>
     <w:p>
@@ -813,14 +663,8 @@
           <w:szCs w:val="20"/>
         </w:rPr>
         <w:t>7.2 Unser Feedback zur Fallstudie</w:t>
-      </w:r>
-      <w:r>
-        <w:rPr>
-          <w:sz w:val="20"/>
-          <w:szCs w:val="20"/>
-        </w:rPr>
         <w:tab/>
-        <w:t>18</w:t>
+        <w:t>19</w:t>
       </w:r>
     </w:p>
     <w:p>
@@ -1525,22 +1369,7 @@
         <w:t xml:space="preserve">Nina Sattler: </w:t>
       </w:r>
       <w:r>
-        <w:t xml:space="preserve">Gesamtplanung und Terminsteuerung, Prüfung der BPMN-Diagramme 07 und 08 in Sprint 1, Redaktion der </w:t>
-      </w:r>
-      <w:r>
-        <w:t xml:space="preserve">gesamten </w:t>
-      </w:r>
-      <w:r>
-        <w:t>Projektdokumentation</w:t>
-      </w:r>
-      <w:r>
-        <w:t xml:space="preserve"> </w:t>
-      </w:r>
-      <w:r>
-        <w:t>(Kapitel 1, 4 und 7, Abbildungen, Inhaltsverzeichnis, PDF)</w:t>
-      </w:r>
-      <w:r>
-        <w:t>, Zusammenstellung des Abgabe-Archivs, Folien 1–2 und 16–17.</w:t>
+        <w:t xml:space="preserve">Gesamtplanung und Terminsteuerung, Prüfung der BPMN-Diagramme 07 und 08 in Sprint 1, Redaktion der gesamten Projektdokumentation (Kapitel 1, 4 und 7, Abbildungen, Inhaltsverzeichnis, PDF), Zusammenstellung des Abgabe-Archivs, Folien 1–2 und 16–17.</w:t>
       </w:r>
     </w:p>
     <w:p>
@@ -1739,13 +1568,7 @@
         <w:jc w:val="both"/>
       </w:pPr>
       <w:r>
-        <w:t>RepairFlow ist ein Software-Startup, das Werkstätten eine cloudbasierte Plattform für den gesamten Reparaturablauf anbietet. Sie unterstützt den Prozess von der Kundenanfrage über Diagnose, Kostenvoranschlag (KVA), Ersatzteil-Disposition und Reparatur bis hin zu Abholung, Rechnung und Reklamation.</w:t>
-      </w:r>
-      <w:r>
-        <w:t xml:space="preserve"> </w:t>
-      </w:r>
-      <w:r>
-        <w:t>Wir treten als Softwareanbieter auf. Die FixWerk GmbH ist unser Pilotkunde, an dessen Abläufen wir die Anforderungen an die Plattform modellieren.</w:t>
+        <w:t xml:space="preserve">RepairFlow ist ein Software-Startup, das Werkstätten eine cloudbasierte Plattform für den gesamten Reparaturablauf anbietet. Sie unterstützt den Prozess von der Kundenanfrage über Diagnose, Kostenvoranschlag (KVA), Ersatzteil-Disposition und Reparatur bis hin zu Abholung, Rechnung und Reklamation. Wir treten als Softwareanbieter auf. Die FixWerk GmbH ist unser Pilotkunde, an dessen Abläufen wir die Anforderungen an die Plattform modellieren.</w:t>
       </w:r>
     </w:p>
     <w:p>
@@ -1754,19 +1577,7 @@
         <w:jc w:val="both"/>
       </w:pPr>
       <w:r>
-        <w:t xml:space="preserve">Die Plattform besteht aus vier Modulen: einem Kundenportal mit App, einem Auftrags- und Werkstattmodul, einem Dispositionsmodul für die filialübergreifende Ersatzteilversorgung sowie einer Abrechnung mit Schnittstelle zur Buchhaltung. </w:t>
-      </w:r>
-      <w:r>
-        <w:t xml:space="preserve">Zielkunden sind unabhängige Werkstätten und kleine Ketten mit zwei bis zehn Filialen im deutschsprachigen Raum. </w:t>
-      </w:r>
-      <w:r>
-        <w:t>Vorgesehen ist ein monatliches Abonnement je Filiale mit den Stufen Basis (Auftragsverwaltung und Kundenkommunikation) und Pro (zusätzlich filialübergreifende Disposition und KI-Sofortdiagnose). Unser Konzept verbindet Fahrrad-, E-Bike- und Elektronikreparaturen in einer Plattform</w:t>
-      </w:r>
-      <w:r>
-        <w:t xml:space="preserve"> </w:t>
-      </w:r>
-      <w:r>
-        <w:t>mit gemeinsamem Ersatzteillager. Einen belegten Funktionsvergleich mit bestehenden Werkstattlösungen haben wir nicht erstellt.</w:t>
+        <w:t xml:space="preserve">Die Plattform besteht aus vier Modulen: einem Kundenportal mit App, einem Auftrags- und Werkstattmodul, einem Dispositionsmodul für die filialübergreifende Ersatzteilversorgung sowie einer Abrechnung mit Schnittstelle zur Buchhaltung. Zielkunden sind unabhängige Werkstätten und kleine Ketten mit zwei bis zehn Filialen im deutschsprachigen Raum. Vorgesehen ist ein monatliches Abonnement je Filiale mit den Stufen Basis (Auftragsverwaltung und Kundenkommunikation) und Pro (zusätzlich filialübergreifende Disposition und KI-Sofortdiagnose). Unser Konzept verbindet Fahrrad-, E-Bike- und Elektronikreparaturen in einer Plattform mit gemeinsamem Ersatzteillager. Einen belegten Funktionsvergleich mit bestehenden Werkstattlösungen haben wir nicht erstellt.</w:t>
       </w:r>
     </w:p>
     <w:p>
@@ -1784,10 +1595,7 @@
         <w:jc w:val="both"/>
       </w:pPr>
       <w:r>
-        <w:t xml:space="preserve">Abbildung 1 stellt den Systemkontext und die Systemgrenze dar. </w:t>
-      </w:r>
-      <w:r>
-        <w:t>Innerhalb der Systemgrenze liegt die RepairFlow-Plattform. Der Werkstattbetrieb ist als Mandant angebunden, seine Rollen Service/Annahme, Techniker, Werkstattleitung und Ersatzteil-Disposition arbeiten in der Oberfläche der Plattform. Der Kunde nutzt das Kundenportal. Mit dem Lieferanten tauscht RepairFlow Bestellungen, Bestätigungen, Lieferungen und Retouren aus. Der KI-Diagnosedienst ist ein externer Dienst, den die Plattform zur Auswertung von Foto, Video und Ton aufruft. Außerhalb der Systemgrenze liegen die physische Reparatur, die Systeme der Lieferanten und die Buchhaltung, an die nur über eine Exportschnittstelle übergeben wird.</w:t>
+        <w:t xml:space="preserve">Abbildung 1 stellt den Systemkontext und die Systemgrenze dar. Innerhalb der Systemgrenze liegt die RepairFlow-Plattform. Der Werkstattbetrieb ist als Mandant angebunden, seine Rollen Service/Annahme, Techniker, Werkstattleitung und Ersatzteil-Disposition arbeiten in der Oberfläche der Plattform. Der Kunde nutzt das Kundenportal. Mit dem Lieferanten tauscht RepairFlow Bestellungen, Bestätigungen, Lieferungen und Retouren aus. Der KI-Diagnosedienst ist ein externer Dienst, den die Plattform zur Auswertung von Foto, Video und Ton aufruft. Außerhalb der Systemgrenze liegen die physische Reparatur, die Systeme der Lieferanten und die Buchhaltung, an die nur über eine Exportschnittstelle übergeben wird.</w:t>
       </w:r>
     </w:p>
     <w:p>
@@ -1895,13 +1703,7 @@
         <w:jc w:val="both"/>
       </w:pPr>
       <w:r>
-        <w:t xml:space="preserve">Bei der Konzeptvorstellung hat uns der Dozent geraten, </w:t>
-      </w:r>
-      <w:r>
-        <w:t xml:space="preserve">das Produkt um ein prägnantes Alleinstellungsmerkmal zu ergänzen, das auch visionär sein darf. </w:t>
-      </w:r>
-      <w:r>
-        <w:t>Wir haben uns für die KI-Sofortdiagnose entschieden. Sie setzt bei der Ungewissheit an, die Werkstattkunden vor einer Reparatur haben: Was kostet die Reparatur, und wie lange dauert sie?</w:t>
+        <w:t xml:space="preserve">Bei der Konzeptvorstellung hat uns der Dozent geraten, das Produkt um ein prägnantes Alleinstellungsmerkmal zu ergänzen, das auch visionär sein darf. Wir haben uns für die KI-Sofortdiagnose entschieden. Sie setzt bei der Ungewissheit an, die Werkstattkunden vor einer Reparatur haben: Was kostet die Reparatur, und wie lange dauert sie?</w:t>
       </w:r>
     </w:p>
     <w:p>
@@ -2627,19 +2429,6 @@
         <w:jc w:val="both"/>
       </w:pPr>
       <w:r>
-        <w:rPr>
-          <w:i/>
-          <w:shd w:val="clear" w:color="auto" w:fill="FFF2A8"/>
-        </w:rPr>
-        <w:t>[Nach Fertigstellung prüfen: Sind alle sechs Sequenzdiagramme in VP als Unterdiagramme angelegt und liegt UML-WWI25B4-Gruppe1.vpp in 2_uml/ (betrifft auch 4.3 und Tabelle 5)? Dann diesen Hinweis löschen.]</w:t>
-      </w:r>
-    </w:p>
-    <w:p>
-      <w:pPr>
-        <w:spacing w:after="120" w:line="276" w:lineRule="auto"/>
-        <w:jc w:val="both"/>
-      </w:pPr>
-      <w:r>
         <w:t>Damit die Modelle zusammenpassen, haben wir uns in Sprint 1 auf gemeinsame Regeln geeinigt:</w:t>
       </w:r>
     </w:p>
@@ -2693,8 +2482,6 @@
       </w:pPr>
       <w:r>
         <w:t xml:space="preserve">Die Beteiligten erscheinen in BPMN als Pool (Kunde) oder Lane (Service / Annahme, Techniker, Ersatzteil-Disposition, Werkstattleitung), im Use-Case-Diagramm als Rollen mit genau einem Use Case je Rolle (Tabelle 7), in den Sequenzdiagrammen als Akteure mit demselben </w:t>
-      </w:r>
-      <w:r>
         <w:lastRenderedPageBreak/>
         <w:t>Rollennamen und im Klassendiagramm als Unterklassen von Mitarbeiter. Welche Rolle zu welcher Klasse und Lane gehört, legt Tabelle 7 fest.</w:t>
       </w:r>
@@ -2738,11 +2525,6 @@
       <w:r>
         <w:t>Bis zum 05.10.2026 gab es mehrere Prüfrunden. In Sprint 1 haben wir die Diagramme im Zweierteam erstellt und gegenseitig geprüft. Bei der Gesamtprüfung am 26.09.2026 fanden wir fachliche Fehler, die wir gegenseitig überarbeitet haben. Die zweite Prüfrunde am 05.10.2026, bei der wir in der Gesamtgruppe alles auf Korrektheit überprüft haben, ergab nur noch kleinere Fehler in den Details. Die Korrekturen aus beiden Runden sind im Entscheidungslog als E-15 bis E-20 festgehalten.</w:t>
       </w:r>
-      <w:r/>
-      <w:r/>
-      <w:r/>
-      <w:r/>
-      <w:r/>
       <w:r>
         <w:rPr>
           <w:color w:val="000000"/>
@@ -2750,27 +2532,6 @@
           <w:szCs w:val="19"/>
         </w:rPr>
       </w:r>
-      <w:r/>
-      <w:r/>
-      <w:r/>
-      <w:r/>
-      <w:r/>
-      <w:r/>
-      <w:r/>
-      <w:r/>
-      <w:r/>
-      <w:r/>
-      <w:r/>
-      <w:r/>
-      <w:r/>
-      <w:r/>
-      <w:r/>
-      <w:r/>
-      <w:r/>
-      <w:r/>
-      <w:r/>
-      <w:r/>
-      <w:r/>
       <w:r/>
     </w:p>
     <w:p>
@@ -9065,70 +8826,47 @@
         <w:t>Zwei include-Beziehungen stehen für Teilschritte, die immer ausgeführt werden: „Sofortdiagnose anfordern“ und „Ersatzteile disponieren und reservieren“ schließen „Ersatzteil-Verfügbarkeit prüfen“ ein. Sechs extend-Beziehungen beschreiben bedingtes Verhalten. So erweitert „Lieferantenbestellung auslösen“ die Disposition nur, wenn Fehlteile vorhanden sind, und „Retoure abwickeln“ den Wareneingang nur bei mangelhafter Lieferung.</w:t>
       </w:r>
     </w:p>
-    <w:tbl>
-      <w:tblPr>
-        <w:tblW w:w="9070" w:type="dxa"/>
+    <w:p>
+      <w:pPr>
+        <w:keepNext/>
+        <w:spacing w:before="120"/>
         <w:jc w:val="center"/>
-        <w:tblBorders>
-          <w:top w:val="dashed" w:sz="8" w:space="0" w:color="B8860B"/>
-          <w:left w:val="dashed" w:sz="8" w:space="0" w:color="B8860B"/>
-          <w:bottom w:val="dashed" w:sz="8" w:space="0" w:color="B8860B"/>
-          <w:right w:val="dashed" w:sz="8" w:space="0" w:color="B8860B"/>
-        </w:tblBorders>
-        <w:tblCellMar>
-          <w:left w:w="10" w:type="dxa"/>
-          <w:right w:w="10" w:type="dxa"/>
-        </w:tblCellMar>
-        <w:tblLook w:val="04A0" w:firstRow="1" w:lastRow="0" w:firstColumn="1" w:lastColumn="0" w:noHBand="0" w:noVBand="1"/>
-      </w:tblPr>
-      <w:tblGrid>
-        <w:gridCol w:w="9070"/>
-      </w:tblGrid>
-      <w:tr>
-        <w:tblPrEx>
-          <w:tblCellMar>
-            <w:top w:w="0" w:type="dxa"/>
-            <w:bottom w:w="0" w:type="dxa"/>
-          </w:tblCellMar>
-        </w:tblPrEx>
-        <w:trPr>
-          <w:cantSplit/>
-          <w:trHeight w:hRule="exact" w:val="7371"/>
-          <w:jc w:val="center"/>
-        </w:trPr>
-        <w:tc>
-          <w:tcPr>
-            <w:tcW w:w="9106" w:type="dxa"/>
-            <w:shd w:val="clear" w:color="auto" w:fill="FFF8D6"/>
-            <w:vAlign w:val="center"/>
-          </w:tcPr>
-          <w:p>
-            <w:pPr>
-              <w:jc w:val="center"/>
-            </w:pPr>
-            <w:r>
-              <w:rPr>
-                <w:b/>
-              </w:rPr>
-              <w:lastRenderedPageBreak/>
-              <w:t>Abbildung einfügen: Use-Case-Diagramm „ud : RepairFlow“</w:t>
-            </w:r>
-          </w:p>
-          <w:p>
-            <w:pPr>
-              <w:jc w:val="center"/>
-            </w:pPr>
-            <w:r>
-              <w:rPr>
-                <w:i/>
-                <w:sz w:val="19"/>
-              </w:rPr>
-              <w:t>Visual Paradigm: Diagramm öffnen → File → Export → Active Diagram as Image → PNG. Einfügen mit 16 cm Breite, dann diesen Kasten löschen.</w:t>
-            </w:r>
-          </w:p>
-        </w:tc>
-      </w:tr>
-    </w:tbl>
+      </w:pPr>
+      <w:r>
+        <w:drawing>
+          <wp:inline xmlns:a="http://schemas.openxmlformats.org/drawingml/2006/main" xmlns:pic="http://schemas.openxmlformats.org/drawingml/2006/picture">
+            <wp:extent cx="3021910" cy="7920000"/>
+            <wp:docPr id="200" name="Picture 200"/>
+            <wp:cNvGraphicFramePr>
+              <a:graphicFrameLocks noChangeAspect="1"/>
+            </wp:cNvGraphicFramePr>
+            <a:graphic>
+              <a:graphicData uri="http://schemas.openxmlformats.org/drawingml/2006/picture">
+                <pic:pic>
+                  <pic:nvPicPr>
+                    <pic:cNvPr id="0" name="usecase-diagramm.png"/>
+                    <pic:cNvPicPr/>
+                  </pic:nvPicPr>
+                  <pic:blipFill>
+                    <a:blip r:embed="rId20"/>
+                    <a:stretch>
+                      <a:fillRect/>
+                    </a:stretch>
+                  </pic:blipFill>
+                  <pic:spPr>
+                    <a:xfrm>
+                      <a:off x="0" y="0"/>
+                      <a:ext cx="3021910" cy="7920000"/>
+                    </a:xfrm>
+                    <a:prstGeom prst="rect"/>
+                  </pic:spPr>
+                </pic:pic>
+              </a:graphicData>
+            </a:graphic>
+          </wp:inline>
+        </w:drawing>
+      </w:r>
+    </w:p>
     <w:p>
       <w:pPr>
         <w:spacing w:before="60" w:after="200"/>
@@ -9251,6 +8989,15 @@
           <w:numId w:val="2"/>
         </w:numPr>
         <w:spacing w:after="60" w:line="264" w:lineRule="auto"/>
+        <w:sectPr>
+          <w:headerReference w:type="default" r:id="rId8"/>
+          <w:footerReference w:type="default" r:id="rId9"/>
+          <w:pgSz w:w="11906" w:h="16838"/>
+          <w:pgMar w:top="1300" w:right="1400" w:bottom="1200" w:left="1400" w:header="708" w:footer="708" w:gutter="0"/>
+          <w:pgNumType w:start="1"/>
+          <w:cols w:space="720"/>
+          <w:docGrid w:linePitch="360"/>
+        </w:sectPr>
       </w:pPr>
       <w:r>
         <w:rPr>
@@ -9263,74 +9010,59 @@
         <w:t>Eine Reklamation verweist auf den Ursprungsauftrag und führt zu einem neuen Reparaturauftrag, dessen Attribut kostenfrei angibt, ob die Gewährleistung greift.</w:t>
       </w:r>
     </w:p>
-    <w:tbl>
-      <w:tblPr>
-        <w:tblW w:w="9070" w:type="dxa"/>
+    <w:p>
+      <w:pPr>
+        <w:keepNext/>
+        <w:spacing w:before="120"/>
         <w:jc w:val="center"/>
-        <w:tblBorders>
-          <w:top w:val="dashed" w:sz="8" w:space="0" w:color="B8860B"/>
-          <w:left w:val="dashed" w:sz="8" w:space="0" w:color="B8860B"/>
-          <w:bottom w:val="dashed" w:sz="8" w:space="0" w:color="B8860B"/>
-          <w:right w:val="dashed" w:sz="8" w:space="0" w:color="B8860B"/>
-        </w:tblBorders>
-        <w:tblCellMar>
-          <w:left w:w="10" w:type="dxa"/>
-          <w:right w:w="10" w:type="dxa"/>
-        </w:tblCellMar>
-        <w:tblLook w:val="04A0" w:firstRow="1" w:lastRow="0" w:firstColumn="1" w:lastColumn="0" w:noHBand="0" w:noVBand="1"/>
-      </w:tblPr>
-      <w:tblGrid>
-        <w:gridCol w:w="9070"/>
-      </w:tblGrid>
-      <w:tr>
-        <w:tblPrEx>
-          <w:tblCellMar>
-            <w:top w:w="0" w:type="dxa"/>
-            <w:bottom w:w="0" w:type="dxa"/>
-          </w:tblCellMar>
-        </w:tblPrEx>
-        <w:trPr>
-          <w:cantSplit/>
-          <w:trHeight w:hRule="exact" w:val="10773"/>
-          <w:jc w:val="center"/>
-        </w:trPr>
-        <w:tc>
-          <w:tcPr>
-            <w:tcW w:w="9106" w:type="dxa"/>
-            <w:shd w:val="clear" w:color="auto" w:fill="FFF8D6"/>
-            <w:vAlign w:val="center"/>
-          </w:tcPr>
-          <w:p>
-            <w:pPr>
-              <w:jc w:val="center"/>
-            </w:pPr>
-            <w:r>
-              <w:rPr>
-                <w:b/>
-              </w:rPr>
-              <w:lastRenderedPageBreak/>
-              <w:t>Abbildung einfügen: Klassendiagramm „cd : RepairFlow“</w:t>
-            </w:r>
-          </w:p>
-          <w:p>
-            <w:pPr>
-              <w:jc w:val="center"/>
-            </w:pPr>
-            <w:r>
-              <w:rPr>
-                <w:i/>
-                <w:sz w:val="19"/>
-              </w:rPr>
-              <w:t>Visual Paradigm: Diagramm öffnen → File → Export → Active Diagram as Image → PNG. Einfügen mit 16 cm Breite (bei Bedarf Querformat), dann diesen Kasten löschen.</w:t>
-            </w:r>
-          </w:p>
-        </w:tc>
-      </w:tr>
-    </w:tbl>
+      </w:pPr>
+      <w:r>
+        <w:drawing>
+          <wp:inline xmlns:a="http://schemas.openxmlformats.org/drawingml/2006/main" xmlns:pic="http://schemas.openxmlformats.org/drawingml/2006/picture">
+            <wp:extent cx="6984737" cy="5472000"/>
+            <wp:docPr id="201" name="Picture 201"/>
+            <wp:cNvGraphicFramePr>
+              <a:graphicFrameLocks noChangeAspect="1"/>
+            </wp:cNvGraphicFramePr>
+            <a:graphic>
+              <a:graphicData uri="http://schemas.openxmlformats.org/drawingml/2006/picture">
+                <pic:pic>
+                  <pic:nvPicPr>
+                    <pic:cNvPr id="0" name="klassendiagramm.png"/>
+                    <pic:cNvPicPr/>
+                  </pic:nvPicPr>
+                  <pic:blipFill>
+                    <a:blip r:embed="rId21"/>
+                    <a:stretch>
+                      <a:fillRect/>
+                    </a:stretch>
+                  </pic:blipFill>
+                  <pic:spPr>
+                    <a:xfrm>
+                      <a:off x="0" y="0"/>
+                      <a:ext cx="6984737" cy="5472000"/>
+                    </a:xfrm>
+                    <a:prstGeom prst="rect"/>
+                  </pic:spPr>
+                </pic:pic>
+              </a:graphicData>
+            </a:graphic>
+          </wp:inline>
+        </w:drawing>
+      </w:r>
+    </w:p>
     <w:p>
       <w:pPr>
         <w:spacing w:before="60" w:after="200"/>
         <w:jc w:val="center"/>
+        <w:sectPr>
+          <w:headerReference w:type="default" r:id="rId8"/>
+          <w:footerReference w:type="default" r:id="rId9"/>
+          <w:pgSz w:w="16838" w:h="11906" w:orient="landscape"/>
+          <w:pgMar w:top="1300" w:right="1400" w:bottom="1200" w:left="1400" w:header="708" w:footer="708" w:gutter="0"/>
+          <w:cols w:space="720"/>
+          <w:docGrid w:linePitch="360"/>
+        </w:sectPr>
       </w:pPr>
       <w:r>
         <w:rPr>
@@ -10201,69 +9933,47 @@
         <w:t>Abbildung 6 zeigt SD1 zum Alleinstellungsmerkmal, Abbildung 7 SD3 zur filialübergreifenden Disposition.</w:t>
       </w:r>
     </w:p>
-    <w:tbl>
-      <w:tblPr>
-        <w:tblW w:w="9070" w:type="dxa"/>
+    <w:p>
+      <w:pPr>
+        <w:keepNext/>
+        <w:spacing w:before="120"/>
         <w:jc w:val="center"/>
-        <w:tblBorders>
-          <w:top w:val="dashed" w:sz="8" w:space="0" w:color="B8860B"/>
-          <w:left w:val="dashed" w:sz="8" w:space="0" w:color="B8860B"/>
-          <w:bottom w:val="dashed" w:sz="8" w:space="0" w:color="B8860B"/>
-          <w:right w:val="dashed" w:sz="8" w:space="0" w:color="B8860B"/>
-        </w:tblBorders>
-        <w:tblCellMar>
-          <w:left w:w="10" w:type="dxa"/>
-          <w:right w:w="10" w:type="dxa"/>
-        </w:tblCellMar>
-        <w:tblLook w:val="04A0" w:firstRow="1" w:lastRow="0" w:firstColumn="1" w:lastColumn="0" w:noHBand="0" w:noVBand="1"/>
-      </w:tblPr>
-      <w:tblGrid>
-        <w:gridCol w:w="9070"/>
-      </w:tblGrid>
-      <w:tr>
-        <w:tblPrEx>
-          <w:tblCellMar>
-            <w:top w:w="0" w:type="dxa"/>
-            <w:bottom w:w="0" w:type="dxa"/>
-          </w:tblCellMar>
-        </w:tblPrEx>
-        <w:trPr>
-          <w:cantSplit/>
-          <w:trHeight w:hRule="exact" w:val="5670"/>
-          <w:jc w:val="center"/>
-        </w:trPr>
-        <w:tc>
-          <w:tcPr>
-            <w:tcW w:w="9106" w:type="dxa"/>
-            <w:shd w:val="clear" w:color="auto" w:fill="FFF8D6"/>
-            <w:vAlign w:val="center"/>
-          </w:tcPr>
-          <w:p>
-            <w:pPr>
-              <w:jc w:val="center"/>
-            </w:pPr>
-            <w:r>
-              <w:rPr>
-                <w:b/>
-              </w:rPr>
-              <w:t>Abbildung einfügen: SD1 – Sofortdiagnose anfordern (Unterdiagramm von UC01)</w:t>
-            </w:r>
-          </w:p>
-          <w:p>
-            <w:pPr>
-              <w:jc w:val="center"/>
-            </w:pPr>
-            <w:r>
-              <w:rPr>
-                <w:i/>
-                <w:sz w:val="19"/>
-              </w:rPr>
-              <w:t>Visual Paradigm: SD1 öffnen → File → Export → Active Diagram as Image → PNG. Einfügen mit 15 cm Breite, dann diesen Kasten löschen.</w:t>
-            </w:r>
-          </w:p>
-        </w:tc>
-      </w:tr>
-    </w:tbl>
+      </w:pPr>
+      <w:r>
+        <w:drawing>
+          <wp:inline xmlns:a="http://schemas.openxmlformats.org/drawingml/2006/main" xmlns:pic="http://schemas.openxmlformats.org/drawingml/2006/picture">
+            <wp:extent cx="5760000" cy="4820068"/>
+            <wp:docPr id="202" name="Picture 202"/>
+            <wp:cNvGraphicFramePr>
+              <a:graphicFrameLocks noChangeAspect="1"/>
+            </wp:cNvGraphicFramePr>
+            <a:graphic>
+              <a:graphicData uri="http://schemas.openxmlformats.org/drawingml/2006/picture">
+                <pic:pic>
+                  <pic:nvPicPr>
+                    <pic:cNvPr id="0" name="sequenz-01-sofortdiagnose.png"/>
+                    <pic:cNvPicPr/>
+                  </pic:nvPicPr>
+                  <pic:blipFill>
+                    <a:blip r:embed="rId22"/>
+                    <a:stretch>
+                      <a:fillRect/>
+                    </a:stretch>
+                  </pic:blipFill>
+                  <pic:spPr>
+                    <a:xfrm>
+                      <a:off x="0" y="0"/>
+                      <a:ext cx="5760000" cy="4820068"/>
+                    </a:xfrm>
+                    <a:prstGeom prst="rect"/>
+                  </pic:spPr>
+                </pic:pic>
+              </a:graphicData>
+            </a:graphic>
+          </wp:inline>
+        </w:drawing>
+      </w:r>
+    </w:p>
     <w:p>
       <w:pPr>
         <w:spacing w:before="60" w:after="200"/>
@@ -10280,70 +9990,47 @@
         <w:t>Abbildung 6: SD1 Sofortdiagnose anfordern (UC01)</w:t>
       </w:r>
     </w:p>
-    <w:tbl>
-      <w:tblPr>
-        <w:tblW w:w="9070" w:type="dxa"/>
+    <w:p>
+      <w:pPr>
+        <w:keepNext/>
+        <w:spacing w:before="120"/>
         <w:jc w:val="center"/>
-        <w:tblBorders>
-          <w:top w:val="dashed" w:sz="8" w:space="0" w:color="B8860B"/>
-          <w:left w:val="dashed" w:sz="8" w:space="0" w:color="B8860B"/>
-          <w:bottom w:val="dashed" w:sz="8" w:space="0" w:color="B8860B"/>
-          <w:right w:val="dashed" w:sz="8" w:space="0" w:color="B8860B"/>
-        </w:tblBorders>
-        <w:tblCellMar>
-          <w:left w:w="10" w:type="dxa"/>
-          <w:right w:w="10" w:type="dxa"/>
-        </w:tblCellMar>
-        <w:tblLook w:val="04A0" w:firstRow="1" w:lastRow="0" w:firstColumn="1" w:lastColumn="0" w:noHBand="0" w:noVBand="1"/>
-      </w:tblPr>
-      <w:tblGrid>
-        <w:gridCol w:w="9070"/>
-      </w:tblGrid>
-      <w:tr>
-        <w:tblPrEx>
-          <w:tblCellMar>
-            <w:top w:w="0" w:type="dxa"/>
-            <w:bottom w:w="0" w:type="dxa"/>
-          </w:tblCellMar>
-        </w:tblPrEx>
-        <w:trPr>
-          <w:cantSplit/>
-          <w:trHeight w:hRule="exact" w:val="5670"/>
-          <w:jc w:val="center"/>
-        </w:trPr>
-        <w:tc>
-          <w:tcPr>
-            <w:tcW w:w="9106" w:type="dxa"/>
-            <w:shd w:val="clear" w:color="auto" w:fill="FFF8D6"/>
-            <w:vAlign w:val="center"/>
-          </w:tcPr>
-          <w:p>
-            <w:pPr>
-              <w:jc w:val="center"/>
-            </w:pPr>
-            <w:r>
-              <w:rPr>
-                <w:b/>
-              </w:rPr>
-              <w:lastRenderedPageBreak/>
-              <w:t>Abbildung einfügen: SD3 – Ersatzteile disponieren und reservieren (Unterdiagramm von UC09)</w:t>
-            </w:r>
-          </w:p>
-          <w:p>
-            <w:pPr>
-              <w:jc w:val="center"/>
-            </w:pPr>
-            <w:r>
-              <w:rPr>
-                <w:i/>
-                <w:sz w:val="19"/>
-              </w:rPr>
-              <w:t>Visual Paradigm: SD3 öffnen → File → Export → Active Diagram as Image → PNG. Einfügen mit 15 cm Breite, dann diesen Kasten löschen.</w:t>
-            </w:r>
-          </w:p>
-        </w:tc>
-      </w:tr>
-    </w:tbl>
+      </w:pPr>
+      <w:r>
+        <w:drawing>
+          <wp:inline xmlns:a="http://schemas.openxmlformats.org/drawingml/2006/main" xmlns:pic="http://schemas.openxmlformats.org/drawingml/2006/picture">
+            <wp:extent cx="5760000" cy="4324140"/>
+            <wp:docPr id="203" name="Picture 203"/>
+            <wp:cNvGraphicFramePr>
+              <a:graphicFrameLocks noChangeAspect="1"/>
+            </wp:cNvGraphicFramePr>
+            <a:graphic>
+              <a:graphicData uri="http://schemas.openxmlformats.org/drawingml/2006/picture">
+                <pic:pic>
+                  <pic:nvPicPr>
+                    <pic:cNvPr id="0" name="sequenz-03-reservierung.png"/>
+                    <pic:cNvPicPr/>
+                  </pic:nvPicPr>
+                  <pic:blipFill>
+                    <a:blip r:embed="rId23"/>
+                    <a:stretch>
+                      <a:fillRect/>
+                    </a:stretch>
+                  </pic:blipFill>
+                  <pic:spPr>
+                    <a:xfrm>
+                      <a:off x="0" y="0"/>
+                      <a:ext cx="5760000" cy="4324140"/>
+                    </a:xfrm>
+                    <a:prstGeom prst="rect"/>
+                  </pic:spPr>
+                </pic:pic>
+              </a:graphicData>
+            </a:graphic>
+          </wp:inline>
+        </w:drawing>
+      </w:r>
+    </w:p>
     <w:p>
       <w:pPr>
         <w:spacing w:before="60" w:after="200"/>
@@ -11862,7 +11549,6 @@
       <w:footerReference w:type="default" r:id="rId9"/>
       <w:pgSz w:w="11906" w:h="16838"/>
       <w:pgMar w:top="1300" w:right="1400" w:bottom="1200" w:left="1400" w:header="708" w:footer="708" w:gutter="0"/>
-      <w:pgNumType w:start="1"/>
       <w:cols w:space="720"/>
       <w:docGrid w:linePitch="360"/>
     </w:sectPr>

</xml_diff>

<commit_message>
[T05 2026-10-20] docs: hochaufgelöste BPMN-Bilder in der Doku, TODO auf Stand 20.10.
- Abb. 2 (P01) und Abb. 3 (P04) durch die neuen PNG-Exporte aus PR #35 ersetzt, PDF neu erzeugt
- TODO B: PNG-Export erledigt, Bestätigung der Problems-Panel-Prüfung offen
- TODO D: Befunde aus PR #36 (doppelte Folie 6/7, Kennzahlen und PR-Zahl wieder alt, Zustandsdiagramm auf Folie 9/13, Foliennummern), Abgleich des Mockups mit dem Modell

Co-Authored-By: Claude Opus 5.5 <noreply@anthropic.com>
Claude-Session: https://claude.ai/code/session_01H2bGsFaySUqsEjJ1PXuxUw
</commit_message>
<xml_diff>
--- a/3_doku/Projektdokumentation.docx
+++ b/3_doku/Projektdokumentation.docx
@@ -6561,7 +6561,7 @@
       <w:r>
         <w:drawing>
           <wp:inline xmlns:a="http://schemas.openxmlformats.org/drawingml/2006/main" xmlns:pic="http://schemas.openxmlformats.org/drawingml/2006/picture">
-            <wp:extent cx="5760000" cy="2096305"/>
+            <wp:extent cx="5760000" cy="2063184"/>
             <wp:docPr id="3" name="Picture 3"/>
             <wp:cNvGraphicFramePr>
               <a:graphicFrameLocks noChangeAspect="1"/>
@@ -6582,7 +6582,7 @@
                   <pic:spPr>
                     <a:xfrm>
                       <a:off x="0" y="0"/>
-                      <a:ext cx="5760000" cy="2096305"/>
+                      <a:ext cx="5760000" cy="2063184"/>
                     </a:xfrm>
                     <a:prstGeom prst="rect"/>
                   </pic:spPr>
@@ -6616,7 +6616,7 @@
       <w:r>
         <w:drawing>
           <wp:inline xmlns:a="http://schemas.openxmlformats.org/drawingml/2006/main" xmlns:pic="http://schemas.openxmlformats.org/drawingml/2006/picture">
-            <wp:extent cx="5760000" cy="2364632"/>
+            <wp:extent cx="5760000" cy="2323330"/>
             <wp:docPr id="2" name="Picture 2"/>
             <wp:cNvGraphicFramePr>
               <a:graphicFrameLocks noChangeAspect="1"/>
@@ -6637,7 +6637,7 @@
                   <pic:spPr>
                     <a:xfrm>
                       <a:off x="0" y="0"/>
-                      <a:ext cx="5760000" cy="2364632"/>
+                      <a:ext cx="5760000" cy="2323330"/>
                     </a:xfrm>
                     <a:prstGeom prst="rect"/>
                   </pic:spPr>

</xml_diff>

<commit_message>
[T05 2026-10-20] docs: Tabelle 7 mit Use-Case-Namen, Kapitel 6 gekürzt
Co-Authored-By: Claude Fable 5.1 <noreply@anthropic.com>
Claude-Session: https://claude.ai/code/session_01H2bGsFaySUqsEjJ1PXuxUw
</commit_message>
<xml_diff>
--- a/3_doku/Projektdokumentation.docx
+++ b/3_doku/Projektdokumentation.docx
@@ -421,7 +421,7 @@
         </w:rPr>
         <w:t>4.2 Sprintplan und Verlauf</w:t>
         <w:tab/>
-        <w:t>7</w:t>
+        <w:t>6</w:t>
       </w:r>
     </w:p>
     <w:p>
@@ -474,7 +474,7 @@
         </w:rPr>
         <w:t>5 Überblick über die erstellten Artefakte</w:t>
         <w:tab/>
-        <w:t>8</w:t>
+        <w:t>7</w:t>
       </w:r>
     </w:p>
     <w:p>
@@ -492,7 +492,7 @@
         </w:rPr>
         <w:t>5.1 Geschäftsprozessmodell (BPMN)</w:t>
         <w:tab/>
-        <w:t>8</w:t>
+        <w:t>7</w:t>
       </w:r>
     </w:p>
     <w:p>
@@ -528,7 +528,7 @@
         </w:rPr>
         <w:t>5.3 Use-Case-Diagramm</w:t>
         <w:tab/>
-        <w:t>11</w:t>
+        <w:t>10</w:t>
       </w:r>
     </w:p>
     <w:p>
@@ -1404,7 +1404,7 @@
         <w:t xml:space="preserve">Kilian Platter: </w:t>
       </w:r>
       <w:r>
-        <w:t>eigener Entwurf und dessen Zusammenführung mit dem Solution-Provider-Entwurf, fachliche Prüfung der Diagramme mit Korrekturen, Klassendiagramm, SD1 bis SD4 in Visual Paradigm, Visual-Paradigm-Projekt und Konsistenzprüfung der Sequenzdiagramme gegen das Klassendiagramm, Sprint-Rituale und Trello-Board; in der Präsentation Datenmodell sowie Vorgehen und Projektmanagement.</w:t>
+        <w:t>fachliche Prüfung der Diagramme mit Korrekturen, Klassendiagramm, SD1 bis SD4 in Visual Paradigm, Visual-Paradigm-Projekt und Konsistenzprüfung der Sequenzdiagramme gegen das Klassendiagramm, Sprint-Rituale und Trello-Board; in der Präsentation Datenmodell sowie Vorgehen und Projektmanagement.</w:t>
       </w:r>
     </w:p>
     <w:p>
@@ -6537,7 +6537,7 @@
         <w:jc w:val="both"/>
       </w:pPr>
       <w:r>
-        <w:t xml:space="preserve">Das Use-Case-Diagramm (Abbildung 4) zeigt, was RepairFlow aus Sicht seiner Benutzer leistet. Es enthält 19 Use Cases und 17 Akteure: den Kunden, 15 Mitarbeiterrollen und den KI-Diagnosedienst als externes System. Der Lieferant ist kein Akteur, sondern eine Black Box ohne Zugang zu RepairFlow; wie in den Prozessmodellen kommt er nur über Nachrichten vor. Jeder Use Case hat genau eine Rolle als primären Akteur. Diese Struktur geht auf einen Hinweis des Dozenten vom 15.10.2026 zurück: Unsere erste Fassung hatte acht Akteure mit bis zu acht Verbindungen, etwa den Techniker an Diagnose, KVA, Reparatur, Fertigmeldung und Reklamation. Statt eines Akteurs mit vielen Linien gibt es jetzt je Use Case eine Rolle, zum Beispiel Diagnoseprüfer, Diagnostiker, Kalkulator, Reparateur und Endkontrolleur anstelle des Technikers. Welche Person eine Rolle ausfüllt, regelt das Organigramm des Werkstattbetriebs; im Modell sind das die Unterklassen von Mitarbeiter (Tabelle 7). Der Kunde ist einmal dargestellt und mit UC01, UC02 und UC07 verbunden. UC08 „Ersatzteil-Verfügbarkeit prüfen“ wird nur über include erreicht und hat deshalb keinen eigenen Akteur.</w:t>
+        <w:t xml:space="preserve">Das Use-Case-Diagramm (Abbildung 4) zeigt, was RepairFlow aus Sicht seiner Benutzer leistet. Es enthält 19 Use Cases und 17 Akteure: den Kunden, 15 Mitarbeiterrollen und den KI-Diagnosedienst als externes System. Der Lieferant ist kein Akteur, sondern eine Black Box ohne Zugang zu RepairFlow; wie in den Prozessmodellen kommt er nur über Nachrichten vor. Jeder Use Case hat genau eine Rolle als primären Akteur; die Nummern UC01 bis UC19 dienen nur der Zuordnung in den Tabellen, im Diagramm stehen die Namen. Diese Struktur geht auf einen Hinweis des Dozenten vom 15.10.2026 zurück: Unsere erste Fassung hatte acht Akteure mit bis zu acht Verbindungen, etwa den Techniker an Diagnose, KVA, Reparatur, Fertigmeldung und Reklamation. Statt eines Akteurs mit vielen Linien gibt es jetzt je Use Case eine Rolle, zum Beispiel Diagnoseprüfer, Diagnostiker, Kalkulator, Reparateur und Endkontrolleur anstelle des Technikers. Welche Person eine Rolle ausfüllt, regelt das Organigramm des Werkstattbetriebs; im Modell sind das die Unterklassen von Mitarbeiter (Tabelle 7). Der Kunde ist einmal dargestellt und mit UC01, UC02 und UC07 verbunden. UC08 „Ersatzteil-Verfügbarkeit prüfen“ wird nur über include erreicht und hat deshalb keinen eigenen Akteur.</w:t>
       </w:r>
     </w:p>
     <w:tbl>
@@ -6558,10 +6558,10 @@
         <w:tblLook w:val="04A0" w:firstRow="1" w:lastRow="0" w:firstColumn="1" w:lastColumn="0" w:noHBand="0" w:noVBand="1"/>
       </w:tblPr>
       <w:tblGrid>
-        <w:gridCol w:w="2457"/>
-        <w:gridCol w:w="1521"/>
-        <w:gridCol w:w="2691"/>
-        <w:gridCol w:w="2691"/>
+        <w:gridCol w:w="2200"/>
+        <w:gridCol w:w="3360"/>
+        <w:gridCol w:w="1900"/>
+        <w:gridCol w:w="1900"/>
       </w:tblGrid>
       <w:tr>
         <w:trPr>
@@ -6570,7 +6570,7 @@
         </w:trPr>
         <w:tc>
           <w:tcPr>
-            <w:tcW w:w="2381" w:type="dxa"/>
+            <w:tcW w:w="2130" w:type="dxa"/>
             <w:shd w:val="clear" w:color="auto" w:fill="1F3864"/>
             <w:tcMar>
               <w:top w:w="50" w:type="dxa"/>
@@ -6599,7 +6599,7 @@
         </w:tc>
         <w:tc>
           <w:tcPr>
-            <w:tcW w:w="1474" w:type="dxa"/>
+            <w:tcW w:w="3261" w:type="dxa"/>
             <w:shd w:val="clear" w:color="auto" w:fill="1F3864"/>
             <w:tcMar>
               <w:top w:w="50" w:type="dxa"/>
@@ -6627,7 +6627,7 @@
         </w:tc>
         <w:tc>
           <w:tcPr>
-            <w:tcW w:w="2608" w:type="dxa"/>
+            <w:tcW w:w="1840" w:type="dxa"/>
             <w:shd w:val="clear" w:color="auto" w:fill="1F3864"/>
             <w:tcMar>
               <w:top w:w="50" w:type="dxa"/>
@@ -6655,7 +6655,7 @@
         </w:tc>
         <w:tc>
           <w:tcPr>
-            <w:tcW w:w="2608" w:type="dxa"/>
+            <w:tcW w:w="1840" w:type="dxa"/>
             <w:shd w:val="clear" w:color="auto" w:fill="1F3864"/>
             <w:tcMar>
               <w:top w:w="50" w:type="dxa"/>
@@ -6688,7 +6688,7 @@
         </w:trPr>
         <w:tc>
           <w:tcPr>
-            <w:tcW w:w="2381" w:type="dxa"/>
+            <w:tcW w:w="2130" w:type="dxa"/>
             <w:tcMar>
               <w:top w:w="50" w:type="dxa"/>
               <w:left w:w="90" w:type="dxa"/>
@@ -6713,32 +6713,32 @@
         </w:tc>
         <w:tc>
           <w:tcPr>
-            <w:tcW w:w="1474" w:type="dxa"/>
-            <w:tcMar>
-              <w:top w:w="50" w:type="dxa"/>
-              <w:left w:w="90" w:type="dxa"/>
-              <w:bottom w:w="50" w:type="dxa"/>
-              <w:right w:w="90" w:type="dxa"/>
-            </w:tcMar>
-          </w:tcPr>
-          <w:p>
-            <w:pPr>
-              <w:keepNext/>
-              <w:spacing w:after="40" w:line="252" w:lineRule="auto"/>
-            </w:pPr>
-            <w:r>
-              <w:rPr>
-                <w:color w:val="000000"/>
-                <w:sz w:val="19"/>
-                <w:szCs w:val="19"/>
-              </w:rPr>
-              <w:t>UC01, UC02, UC07</w:t>
-            </w:r>
-          </w:p>
-        </w:tc>
-        <w:tc>
-          <w:tcPr>
-            <w:tcW w:w="2608" w:type="dxa"/>
+            <w:tcW w:w="3261" w:type="dxa"/>
+            <w:tcMar>
+              <w:top w:w="50" w:type="dxa"/>
+              <w:left w:w="90" w:type="dxa"/>
+              <w:bottom w:w="50" w:type="dxa"/>
+              <w:right w:w="90" w:type="dxa"/>
+            </w:tcMar>
+          </w:tcPr>
+          <w:p>
+            <w:pPr>
+              <w:keepNext/>
+              <w:spacing w:after="40" w:line="252" w:lineRule="auto"/>
+            </w:pPr>
+            <w:r>
+              <w:rPr>
+                <w:color w:val="000000"/>
+                <w:sz w:val="19"/>
+                <w:szCs w:val="19"/>
+              </w:rPr>
+              <w:t>UC01 Sofortdiagnose anfordern; UC02 Voranmeldung bestätigen; UC07 KVA freigeben / ablehnen</w:t>
+            </w:r>
+          </w:p>
+        </w:tc>
+        <w:tc>
+          <w:tcPr>
+            <w:tcW w:w="1840" w:type="dxa"/>
             <w:tcMar>
               <w:top w:w="50" w:type="dxa"/>
               <w:left w:w="90" w:type="dxa"/>
@@ -6763,7 +6763,7 @@
         </w:tc>
         <w:tc>
           <w:tcPr>
-            <w:tcW w:w="2608" w:type="dxa"/>
+            <w:tcW w:w="1840" w:type="dxa"/>
             <w:tcMar>
               <w:top w:w="50" w:type="dxa"/>
               <w:left w:w="90" w:type="dxa"/>
@@ -6793,7 +6793,7 @@
         </w:trPr>
         <w:tc>
           <w:tcPr>
-            <w:tcW w:w="2381" w:type="dxa"/>
+            <w:tcW w:w="2130" w:type="dxa"/>
             <w:tcMar>
               <w:top w:w="50" w:type="dxa"/>
               <w:left w:w="90" w:type="dxa"/>
@@ -6818,32 +6818,32 @@
         </w:tc>
         <w:tc>
           <w:tcPr>
-            <w:tcW w:w="1474" w:type="dxa"/>
-            <w:tcMar>
-              <w:top w:w="50" w:type="dxa"/>
-              <w:left w:w="90" w:type="dxa"/>
-              <w:bottom w:w="50" w:type="dxa"/>
-              <w:right w:w="90" w:type="dxa"/>
-            </w:tcMar>
-          </w:tcPr>
-          <w:p>
-            <w:pPr>
-              <w:keepNext/>
-              <w:spacing w:after="40" w:line="252" w:lineRule="auto"/>
-            </w:pPr>
-            <w:r>
-              <w:rPr>
-                <w:color w:val="000000"/>
-                <w:sz w:val="19"/>
-                <w:szCs w:val="19"/>
-              </w:rPr>
-              <w:t>UC03</w:t>
-            </w:r>
-          </w:p>
-        </w:tc>
-        <w:tc>
-          <w:tcPr>
-            <w:tcW w:w="2608" w:type="dxa"/>
+            <w:tcW w:w="3261" w:type="dxa"/>
+            <w:tcMar>
+              <w:top w:w="50" w:type="dxa"/>
+              <w:left w:w="90" w:type="dxa"/>
+              <w:bottom w:w="50" w:type="dxa"/>
+              <w:right w:w="90" w:type="dxa"/>
+            </w:tcMar>
+          </w:tcPr>
+          <w:p>
+            <w:pPr>
+              <w:keepNext/>
+              <w:spacing w:after="40" w:line="252" w:lineRule="auto"/>
+            </w:pPr>
+            <w:r>
+              <w:rPr>
+                <w:color w:val="000000"/>
+                <w:sz w:val="19"/>
+                <w:szCs w:val="19"/>
+              </w:rPr>
+              <w:t>UC03 Reparaturauftrag anlegen</w:t>
+            </w:r>
+          </w:p>
+        </w:tc>
+        <w:tc>
+          <w:tcPr>
+            <w:tcW w:w="1840" w:type="dxa"/>
             <w:tcMar>
               <w:top w:w="50" w:type="dxa"/>
               <w:left w:w="90" w:type="dxa"/>
@@ -6868,7 +6868,7 @@
         </w:tc>
         <w:tc>
           <w:tcPr>
-            <w:tcW w:w="2608" w:type="dxa"/>
+            <w:tcW w:w="1840" w:type="dxa"/>
             <w:tcMar>
               <w:top w:w="50" w:type="dxa"/>
               <w:left w:w="90" w:type="dxa"/>
@@ -6898,7 +6898,7 @@
         </w:trPr>
         <w:tc>
           <w:tcPr>
-            <w:tcW w:w="2381" w:type="dxa"/>
+            <w:tcW w:w="2130" w:type="dxa"/>
             <w:tcMar>
               <w:top w:w="50" w:type="dxa"/>
               <w:left w:w="90" w:type="dxa"/>
@@ -6923,32 +6923,32 @@
         </w:tc>
         <w:tc>
           <w:tcPr>
-            <w:tcW w:w="1474" w:type="dxa"/>
-            <w:tcMar>
-              <w:top w:w="50" w:type="dxa"/>
-              <w:left w:w="90" w:type="dxa"/>
-              <w:bottom w:w="50" w:type="dxa"/>
-              <w:right w:w="90" w:type="dxa"/>
-            </w:tcMar>
-          </w:tcPr>
-          <w:p>
-            <w:pPr>
-              <w:keepNext/>
-              <w:spacing w:after="40" w:line="252" w:lineRule="auto"/>
-            </w:pPr>
-            <w:r>
-              <w:rPr>
-                <w:color w:val="000000"/>
-                <w:sz w:val="19"/>
-                <w:szCs w:val="19"/>
-              </w:rPr>
-              <w:t>UC15</w:t>
-            </w:r>
-          </w:p>
-        </w:tc>
-        <w:tc>
-          <w:tcPr>
-            <w:tcW w:w="2608" w:type="dxa"/>
+            <w:tcW w:w="3261" w:type="dxa"/>
+            <w:tcMar>
+              <w:top w:w="50" w:type="dxa"/>
+              <w:left w:w="90" w:type="dxa"/>
+              <w:bottom w:w="50" w:type="dxa"/>
+              <w:right w:w="90" w:type="dxa"/>
+            </w:tcMar>
+          </w:tcPr>
+          <w:p>
+            <w:pPr>
+              <w:keepNext/>
+              <w:spacing w:after="40" w:line="252" w:lineRule="auto"/>
+            </w:pPr>
+            <w:r>
+              <w:rPr>
+                <w:color w:val="000000"/>
+                <w:sz w:val="19"/>
+                <w:szCs w:val="19"/>
+              </w:rPr>
+              <w:t>UC15 Abholung und Abrechnung abwickeln</w:t>
+            </w:r>
+          </w:p>
+        </w:tc>
+        <w:tc>
+          <w:tcPr>
+            <w:tcW w:w="1840" w:type="dxa"/>
             <w:tcMar>
               <w:top w:w="50" w:type="dxa"/>
               <w:left w:w="90" w:type="dxa"/>
@@ -6973,7 +6973,7 @@
         </w:tc>
         <w:tc>
           <w:tcPr>
-            <w:tcW w:w="2608" w:type="dxa"/>
+            <w:tcW w:w="1840" w:type="dxa"/>
             <w:tcMar>
               <w:top w:w="50" w:type="dxa"/>
               <w:left w:w="90" w:type="dxa"/>
@@ -7003,7 +7003,7 @@
         </w:trPr>
         <w:tc>
           <w:tcPr>
-            <w:tcW w:w="2381" w:type="dxa"/>
+            <w:tcW w:w="2130" w:type="dxa"/>
             <w:tcMar>
               <w:top w:w="50" w:type="dxa"/>
               <w:left w:w="90" w:type="dxa"/>
@@ -7028,32 +7028,32 @@
         </w:tc>
         <w:tc>
           <w:tcPr>
-            <w:tcW w:w="1474" w:type="dxa"/>
-            <w:tcMar>
-              <w:top w:w="50" w:type="dxa"/>
-              <w:left w:w="90" w:type="dxa"/>
-              <w:bottom w:w="50" w:type="dxa"/>
-              <w:right w:w="90" w:type="dxa"/>
-            </w:tcMar>
-          </w:tcPr>
-          <w:p>
-            <w:pPr>
-              <w:keepNext/>
-              <w:spacing w:after="40" w:line="252" w:lineRule="auto"/>
-            </w:pPr>
-            <w:r>
-              <w:rPr>
-                <w:color w:val="000000"/>
-                <w:sz w:val="19"/>
-                <w:szCs w:val="19"/>
-              </w:rPr>
-              <w:t>UC16</w:t>
-            </w:r>
-          </w:p>
-        </w:tc>
-        <w:tc>
-          <w:tcPr>
-            <w:tcW w:w="2608" w:type="dxa"/>
+            <w:tcW w:w="3261" w:type="dxa"/>
+            <w:tcMar>
+              <w:top w:w="50" w:type="dxa"/>
+              <w:left w:w="90" w:type="dxa"/>
+              <w:bottom w:w="50" w:type="dxa"/>
+              <w:right w:w="90" w:type="dxa"/>
+            </w:tcMar>
+          </w:tcPr>
+          <w:p>
+            <w:pPr>
+              <w:keepNext/>
+              <w:spacing w:after="40" w:line="252" w:lineRule="auto"/>
+            </w:pPr>
+            <w:r>
+              <w:rPr>
+                <w:color w:val="000000"/>
+                <w:sz w:val="19"/>
+                <w:szCs w:val="19"/>
+              </w:rPr>
+              <w:t>UC16 Reklamation bearbeiten</w:t>
+            </w:r>
+          </w:p>
+        </w:tc>
+        <w:tc>
+          <w:tcPr>
+            <w:tcW w:w="1840" w:type="dxa"/>
             <w:tcMar>
               <w:top w:w="50" w:type="dxa"/>
               <w:left w:w="90" w:type="dxa"/>
@@ -7078,7 +7078,7 @@
         </w:tc>
         <w:tc>
           <w:tcPr>
-            <w:tcW w:w="2608" w:type="dxa"/>
+            <w:tcW w:w="1840" w:type="dxa"/>
             <w:tcMar>
               <w:top w:w="50" w:type="dxa"/>
               <w:left w:w="90" w:type="dxa"/>
@@ -7108,7 +7108,7 @@
         </w:trPr>
         <w:tc>
           <w:tcPr>
-            <w:tcW w:w="2381" w:type="dxa"/>
+            <w:tcW w:w="2130" w:type="dxa"/>
             <w:tcMar>
               <w:top w:w="50" w:type="dxa"/>
               <w:left w:w="90" w:type="dxa"/>
@@ -7133,32 +7133,32 @@
         </w:tc>
         <w:tc>
           <w:tcPr>
-            <w:tcW w:w="1474" w:type="dxa"/>
-            <w:tcMar>
-              <w:top w:w="50" w:type="dxa"/>
-              <w:left w:w="90" w:type="dxa"/>
-              <w:bottom w:w="50" w:type="dxa"/>
-              <w:right w:w="90" w:type="dxa"/>
-            </w:tcMar>
-          </w:tcPr>
-          <w:p>
-            <w:pPr>
-              <w:keepNext/>
-              <w:spacing w:after="40" w:line="252" w:lineRule="auto"/>
-            </w:pPr>
-            <w:r>
-              <w:rPr>
-                <w:color w:val="000000"/>
-                <w:sz w:val="19"/>
-                <w:szCs w:val="19"/>
-              </w:rPr>
-              <w:t>UC04</w:t>
-            </w:r>
-          </w:p>
-        </w:tc>
-        <w:tc>
-          <w:tcPr>
-            <w:tcW w:w="2608" w:type="dxa"/>
+            <w:tcW w:w="3261" w:type="dxa"/>
+            <w:tcMar>
+              <w:top w:w="50" w:type="dxa"/>
+              <w:left w:w="90" w:type="dxa"/>
+              <w:bottom w:w="50" w:type="dxa"/>
+              <w:right w:w="90" w:type="dxa"/>
+            </w:tcMar>
+          </w:tcPr>
+          <w:p>
+            <w:pPr>
+              <w:keepNext/>
+              <w:spacing w:after="40" w:line="252" w:lineRule="auto"/>
+            </w:pPr>
+            <w:r>
+              <w:rPr>
+                <w:color w:val="000000"/>
+                <w:sz w:val="19"/>
+                <w:szCs w:val="19"/>
+              </w:rPr>
+              <w:t>UC04 Diagnosevorschlag prüfen</w:t>
+            </w:r>
+          </w:p>
+        </w:tc>
+        <w:tc>
+          <w:tcPr>
+            <w:tcW w:w="1840" w:type="dxa"/>
             <w:tcMar>
               <w:top w:w="50" w:type="dxa"/>
               <w:left w:w="90" w:type="dxa"/>
@@ -7183,7 +7183,7 @@
         </w:tc>
         <w:tc>
           <w:tcPr>
-            <w:tcW w:w="2608" w:type="dxa"/>
+            <w:tcW w:w="1840" w:type="dxa"/>
             <w:tcMar>
               <w:top w:w="50" w:type="dxa"/>
               <w:left w:w="90" w:type="dxa"/>
@@ -7213,7 +7213,7 @@
         </w:trPr>
         <w:tc>
           <w:tcPr>
-            <w:tcW w:w="2381" w:type="dxa"/>
+            <w:tcW w:w="2130" w:type="dxa"/>
             <w:tcMar>
               <w:top w:w="50" w:type="dxa"/>
               <w:left w:w="90" w:type="dxa"/>
@@ -7238,32 +7238,32 @@
         </w:tc>
         <w:tc>
           <w:tcPr>
-            <w:tcW w:w="1474" w:type="dxa"/>
-            <w:tcMar>
-              <w:top w:w="50" w:type="dxa"/>
-              <w:left w:w="90" w:type="dxa"/>
-              <w:bottom w:w="50" w:type="dxa"/>
-              <w:right w:w="90" w:type="dxa"/>
-            </w:tcMar>
-          </w:tcPr>
-          <w:p>
-            <w:pPr>
-              <w:keepNext/>
-              <w:spacing w:after="40" w:line="252" w:lineRule="auto"/>
-            </w:pPr>
-            <w:r>
-              <w:rPr>
-                <w:color w:val="000000"/>
-                <w:sz w:val="19"/>
-                <w:szCs w:val="19"/>
-              </w:rPr>
-              <w:t>UC05</w:t>
-            </w:r>
-          </w:p>
-        </w:tc>
-        <w:tc>
-          <w:tcPr>
-            <w:tcW w:w="2608" w:type="dxa"/>
+            <w:tcW w:w="3261" w:type="dxa"/>
+            <w:tcMar>
+              <w:top w:w="50" w:type="dxa"/>
+              <w:left w:w="90" w:type="dxa"/>
+              <w:bottom w:w="50" w:type="dxa"/>
+              <w:right w:w="90" w:type="dxa"/>
+            </w:tcMar>
+          </w:tcPr>
+          <w:p>
+            <w:pPr>
+              <w:keepNext/>
+              <w:spacing w:after="40" w:line="252" w:lineRule="auto"/>
+            </w:pPr>
+            <w:r>
+              <w:rPr>
+                <w:color w:val="000000"/>
+                <w:sz w:val="19"/>
+                <w:szCs w:val="19"/>
+              </w:rPr>
+              <w:t>UC05 Diagnosebefund erfassen</w:t>
+            </w:r>
+          </w:p>
+        </w:tc>
+        <w:tc>
+          <w:tcPr>
+            <w:tcW w:w="1840" w:type="dxa"/>
             <w:tcMar>
               <w:top w:w="50" w:type="dxa"/>
               <w:left w:w="90" w:type="dxa"/>
@@ -7288,7 +7288,7 @@
         </w:tc>
         <w:tc>
           <w:tcPr>
-            <w:tcW w:w="2608" w:type="dxa"/>
+            <w:tcW w:w="1840" w:type="dxa"/>
             <w:tcMar>
               <w:top w:w="50" w:type="dxa"/>
               <w:left w:w="90" w:type="dxa"/>
@@ -7318,7 +7318,7 @@
         </w:trPr>
         <w:tc>
           <w:tcPr>
-            <w:tcW w:w="2381" w:type="dxa"/>
+            <w:tcW w:w="2130" w:type="dxa"/>
             <w:tcMar>
               <w:top w:w="50" w:type="dxa"/>
               <w:left w:w="90" w:type="dxa"/>
@@ -7343,32 +7343,32 @@
         </w:tc>
         <w:tc>
           <w:tcPr>
-            <w:tcW w:w="1474" w:type="dxa"/>
-            <w:tcMar>
-              <w:top w:w="50" w:type="dxa"/>
-              <w:left w:w="90" w:type="dxa"/>
-              <w:bottom w:w="50" w:type="dxa"/>
-              <w:right w:w="90" w:type="dxa"/>
-            </w:tcMar>
-          </w:tcPr>
-          <w:p>
-            <w:pPr>
-              <w:keepNext/>
-              <w:spacing w:after="40" w:line="252" w:lineRule="auto"/>
-            </w:pPr>
-            <w:r>
-              <w:rPr>
-                <w:color w:val="000000"/>
-                <w:sz w:val="19"/>
-                <w:szCs w:val="19"/>
-              </w:rPr>
-              <w:t>UC06</w:t>
-            </w:r>
-          </w:p>
-        </w:tc>
-        <w:tc>
-          <w:tcPr>
-            <w:tcW w:w="2608" w:type="dxa"/>
+            <w:tcW w:w="3261" w:type="dxa"/>
+            <w:tcMar>
+              <w:top w:w="50" w:type="dxa"/>
+              <w:left w:w="90" w:type="dxa"/>
+              <w:bottom w:w="50" w:type="dxa"/>
+              <w:right w:w="90" w:type="dxa"/>
+            </w:tcMar>
+          </w:tcPr>
+          <w:p>
+            <w:pPr>
+              <w:keepNext/>
+              <w:spacing w:after="40" w:line="252" w:lineRule="auto"/>
+            </w:pPr>
+            <w:r>
+              <w:rPr>
+                <w:color w:val="000000"/>
+                <w:sz w:val="19"/>
+                <w:szCs w:val="19"/>
+              </w:rPr>
+              <w:t>UC06 KVA erstellen</w:t>
+            </w:r>
+          </w:p>
+        </w:tc>
+        <w:tc>
+          <w:tcPr>
+            <w:tcW w:w="1840" w:type="dxa"/>
             <w:tcMar>
               <w:top w:w="50" w:type="dxa"/>
               <w:left w:w="90" w:type="dxa"/>
@@ -7393,7 +7393,7 @@
         </w:tc>
         <w:tc>
           <w:tcPr>
-            <w:tcW w:w="2608" w:type="dxa"/>
+            <w:tcW w:w="1840" w:type="dxa"/>
             <w:tcMar>
               <w:top w:w="50" w:type="dxa"/>
               <w:left w:w="90" w:type="dxa"/>
@@ -7423,7 +7423,7 @@
         </w:trPr>
         <w:tc>
           <w:tcPr>
-            <w:tcW w:w="2381" w:type="dxa"/>
+            <w:tcW w:w="2130" w:type="dxa"/>
             <w:tcMar>
               <w:top w:w="50" w:type="dxa"/>
               <w:left w:w="90" w:type="dxa"/>
@@ -7448,32 +7448,32 @@
         </w:tc>
         <w:tc>
           <w:tcPr>
-            <w:tcW w:w="1474" w:type="dxa"/>
-            <w:tcMar>
-              <w:top w:w="50" w:type="dxa"/>
-              <w:left w:w="90" w:type="dxa"/>
-              <w:bottom w:w="50" w:type="dxa"/>
-              <w:right w:w="90" w:type="dxa"/>
-            </w:tcMar>
-          </w:tcPr>
-          <w:p>
-            <w:pPr>
-              <w:keepNext/>
-              <w:spacing w:after="40" w:line="252" w:lineRule="auto"/>
-            </w:pPr>
-            <w:r>
-              <w:rPr>
-                <w:color w:val="000000"/>
-                <w:sz w:val="19"/>
-                <w:szCs w:val="19"/>
-              </w:rPr>
-              <w:t>UC13</w:t>
-            </w:r>
-          </w:p>
-        </w:tc>
-        <w:tc>
-          <w:tcPr>
-            <w:tcW w:w="2608" w:type="dxa"/>
+            <w:tcW w:w="3261" w:type="dxa"/>
+            <w:tcMar>
+              <w:top w:w="50" w:type="dxa"/>
+              <w:left w:w="90" w:type="dxa"/>
+              <w:bottom w:w="50" w:type="dxa"/>
+              <w:right w:w="90" w:type="dxa"/>
+            </w:tcMar>
+          </w:tcPr>
+          <w:p>
+            <w:pPr>
+              <w:keepNext/>
+              <w:spacing w:after="40" w:line="252" w:lineRule="auto"/>
+            </w:pPr>
+            <w:r>
+              <w:rPr>
+                <w:color w:val="000000"/>
+                <w:sz w:val="19"/>
+                <w:szCs w:val="19"/>
+              </w:rPr>
+              <w:t>UC13 Reparaturschritt und Arbeitszeit erfassen</w:t>
+            </w:r>
+          </w:p>
+        </w:tc>
+        <w:tc>
+          <w:tcPr>
+            <w:tcW w:w="1840" w:type="dxa"/>
             <w:tcMar>
               <w:top w:w="50" w:type="dxa"/>
               <w:left w:w="90" w:type="dxa"/>
@@ -7498,7 +7498,7 @@
         </w:tc>
         <w:tc>
           <w:tcPr>
-            <w:tcW w:w="2608" w:type="dxa"/>
+            <w:tcW w:w="1840" w:type="dxa"/>
             <w:tcMar>
               <w:top w:w="50" w:type="dxa"/>
               <w:left w:w="90" w:type="dxa"/>
@@ -7528,7 +7528,7 @@
         </w:trPr>
         <w:tc>
           <w:tcPr>
-            <w:tcW w:w="2381" w:type="dxa"/>
+            <w:tcW w:w="2130" w:type="dxa"/>
             <w:tcMar>
               <w:top w:w="50" w:type="dxa"/>
               <w:left w:w="90" w:type="dxa"/>
@@ -7553,32 +7553,32 @@
         </w:tc>
         <w:tc>
           <w:tcPr>
-            <w:tcW w:w="1474" w:type="dxa"/>
-            <w:tcMar>
-              <w:top w:w="50" w:type="dxa"/>
-              <w:left w:w="90" w:type="dxa"/>
-              <w:bottom w:w="50" w:type="dxa"/>
-              <w:right w:w="90" w:type="dxa"/>
-            </w:tcMar>
-          </w:tcPr>
-          <w:p>
-            <w:pPr>
-              <w:keepNext/>
-              <w:spacing w:after="40" w:line="252" w:lineRule="auto"/>
-            </w:pPr>
-            <w:r>
-              <w:rPr>
-                <w:color w:val="000000"/>
-                <w:sz w:val="19"/>
-                <w:szCs w:val="19"/>
-              </w:rPr>
-              <w:t>UC14</w:t>
-            </w:r>
-          </w:p>
-        </w:tc>
-        <w:tc>
-          <w:tcPr>
-            <w:tcW w:w="2608" w:type="dxa"/>
+            <w:tcW w:w="3261" w:type="dxa"/>
+            <w:tcMar>
+              <w:top w:w="50" w:type="dxa"/>
+              <w:left w:w="90" w:type="dxa"/>
+              <w:bottom w:w="50" w:type="dxa"/>
+              <w:right w:w="90" w:type="dxa"/>
+            </w:tcMar>
+          </w:tcPr>
+          <w:p>
+            <w:pPr>
+              <w:keepNext/>
+              <w:spacing w:after="40" w:line="252" w:lineRule="auto"/>
+            </w:pPr>
+            <w:r>
+              <w:rPr>
+                <w:color w:val="000000"/>
+                <w:sz w:val="19"/>
+                <w:szCs w:val="19"/>
+              </w:rPr>
+              <w:t>UC14 Auftrag fertigmelden</w:t>
+            </w:r>
+          </w:p>
+        </w:tc>
+        <w:tc>
+          <w:tcPr>
+            <w:tcW w:w="1840" w:type="dxa"/>
             <w:tcMar>
               <w:top w:w="50" w:type="dxa"/>
               <w:left w:w="90" w:type="dxa"/>
@@ -7603,7 +7603,7 @@
         </w:tc>
         <w:tc>
           <w:tcPr>
-            <w:tcW w:w="2608" w:type="dxa"/>
+            <w:tcW w:w="1840" w:type="dxa"/>
             <w:tcMar>
               <w:top w:w="50" w:type="dxa"/>
               <w:left w:w="90" w:type="dxa"/>
@@ -7633,7 +7633,7 @@
         </w:trPr>
         <w:tc>
           <w:tcPr>
-            <w:tcW w:w="2381" w:type="dxa"/>
+            <w:tcW w:w="2130" w:type="dxa"/>
             <w:tcMar>
               <w:top w:w="50" w:type="dxa"/>
               <w:left w:w="90" w:type="dxa"/>
@@ -7658,32 +7658,32 @@
         </w:tc>
         <w:tc>
           <w:tcPr>
-            <w:tcW w:w="1474" w:type="dxa"/>
-            <w:tcMar>
-              <w:top w:w="50" w:type="dxa"/>
-              <w:left w:w="90" w:type="dxa"/>
-              <w:bottom w:w="50" w:type="dxa"/>
-              <w:right w:w="90" w:type="dxa"/>
-            </w:tcMar>
-          </w:tcPr>
-          <w:p>
-            <w:pPr>
-              <w:keepNext/>
-              <w:spacing w:after="40" w:line="252" w:lineRule="auto"/>
-            </w:pPr>
-            <w:r>
-              <w:rPr>
-                <w:color w:val="000000"/>
-                <w:sz w:val="19"/>
-                <w:szCs w:val="19"/>
-              </w:rPr>
-              <w:t>UC09</w:t>
-            </w:r>
-          </w:p>
-        </w:tc>
-        <w:tc>
-          <w:tcPr>
-            <w:tcW w:w="2608" w:type="dxa"/>
+            <w:tcW w:w="3261" w:type="dxa"/>
+            <w:tcMar>
+              <w:top w:w="50" w:type="dxa"/>
+              <w:left w:w="90" w:type="dxa"/>
+              <w:bottom w:w="50" w:type="dxa"/>
+              <w:right w:w="90" w:type="dxa"/>
+            </w:tcMar>
+          </w:tcPr>
+          <w:p>
+            <w:pPr>
+              <w:keepNext/>
+              <w:spacing w:after="40" w:line="252" w:lineRule="auto"/>
+            </w:pPr>
+            <w:r>
+              <w:rPr>
+                <w:color w:val="000000"/>
+                <w:sz w:val="19"/>
+                <w:szCs w:val="19"/>
+              </w:rPr>
+              <w:t>UC09 Ersatzteile disponieren und reservieren</w:t>
+            </w:r>
+          </w:p>
+        </w:tc>
+        <w:tc>
+          <w:tcPr>
+            <w:tcW w:w="1840" w:type="dxa"/>
             <w:tcMar>
               <w:top w:w="50" w:type="dxa"/>
               <w:left w:w="90" w:type="dxa"/>
@@ -7708,7 +7708,7 @@
         </w:tc>
         <w:tc>
           <w:tcPr>
-            <w:tcW w:w="2608" w:type="dxa"/>
+            <w:tcW w:w="1840" w:type="dxa"/>
             <w:tcMar>
               <w:top w:w="50" w:type="dxa"/>
               <w:left w:w="90" w:type="dxa"/>
@@ -7738,7 +7738,7 @@
         </w:trPr>
         <w:tc>
           <w:tcPr>
-            <w:tcW w:w="2381" w:type="dxa"/>
+            <w:tcW w:w="2130" w:type="dxa"/>
             <w:tcMar>
               <w:top w:w="50" w:type="dxa"/>
               <w:left w:w="90" w:type="dxa"/>
@@ -7763,32 +7763,32 @@
         </w:tc>
         <w:tc>
           <w:tcPr>
-            <w:tcW w:w="1474" w:type="dxa"/>
-            <w:tcMar>
-              <w:top w:w="50" w:type="dxa"/>
-              <w:left w:w="90" w:type="dxa"/>
-              <w:bottom w:w="50" w:type="dxa"/>
-              <w:right w:w="90" w:type="dxa"/>
-            </w:tcMar>
-          </w:tcPr>
-          <w:p>
-            <w:pPr>
-              <w:keepNext/>
-              <w:spacing w:after="40" w:line="252" w:lineRule="auto"/>
-            </w:pPr>
-            <w:r>
-              <w:rPr>
-                <w:color w:val="000000"/>
-                <w:sz w:val="19"/>
-                <w:szCs w:val="19"/>
-              </w:rPr>
-              <w:t>UC12</w:t>
-            </w:r>
-          </w:p>
-        </w:tc>
-        <w:tc>
-          <w:tcPr>
-            <w:tcW w:w="2608" w:type="dxa"/>
+            <w:tcW w:w="3261" w:type="dxa"/>
+            <w:tcMar>
+              <w:top w:w="50" w:type="dxa"/>
+              <w:left w:w="90" w:type="dxa"/>
+              <w:bottom w:w="50" w:type="dxa"/>
+              <w:right w:w="90" w:type="dxa"/>
+            </w:tcMar>
+          </w:tcPr>
+          <w:p>
+            <w:pPr>
+              <w:keepNext/>
+              <w:spacing w:after="40" w:line="252" w:lineRule="auto"/>
+            </w:pPr>
+            <w:r>
+              <w:rPr>
+                <w:color w:val="000000"/>
+                <w:sz w:val="19"/>
+                <w:szCs w:val="19"/>
+              </w:rPr>
+              <w:t>UC12 Nachbestellvorschlag erzeugen</w:t>
+            </w:r>
+          </w:p>
+        </w:tc>
+        <w:tc>
+          <w:tcPr>
+            <w:tcW w:w="1840" w:type="dxa"/>
             <w:tcMar>
               <w:top w:w="50" w:type="dxa"/>
               <w:left w:w="90" w:type="dxa"/>
@@ -7813,7 +7813,7 @@
         </w:tc>
         <w:tc>
           <w:tcPr>
-            <w:tcW w:w="2608" w:type="dxa"/>
+            <w:tcW w:w="1840" w:type="dxa"/>
             <w:tcMar>
               <w:top w:w="50" w:type="dxa"/>
               <w:left w:w="90" w:type="dxa"/>
@@ -7843,7 +7843,7 @@
         </w:trPr>
         <w:tc>
           <w:tcPr>
-            <w:tcW w:w="2381" w:type="dxa"/>
+            <w:tcW w:w="2130" w:type="dxa"/>
             <w:tcMar>
               <w:top w:w="50" w:type="dxa"/>
               <w:left w:w="90" w:type="dxa"/>
@@ -7868,32 +7868,32 @@
         </w:tc>
         <w:tc>
           <w:tcPr>
-            <w:tcW w:w="1474" w:type="dxa"/>
-            <w:tcMar>
-              <w:top w:w="50" w:type="dxa"/>
-              <w:left w:w="90" w:type="dxa"/>
-              <w:bottom w:w="50" w:type="dxa"/>
-              <w:right w:w="90" w:type="dxa"/>
-            </w:tcMar>
-          </w:tcPr>
-          <w:p>
-            <w:pPr>
-              <w:keepNext/>
-              <w:spacing w:after="40" w:line="252" w:lineRule="auto"/>
-            </w:pPr>
-            <w:r>
-              <w:rPr>
-                <w:color w:val="000000"/>
-                <w:sz w:val="19"/>
-                <w:szCs w:val="19"/>
-              </w:rPr>
-              <w:t>UC10</w:t>
-            </w:r>
-          </w:p>
-        </w:tc>
-        <w:tc>
-          <w:tcPr>
-            <w:tcW w:w="2608" w:type="dxa"/>
+            <w:tcW w:w="3261" w:type="dxa"/>
+            <w:tcMar>
+              <w:top w:w="50" w:type="dxa"/>
+              <w:left w:w="90" w:type="dxa"/>
+              <w:bottom w:w="50" w:type="dxa"/>
+              <w:right w:w="90" w:type="dxa"/>
+            </w:tcMar>
+          </w:tcPr>
+          <w:p>
+            <w:pPr>
+              <w:keepNext/>
+              <w:spacing w:after="40" w:line="252" w:lineRule="auto"/>
+            </w:pPr>
+            <w:r>
+              <w:rPr>
+                <w:color w:val="000000"/>
+                <w:sz w:val="19"/>
+                <w:szCs w:val="19"/>
+              </w:rPr>
+              <w:t>UC10 Lieferantenbestellung auslösen</w:t>
+            </w:r>
+          </w:p>
+        </w:tc>
+        <w:tc>
+          <w:tcPr>
+            <w:tcW w:w="1840" w:type="dxa"/>
             <w:tcMar>
               <w:top w:w="50" w:type="dxa"/>
               <w:left w:w="90" w:type="dxa"/>
@@ -7918,7 +7918,7 @@
         </w:tc>
         <w:tc>
           <w:tcPr>
-            <w:tcW w:w="2608" w:type="dxa"/>
+            <w:tcW w:w="1840" w:type="dxa"/>
             <w:tcMar>
               <w:top w:w="50" w:type="dxa"/>
               <w:left w:w="90" w:type="dxa"/>
@@ -7948,7 +7948,7 @@
         </w:trPr>
         <w:tc>
           <w:tcPr>
-            <w:tcW w:w="2381" w:type="dxa"/>
+            <w:tcW w:w="2130" w:type="dxa"/>
             <w:tcMar>
               <w:top w:w="50" w:type="dxa"/>
               <w:left w:w="90" w:type="dxa"/>
@@ -7973,32 +7973,32 @@
         </w:tc>
         <w:tc>
           <w:tcPr>
-            <w:tcW w:w="1474" w:type="dxa"/>
-            <w:tcMar>
-              <w:top w:w="50" w:type="dxa"/>
-              <w:left w:w="90" w:type="dxa"/>
-              <w:bottom w:w="50" w:type="dxa"/>
-              <w:right w:w="90" w:type="dxa"/>
-            </w:tcMar>
-          </w:tcPr>
-          <w:p>
-            <w:pPr>
-              <w:keepNext/>
-              <w:spacing w:after="40" w:line="252" w:lineRule="auto"/>
-            </w:pPr>
-            <w:r>
-              <w:rPr>
-                <w:color w:val="000000"/>
-                <w:sz w:val="19"/>
-                <w:szCs w:val="19"/>
-              </w:rPr>
-              <w:t>UC11</w:t>
-            </w:r>
-          </w:p>
-        </w:tc>
-        <w:tc>
-          <w:tcPr>
-            <w:tcW w:w="2608" w:type="dxa"/>
+            <w:tcW w:w="3261" w:type="dxa"/>
+            <w:tcMar>
+              <w:top w:w="50" w:type="dxa"/>
+              <w:left w:w="90" w:type="dxa"/>
+              <w:bottom w:w="50" w:type="dxa"/>
+              <w:right w:w="90" w:type="dxa"/>
+            </w:tcMar>
+          </w:tcPr>
+          <w:p>
+            <w:pPr>
+              <w:keepNext/>
+              <w:spacing w:after="40" w:line="252" w:lineRule="auto"/>
+            </w:pPr>
+            <w:r>
+              <w:rPr>
+                <w:color w:val="000000"/>
+                <w:sz w:val="19"/>
+                <w:szCs w:val="19"/>
+              </w:rPr>
+              <w:t>UC11 Wareneingang buchen</w:t>
+            </w:r>
+          </w:p>
+        </w:tc>
+        <w:tc>
+          <w:tcPr>
+            <w:tcW w:w="1840" w:type="dxa"/>
             <w:tcMar>
               <w:top w:w="50" w:type="dxa"/>
               <w:left w:w="90" w:type="dxa"/>
@@ -8023,7 +8023,7 @@
         </w:tc>
         <w:tc>
           <w:tcPr>
-            <w:tcW w:w="2608" w:type="dxa"/>
+            <w:tcW w:w="1840" w:type="dxa"/>
             <w:tcMar>
               <w:top w:w="50" w:type="dxa"/>
               <w:left w:w="90" w:type="dxa"/>
@@ -8053,7 +8053,7 @@
         </w:trPr>
         <w:tc>
           <w:tcPr>
-            <w:tcW w:w="2381" w:type="dxa"/>
+            <w:tcW w:w="2130" w:type="dxa"/>
             <w:tcMar>
               <w:top w:w="50" w:type="dxa"/>
               <w:left w:w="90" w:type="dxa"/>
@@ -8078,32 +8078,32 @@
         </w:tc>
         <w:tc>
           <w:tcPr>
-            <w:tcW w:w="1474" w:type="dxa"/>
-            <w:tcMar>
-              <w:top w:w="50" w:type="dxa"/>
-              <w:left w:w="90" w:type="dxa"/>
-              <w:bottom w:w="50" w:type="dxa"/>
-              <w:right w:w="90" w:type="dxa"/>
-            </w:tcMar>
-          </w:tcPr>
-          <w:p>
-            <w:pPr>
-              <w:keepNext/>
-              <w:spacing w:after="40" w:line="252" w:lineRule="auto"/>
-            </w:pPr>
-            <w:r>
-              <w:rPr>
-                <w:color w:val="000000"/>
-                <w:sz w:val="19"/>
-                <w:szCs w:val="19"/>
-              </w:rPr>
-              <w:t>UC19</w:t>
-            </w:r>
-          </w:p>
-        </w:tc>
-        <w:tc>
-          <w:tcPr>
-            <w:tcW w:w="2608" w:type="dxa"/>
+            <w:tcW w:w="3261" w:type="dxa"/>
+            <w:tcMar>
+              <w:top w:w="50" w:type="dxa"/>
+              <w:left w:w="90" w:type="dxa"/>
+              <w:bottom w:w="50" w:type="dxa"/>
+              <w:right w:w="90" w:type="dxa"/>
+            </w:tcMar>
+          </w:tcPr>
+          <w:p>
+            <w:pPr>
+              <w:keepNext/>
+              <w:spacing w:after="40" w:line="252" w:lineRule="auto"/>
+            </w:pPr>
+            <w:r>
+              <w:rPr>
+                <w:color w:val="000000"/>
+                <w:sz w:val="19"/>
+                <w:szCs w:val="19"/>
+              </w:rPr>
+              <w:t>UC19 Retoure abwickeln</w:t>
+            </w:r>
+          </w:p>
+        </w:tc>
+        <w:tc>
+          <w:tcPr>
+            <w:tcW w:w="1840" w:type="dxa"/>
             <w:tcMar>
               <w:top w:w="50" w:type="dxa"/>
               <w:left w:w="90" w:type="dxa"/>
@@ -8128,7 +8128,7 @@
         </w:tc>
         <w:tc>
           <w:tcPr>
-            <w:tcW w:w="2608" w:type="dxa"/>
+            <w:tcW w:w="1840" w:type="dxa"/>
             <w:tcMar>
               <w:top w:w="50" w:type="dxa"/>
               <w:left w:w="90" w:type="dxa"/>
@@ -8158,7 +8158,7 @@
         </w:trPr>
         <w:tc>
           <w:tcPr>
-            <w:tcW w:w="2381" w:type="dxa"/>
+            <w:tcW w:w="2130" w:type="dxa"/>
             <w:tcMar>
               <w:top w:w="50" w:type="dxa"/>
               <w:left w:w="90" w:type="dxa"/>
@@ -8183,32 +8183,32 @@
         </w:tc>
         <w:tc>
           <w:tcPr>
-            <w:tcW w:w="1474" w:type="dxa"/>
-            <w:tcMar>
-              <w:top w:w="50" w:type="dxa"/>
-              <w:left w:w="90" w:type="dxa"/>
-              <w:bottom w:w="50" w:type="dxa"/>
-              <w:right w:w="90" w:type="dxa"/>
-            </w:tcMar>
-          </w:tcPr>
-          <w:p>
-            <w:pPr>
-              <w:keepNext/>
-              <w:spacing w:after="40" w:line="252" w:lineRule="auto"/>
-            </w:pPr>
-            <w:r>
-              <w:rPr>
-                <w:color w:val="000000"/>
-                <w:sz w:val="19"/>
-                <w:szCs w:val="19"/>
-              </w:rPr>
-              <w:t>UC17</w:t>
-            </w:r>
-          </w:p>
-        </w:tc>
-        <w:tc>
-          <w:tcPr>
-            <w:tcW w:w="2608" w:type="dxa"/>
+            <w:tcW w:w="3261" w:type="dxa"/>
+            <w:tcMar>
+              <w:top w:w="50" w:type="dxa"/>
+              <w:left w:w="90" w:type="dxa"/>
+              <w:bottom w:w="50" w:type="dxa"/>
+              <w:right w:w="90" w:type="dxa"/>
+            </w:tcMar>
+          </w:tcPr>
+          <w:p>
+            <w:pPr>
+              <w:keepNext/>
+              <w:spacing w:after="40" w:line="252" w:lineRule="auto"/>
+            </w:pPr>
+            <w:r>
+              <w:rPr>
+                <w:color w:val="000000"/>
+                <w:sz w:val="19"/>
+                <w:szCs w:val="19"/>
+              </w:rPr>
+              <w:t>UC17 Werkstatttermin planen und Techniker zuweisen</w:t>
+            </w:r>
+          </w:p>
+        </w:tc>
+        <w:tc>
+          <w:tcPr>
+            <w:tcW w:w="1840" w:type="dxa"/>
             <w:tcMar>
               <w:top w:w="50" w:type="dxa"/>
               <w:left w:w="90" w:type="dxa"/>
@@ -8233,7 +8233,7 @@
         </w:tc>
         <w:tc>
           <w:tcPr>
-            <w:tcW w:w="2608" w:type="dxa"/>
+            <w:tcW w:w="1840" w:type="dxa"/>
             <w:tcMar>
               <w:top w:w="50" w:type="dxa"/>
               <w:left w:w="90" w:type="dxa"/>
@@ -8263,7 +8263,7 @@
         </w:trPr>
         <w:tc>
           <w:tcPr>
-            <w:tcW w:w="2381" w:type="dxa"/>
+            <w:tcW w:w="2130" w:type="dxa"/>
             <w:tcMar>
               <w:top w:w="50" w:type="dxa"/>
               <w:left w:w="90" w:type="dxa"/>
@@ -8288,32 +8288,32 @@
         </w:tc>
         <w:tc>
           <w:tcPr>
-            <w:tcW w:w="1474" w:type="dxa"/>
-            <w:tcMar>
-              <w:top w:w="50" w:type="dxa"/>
-              <w:left w:w="90" w:type="dxa"/>
-              <w:bottom w:w="50" w:type="dxa"/>
-              <w:right w:w="90" w:type="dxa"/>
-            </w:tcMar>
-          </w:tcPr>
-          <w:p>
-            <w:pPr>
-              <w:keepNext/>
-              <w:spacing w:after="40" w:line="252" w:lineRule="auto"/>
-            </w:pPr>
-            <w:r>
-              <w:rPr>
-                <w:color w:val="000000"/>
-                <w:sz w:val="19"/>
-                <w:szCs w:val="19"/>
-              </w:rPr>
-              <w:t>UC18</w:t>
-            </w:r>
-          </w:p>
-        </w:tc>
-        <w:tc>
-          <w:tcPr>
-            <w:tcW w:w="2608" w:type="dxa"/>
+            <w:tcW w:w="3261" w:type="dxa"/>
+            <w:tcMar>
+              <w:top w:w="50" w:type="dxa"/>
+              <w:left w:w="90" w:type="dxa"/>
+              <w:bottom w:w="50" w:type="dxa"/>
+              <w:right w:w="90" w:type="dxa"/>
+            </w:tcMar>
+          </w:tcPr>
+          <w:p>
+            <w:pPr>
+              <w:keepNext/>
+              <w:spacing w:after="40" w:line="252" w:lineRule="auto"/>
+            </w:pPr>
+            <w:r>
+              <w:rPr>
+                <w:color w:val="000000"/>
+                <w:sz w:val="19"/>
+                <w:szCs w:val="19"/>
+              </w:rPr>
+              <w:t>UC18 Werkstattbetrieb und Filialen verwalten</w:t>
+            </w:r>
+          </w:p>
+        </w:tc>
+        <w:tc>
+          <w:tcPr>
+            <w:tcW w:w="1840" w:type="dxa"/>
             <w:tcMar>
               <w:top w:w="50" w:type="dxa"/>
               <w:left w:w="90" w:type="dxa"/>
@@ -8338,7 +8338,7 @@
         </w:tc>
         <w:tc>
           <w:tcPr>
-            <w:tcW w:w="2608" w:type="dxa"/>
+            <w:tcW w:w="1840" w:type="dxa"/>
             <w:tcMar>
               <w:top w:w="50" w:type="dxa"/>
               <w:left w:w="90" w:type="dxa"/>
@@ -8368,7 +8368,7 @@
         </w:trPr>
         <w:tc>
           <w:tcPr>
-            <w:tcW w:w="2381" w:type="dxa"/>
+            <w:tcW w:w="2130" w:type="dxa"/>
             <w:tcMar>
               <w:top w:w="50" w:type="dxa"/>
               <w:left w:w="90" w:type="dxa"/>
@@ -8393,32 +8393,32 @@
         </w:tc>
         <w:tc>
           <w:tcPr>
-            <w:tcW w:w="1474" w:type="dxa"/>
-            <w:tcMar>
-              <w:top w:w="50" w:type="dxa"/>
-              <w:left w:w="90" w:type="dxa"/>
-              <w:bottom w:w="50" w:type="dxa"/>
-              <w:right w:w="90" w:type="dxa"/>
-            </w:tcMar>
-          </w:tcPr>
-          <w:p>
-            <w:pPr>
-              <w:keepNext/>
-              <w:spacing w:after="40" w:line="252" w:lineRule="auto"/>
-            </w:pPr>
-            <w:r>
-              <w:rPr>
-                <w:color w:val="000000"/>
-                <w:sz w:val="19"/>
-                <w:szCs w:val="19"/>
-              </w:rPr>
-              <w:t>UC01</w:t>
-            </w:r>
-          </w:p>
-        </w:tc>
-        <w:tc>
-          <w:tcPr>
-            <w:tcW w:w="2608" w:type="dxa"/>
+            <w:tcW w:w="3261" w:type="dxa"/>
+            <w:tcMar>
+              <w:top w:w="50" w:type="dxa"/>
+              <w:left w:w="90" w:type="dxa"/>
+              <w:bottom w:w="50" w:type="dxa"/>
+              <w:right w:w="90" w:type="dxa"/>
+            </w:tcMar>
+          </w:tcPr>
+          <w:p>
+            <w:pPr>
+              <w:keepNext/>
+              <w:spacing w:after="40" w:line="252" w:lineRule="auto"/>
+            </w:pPr>
+            <w:r>
+              <w:rPr>
+                <w:color w:val="000000"/>
+                <w:sz w:val="19"/>
+                <w:szCs w:val="19"/>
+              </w:rPr>
+              <w:t>UC01 Sofortdiagnose anfordern</w:t>
+            </w:r>
+          </w:p>
+        </w:tc>
+        <w:tc>
+          <w:tcPr>
+            <w:tcW w:w="1840" w:type="dxa"/>
             <w:tcMar>
               <w:top w:w="50" w:type="dxa"/>
               <w:left w:w="90" w:type="dxa"/>
@@ -8443,7 +8443,7 @@
         </w:tc>
         <w:tc>
           <w:tcPr>
-            <w:tcW w:w="2608" w:type="dxa"/>
+            <w:tcW w:w="1840" w:type="dxa"/>
             <w:tcMar>
               <w:top w:w="50" w:type="dxa"/>
               <w:left w:w="90" w:type="dxa"/>
@@ -10948,22 +10948,6 @@
       </w:pPr>
       <w:r>
         <w:t>6 Probleme und Herausforderungen</w:t>
-      </w:r>
-    </w:p>
-    <w:p>
-      <w:pPr>
-        <w:spacing w:after="120" w:line="276" w:lineRule="auto"/>
-        <w:jc w:val="both"/>
-      </w:pPr>
-      <w:r>
-        <w:rPr>
-          <w:b/>
-          <w:bCs/>
-        </w:rPr>
-        <w:t xml:space="preserve">Zwei Entwürfe. </w:t>
-      </w:r>
-      <w:r>
-        <w:t>Zu Beginn sind zwei vollständige Entwürfe entstanden, einer aus Sicht der Werkstatt als Betreiber und einer aus Sicht des Softwareanbieters mit KI-Sofortdiagnose. Statt einen zu verwerfen, haben wir beide Artefakt für Artefakt verglichen. Grundlage wurde der Solution-Provider-Entwurf, weil er das Feedback des Dozenten umsetzt. Aus dem anderen Entwurf haben wir unter anderem die Rollenklassen, die Datenspeicher Technikerplan und Buchhaltung und den Sprintplan übernommen.</w:t>
       </w:r>
     </w:p>
     <w:p>

</xml_diff>

<commit_message>
[T05 2026-10-20] docs: Kapitel 6 Werkzeuge ergänzt (Visual Paradigm, überschriebene Diagramme)
Co-Authored-By: Claude Fable 5.1 <noreply@anthropic.com>
Claude-Session: https://claude.ai/code/session_01H2bGsFaySUqsEjJ1PXuxUw
</commit_message>
<xml_diff>
--- a/3_doku/Projektdokumentation.docx
+++ b/3_doku/Projektdokumentation.docx
@@ -11028,7 +11028,39 @@
         <w:t xml:space="preserve">Werkzeuge. </w:t>
       </w:r>
       <w:r>
-        <w:t xml:space="preserve">Der Teamwork-Server von Visual Paradigm ist nur über das Lehre-VPN erreichbar, und nur zwei von uns arbeiten damit. Ein wiederholter XMI-Import erzeugte doppelte Beziehungen, die wir erst durch einen vollständigen Neuimport losgeworden sind. Der Camunda Modeler meldet für Camunda 8 fehlende technische Angaben als Fehler, deshalb haben wir die Diagramme entsprechend ergänzt. </w:t>
+        <w:t xml:space="preserve">Visual Paradigm war unser größtes Werkzeugproblem. Vier von sechs Gruppenmitgliedern arbeiten mit Firmen-Laptops, auf denen keine zusätzlichen Programme installiert werden dürfen; sie konnten Visual Paradigm nicht nutzen. Die gesamte UML-Arbeit lag damit bei zwei Personen, die übrigen haben die Diagramme anhand der Exporte geprüft. Dazu kommt, dass der Teamwork-Server der DHBW nur über das Lehre-VPN erreichbar ist. </w:t>
+      </w:r>
+    </w:p>
+    <w:p>
+      <w:pPr>
+        <w:spacing w:after="120" w:line="276" w:lineRule="auto"/>
+        <w:jc w:val="both"/>
+      </w:pPr>
+      <w:r>
+        <w:rPr>
+          <w:b/>
+          <w:bCs/>
+        </w:rPr>
+        <w:t xml:space="preserve">Überschriebene Diagramme. </w:t>
+      </w:r>
+      <w:r>
+        <w:t xml:space="preserve">Viel Zeit hat uns ein Fehler beim Abgleich mit dem Teamwork-Server gekostet: Beim Update wurden das Use-Case-Diagramm und das Klassendiagramm mit älteren Versionen aus dem Repository überlagert. Aktuelle und alte Elemente lagen danach übereinander, Beziehungen waren doppelt vorhanden, und ein Aufräumen von Hand brachte bei jedem weiteren Abgleich neue Überlagerungen. Lösbar war das nur, indem wir beide Diagramme im Repository vollständig neu angelegt haben. Seitdem gilt: vor jeder Sitzung Update, nach jeder Änderung sofort Commit, und nie zwei Personen gleichzeitig im selben Diagramm. </w:t>
+      </w:r>
+    </w:p>
+    <w:p>
+      <w:pPr>
+        <w:spacing w:after="120" w:line="276" w:lineRule="auto"/>
+        <w:jc w:val="both"/>
+      </w:pPr>
+      <w:r>
+        <w:rPr>
+          <w:b/>
+          <w:bCs/>
+        </w:rPr>
+        <w:t xml:space="preserve">Camunda Modeler. </w:t>
+      </w:r>
+      <w:r>
+        <w:t xml:space="preserve">Der Modeler meldet für Camunda 8 fehlende technische Angaben wie Task-Definitionen oder Timer-Ausdrücke als Fehler. Wir haben die Diagramme entsprechend ergänzt, bis das Problems-Panel keine Einträge mehr zeigte. </w:t>
       </w:r>
     </w:p>
     <w:p>

</xml_diff>

<commit_message>
[T05 2026-10-22] docs: Doku und Präsentation an E-32 angepasst
- Doku 5.1: Kennzahlen (134/13,4/82/61 %, 25 Kundenaktivitäten, 44 Nachrichtenflüsse,
  32 Benutzer-Aktivitäten, 10 Aufrufe), Tabelle 6 Zeilen 06–10, Kurztexte P06/P09/P10
- Abbildung 3 durch aktuelles P04 ersetzt (Stand E-31, gleiche Pixelmaße)
- Folie 10 und 11 (Kennzahlen, Prozesstabelle), Notiz Folie 10 und Sprechtext

Co-Authored-By: Claude Opus 5.5 <noreply@anthropic.com>
</commit_message>
<xml_diff>
--- a/3_doku/Projektdokumentation.docx
+++ b/3_doku/Projektdokumentation.docx
@@ -4290,11 +4290,11 @@
         <w:jc w:val="both"/>
       </w:pPr>
       <w:r>
-        <w:t xml:space="preserve">Wir haben zehn Soll-Prozesse unseres Pilotkunden als Kollaborationsdiagramme modelliert (Tabelle 6). Zusammen enthalten sie 133 Aktivitäten im Werkstatt-Pool, im Schnitt 13,3 je Diagramm. Hinzu </w:t>
+        <w:t xml:space="preserve">Wir haben zehn Soll-Prozesse unseres Pilotkunden als Kollaborationsdiagramme modelliert (Tabelle 6). Zusammen enthalten sie 134 Aktivitäten im Werkstatt-Pool, im Schnitt 13,4 je Diagramm. Hinzu </w:t>
       </w:r>
       <w:r>
         <w:lastRenderedPageBreak/>
-        <w:t>kommen 26 Aktivitäten in den Abläufen des Kunden, 42 Nachrichtenflüsse sowie 51 Datenobjekte und 12 Datenspeicher.</w:t>
+        <w:t>kommen 25 Aktivitäten in den Abläufen des Kunden, 44 Nachrichtenflüsse sowie 51 Datenobjekte und 12 Datenspeicher.</w:t>
       </w:r>
     </w:p>
     <w:tbl>
@@ -5575,7 +5575,7 @@
                 <w:sz w:val="19"/>
                 <w:szCs w:val="19"/>
               </w:rPr>
-              <w:t>15</w:t>
+              <w:t>17</w:t>
             </w:r>
           </w:p>
         </w:tc>
@@ -5600,7 +5600,7 @@
                 <w:sz w:val="19"/>
                 <w:szCs w:val="19"/>
               </w:rPr>
-              <w:t>9 (60 %)</w:t>
+              <w:t>11 (65 %)</w:t>
             </w:r>
           </w:p>
         </w:tc>
@@ -5780,7 +5780,7 @@
                 <w:sz w:val="19"/>
                 <w:szCs w:val="19"/>
               </w:rPr>
-              <w:t>5 (38 %)</w:t>
+              <w:t>6 (46 %)</w:t>
             </w:r>
           </w:p>
         </w:tc>
@@ -6115,7 +6115,7 @@
                 <w:sz w:val="19"/>
                 <w:szCs w:val="19"/>
               </w:rPr>
-              <w:t>15</w:t>
+              <w:t>16</w:t>
             </w:r>
           </w:p>
         </w:tc>
@@ -6140,7 +6140,7 @@
                 <w:sz w:val="19"/>
                 <w:szCs w:val="19"/>
               </w:rPr>
-              <w:t>8 (53 %)</w:t>
+              <w:t>8 (50 %)</w:t>
             </w:r>
           </w:p>
         </w:tc>
@@ -6295,7 +6295,7 @@
                 <w:sz w:val="19"/>
                 <w:szCs w:val="19"/>
               </w:rPr>
-              <w:t>11</w:t>
+              <w:t>9</w:t>
             </w:r>
           </w:p>
         </w:tc>
@@ -6320,7 +6320,7 @@
                 <w:sz w:val="19"/>
                 <w:szCs w:val="19"/>
               </w:rPr>
-              <w:t>8 (73 %)</w:t>
+              <w:t>6 (67 %)</w:t>
             </w:r>
           </w:p>
         </w:tc>
@@ -6487,7 +6487,7 @@
         <w:t xml:space="preserve">06 Ersatzteil-Bestellung. </w:t>
       </w:r>
       <w:r>
-        <w:t>Fehlteile und Nachbestellvorschläge werden gebündelt bestellt, oberhalb einer Freigabegrenze erst nach Freigabe. Ohne Bestätigung oder nach zwei erfolglosen Mahnungen wird storniert und ein anderer Lieferant gesucht.</w:t>
+        <w:t>Fehlteile und Nachbestellvorschläge werden gebündelt bestellt, oberhalb einer Freigabegrenze erst nach Freigabe. Ohne Bestätigung oder nach zwei erfolglosen Mahnungen wird storniert und ein anderer Lieferant gesucht. Der Wareneingang wird erst geprüft und nur mangelfreie Ware gebucht, auch bei einer Ersatzlieferung.</w:t>
       </w:r>
     </w:p>
     <w:p>
@@ -6547,7 +6547,7 @@
         <w:t xml:space="preserve">09 Reklamation und Gewährleistung. </w:t>
       </w:r>
       <w:r>
-        <w:t>Der Mangel wird geprüft und die Gewährleistung bewertet. Kostenfreie Nacharbeit gibt die Werkstattleitung frei, sonst entscheidet der Kunde über ein Angebot.</w:t>
+        <w:t>Der Mangel wird geprüft und die Gewährleistung bewertet. Kostenfreie Nacharbeit gibt die Werkstattleitung frei, sonst entscheidet der Kunde über ein Angebot. Lehnt er ab, antwortet er nicht oder ist ein Teil nicht beschaffbar, erhält er eine Absage.</w:t>
       </w:r>
     </w:p>
     <w:p>
@@ -6567,7 +6567,7 @@
         <w:t xml:space="preserve">10 Ersatzteil-Retoure. </w:t>
       </w:r>
       <w:r>
-        <w:t>Defekte Lieferantenteile werden angemeldet und zurückgesendet. Danach folgt eine Gutschrift oder eine Ersatzlieferung, ohne Antwort nach der Eskalation wird das Teil abgeschrieben.</w:t>
+        <w:t>Defekte Lieferantenteile werden angemeldet und zurückgesendet. Danach folgt eine Gutschrift oder eine Ersatzlieferung, die Prozess 06 prüft und bucht. Ohne Antwort nach der Eskalation wird das Teil abgeschrieben.</w:t>
       </w:r>
     </w:p>
     <w:p>
@@ -6708,7 +6708,7 @@
         <w:jc w:val="both"/>
       </w:pPr>
       <w:r>
-        <w:t>Von den 133 Aktivitäten sind 81 automatisiert, regelbasiert oder Nachrichten der Plattform, also rund 61 Prozent. 33 weitere sind Benutzer-Aktivitäten in der Plattform. Neun manuelle Aktivitäten liegen außerhalb der Software, neun rufen einen anderen Prozess auf, und eine ist der Mehrfach-Teilprozess für die Prüfung je Ersatzteil. Die Software automatisiert vor allem:</w:t>
+        <w:t>Von den 134 Aktivitäten sind 82 automatisiert, regelbasiert oder Nachrichten der Plattform, also rund 61 Prozent. 32 weitere sind Benutzer-Aktivitäten in der Plattform. Neun manuelle Aktivitäten liegen außerhalb der Software, zehn rufen einen anderen Prozess auf, und eine ist der Mehrfach-Teilprozess für die Prüfung je Ersatzteil. Die Software automatisiert vor allem:</w:t>
       </w:r>
     </w:p>
     <w:p>

</xml_diff>

<commit_message>
fix: P01 von Adrian nach 1_bpmn uebernommen, Kennzahlen in Doku, Praesentation und Sprechtext nachgezogen (E-33)
</commit_message>
<xml_diff>
--- a/3_doku/Projektdokumentation.docx
+++ b/3_doku/Projektdokumentation.docx
@@ -4290,11 +4290,10 @@
         <w:jc w:val="both"/>
       </w:pPr>
       <w:r>
-        <w:t xml:space="preserve">Wir haben zehn Soll-Prozesse unseres Pilotkunden als Kollaborationsdiagramme modelliert (Tabelle 6). Zusammen enthalten sie 134 Aktivitäten im Werkstatt-Pool, im Schnitt 13,4 je Diagramm. Hinzu </w:t>
-      </w:r>
-      <w:r>
-        <w:lastRenderedPageBreak/>
-        <w:t>kommen 25 Aktivitäten in den Abläufen des Kunden, 44 Nachrichtenflüsse sowie 51 Datenobjekte und 12 Datenspeicher.</w:t>
+        <w:t xml:space="preserve">Wir haben zehn Soll-Prozesse unseres Pilotkunden als Kollaborationsdiagramme modelliert (Tabelle 6). Zusammen enthalten sie 136 Aktivitäten im Werkstatt-Pool, im Schnitt 13,6 je Diagramm. Hinzu </w:t>
+      </w:r>
+      <w:r>
+        <w:t>kommen 27 Aktivitäten in den Abläufen des Kunden, 45 Nachrichtenflüsse sowie 53 Datenobjekte und 12 Datenspeicher.</w:t>
       </w:r>
     </w:p>
     <w:tbl>
@@ -4675,7 +4674,7 @@
                 <w:sz w:val="19"/>
                 <w:szCs w:val="19"/>
               </w:rPr>
-              <w:t>12</w:t>
+              <w:t>14</w:t>
             </w:r>
           </w:p>
         </w:tc>
@@ -4700,7 +4699,7 @@
                 <w:sz w:val="19"/>
                 <w:szCs w:val="19"/>
               </w:rPr>
-              <w:t>12 (100 %)</w:t>
+              <w:t>14 (100 %)</w:t>
             </w:r>
           </w:p>
         </w:tc>
@@ -6387,7 +6386,7 @@
         <w:t xml:space="preserve">01 KI-Sofortdiagnose und Voranmeldung. </w:t>
       </w:r>
       <w:r>
-        <w:t>Aus Foto, Video oder Ton des Kunden entstehen Voranmeldung, KI-Diagnosevorschlag, vorläufiger KVA und Terminvorschlag. Nicht auswertbare Medien fordert das System neu an. Ohne Antwort binnen sieben Tagen wird die Voranmeldung verworfen.</w:t>
+        <w:t>Aus Foto, Video oder Ton des Kunden entstehen Voranmeldung, KI-Diagnosevorschlag, vorläufiger KVA und Terminvorschlag. Nicht auswertbare Medien fordert das System neu an. Bestätigt der Kunde, werden die Teile vorreserviert; ist ein Teil nirgends verfügbar, erhält die Voranmeldung einen Hinweis auf Nachbestellung. Lehnt der Kunde ab oder bleibt eine Antwort sieben Tage aus, wird die Voranmeldung verworfen, bei Fristablauf mit Hinweis an den Kunden.</w:t>
       </w:r>
     </w:p>
     <w:p>
@@ -6580,7 +6579,7 @@
         </w:rPr>
         <w:drawing>
           <wp:inline distT="0" distB="0" distL="0" distR="0" wp14:anchorId="19D2E60F" wp14:editId="4AD0833F">
-            <wp:extent cx="5760000" cy="2063184"/>
+            <wp:extent cx="5760000" cy="2125679"/>
             <wp:effectExtent l="0" t="0" r="0" b="0"/>
             <wp:docPr id="3" name="Picture 3"/>
             <wp:cNvGraphicFramePr>
@@ -6602,7 +6601,7 @@
                   <pic:spPr>
                     <a:xfrm>
                       <a:off x="0" y="0"/>
-                      <a:ext cx="5760000" cy="2063184"/>
+                      <a:ext cx="5760000" cy="2125679"/>
                     </a:xfrm>
                     <a:prstGeom prst="rect">
                       <a:avLst/>
@@ -6708,7 +6707,7 @@
         <w:jc w:val="both"/>
       </w:pPr>
       <w:r>
-        <w:t>Von den 134 Aktivitäten sind 82 automatisiert, regelbasiert oder Nachrichten der Plattform, also rund 61 Prozent. 32 weitere sind Benutzer-Aktivitäten in der Plattform. Neun manuelle Aktivitäten liegen außerhalb der Software, zehn rufen einen anderen Prozess auf, und eine ist der Mehrfach-Teilprozess für die Prüfung je Ersatzteil. Die Software automatisiert vor allem:</w:t>
+        <w:t>Von den 136 Aktivitäten sind 84 automatisiert, regelbasiert oder Nachrichten der Plattform, also rund 62 Prozent. 32 weitere sind Benutzer-Aktivitäten in der Plattform. Neun manuelle Aktivitäten liegen außerhalb der Software, zehn rufen einen anderen Prozess auf, und eine ist der Mehrfach-Teilprozess für die Prüfung je Ersatzteil. Die Software automatisiert vor allem:</w:t>
       </w:r>
     </w:p>
     <w:p>

</xml_diff>

<commit_message>
docs: Doku und Sprechtext angepasst
</commit_message>
<xml_diff>
--- a/3_doku/Projektdokumentation.docx
+++ b/3_doku/Projektdokumentation.docx
@@ -1263,24 +1263,7 @@
                 <w:sz w:val="19"/>
                 <w:szCs w:val="19"/>
               </w:rPr>
-              <w:t xml:space="preserve">Sprint-Rituale und Trello-Board; Klassendiagramm, SD1 </w:t>
-            </w:r>
-            <w:r>
-              <w:rPr>
-                <w:color w:val="000000"/>
-                <w:sz w:val="19"/>
-                <w:szCs w:val="19"/>
-                <w:lang w:val="de-DE"/>
-              </w:rPr>
-              <w:t>bis</w:t>
-            </w:r>
-            <w:r>
-              <w:rPr>
-                <w:color w:val="000000"/>
-                <w:sz w:val="19"/>
-                <w:szCs w:val="19"/>
-              </w:rPr>
-              <w:t xml:space="preserve"> SD4, Visual-Paradigm-Projekt und Konsistenz der UML-Modelle</w:t>
+              <w:t>Sprint-Rituale und Trello-Board; Klassendiagramm, SD1 bis SD4, Visual-Paradigm-Projekt und Konsistenz der UML-Modelle</w:t>
             </w:r>
           </w:p>
         </w:tc>
@@ -1433,9 +1416,6 @@
             <w:pPr>
               <w:keepNext/>
               <w:spacing w:after="40" w:line="252" w:lineRule="auto"/>
-              <w:rPr>
-                <w:lang w:val="de-DE"/>
-              </w:rPr>
             </w:pPr>
             <w:r>
               <w:rPr>
@@ -1475,9 +1455,6 @@
       <w:pPr>
         <w:spacing w:after="120" w:line="276" w:lineRule="auto"/>
         <w:jc w:val="both"/>
-        <w:rPr>
-          <w:lang w:val="de-DE"/>
-        </w:rPr>
       </w:pPr>
       <w:r>
         <w:t>Die Gruppenmitglieder haben folgende Beiträge erarbeitet</w:t>
@@ -1599,13 +1576,29 @@
         <w:t>(</w:t>
       </w:r>
       <w:r>
-        <w:t>Klassendiagramm, SD1 bis SD4 in Visual Paradigm</w:t>
+        <w:t xml:space="preserve">Klassendiagramm, SD1 bis SD4 in Visual </w:t>
+      </w:r>
+      <w:proofErr w:type="spellStart"/>
+      <w:r>
+        <w:t>Paradigm</w:t>
+      </w:r>
+      <w:proofErr w:type="spellEnd"/>
+      <w:r>
+        <w:t>, BPMN 10</w:t>
       </w:r>
       <w:r>
         <w:t>)</w:t>
       </w:r>
       <w:r>
-        <w:t>, Visual-Paradigm-Projekt und Konsistenzprüfung der Sequenzdiagramme gegen das Klassendiagramm, Sprint-Rituale und Trello-Board</w:t>
+        <w:t>, Visual-</w:t>
+      </w:r>
+      <w:proofErr w:type="spellStart"/>
+      <w:r>
+        <w:t>Paradigm</w:t>
+      </w:r>
+      <w:proofErr w:type="spellEnd"/>
+      <w:r>
+        <w:t>-Projekt und Konsistenzprüfung der Sequenzdiagramme gegen das Klassendiagramm, Sprint-Rituale und Trello-Board</w:t>
       </w:r>
       <w:r>
         <w:t>.</w:t>
@@ -1631,10 +1624,25 @@
         <w:t xml:space="preserve">Erstellung </w:t>
       </w:r>
       <w:r>
-        <w:t>der BPMN-Diagramme 01 und 02, alle zehn BPMN-Dateien im Camunda Modeler (Anreicherung für Camunda 8, Prüfung im Problems-Panel, PNG-Export), Prozesskennzahlen und Beschreibung der Prozesse</w:t>
+        <w:t>der BPMN-Diagramme 01</w:t>
+      </w:r>
+      <w:r>
+        <w:t xml:space="preserve">, </w:t>
+      </w:r>
+      <w:r>
+        <w:t>02</w:t>
+      </w:r>
+      <w:r>
+        <w:t xml:space="preserve"> und 09</w:t>
+      </w:r>
+      <w:r>
+        <w:t>, alle zehn BPMN-Dateien im Camunda Modeler (Anreicherung für Camunda 8, Prüfung im Problems-Panel, PNG-Export), Prozesskennzahlen und Beschreibung der Prozesse</w:t>
       </w:r>
       <w:r>
         <w:t>, Erstellung der PowerPoint</w:t>
+      </w:r>
+      <w:r>
+        <w:t>-Präsentation</w:t>
       </w:r>
     </w:p>
     <w:p>
@@ -2634,7 +2642,13 @@
         <w:spacing w:after="60" w:line="264" w:lineRule="auto"/>
       </w:pPr>
       <w:r>
-        <w:t>Die Beteiligten erscheinen in BPMN als Pool (Kunde) oder Lane (Service / Annahme, Techniker, Ersatzteil-Disposition, Werkstattleitung), im Use-Case-Diagramm als Rollen mit genau einem Use Case je Rolle (Tabelle 7), in den Sequenzdiagrammen als Akteure mit demselben Rollennamen und im Klassendiagramm als Unterklassen von Mitarbeiter. Welche Rolle zu welcher Klasse und Lane gehört, legt Tabelle 7 fest.</w:t>
+        <w:t xml:space="preserve">Die Beteiligten erscheinen in BPMN als Pool (Kunde) oder Lane (Service / Annahme, Techniker, Ersatzteil-Disposition, Werkstattleitung), </w:t>
+      </w:r>
+      <w:r>
+        <w:t>jeder Use-Case hat eine Rolle als Hauptakteur</w:t>
+      </w:r>
+      <w:r>
+        <w:t xml:space="preserve"> (Tabelle 7), in den Sequenzdiagrammen als Akteure mit demselben Rollennamen und im Klassendiagramm als Unterklassen von Mitarbeiter. Welche Rolle zu welcher Klasse und Lane gehört, legt Tabelle 7 fest.</w:t>
       </w:r>
     </w:p>
     <w:p>
@@ -2712,7 +2726,13 @@
         <w:jc w:val="both"/>
       </w:pPr>
       <w:r>
-        <w:t>Den Takt geben die vier Gruppentermine in Präsenz vor (jeweils 4:15 Stunden). Jeder Termin verbindet Review und Retrospektive des vergangenen Sprints mit dem Planning des nächsten, und Hinweise aus dem Coaching fließen direkt in die Planung ein. Zwischen den Terminen arbeiten wir asynchron. Abgestimmt wird in einer WhatsApp-Gruppe, Dateien teilen wir nur über das GitHub-Repository.</w:t>
+        <w:t>Den Takt geben die vier Gruppentermine in Präsenz vor (jeweils 4:15 Stunden). Jeder Termin verbindet Review und Retrospektive des vergangenen Sprints mit dem Planning des nächsten, und Hinweise aus dem Coaching fließen direkt in die Planung ein.</w:t>
+      </w:r>
+      <w:r>
+        <w:t xml:space="preserve"> Tabelle 3 zeigt den Verlauf der vier Sprints.</w:t>
+      </w:r>
+      <w:r>
+        <w:t xml:space="preserve"> Zwischen den Terminen arbeiten wir asynchron. Abgestimmt wird in einer WhatsApp-Gruppe, Dateien teilen wir nur über das GitHub-Repository.</w:t>
       </w:r>
     </w:p>
     <w:p>
@@ -3276,14 +3296,12 @@
               <w:rPr>
                 <w:sz w:val="19"/>
                 <w:szCs w:val="19"/>
-                <w:lang w:val="de-DE"/>
-              </w:rPr>
-            </w:pPr>
-            <w:r>
-              <w:rPr>
-                <w:sz w:val="19"/>
-                <w:szCs w:val="19"/>
-                <w:lang w:val="de-DE"/>
+              </w:rPr>
+            </w:pPr>
+            <w:r>
+              <w:rPr>
+                <w:sz w:val="19"/>
+                <w:szCs w:val="19"/>
               </w:rPr>
               <w:t>UI-Umbau</w:t>
             </w:r>
@@ -3291,7 +3309,6 @@
               <w:rPr>
                 <w:sz w:val="19"/>
                 <w:szCs w:val="19"/>
-                <w:lang w:val="de-DE"/>
               </w:rPr>
               <w:t xml:space="preserve"> nach dem Gespräch am 22.10. </w:t>
             </w:r>
@@ -3391,9 +3408,6 @@
             <w:pPr>
               <w:keepNext/>
               <w:spacing w:after="40" w:line="252" w:lineRule="auto"/>
-              <w:rPr>
-                <w:lang w:val="de-DE"/>
-              </w:rPr>
             </w:pPr>
             <w:r>
               <w:rPr>
@@ -3408,7 +3422,6 @@
                 <w:color w:val="000000"/>
                 <w:sz w:val="19"/>
                 <w:szCs w:val="19"/>
-                <w:lang w:val="de-DE"/>
               </w:rPr>
               <w:t xml:space="preserve"> Weitere Anpassungen in VP</w:t>
             </w:r>
@@ -3417,7 +3430,6 @@
                 <w:color w:val="000000"/>
                 <w:sz w:val="19"/>
                 <w:szCs w:val="19"/>
-                <w:lang w:val="de-DE"/>
               </w:rPr>
               <w:t>.</w:t>
             </w:r>
@@ -4293,7 +4305,14 @@
         <w:t xml:space="preserve">Wir haben zehn Soll-Prozesse unseres Pilotkunden als Kollaborationsdiagramme modelliert (Tabelle 6). Zusammen enthalten sie 136 Aktivitäten im Werkstatt-Pool, im Schnitt 13,6 je Diagramm. Hinzu </w:t>
       </w:r>
       <w:r>
-        <w:t>kommen 27 Aktivitäten in den Abläufen des Kunden, 45 Nachrichtenflüsse sowie 53 Datenobjekte und 12 Datenspeicher.</w:t>
+        <w:lastRenderedPageBreak/>
+        <w:t>kommen 27 Aktivitäten in den Abläufen des Kunden, 45 Nachrichtenflüsse sowie 53 Datenobjekte und 1</w:t>
+      </w:r>
+      <w:r>
+        <w:t>3</w:t>
+      </w:r>
+      <w:r>
+        <w:t xml:space="preserve"> Datenspeicher.</w:t>
       </w:r>
     </w:p>
     <w:tbl>
@@ -6577,6 +6596,7 @@
         <w:rPr>
           <w:noProof/>
         </w:rPr>
+        <w:lastRenderedPageBreak/>
         <w:drawing>
           <wp:inline distT="0" distB="0" distL="0" distR="0" wp14:anchorId="19D2E60F" wp14:editId="4AD0833F">
             <wp:extent cx="5760000" cy="2125679"/>
@@ -6638,7 +6658,6 @@
         <w:rPr>
           <w:noProof/>
         </w:rPr>
-        <w:lastRenderedPageBreak/>
         <w:drawing>
           <wp:inline distT="0" distB="0" distL="0" distR="0" wp14:anchorId="3C47F1C3" wp14:editId="2F129291">
             <wp:extent cx="5760000" cy="2323330"/>
@@ -6790,7 +6809,11 @@
         <w:jc w:val="both"/>
       </w:pPr>
       <w:r>
-        <w:t>Das Use-Case-Diagramm (Abbildung 4) zeigt, was RepairFlow aus Sicht seiner Benutzer leistet. Es enthält 19 Use Cases und 17 Akteure: den Kunden, 15 Mitarbeiterrollen und den KI-Diagnosedienst als externes System. Der Lieferant ist kein Akteur, sondern eine Black Box ohne Zugang zu RepairFlow; wie in den Prozessmodellen kommt er nur über Nachrichten vor. Jeder Use Case hat genau eine Rolle als primären Akteur; die Nummern UC01 bis UC19 dienen nur der Zuordnung in den Tabellen, im Diagramm stehen die Namen. Diese Struktur geht auf einen Hinweis des Dozenten vom 15.10.2026 zurück: Unsere erste Fassung hatte acht Akteure mit bis zu acht Verbindungen, etwa den Techniker an Diagnose, KVA, Reparatur, Fertigmeldung und Reklamation. Statt eines Akteurs mit vielen Linien gibt es jetzt je Use Case eine Rolle, zum Beispiel Diagnoseprüfer, Diagnostiker, Kalkulator, Reparateur und Endkontrolleur anstelle des Technikers. Welche Person eine Rolle ausfüllt, regelt das Organigramm des Werkstattbetriebs; im Modell sind das die Unterklassen von Mitarbeiter (Tabelle 7). Der Kunde ist einmal dargestellt und mit UC01, UC02 und UC07 verbunden. UC08 „Ersatzteil-Verfügbarkeit prüfen“ wird nur über include erreicht und hat deshalb keinen eigenen Akteur.</w:t>
+        <w:t xml:space="preserve">Das Use-Case-Diagramm (Abbildung 4) zeigt, was RepairFlow aus Sicht seiner Benutzer leistet. Es enthält 19 Use Cases und 17 Akteure: den Kunden, 15 Mitarbeiterrollen und den KI-Diagnosedienst als externes System. Der Lieferant ist kein Akteur, sondern eine Black Box ohne Zugang zu RepairFlow; wie in den Prozessmodellen kommt er nur über Nachrichten vor. Jeder Use Case hat genau eine Rolle als </w:t>
+      </w:r>
+      <w:r>
+        <w:lastRenderedPageBreak/>
+        <w:t>primären Akteur; die Nummern UC01 bis UC19 dienen nur der Zuordnung in den Tabellen, im Diagramm stehen die Namen. Diese Struktur geht auf einen Hinweis des Dozenten vom 15.10.2026 zurück: Unsere erste Fassung hatte acht Akteure mit bis zu acht Verbindungen, etwa den Techniker an Diagnose, KVA, Reparatur, Fertigmeldung und Reklamation. Statt eines Akteurs mit vielen Linien gibt es jetzt je Use Case eine Rolle, zum Beispiel Diagnoseprüfer, Diagnostiker, Kalkulator, Reparateur und Endkontrolleur anstelle des Technikers. Welche Person eine Rolle ausfüllt, regelt das Organigramm des Werkstattbetriebs; im Modell sind das die Unterklassen von Mitarbeiter (Tabelle 7). Der Kunde ist einmal dargestellt und mit UC01, UC02 und UC07 verbunden. UC08 „Ersatzteil-Verfügbarkeit prüfen“ wird nur über include erreicht und hat deshalb keinen eigenen Akteur.</w:t>
       </w:r>
     </w:p>
     <w:tbl>
@@ -6845,7 +6868,6 @@
                 <w:sz w:val="19"/>
                 <w:szCs w:val="19"/>
               </w:rPr>
-              <w:lastRenderedPageBreak/>
               <w:t>Rolle (Akteur)</w:t>
             </w:r>
           </w:p>
@@ -8814,9 +8836,6 @@
       <w:pPr>
         <w:pStyle w:val="berschrift2"/>
         <w:keepNext/>
-        <w:rPr>
-          <w:lang w:val="de-DE"/>
-        </w:rPr>
       </w:pPr>
     </w:p>
     <w:p>
@@ -8837,18 +8856,12 @@
         <w:t>Das Klassendiagramm (Abbildung 5) umfasst 2</w:t>
       </w:r>
       <w:r>
-        <w:rPr>
-          <w:lang w:val="de-DE"/>
-        </w:rPr>
         <w:t>9</w:t>
       </w:r>
       <w:r>
         <w:t xml:space="preserve"> Klassen, darunter die abstrakten Klassen Person und Mitarbeiter, sowie sieben Aufzählungen und </w:t>
       </w:r>
       <w:r>
-        <w:rPr>
-          <w:lang w:val="de-DE"/>
-        </w:rPr>
         <w:t>40</w:t>
       </w:r>
       <w:r>
@@ -8963,7 +8976,13 @@
       </w:r>
       <w:proofErr w:type="spellEnd"/>
       <w:r>
-        <w:t xml:space="preserve">, die Mitarbeiter in der Werkstattoberfläche. Ihre Methoden entsprechen den Aktionen der Benutzer, zum Beispiel </w:t>
+        <w:t>, die Mitarbeiter in der Werkstattoberfl</w:t>
+      </w:r>
+      <w:r>
+        <w:t>ä</w:t>
+      </w:r>
+      <w:r>
+        <w:t xml:space="preserve">che. Ihre Methoden entsprechen den Aktionen der Benutzer, zum Beispiel </w:t>
       </w:r>
       <w:proofErr w:type="spellStart"/>
       <w:proofErr w:type="gramStart"/>
@@ -9132,99 +9151,57 @@
         <w:t xml:space="preserve">Für sechs Use Cases haben wir Sequenzdiagramme erstellt, gefordert waren fünf (Tabelle 8). Jedes folgt einem Prozess. Die erste Lebenslinie ist die Rolle des Use Case aus Abbildung 4; weitere beteiligte Rollen tragen ihren Namen aus dem Use-Case-Diagramm; der Werkstattleiter, der dort keine Rolle hat, erscheint als Objekt seiner Klasse (: Werkstattleiter) mit seinen Operationen. </w:t>
       </w:r>
       <w:r>
-        <w:rPr>
-          <w:lang w:val="de-DE"/>
-        </w:rPr>
         <w:t xml:space="preserve">Die Rolle spricht nie direkt mit dem Fachobjekt, sondern immer mit der Oberfläche </w:t>
       </w:r>
       <w:proofErr w:type="gramStart"/>
       <w:r>
-        <w:rPr>
-          <w:lang w:val="de-DE"/>
-        </w:rPr>
         <w:t>(:</w:t>
       </w:r>
       <w:proofErr w:type="spellStart"/>
       <w:r>
-        <w:rPr>
-          <w:lang w:val="de-DE"/>
-        </w:rPr>
         <w:t>KundenApp</w:t>
       </w:r>
       <w:proofErr w:type="spellEnd"/>
       <w:proofErr w:type="gramEnd"/>
       <w:r>
-        <w:rPr>
-          <w:lang w:val="de-DE"/>
-        </w:rPr>
         <w:t xml:space="preserve"> </w:t>
       </w:r>
       <w:proofErr w:type="gramStart"/>
       <w:r>
-        <w:rPr>
-          <w:lang w:val="de-DE"/>
-        </w:rPr>
         <w:t>oder :</w:t>
       </w:r>
       <w:proofErr w:type="spellStart"/>
       <w:r>
-        <w:rPr>
-          <w:lang w:val="de-DE"/>
-        </w:rPr>
         <w:t>Werkstattoberfl</w:t>
       </w:r>
       <w:r>
-        <w:rPr>
-          <w:lang w:val="de-DE"/>
-        </w:rPr>
         <w:t>ae</w:t>
       </w:r>
       <w:r>
-        <w:rPr>
-          <w:lang w:val="de-DE"/>
-        </w:rPr>
         <w:t>che</w:t>
       </w:r>
       <w:proofErr w:type="spellEnd"/>
       <w:proofErr w:type="gramEnd"/>
       <w:r>
-        <w:rPr>
-          <w:lang w:val="de-DE"/>
-        </w:rPr>
         <w:t>). Die Oberfläche öffnet das benötigte Objekt über seine Nummer, ruft dessen Operationen auf und zeigt das Ergebnis an (</w:t>
       </w:r>
       <w:proofErr w:type="spellStart"/>
       <w:proofErr w:type="gramStart"/>
       <w:r>
-        <w:rPr>
-          <w:lang w:val="de-DE"/>
-        </w:rPr>
         <w:t>anzeigenErgebnis</w:t>
       </w:r>
       <w:proofErr w:type="spellEnd"/>
       <w:r>
-        <w:rPr>
-          <w:lang w:val="de-DE"/>
-        </w:rPr>
         <w:t>(</w:t>
       </w:r>
       <w:proofErr w:type="gramEnd"/>
       <w:r>
-        <w:rPr>
-          <w:lang w:val="de-DE"/>
-        </w:rPr>
         <w:t>))</w:t>
       </w:r>
       <w:r>
-        <w:rPr>
-          <w:lang w:val="de-DE"/>
-        </w:rPr>
         <w:t xml:space="preserve">. Wo zwischen </w:t>
       </w:r>
       <w:r>
-        <w:rPr>
-          <w:lang w:val="de-DE"/>
-        </w:rPr>
         <w:t xml:space="preserve">zwei Schritten Zeit vergeht, etwa nach einer Nacharbeit, wird das Objekt neu gesucht. </w:t>
       </w:r>
       <w:r>
@@ -9473,6 +9450,22 @@
                 <w:szCs w:val="19"/>
               </w:rPr>
               <w:t>Medienprüfung mit Nachreichen, KI-Vorschlag, vorläufiger KVA, Terminvorschlag, Vorreservierung erst nach Bestätigung</w:t>
+            </w:r>
+            <w:r>
+              <w:rPr>
+                <w:color w:val="000000"/>
+                <w:sz w:val="19"/>
+                <w:szCs w:val="19"/>
+              </w:rPr>
+              <w:t xml:space="preserve">. </w:t>
+            </w:r>
+            <w:r>
+              <w:rPr>
+                <w:color w:val="000000"/>
+                <w:sz w:val="19"/>
+                <w:szCs w:val="19"/>
+              </w:rPr>
+              <w:t>Bei Ablehnung oder nach sieben Tagen ohne Antwort wird die Voranmeldung verworfen.</w:t>
             </w:r>
           </w:p>
         </w:tc>
@@ -10171,7 +10164,13 @@
         <w:jc w:val="both"/>
       </w:pPr>
       <w:r>
-        <w:t>Tabelle 9 ordnet jedem Prozess seine Use Cases, zentralen Klassen und Sequenzdiagramme zu. BPMN-Datenobjekte tragen die Klassennamen, jede Rolle des Use-Case-Diagramms gehört zu genau einer Lane und einer Mitarbeiterklasse (Tabelle 7), und die Zustände des Reparaturauftrags folgen in allen Modellen AuftragStatus.</w:t>
+        <w:t>Tabelle 9 ordnet jedem Prozess seine Use Cases, zentralen Klassen und Sequenzdiagramme zu. BPMN-Datenobjekte tragen die Klassennamen, jede Rolle des Use-Case-Diagramms gehört zu genau einer Lane und einer Mitarbeiterklasse</w:t>
+      </w:r>
+      <w:r>
+        <w:t>; Ausnahmen zeigt Tabelle 7</w:t>
+      </w:r>
+      <w:r>
+        <w:t>, und die Zustände des Reparaturauftrags folgen in allen Modellen AuftragStatus.</w:t>
       </w:r>
     </w:p>
     <w:tbl>
@@ -11514,10 +11513,7 @@
         <w:t xml:space="preserve">Überschriebene Diagramme. </w:t>
       </w:r>
       <w:r>
-        <w:t>Viel Zeit hat uns ein Fehler beim Abgleich mit dem Teamwork-Server gekostet: Beim Update wurden das Use-Case-Diagramm und das Klassendiagramm mit älteren Versionen aus dem Repository überlagert. Aktuelle und alte Elemente lagen danach übereinander, Beziehungen waren doppelt vorhanden, und ein Aufräumen von Hand brachte bei jedem weiteren Abgleich neue Überlagerungen. Lösbar war das nur, indem wir beide Diagramme im Repository vollständig neu angelegt haben. Seitdem gilt: vor jeder Sitzung Update, nach jeder</w:t>
-      </w:r>
-      <w:r>
-        <w:t xml:space="preserve"> Änderung sofort Commit, und nie zwei Personen gleichzeitig im selben Diagramm. </w:t>
+        <w:t xml:space="preserve">Viel Zeit hat uns ein Fehler beim Abgleich mit dem Teamwork-Server gekostet: Beim Update wurden das Use-Case-Diagramm und das Klassendiagramm mit älteren Versionen aus dem Repository überlagert. Aktuelle und alte Elemente lagen danach übereinander, Beziehungen waren doppelt vorhanden, und ein Aufräumen von Hand brachte bei jedem weiteren Abgleich neue Überlagerungen. Lösbar war das nur, indem wir beide Diagramme im Repository vollständig neu angelegt haben. Seitdem gilt: vor jeder Sitzung Update, nach jeder Änderung sofort Commit, und nie zwei Personen gleichzeitig im selben Diagramm. </w:t>
       </w:r>
     </w:p>
     <w:p>
@@ -11590,12 +11586,15 @@
       <w:pPr>
         <w:spacing w:after="120" w:line="276" w:lineRule="auto"/>
         <w:jc w:val="both"/>
-        <w:rPr>
-          <w:lang w:val="de-DE"/>
-        </w:rPr>
-      </w:pPr>
-      <w:r>
-        <w:t>Im Coaching am 15.10.2026 sah der Dozent das Use-Case-Diagramm als zu verbunden an: Einzelne Akteure hingen an bis zu acht Use Cases. Sein Vorschlag war, je Use Case eine Rolle anzustreben, Akteure bei Bedarf mehrfach darzustellen und die Zuordnung der Rollen zu Personen einem Organigramm zu überlassen. Wir haben das Diagramm auf 15 Mitarbeiterrollen umgebaut und die Rollen in Tabelle 7 den Klassen und Lanes zugeordnet (Abschnitt 5.3).</w:t>
+      </w:pPr>
+      <w:r>
+        <w:t>Im Coaching am 15.10.2026 sah der Dozent das Use-Case-Diagramm als zu</w:t>
+      </w:r>
+      <w:r>
+        <w:t xml:space="preserve"> stark vernetzt</w:t>
+      </w:r>
+      <w:r>
+        <w:t xml:space="preserve"> an: Einzelne Akteure hingen an bis zu acht Use Cases. Sein Vorschlag war, je Use Case eine Rolle anzustreben, Akteure bei Bedarf mehrfach darzustellen und die Zuordnung der Rollen zu Personen einem Organigramm zu überlassen. Wir haben das Diagramm auf 15 Mitarbeiterrollen umgebaut und die Rollen in Tabelle 7 den Klassen und Lanes zugeordnet (Abschnitt 5.3).</w:t>
       </w:r>
     </w:p>
     <w:p>
@@ -11618,136 +11617,13 @@
           <w:szCs w:val="22"/>
           <w:lang w:eastAsia="en-GB"/>
         </w:rPr>
-        <w:t>Im Coaching am 22.10.2026 wies der Dozent darauf hin, dass in den Sequenzdiagrammen</w:t>
-      </w:r>
-      <w:r>
-        <w:rPr>
-          <w:rFonts w:ascii="Calibri" w:eastAsia="Calibri" w:hAnsi="Calibri" w:cs="Calibri"/>
-          <w:color w:val="auto"/>
-          <w:sz w:val="22"/>
-          <w:szCs w:val="22"/>
-          <w:lang w:eastAsia="en-GB"/>
-        </w:rPr>
-        <w:t xml:space="preserve"> </w:t>
-      </w:r>
-      <w:r>
-        <w:rPr>
-          <w:rFonts w:ascii="Calibri" w:eastAsia="Calibri" w:hAnsi="Calibri" w:cs="Calibri"/>
-          <w:color w:val="auto"/>
-          <w:sz w:val="22"/>
-          <w:szCs w:val="22"/>
-          <w:lang w:eastAsia="en-GB"/>
-        </w:rPr>
-        <w:t>zwischen Akteur und Fachobjekt ein Objekt der Benutzeroberfläche fehlt und dass offen</w:t>
-      </w:r>
-      <w:r>
-        <w:rPr>
-          <w:rFonts w:ascii="Calibri" w:eastAsia="Calibri" w:hAnsi="Calibri" w:cs="Calibri"/>
-          <w:color w:val="auto"/>
-          <w:sz w:val="22"/>
-          <w:szCs w:val="22"/>
-          <w:lang w:eastAsia="en-GB"/>
-        </w:rPr>
-        <w:t xml:space="preserve"> </w:t>
-      </w:r>
-      <w:r>
-        <w:rPr>
-          <w:rFonts w:ascii="Calibri" w:eastAsia="Calibri" w:hAnsi="Calibri" w:cs="Calibri"/>
-          <w:color w:val="auto"/>
-          <w:sz w:val="22"/>
-          <w:szCs w:val="22"/>
-          <w:lang w:eastAsia="en-GB"/>
-        </w:rPr>
-        <w:t>bleibt, wie die</w:t>
-      </w:r>
-      <w:r>
-        <w:rPr>
-          <w:rFonts w:ascii="Calibri" w:eastAsia="Calibri" w:hAnsi="Calibri" w:cs="Calibri"/>
-          <w:color w:val="auto"/>
-          <w:sz w:val="22"/>
-          <w:szCs w:val="22"/>
-          <w:lang w:eastAsia="en-GB"/>
-        </w:rPr>
-        <w:t xml:space="preserve"> </w:t>
-      </w:r>
-      <w:r>
-        <w:rPr>
-          <w:rFonts w:ascii="Calibri" w:eastAsia="Calibri" w:hAnsi="Calibri" w:cs="Calibri"/>
-          <w:color w:val="auto"/>
-          <w:sz w:val="22"/>
-          <w:szCs w:val="22"/>
-          <w:lang w:eastAsia="en-GB"/>
-        </w:rPr>
-        <w:t>Oberfläche an das richtige Objekt kommt. Wir haben die Klassen</w:t>
-      </w:r>
-      <w:r>
-        <w:rPr>
-          <w:rFonts w:ascii="Calibri" w:eastAsia="Calibri" w:hAnsi="Calibri" w:cs="Calibri"/>
-          <w:color w:val="auto"/>
-          <w:sz w:val="22"/>
-          <w:szCs w:val="22"/>
-          <w:lang w:eastAsia="en-GB"/>
-        </w:rPr>
-        <w:t xml:space="preserve"> </w:t>
-      </w:r>
-      <w:r>
-        <w:rPr>
-          <w:rFonts w:ascii="Calibri" w:eastAsia="Calibri" w:hAnsi="Calibri" w:cs="Calibri"/>
-          <w:color w:val="auto"/>
-          <w:sz w:val="22"/>
-          <w:szCs w:val="22"/>
-          <w:lang w:eastAsia="en-GB"/>
-        </w:rPr>
-        <w:t>KundenApp und Werkstattoberflaeche mit den Methoden der Benutzeraktionen ergänzt und den Werkstattbetrieb um Suchoperationen erweitert, die zu einer eingegebenen</w:t>
-      </w:r>
-      <w:r>
-        <w:rPr>
-          <w:rFonts w:ascii="Calibri" w:eastAsia="Calibri" w:hAnsi="Calibri" w:cs="Calibri"/>
-          <w:color w:val="auto"/>
-          <w:sz w:val="22"/>
-          <w:szCs w:val="22"/>
-          <w:lang w:eastAsia="en-GB"/>
-        </w:rPr>
-        <w:t xml:space="preserve"> </w:t>
-      </w:r>
-      <w:r>
-        <w:rPr>
-          <w:rFonts w:ascii="Calibri" w:eastAsia="Calibri" w:hAnsi="Calibri" w:cs="Calibri"/>
-          <w:color w:val="auto"/>
-          <w:sz w:val="22"/>
-          <w:szCs w:val="22"/>
-          <w:lang w:eastAsia="en-GB"/>
-        </w:rPr>
-        <w:t>Nummer das Objekt liefern. Alle sechs Sequenzdiagramme folgen jetzt dem Muster Akteur,</w:t>
-      </w:r>
-      <w:r>
-        <w:rPr>
-          <w:rFonts w:ascii="Calibri" w:eastAsia="Calibri" w:hAnsi="Calibri" w:cs="Calibri"/>
-          <w:color w:val="auto"/>
-          <w:sz w:val="22"/>
-          <w:szCs w:val="22"/>
-          <w:lang w:eastAsia="en-GB"/>
-        </w:rPr>
-        <w:t xml:space="preserve"> </w:t>
-      </w:r>
-      <w:r>
-        <w:rPr>
-          <w:rFonts w:ascii="Calibri" w:eastAsia="Calibri" w:hAnsi="Calibri" w:cs="Calibri"/>
-          <w:color w:val="auto"/>
-          <w:sz w:val="22"/>
-          <w:szCs w:val="22"/>
-          <w:lang w:eastAsia="en-GB"/>
-        </w:rPr>
-        <w:t>Oberfläche, Fachobjekt (Abschnitte 5.4 und 5.5).</w:t>
+        <w:t>Im Coaching am 22.10.2026 wies der Dozent darauf hin, dass in den Sequenzdiagrammen zwischen Akteur und Fachobjekt ein Objekt der Benutzeroberfläche fehlt und dass offen bleibt, wie die Oberfläche an das richtige Objekt kommt. Wir haben die Klassen KundenApp und Werkstattoberflaeche mit den Methoden der Benutzeraktionen ergänzt und den Werkstattbetrieb um Suchoperationen erweitert, die zu einer eingegebenen Nummer das Objekt liefern. Alle sechs Sequenzdiagramme folgen jetzt dem Muster Akteur, Oberfläche, Fachobjekt (Abschnitte 5.4 und 5.5).</w:t>
       </w:r>
     </w:p>
     <w:p>
       <w:pPr>
         <w:spacing w:after="120" w:line="276" w:lineRule="auto"/>
         <w:jc w:val="both"/>
-        <w:rPr>
-          <w:lang w:val="de-DE"/>
-        </w:rPr>
       </w:pPr>
     </w:p>
     <w:p>
@@ -12020,13 +11896,23 @@
       </w:pBdr>
       <w:jc w:val="right"/>
     </w:pPr>
+    <w:proofErr w:type="spellStart"/>
     <w:r>
       <w:rPr>
         <w:color w:val="595959"/>
         <w:sz w:val="18"/>
         <w:szCs w:val="18"/>
       </w:rPr>
-      <w:t>RepairFlow · Fallstudie Systemanalyse · WWI25B4 · Gruppe 1</w:t>
+      <w:t>RepairFlow</w:t>
+    </w:r>
+    <w:proofErr w:type="spellEnd"/>
+    <w:r>
+      <w:rPr>
+        <w:color w:val="595959"/>
+        <w:sz w:val="18"/>
+        <w:szCs w:val="18"/>
+      </w:rPr>
+      <w:t xml:space="preserve"> · Fallstudie Systemanalyse · WWI25B4 · Gruppe 1</w:t>
     </w:r>
   </w:p>
 </w:hdr>
@@ -12041,13 +11927,23 @@
       </w:pBdr>
       <w:jc w:val="right"/>
     </w:pPr>
+    <w:proofErr w:type="spellStart"/>
     <w:r>
       <w:rPr>
         <w:color w:val="595959"/>
         <w:sz w:val="18"/>
         <w:szCs w:val="18"/>
       </w:rPr>
-      <w:t>RepairFlow · Fallstudie Systemanalyse · WWI25B4 · Gruppe 1</w:t>
+      <w:t>RepairFlow</w:t>
+    </w:r>
+    <w:proofErr w:type="spellEnd"/>
+    <w:r>
+      <w:rPr>
+        <w:color w:val="595959"/>
+        <w:sz w:val="18"/>
+        <w:szCs w:val="18"/>
+      </w:rPr>
+      <w:t xml:space="preserve"> · Fallstudie Systemanalyse · WWI25B4 · Gruppe 1</w:t>
     </w:r>
   </w:p>
 </w:hdr>
@@ -12062,13 +11958,23 @@
       </w:pBdr>
       <w:jc w:val="right"/>
     </w:pPr>
+    <w:proofErr w:type="spellStart"/>
     <w:r>
       <w:rPr>
         <w:color w:val="595959"/>
         <w:sz w:val="18"/>
         <w:szCs w:val="18"/>
       </w:rPr>
-      <w:t>RepairFlow · Fallstudie Systemanalyse · WWI25B4 · Gruppe 1</w:t>
+      <w:t>RepairFlow</w:t>
+    </w:r>
+    <w:proofErr w:type="spellEnd"/>
+    <w:r>
+      <w:rPr>
+        <w:color w:val="595959"/>
+        <w:sz w:val="18"/>
+        <w:szCs w:val="18"/>
+      </w:rPr>
+      <w:t xml:space="preserve"> · Fallstudie Systemanalyse · WWI25B4 · Gruppe 1</w:t>
     </w:r>
   </w:p>
 </w:hdr>
@@ -12293,7 +12199,7 @@
         <w:rFonts w:ascii="Calibri" w:eastAsia="Calibri" w:hAnsi="Calibri" w:cs="Calibri"/>
         <w:sz w:val="22"/>
         <w:szCs w:val="22"/>
-        <w:lang w:eastAsia="en-GB" w:bidi="ar-SA"/>
+        <w:lang w:val="de-DE" w:eastAsia="en-GB" w:bidi="ar-SA"/>
       </w:rPr>
     </w:rPrDefault>
     <w:pPrDefault/>
@@ -12919,7 +12825,7 @@
       <w:color w:val="000000"/>
       <w:sz w:val="18"/>
       <w:szCs w:val="18"/>
-      <w:lang w:val="de-DE" w:eastAsia="de-DE"/>
+      <w:lang w:eastAsia="de-DE"/>
     </w:rPr>
   </w:style>
 </w:styles>

</xml_diff>

<commit_message>
bpmn:1_bpmn uebernommen; Doku angepasst
</commit_message>
<xml_diff>
--- a/3_doku/Projektdokumentation.docx
+++ b/3_doku/Projektdokumentation.docx
@@ -6598,10 +6598,10 @@
         </w:rPr>
         <w:lastRenderedPageBreak/>
         <w:drawing>
-          <wp:inline distT="0" distB="0" distL="0" distR="0" wp14:anchorId="19D2E60F" wp14:editId="4AD0833F">
-            <wp:extent cx="5760000" cy="2125679"/>
+          <wp:inline distT="0" distB="0" distL="0" distR="0" wp14:anchorId="0F60C88C" wp14:editId="1C9F8959">
+            <wp:extent cx="5782310" cy="2133600"/>
             <wp:effectExtent l="0" t="0" r="0" b="0"/>
-            <wp:docPr id="3" name="Picture 3"/>
+            <wp:docPr id="644557787" name="Grafik 1"/>
             <wp:cNvGraphicFramePr>
               <a:graphicFrameLocks xmlns:a="http://schemas.openxmlformats.org/drawingml/2006/main" noChangeAspect="1"/>
             </wp:cNvGraphicFramePr>
@@ -6609,11 +6609,17 @@
               <a:graphicData uri="http://schemas.openxmlformats.org/drawingml/2006/picture">
                 <pic:pic xmlns:pic="http://schemas.openxmlformats.org/drawingml/2006/picture">
                   <pic:nvPicPr>
-                    <pic:cNvPr id="0" name="p01-sofortdiagnose.png"/>
+                    <pic:cNvPr id="644557787" name="Grafik 644557787"/>
                     <pic:cNvPicPr/>
                   </pic:nvPicPr>
                   <pic:blipFill>
-                    <a:blip r:embed="rId8"/>
+                    <a:blip r:embed="rId8" cstate="print">
+                      <a:extLst>
+                        <a:ext uri="{28A0092B-C50C-407E-A947-70E740481C1C}">
+                          <a14:useLocalDpi xmlns:a14="http://schemas.microsoft.com/office/drawing/2010/main" val="0"/>
+                        </a:ext>
+                      </a:extLst>
+                    </a:blip>
                     <a:stretch>
                       <a:fillRect/>
                     </a:stretch>
@@ -6621,7 +6627,7 @@
                   <pic:spPr>
                     <a:xfrm>
                       <a:off x="0" y="0"/>
-                      <a:ext cx="5760000" cy="2125679"/>
+                      <a:ext cx="5782310" cy="2133600"/>
                     </a:xfrm>
                     <a:prstGeom prst="rect">
                       <a:avLst/>
@@ -6659,10 +6665,10 @@
           <w:noProof/>
         </w:rPr>
         <w:drawing>
-          <wp:inline distT="0" distB="0" distL="0" distR="0" wp14:anchorId="3C47F1C3" wp14:editId="2F129291">
-            <wp:extent cx="5760000" cy="2323330"/>
-            <wp:effectExtent l="0" t="0" r="0" b="0"/>
-            <wp:docPr id="2" name="Picture 2"/>
+          <wp:inline distT="0" distB="0" distL="0" distR="0" wp14:anchorId="2C7C0B39" wp14:editId="525D9143">
+            <wp:extent cx="5782310" cy="2331720"/>
+            <wp:effectExtent l="0" t="0" r="0" b="5080"/>
+            <wp:docPr id="1426216721" name="Grafik 3"/>
             <wp:cNvGraphicFramePr>
               <a:graphicFrameLocks xmlns:a="http://schemas.openxmlformats.org/drawingml/2006/main" noChangeAspect="1"/>
             </wp:cNvGraphicFramePr>
@@ -6670,11 +6676,17 @@
               <a:graphicData uri="http://schemas.openxmlformats.org/drawingml/2006/picture">
                 <pic:pic xmlns:pic="http://schemas.openxmlformats.org/drawingml/2006/picture">
                   <pic:nvPicPr>
-                    <pic:cNvPr id="0" name="p04-kostenvoranschlag.png"/>
+                    <pic:cNvPr id="1426216721" name="Grafik 1426216721"/>
                     <pic:cNvPicPr/>
                   </pic:nvPicPr>
                   <pic:blipFill>
-                    <a:blip r:embed="rId9"/>
+                    <a:blip r:embed="rId9" cstate="print">
+                      <a:extLst>
+                        <a:ext uri="{28A0092B-C50C-407E-A947-70E740481C1C}">
+                          <a14:useLocalDpi xmlns:a14="http://schemas.microsoft.com/office/drawing/2010/main" val="0"/>
+                        </a:ext>
+                      </a:extLst>
+                    </a:blip>
                     <a:stretch>
                       <a:fillRect/>
                     </a:stretch>
@@ -6682,7 +6694,7 @@
                   <pic:spPr>
                     <a:xfrm>
                       <a:off x="0" y="0"/>
-                      <a:ext cx="5760000" cy="2323330"/>
+                      <a:ext cx="5782310" cy="2331720"/>
                     </a:xfrm>
                     <a:prstGeom prst="rect">
                       <a:avLst/>
@@ -6697,6 +6709,11 @@
     </w:p>
     <w:p>
       <w:pPr>
+        <w:jc w:val="center"/>
+      </w:pPr>
+    </w:p>
+    <w:p>
+      <w:pPr>
         <w:spacing w:before="60" w:after="200"/>
         <w:jc w:val="center"/>
       </w:pPr>
@@ -6809,11 +6826,11 @@
         <w:jc w:val="both"/>
       </w:pPr>
       <w:r>
-        <w:t xml:space="preserve">Das Use-Case-Diagramm (Abbildung 4) zeigt, was RepairFlow aus Sicht seiner Benutzer leistet. Es enthält 19 Use Cases und 17 Akteure: den Kunden, 15 Mitarbeiterrollen und den KI-Diagnosedienst als externes System. Der Lieferant ist kein Akteur, sondern eine Black Box ohne Zugang zu RepairFlow; wie in den Prozessmodellen kommt er nur über Nachrichten vor. Jeder Use Case hat genau eine Rolle als </w:t>
+        <w:t xml:space="preserve">Das Use-Case-Diagramm (Abbildung 4) zeigt, was RepairFlow aus Sicht seiner Benutzer leistet. Es enthält 19 Use Cases und 17 Akteure: den Kunden, 15 Mitarbeiterrollen und den KI-Diagnosedienst als externes System. Der Lieferant ist kein Akteur, sondern eine Black Box ohne Zugang zu RepairFlow; wie </w:t>
       </w:r>
       <w:r>
         <w:lastRenderedPageBreak/>
-        <w:t>primären Akteur; die Nummern UC01 bis UC19 dienen nur der Zuordnung in den Tabellen, im Diagramm stehen die Namen. Diese Struktur geht auf einen Hinweis des Dozenten vom 15.10.2026 zurück: Unsere erste Fassung hatte acht Akteure mit bis zu acht Verbindungen, etwa den Techniker an Diagnose, KVA, Reparatur, Fertigmeldung und Reklamation. Statt eines Akteurs mit vielen Linien gibt es jetzt je Use Case eine Rolle, zum Beispiel Diagnoseprüfer, Diagnostiker, Kalkulator, Reparateur und Endkontrolleur anstelle des Technikers. Welche Person eine Rolle ausfüllt, regelt das Organigramm des Werkstattbetriebs; im Modell sind das die Unterklassen von Mitarbeiter (Tabelle 7). Der Kunde ist einmal dargestellt und mit UC01, UC02 und UC07 verbunden. UC08 „Ersatzteil-Verfügbarkeit prüfen“ wird nur über include erreicht und hat deshalb keinen eigenen Akteur.</w:t>
+        <w:t>in den Prozessmodellen kommt er nur über Nachrichten vor. Jeder Use Case hat genau eine Rolle als primären Akteur; die Nummern UC01 bis UC19 dienen nur der Zuordnung in den Tabellen, im Diagramm stehen die Namen. Diese Struktur geht auf einen Hinweis des Dozenten vom 15.10.2026 zurück: Unsere erste Fassung hatte acht Akteure mit bis zu acht Verbindungen, etwa den Techniker an Diagnose, KVA, Reparatur, Fertigmeldung und Reklamation. Statt eines Akteurs mit vielen Linien gibt es jetzt je Use Case eine Rolle, zum Beispiel Diagnoseprüfer, Diagnostiker, Kalkulator, Reparateur und Endkontrolleur anstelle des Technikers. Welche Person eine Rolle ausfüllt, regelt das Organigramm des Werkstattbetriebs; im Modell sind das die Unterklassen von Mitarbeiter (Tabelle 7). Der Kunde ist einmal dargestellt und mit UC01, UC02 und UC07 verbunden. UC08 „Ersatzteil-Verfügbarkeit prüfen“ wird nur über include erreicht und hat deshalb keinen eigenen Akteur.</w:t>
       </w:r>
     </w:p>
     <w:tbl>
@@ -8765,7 +8782,11 @@
         <w:jc w:val="both"/>
       </w:pPr>
       <w:r>
-        <w:t>Zwei include-Beziehungen stehen für Teilschritte, die immer ausgeführt werden: „Sofortdiagnose anfordern“ und „Ersatzteile disponieren und reservieren“ schließen „Ersatzteil-Verfügbarkeit prüfen“ ein. Sechs extend-Beziehungen beschreiben bedingtes Verhalten. So erweitert „Lieferantenbestellung auslösen“ die Disposition nur, wenn Fehlteile vorhanden sind, und „Retoure abwickeln“ den Wareneingang nur bei mangelhafter Lieferung.</w:t>
+        <w:t xml:space="preserve">Zwei include-Beziehungen stehen für Teilschritte, die immer ausgeführt werden: „Sofortdiagnose anfordern“ und „Ersatzteile disponieren und reservieren“ schließen „Ersatzteil-Verfügbarkeit prüfen“ ein. Sechs extend-Beziehungen beschreiben bedingtes Verhalten. So erweitert „Lieferantenbestellung </w:t>
+      </w:r>
+      <w:r>
+        <w:lastRenderedPageBreak/>
+        <w:t>auslösen“ die Disposition nur, wenn Fehlteile vorhanden sind, und „Retoure abwickeln“ den Wareneingang nur bei mangelhafter Lieferung.</w:t>
       </w:r>
     </w:p>
     <w:p>
@@ -8778,7 +8799,6 @@
         <w:rPr>
           <w:noProof/>
         </w:rPr>
-        <w:lastRenderedPageBreak/>
         <w:drawing>
           <wp:inline distT="0" distB="0" distL="0" distR="0" wp14:anchorId="768D9E83" wp14:editId="3206FFA0">
             <wp:extent cx="3021910" cy="7920000"/>
@@ -9072,10 +9092,10 @@
         </w:rPr>
         <w:lastRenderedPageBreak/>
         <w:drawing>
-          <wp:inline distT="0" distB="0" distL="0" distR="0" wp14:anchorId="51897684" wp14:editId="2194742E">
-            <wp:extent cx="6984737" cy="5299904"/>
-            <wp:effectExtent l="0" t="0" r="0" b="0"/>
-            <wp:docPr id="201" name="Picture 201"/>
+          <wp:inline distT="0" distB="0" distL="0" distR="0" wp14:anchorId="128BF440" wp14:editId="79C6B801">
+            <wp:extent cx="7578721" cy="5749290"/>
+            <wp:effectExtent l="0" t="0" r="3810" b="3810"/>
+            <wp:docPr id="1600717457" name="Grafik 4"/>
             <wp:cNvGraphicFramePr>
               <a:graphicFrameLocks xmlns:a="http://schemas.openxmlformats.org/drawingml/2006/main" noChangeAspect="1"/>
             </wp:cNvGraphicFramePr>
@@ -9083,11 +9103,17 @@
               <a:graphicData uri="http://schemas.openxmlformats.org/drawingml/2006/picture">
                 <pic:pic xmlns:pic="http://schemas.openxmlformats.org/drawingml/2006/picture">
                   <pic:nvPicPr>
-                    <pic:cNvPr id="0" name="klassendiagramm.png"/>
+                    <pic:cNvPr id="1600717457" name="Grafik 1600717457"/>
                     <pic:cNvPicPr/>
                   </pic:nvPicPr>
                   <pic:blipFill>
-                    <a:blip r:embed="rId13"/>
+                    <a:blip r:embed="rId13" cstate="print">
+                      <a:extLst>
+                        <a:ext uri="{28A0092B-C50C-407E-A947-70E740481C1C}">
+                          <a14:useLocalDpi xmlns:a14="http://schemas.microsoft.com/office/drawing/2010/main" val="0"/>
+                        </a:ext>
+                      </a:extLst>
+                    </a:blip>
                     <a:stretch>
                       <a:fillRect/>
                     </a:stretch>
@@ -9095,7 +9121,7 @@
                   <pic:spPr>
                     <a:xfrm>
                       <a:off x="0" y="0"/>
-                      <a:ext cx="6984737" cy="5299904"/>
+                      <a:ext cx="7587707" cy="5756107"/>
                     </a:xfrm>
                     <a:prstGeom prst="rect">
                       <a:avLst/>
@@ -10033,10 +10059,10 @@
         </w:rPr>
         <w:lastRenderedPageBreak/>
         <w:drawing>
-          <wp:inline distT="0" distB="0" distL="0" distR="0" wp14:anchorId="5739D476" wp14:editId="6098A535">
-            <wp:extent cx="5760000" cy="5047830"/>
+          <wp:inline distT="0" distB="0" distL="0" distR="0" wp14:anchorId="307C6272" wp14:editId="47E410A2">
+            <wp:extent cx="5782310" cy="4473575"/>
             <wp:effectExtent l="0" t="0" r="0" b="0"/>
-            <wp:docPr id="202" name="Picture 202"/>
+            <wp:docPr id="248347308" name="Grafik 5"/>
             <wp:cNvGraphicFramePr>
               <a:graphicFrameLocks xmlns:a="http://schemas.openxmlformats.org/drawingml/2006/main" noChangeAspect="1"/>
             </wp:cNvGraphicFramePr>
@@ -10044,11 +10070,17 @@
               <a:graphicData uri="http://schemas.openxmlformats.org/drawingml/2006/picture">
                 <pic:pic xmlns:pic="http://schemas.openxmlformats.org/drawingml/2006/picture">
                   <pic:nvPicPr>
-                    <pic:cNvPr id="0" name="sequenz-01-sofortdiagnose.png"/>
+                    <pic:cNvPr id="248347308" name="Grafik 248347308"/>
                     <pic:cNvPicPr/>
                   </pic:nvPicPr>
                   <pic:blipFill>
-                    <a:blip r:embed="rId16"/>
+                    <a:blip r:embed="rId16" cstate="print">
+                      <a:extLst>
+                        <a:ext uri="{28A0092B-C50C-407E-A947-70E740481C1C}">
+                          <a14:useLocalDpi xmlns:a14="http://schemas.microsoft.com/office/drawing/2010/main" val="0"/>
+                        </a:ext>
+                      </a:extLst>
+                    </a:blip>
                     <a:stretch>
                       <a:fillRect/>
                     </a:stretch>
@@ -10056,7 +10088,7 @@
                   <pic:spPr>
                     <a:xfrm>
                       <a:off x="0" y="0"/>
-                      <a:ext cx="5760000" cy="5047830"/>
+                      <a:ext cx="5782310" cy="4473575"/>
                     </a:xfrm>
                     <a:prstGeom prst="rect">
                       <a:avLst/>
@@ -10095,12 +10127,11 @@
         <w:rPr>
           <w:noProof/>
         </w:rPr>
-        <w:lastRenderedPageBreak/>
         <w:drawing>
-          <wp:inline distT="0" distB="0" distL="0" distR="0" wp14:anchorId="5B06C323" wp14:editId="2D78EA3C">
-            <wp:extent cx="5760000" cy="4044820"/>
+          <wp:inline distT="0" distB="0" distL="0" distR="0" wp14:anchorId="05AB1227" wp14:editId="5480FE0D">
+            <wp:extent cx="5782310" cy="3723005"/>
             <wp:effectExtent l="0" t="0" r="0" b="0"/>
-            <wp:docPr id="203" name="Picture 203"/>
+            <wp:docPr id="5075578" name="Grafik 6"/>
             <wp:cNvGraphicFramePr>
               <a:graphicFrameLocks xmlns:a="http://schemas.openxmlformats.org/drawingml/2006/main" noChangeAspect="1"/>
             </wp:cNvGraphicFramePr>
@@ -10108,11 +10139,17 @@
               <a:graphicData uri="http://schemas.openxmlformats.org/drawingml/2006/picture">
                 <pic:pic xmlns:pic="http://schemas.openxmlformats.org/drawingml/2006/picture">
                   <pic:nvPicPr>
-                    <pic:cNvPr id="0" name="sequenz-03-reservierung.png"/>
+                    <pic:cNvPr id="5075578" name="Grafik 5075578"/>
                     <pic:cNvPicPr/>
                   </pic:nvPicPr>
                   <pic:blipFill>
-                    <a:blip r:embed="rId17"/>
+                    <a:blip r:embed="rId17" cstate="print">
+                      <a:extLst>
+                        <a:ext uri="{28A0092B-C50C-407E-A947-70E740481C1C}">
+                          <a14:useLocalDpi xmlns:a14="http://schemas.microsoft.com/office/drawing/2010/main" val="0"/>
+                        </a:ext>
+                      </a:extLst>
+                    </a:blip>
                     <a:stretch>
                       <a:fillRect/>
                     </a:stretch>
@@ -10120,7 +10157,7 @@
                   <pic:spPr>
                     <a:xfrm>
                       <a:off x="0" y="0"/>
-                      <a:ext cx="5760000" cy="4044820"/>
+                      <a:ext cx="5782310" cy="3723005"/>
                     </a:xfrm>
                     <a:prstGeom prst="rect">
                       <a:avLst/>
@@ -10155,6 +10192,7 @@
         <w:keepNext/>
       </w:pPr>
       <w:r>
+        <w:lastRenderedPageBreak/>
         <w:t>5.6 Konsistenz zwischen den Modellen</w:t>
       </w:r>
     </w:p>
@@ -10225,7 +10263,6 @@
                 <w:sz w:val="19"/>
                 <w:szCs w:val="19"/>
               </w:rPr>
-              <w:lastRenderedPageBreak/>
               <w:t>Prozess (BPMN)</w:t>
             </w:r>
           </w:p>
@@ -11468,6 +11505,7 @@
           <w:b/>
           <w:bCs/>
         </w:rPr>
+        <w:lastRenderedPageBreak/>
         <w:t xml:space="preserve">Einheitliche Begriffe. </w:t>
       </w:r>
       <w:r>
@@ -11493,11 +11531,7 @@
         <w:t>wir</w:t>
       </w:r>
       <w:r>
-        <w:t xml:space="preserve"> </w:t>
-      </w:r>
-      <w:r>
-        <w:lastRenderedPageBreak/>
-        <w:t xml:space="preserve">konnten Visual Paradigm nicht nutzen. Die gesamte UML-Arbeit lag damit bei zwei Personen, die übrigen haben die Diagramme anhand der Exporte geprüft. Dazu kommt, dass der Teamwork-Server der DHBW nur über das Lehre-VPN erreichbar ist. </w:t>
+        <w:t xml:space="preserve"> konnten Visual Paradigm nicht nutzen. Die gesamte UML-Arbeit lag damit bei zwei Personen, die übrigen haben die Diagramme anhand der Exporte geprüft. Dazu kommt, dass der Teamwork-Server der DHBW nur über das Lehre-VPN erreichbar ist. </w:t>
       </w:r>
     </w:p>
     <w:p>
@@ -11650,7 +11684,6 @@
         <w:jc w:val="both"/>
       </w:pPr>
       <w:r>
-        <w:lastRenderedPageBreak/>
         <w:t>Viel Aufwand steckte in Dingen am Rand der eigentlichen Analyse, etwa im Zugang zum Teamwork-Server und in den technischen Angaben, die der Camunda Modeler verlangt. Beim nächsten Mal würden wir früher festlegen, welche Datei die verbindliche Quelle eines Modells ist, und das UML-Modell schon im ersten Sprint in Visual Paradigm anlegen.</w:t>
       </w:r>
     </w:p>

</xml_diff>

<commit_message>
docs: Doku, Sprechtext, PPTX-Kennzahlen, SD1/SD5 und Arbeitslisten auf Stand 24.10.
Co-Authored-By: Claude Opus 5.5 <noreply@anthropic.com>
Claude-Session: https://claude.ai/code/session_01H2bGsFaySUqsEjJ1PXuxUw
</commit_message>
<xml_diff>
--- a/3_doku/Projektdokumentation.docx
+++ b/3_doku/Projektdokumentation.docx
@@ -665,8 +665,7 @@
           <w:sz w:val="20"/>
           <w:szCs w:val="20"/>
         </w:rPr>
-        <w:tab/>
-        <w:t>12</w:t>
+        <w:t>13</w:t>
       </w:r>
     </w:p>
     <w:p>
@@ -736,8 +735,7 @@
           <w:b/>
           <w:bCs/>
         </w:rPr>
-        <w:tab/>
-        <w:t>18</w:t>
+        <w:t>17</w:t>
       </w:r>
     </w:p>
     <w:p>
@@ -759,8 +757,7 @@
           <w:b/>
           <w:bCs/>
         </w:rPr>
-        <w:tab/>
-        <w:t>19</w:t>
+        <w:t>18</w:t>
       </w:r>
     </w:p>
     <w:p>
@@ -783,8 +780,7 @@
           <w:sz w:val="20"/>
           <w:szCs w:val="20"/>
         </w:rPr>
-        <w:tab/>
-        <w:t>19</w:t>
+        <w:t>18</w:t>
       </w:r>
     </w:p>
     <w:p>
@@ -1642,7 +1638,7 @@
         <w:t>, Erstellung der PowerPoint</w:t>
       </w:r>
       <w:r>
-        <w:t>-Präsentation</w:t>
+        <w:t>-Präsentation.</w:t>
       </w:r>
     </w:p>
     <w:p>
@@ -1798,7 +1794,7 @@
         <w:jc w:val="both"/>
       </w:pPr>
       <w:r>
-        <w:t>Abbildung 1 stellt den Systemkontext und die Systemgrenze dar. Innerhalb der Systemgrenze liegt die RepairFlow-Plattform. Der Werkstattbetrieb ist als Mandant angebunden, seine Rollen Service/Annahme, Techniker, Werkstattleitung und Ersatzteil-Disposition arbeiten in der Oberfläche der Plattform. Der Kunde nutzt das Kundenportal. Mit dem Lieferanten tauscht RepairFlow Bestellungen, Bestätigungen, Lieferungen und Retouren aus. Der KI-Diagnosedienst ist ein externer Dienst, den die Plattform zur Auswertung von Foto, Video und Ton aufruft. Außerhalb der Systemgrenze liegen die physische Reparatur, die Systeme der Lieferanten und die Buchhaltung, an die nur über eine Exportschnittstelle übergeben wird.</w:t>
+        <w:t>Abbildung 1 stellt den Systemkontext und die Systemgrenze dar. Innerhalb der Systemgrenze liegt die RepairFlow-Plattform. Der Werkstattbetrieb ist als Mandant angebunden, seine Rollen Service / Annahme, Techniker, Werkstattleitung und Ersatzteil-Disposition arbeiten in der Oberfläche der Plattform. Der Kunde nutzt das Kundenportal. Mit dem Lieferanten tauscht RepairFlow Bestellungen, Bestätigungen, Lieferungen und Retouren aus. Der KI-Diagnosedienst ist ein externer Dienst, den die Plattform zur Auswertung von Foto, Video und Ton aufruft. Außerhalb der Systemgrenze liegen die physische Reparatur, die Systeme der Lieferanten und die Buchhaltung, an die nur über eine Exportschnittstelle übergeben wird.</w:t>
       </w:r>
     </w:p>
     <w:p>
@@ -2382,7 +2378,6 @@
                 <w:color w:val="000000"/>
                 <w:sz w:val="19"/>
                 <w:szCs w:val="19"/>
-                <w:shd w:val="clear" w:color="auto" w:fill="FFF2A8"/>
               </w:rPr>
               <w:t xml:space="preserve"> </w:t>
             </w:r>
@@ -2645,7 +2640,7 @@
         <w:t xml:space="preserve">Die Beteiligten erscheinen in BPMN als Pool (Kunde) oder Lane (Service / Annahme, Techniker, Ersatzteil-Disposition, Werkstattleitung), </w:t>
       </w:r>
       <w:r>
-        <w:t>jeder Use-Case hat eine Rolle als Hauptakteur</w:t>
+        <w:t>jeder Use Case hat genau eine Rolle als Hauptakteur</w:t>
       </w:r>
       <w:r>
         <w:t xml:space="preserve"> (Tabelle 7), in den Sequenzdiagrammen als Akteure mit demselben Rollennamen und im Klassendiagramm als Unterklassen von Mitarbeiter. Welche Rolle zu welcher Klasse und Lane gehört, legt Tabelle 7 fest.</w:t>
@@ -4302,17 +4297,7 @@
         <w:jc w:val="both"/>
       </w:pPr>
       <w:r>
-        <w:t xml:space="preserve">Wir haben zehn Soll-Prozesse unseres Pilotkunden als Kollaborationsdiagramme modelliert (Tabelle 6). Zusammen enthalten sie 136 Aktivitäten im Werkstatt-Pool, im Schnitt 13,6 je Diagramm. Hinzu </w:t>
-      </w:r>
-      <w:r>
-        <w:lastRenderedPageBreak/>
-        <w:t>kommen 27 Aktivitäten in den Abläufen des Kunden, 45 Nachrichtenflüsse sowie 53 Datenobjekte und 1</w:t>
-      </w:r>
-      <w:r>
-        <w:t>3</w:t>
-      </w:r>
-      <w:r>
-        <w:t xml:space="preserve"> Datenspeicher.</w:t>
+        <w:t>Wir haben zehn Soll-Prozesse unseres Pilotkunden als Kollaborationsdiagramme modelliert (Tabelle 6). Zusammen enthalten sie 143 Aktivitäten im Werkstatt-Pool, im Schnitt 14,3 je Diagramm. Hinzu kommen 28 Aktivitäten in den Abläufen des Kunden, 48 Nachrichtenflüsse sowie 58 Datenobjekte und 14 Datenspeicher.</w:t>
       </w:r>
     </w:p>
     <w:tbl>
@@ -4798,7 +4783,7 @@
                 <w:sz w:val="19"/>
                 <w:szCs w:val="19"/>
               </w:rPr>
-              <w:t>Kunde erschienen</w:t>
+              <w:t>Gerät abgegeben</w:t>
             </w:r>
           </w:p>
         </w:tc>
@@ -4873,7 +4858,7 @@
                 <w:sz w:val="19"/>
                 <w:szCs w:val="19"/>
               </w:rPr>
-              <w:t>12</w:t>
+              <w:t>16</w:t>
             </w:r>
           </w:p>
         </w:tc>
@@ -4898,7 +4883,7 @@
                 <w:sz w:val="19"/>
                 <w:szCs w:val="19"/>
               </w:rPr>
-              <w:t>4 (33 %)</w:t>
+              <w:t>7 (44 %)</w:t>
             </w:r>
           </w:p>
         </w:tc>
@@ -5053,7 +5038,7 @@
                 <w:sz w:val="19"/>
                 <w:szCs w:val="19"/>
               </w:rPr>
-              <w:t>12</w:t>
+              <w:t>13</w:t>
             </w:r>
           </w:p>
         </w:tc>
@@ -5078,7 +5063,7 @@
                 <w:sz w:val="19"/>
                 <w:szCs w:val="19"/>
               </w:rPr>
-              <w:t>5 (42 %)</w:t>
+              <w:t>6 (46 %)</w:t>
             </w:r>
           </w:p>
         </w:tc>
@@ -5233,7 +5218,7 @@
                 <w:sz w:val="19"/>
                 <w:szCs w:val="19"/>
               </w:rPr>
-              <w:t>11</w:t>
+              <w:t>12</w:t>
             </w:r>
           </w:p>
         </w:tc>
@@ -5258,7 +5243,7 @@
                 <w:sz w:val="19"/>
                 <w:szCs w:val="19"/>
               </w:rPr>
-              <w:t>7 (64 %)</w:t>
+              <w:t>8 (67 %)</w:t>
             </w:r>
           </w:p>
         </w:tc>
@@ -5413,7 +5398,7 @@
                 <w:sz w:val="19"/>
                 <w:szCs w:val="19"/>
               </w:rPr>
-              <w:t>15</w:t>
+              <w:t>16</w:t>
             </w:r>
           </w:p>
         </w:tc>
@@ -5438,7 +5423,7 @@
                 <w:sz w:val="19"/>
                 <w:szCs w:val="19"/>
               </w:rPr>
-              <w:t>12 (80 %)</w:t>
+              <w:t>12 (75 %)</w:t>
             </w:r>
           </w:p>
         </w:tc>
@@ -6366,7 +6351,7 @@
         <w:jc w:val="both"/>
       </w:pPr>
       <w:r>
-        <w:t>Der Pool Werkstattbetrieb enthält den ausführbaren Prozess. Seine Lanes sind die Rollen Service/Annahme, Techniker, Werkstattleitung und Ersatzteil-Disposition. Kunde und Lieferant sind eigene Pools, mit denen nur über Nachrichtenflüsse kommuniziert wird. Der Kunde hat in den Prozessen 01 bis 09 einen eigenen, nicht ausführbaren Ablauf. So ist sichtbar, wann er antwortet und wie der Vorgang für ihn endet. Den Lieferanten modellieren wir als Black Box, weil wir seine internen Abläufe nicht kennen. Für die Software gibt es keine eigene Lane. Ob RepairFlow einen Schritt allein erledigt, zeigt der Aktivitätstyp: Service Task (automatisch), Business Rule Task (Regel oder KI), Send- und Receive Task (Nachricht über die Plattform), User Task (Mitarbeiter in der Plattform) und Manual Task (außerhalb der Software).</w:t>
+        <w:t>Der Pool Werkstattbetrieb enthält den ausführbaren Prozess. Seine Lanes sind die Rollen Service / Annahme, Techniker, Werkstattleitung und Ersatzteil-Disposition. Kunde und Lieferant sind eigene Pools, mit denen nur über Nachrichtenflüsse kommuniziert wird. Der Kunde hat in den Prozessen 01 bis 09 einen eigenen, nicht ausführbaren Ablauf. So ist sichtbar, wann er antwortet und wie der Vorgang für ihn endet. Den Lieferanten modellieren wir als Black Box, weil wir seine internen Abläufe nicht kennen. Für die Software gibt es keine eigene Lane. Ob RepairFlow einen Schritt allein erledigt, zeigt der Aktivitätstyp: Service Task (automatisch), Business Rule Task (Regel oder KI), Send Task und Receive Task (Nachricht über die Plattform), User Task (Mitarbeiter in der Plattform) und Manual Task (außerhalb der Software).</w:t>
       </w:r>
     </w:p>
     <w:p>
@@ -6505,7 +6490,7 @@
         <w:t xml:space="preserve">06 Ersatzteil-Bestellung. </w:t>
       </w:r>
       <w:r>
-        <w:t>Fehlteile und Nachbestellvorschläge werden gebündelt bestellt, oberhalb einer Freigabegrenze erst nach Freigabe. Ohne Bestätigung oder nach zwei erfolglosen Mahnungen wird storniert und ein anderer Lieferant gesucht. Der Wareneingang wird erst geprüft und nur mangelfreie Ware gebucht, auch bei einer Ersatzlieferung.</w:t>
+        <w:t>Fehlteile und Nachbestellvorschläge werden gebündelt bestellt, oberhalb einer Freigabegrenze erst nach Freigabe. Ohne Bestätigung wird storniert und ein anderer Lieferant gesucht. Bleibt die Lieferung über den Liefertermin hinaus aus, wird sie angemahnt und eine Nachfrist von 14 Tagen gesetzt; nach der zweiten erfolglosen Mahnung wird ebenfalls storniert. Der Wareneingang wird erst geprüft und nur mangelfreie Ware gebucht, auch bei einer Ersatzlieferung.</w:t>
       </w:r>
     </w:p>
     <w:p>
@@ -6666,7 +6651,7 @@
         </w:rPr>
         <w:drawing>
           <wp:inline distT="0" distB="0" distL="0" distR="0" wp14:anchorId="2C7C0B39" wp14:editId="525D9143">
-            <wp:extent cx="5782310" cy="2331720"/>
+            <wp:extent cx="5782310" cy="2228413"/>
             <wp:effectExtent l="0" t="0" r="0" b="5080"/>
             <wp:docPr id="1426216721" name="Grafik 3"/>
             <wp:cNvGraphicFramePr>
@@ -6694,7 +6679,7 @@
                   <pic:spPr>
                     <a:xfrm>
                       <a:off x="0" y="0"/>
-                      <a:ext cx="5782310" cy="2331720"/>
+                      <a:ext cx="5782310" cy="2228413"/>
                     </a:xfrm>
                     <a:prstGeom prst="rect">
                       <a:avLst/>
@@ -6709,11 +6694,6 @@
     </w:p>
     <w:p>
       <w:pPr>
-        <w:jc w:val="center"/>
-      </w:pPr>
-    </w:p>
-    <w:p>
-      <w:pPr>
         <w:spacing w:before="60" w:after="200"/>
         <w:jc w:val="center"/>
       </w:pPr>
@@ -6743,7 +6723,7 @@
         <w:jc w:val="both"/>
       </w:pPr>
       <w:r>
-        <w:t>Von den 136 Aktivitäten sind 84 automatisiert, regelbasiert oder Nachrichten der Plattform, also rund 62 Prozent. 32 weitere sind Benutzer-Aktivitäten in der Plattform. Neun manuelle Aktivitäten liegen außerhalb der Software, zehn rufen einen anderen Prozess auf, und eine ist der Mehrfach-Teilprozess für die Prüfung je Ersatzteil. Die Software automatisiert vor allem:</w:t>
+        <w:t>Von den 143 Aktivitäten sind 89 automatisiert, regelbasiert oder Nachrichten der Plattform, also rund 62 Prozent. 34 weitere sind Benutzer-Aktivitäten in der Plattform. Neun manuelle Aktivitäten liegen außerhalb der Software, zehn rufen einen anderen Prozess auf, und eine ist der Mehrfach-Teilprozess für die Prüfung je Ersatzteil. Die Software automatisiert vor allem:</w:t>
       </w:r>
     </w:p>
     <w:p>
@@ -6829,8 +6809,7 @@
         <w:t xml:space="preserve">Das Use-Case-Diagramm (Abbildung 4) zeigt, was RepairFlow aus Sicht seiner Benutzer leistet. Es enthält 19 Use Cases und 17 Akteure: den Kunden, 15 Mitarbeiterrollen und den KI-Diagnosedienst als externes System. Der Lieferant ist kein Akteur, sondern eine Black Box ohne Zugang zu RepairFlow; wie </w:t>
       </w:r>
       <w:r>
-        <w:lastRenderedPageBreak/>
-        <w:t>in den Prozessmodellen kommt er nur über Nachrichten vor. Jeder Use Case hat genau eine Rolle als primären Akteur; die Nummern UC01 bis UC19 dienen nur der Zuordnung in den Tabellen, im Diagramm stehen die Namen. Diese Struktur geht auf einen Hinweis des Dozenten vom 15.10.2026 zurück: Unsere erste Fassung hatte acht Akteure mit bis zu acht Verbindungen, etwa den Techniker an Diagnose, KVA, Reparatur, Fertigmeldung und Reklamation. Statt eines Akteurs mit vielen Linien gibt es jetzt je Use Case eine Rolle, zum Beispiel Diagnoseprüfer, Diagnostiker, Kalkulator, Reparateur und Endkontrolleur anstelle des Technikers. Welche Person eine Rolle ausfüllt, regelt das Organigramm des Werkstattbetriebs; im Modell sind das die Unterklassen von Mitarbeiter (Tabelle 7). Der Kunde ist einmal dargestellt und mit UC01, UC02 und UC07 verbunden. UC08 „Ersatzteil-Verfügbarkeit prüfen“ wird nur über include erreicht und hat deshalb keinen eigenen Akteur.</w:t>
+        <w:t>in den Prozessmodellen kommt er nur über Nachrichten vor. Jeder Use Case hat genau eine Rolle als primären Akteur; die Nummern UC01 bis UC19 dienen nur der Zuordnung in den Tabellen, im Diagramm stehen die Namen. Diese Struktur geht auf einen Hinweis des Dozenten vom 15.10.2026 zurück: Unsere erste Fassung hatte acht Akteure mit bis zu acht Verbindungen, etwa den Techniker an Diagnosevorschlag, Diagnosebefund, KVA, Reparatur und Fertigmeldung. Statt eines Akteurs mit vielen Linien gibt es jetzt je Use Case eine Rolle, zum Beispiel Diagnoseprüfer, Diagnostiker, Kalkulator, Reparateur und Endkontrolleur anstelle des Technikers. Welche Person eine Rolle ausfüllt, regelt das Organigramm des Werkstattbetriebs; im Modell sind das die Unterklassen von Mitarbeiter (Tabelle 7). Der Kunde ist einmal dargestellt und mit UC01, UC02 und UC07 verbunden. UC08 „Ersatzteil-Verfügbarkeit prüfen“ wird nur über include erreicht und hat deshalb keinen eigenen Akteur.</w:t>
       </w:r>
     </w:p>
     <w:tbl>
@@ -8801,7 +8780,7 @@
         </w:rPr>
         <w:drawing>
           <wp:inline distT="0" distB="0" distL="0" distR="0" wp14:anchorId="768D9E83" wp14:editId="3206FFA0">
-            <wp:extent cx="3021910" cy="7920000"/>
+            <wp:extent cx="3021910" cy="7919998"/>
             <wp:effectExtent l="0" t="0" r="0" b="0"/>
             <wp:docPr id="200" name="Picture 200"/>
             <wp:cNvGraphicFramePr>
@@ -8823,7 +8802,7 @@
                   <pic:spPr>
                     <a:xfrm>
                       <a:off x="0" y="0"/>
-                      <a:ext cx="3021910" cy="7920000"/>
+                      <a:ext cx="3021910" cy="7919998"/>
                     </a:xfrm>
                     <a:prstGeom prst="rect">
                       <a:avLst/>
@@ -8965,7 +8944,7 @@
         <w:t xml:space="preserve">Mandant und Rollen. </w:t>
       </w:r>
       <w:r>
-        <w:t>Der Werkstattbetrieb steht als Mandant über Filialen und Mitarbeitern. Die Unterklassen von Mitarbeiter (Servicemitarbeiter, Techniker, Disponent, Werkstattleiter) entsprechen den Lanes, bündeln die Rollen des Use-Case-Diagramms (Tabelle 7) und tragen die Operationen dieser Rollen.</w:t>
+        <w:t>Der Werkstattbetrieb steht als Mandant über Filialen und Mitarbeitern. Die Unterklassen von Mitarbeiter (Servicemitarbeiter, Techniker, Disponent, Werkstattleiter) entsprechen den Lanes, bündeln die 14 Mitarbeiterrollen des Use-Case-Diagramms (Tabelle 7) und tragen die Operationen dieser Rollen. Der Betriebsadministrator wirkt direkt auf den Mandanten Werkstattbetrieb.</w:t>
       </w:r>
     </w:p>
     <w:p>
@@ -9093,7 +9072,7 @@
         <w:lastRenderedPageBreak/>
         <w:drawing>
           <wp:inline distT="0" distB="0" distL="0" distR="0" wp14:anchorId="128BF440" wp14:editId="79C6B801">
-            <wp:extent cx="7578721" cy="5749290"/>
+            <wp:extent cx="7578721" cy="5750355"/>
             <wp:effectExtent l="0" t="0" r="3810" b="3810"/>
             <wp:docPr id="1600717457" name="Grafik 4"/>
             <wp:cNvGraphicFramePr>
@@ -9475,7 +9454,7 @@
                 <w:sz w:val="19"/>
                 <w:szCs w:val="19"/>
               </w:rPr>
-              <w:t>Medienprüfung mit Nachreichen, KI-Vorschlag, vorläufiger KVA, Terminvorschlag, Vorreservierung erst nach Bestätigung</w:t>
+              <w:t>Medienprüfung mit Nachreichen, KI-Vorschlag, vorläufiger KVA, Vorreservierung erst nach Bestätigung</w:t>
             </w:r>
             <w:r>
               <w:rPr>
@@ -10060,7 +10039,7 @@
         <w:lastRenderedPageBreak/>
         <w:drawing>
           <wp:inline distT="0" distB="0" distL="0" distR="0" wp14:anchorId="307C6272" wp14:editId="47E410A2">
-            <wp:extent cx="5782310" cy="4473575"/>
+            <wp:extent cx="5782310" cy="4117005"/>
             <wp:effectExtent l="0" t="0" r="0" b="0"/>
             <wp:docPr id="248347308" name="Grafik 5"/>
             <wp:cNvGraphicFramePr>
@@ -10088,7 +10067,7 @@
                   <pic:spPr>
                     <a:xfrm>
                       <a:off x="0" y="0"/>
-                      <a:ext cx="5782310" cy="4473575"/>
+                      <a:ext cx="5782310" cy="4117005"/>
                     </a:xfrm>
                     <a:prstGeom prst="rect">
                       <a:avLst/>
@@ -10129,7 +10108,7 @@
         </w:rPr>
         <w:drawing>
           <wp:inline distT="0" distB="0" distL="0" distR="0" wp14:anchorId="05AB1227" wp14:editId="5480FE0D">
-            <wp:extent cx="5782310" cy="3723005"/>
+            <wp:extent cx="5782310" cy="3721705"/>
             <wp:effectExtent l="0" t="0" r="0" b="0"/>
             <wp:docPr id="5075578" name="Grafik 6"/>
             <wp:cNvGraphicFramePr>
@@ -10157,7 +10136,7 @@
                   <pic:spPr>
                     <a:xfrm>
                       <a:off x="0" y="0"/>
-                      <a:ext cx="5782310" cy="3723005"/>
+                      <a:ext cx="5782310" cy="3721705"/>
                     </a:xfrm>
                     <a:prstGeom prst="rect">
                       <a:avLst/>
@@ -11633,7 +11612,6 @@
     </w:p>
     <w:p>
       <w:pPr>
-        <w:pStyle w:val="p1"/>
         <w:jc w:val="both"/>
         <w:rPr>
           <w:rFonts w:ascii="Calibri" w:eastAsia="Calibri" w:hAnsi="Calibri" w:cs="Calibri"/>
@@ -11645,10 +11623,7 @@
       </w:pPr>
       <w:r>
         <w:rPr>
-          <w:rFonts w:ascii="Calibri" w:eastAsia="Calibri" w:hAnsi="Calibri" w:cs="Calibri"/>
           <w:color w:val="auto"/>
-          <w:sz w:val="22"/>
-          <w:szCs w:val="22"/>
           <w:lang w:eastAsia="en-GB"/>
         </w:rPr>
         <w:t>Im Coaching am 22.10.2026 wies der Dozent darauf hin, dass in den Sequenzdiagrammen zwischen Akteur und Fachobjekt ein Objekt der Benutzeroberfläche fehlt und dass offen bleibt, wie die Oberfläche an das richtige Objekt kommt. Wir haben die Klassen KundenApp und Werkstattoberflaeche mit den Methoden der Benutzeraktionen ergänzt und den Werkstattbetrieb um Suchoperationen erweitert, die zu einer eingegebenen Nummer das Objekt liefern. Alle sechs Sequenzdiagramme folgen jetzt dem Muster Akteur, Oberfläche, Fachobjekt (Abschnitte 5.4 und 5.5).</w:t>

</xml_diff>

<commit_message>
docs: Nachzug BPMN-Pruefung 25.10. (Tabelle 1/6, 5.1, Abb. 3, README, TODO)
</commit_message>
<xml_diff>
--- a/3_doku/Projektdokumentation.docx
+++ b/3_doku/Projektdokumentation.docx
@@ -1074,7 +1074,7 @@
                 <w:sz w:val="19"/>
                 <w:szCs w:val="19"/>
               </w:rPr>
-              <w:t>Stellvertretende Projektleitung, Backup-Beauftragter</w:t>
+              <w:t>Stellvertretende Projektleitung, UML</w:t>
             </w:r>
           </w:p>
         </w:tc>
@@ -5323,7 +5323,7 @@
                 <w:sz w:val="19"/>
                 <w:szCs w:val="19"/>
               </w:rPr>
-              <w:t>KVA freigegeben</w:t>
+              <w:t>Teilebedarf freigegeben</w:t>
             </w:r>
           </w:p>
         </w:tc>
@@ -5708,7 +5708,7 @@
                 <w:sz w:val="19"/>
                 <w:szCs w:val="19"/>
               </w:rPr>
-              <w:t>Reparatur abgeschlossen</w:t>
+              <w:t>Gerät abholbereit</w:t>
             </w:r>
           </w:p>
         </w:tc>
@@ -6360,7 +6360,7 @@
         <w:jc w:val="both"/>
       </w:pPr>
       <w:r>
-        <w:t>Die Prozesse greifen über Aufruf-Aktivitäten ineinander. Ein freigegebener KVA (04) startet die Disposition (05), Fehlteile lösen die Bestellung aus (06), und die Rückgabe jedes Geräts läuft über Prozess 08, auch nach einer Ablehnung oder Reklamation. Jede Warteschleife hat einen Ausstieg. Bleibt der KVA dreimal drei Tage ohne Antwort, gilt er als abgelehnt, ausstehende Lieferungen werden zweimal angemahnt, bevor storniert wird, und nach der zweiten erfolglosen Nacharbeit wird ein Auftrag abgelehnt. Abbildung 2 und Abbildung 3 zeigen zwei der zehn Diagramme. Alle Diagramme liegen vollständig in BPMN-WWI25B4-Gruppe1.zip.</w:t>
+        <w:t>Die Prozesse greifen über Aufruf-Aktivitäten ineinander. Ein freigegebener KVA (04) oder eine Nacharbeit aus einer Reklamation (09) startet die Disposition (05), Fehlteile lösen die Bestellung aus (06), und die Rückgabe jedes Geräts läuft über Prozess 08, auch nach einer Ablehnung oder Reklamation. Prozess 07 endet deshalb mit „Gerät abholbereit“, dem Startereignis von Prozess 08. Jede Warteschleife hat einen Ausstieg. Bleibt der KVA dreimal drei Tage ohne Antwort, gilt er als abgelehnt, ausstehende Lieferungen werden zweimal angemahnt, bevor storniert wird, und nach der zweiten erfolglosen Nacharbeit wird ein Auftrag abgelehnt. Abbildung 2 und Abbildung 3 zeigen zwei der zehn Diagramme. Alle Diagramme liegen vollständig in BPMN-WWI25B4-Gruppe1.zip.</w:t>
       </w:r>
     </w:p>
     <w:p>
@@ -6651,7 +6651,7 @@
         </w:rPr>
         <w:drawing>
           <wp:inline distT="0" distB="0" distL="0" distR="0" wp14:anchorId="2C7C0B39" wp14:editId="525D9143">
-            <wp:extent cx="5782310" cy="2228413"/>
+            <wp:extent cx="5782310" cy="2223965"/>
             <wp:effectExtent l="0" t="0" r="0" b="5080"/>
             <wp:docPr id="1426216721" name="Grafik 3"/>
             <wp:cNvGraphicFramePr>
@@ -6679,7 +6679,7 @@
                   <pic:spPr>
                     <a:xfrm>
                       <a:off x="0" y="0"/>
-                      <a:ext cx="5782310" cy="2228413"/>
+                      <a:ext cx="5782310" cy="2223965"/>
                     </a:xfrm>
                     <a:prstGeom prst="rect">
                       <a:avLst/>

</xml_diff>

<commit_message>
docs: Abb. 2 (P01) neu, TODO ohne erledigte BPMN/VP-Punkte
</commit_message>
<xml_diff>
--- a/3_doku/Projektdokumentation.docx
+++ b/3_doku/Projektdokumentation.docx
@@ -6584,7 +6584,7 @@
         <w:lastRenderedPageBreak/>
         <w:drawing>
           <wp:inline distT="0" distB="0" distL="0" distR="0" wp14:anchorId="0F60C88C" wp14:editId="1C9F8959">
-            <wp:extent cx="5782310" cy="2133600"/>
+            <wp:extent cx="5782310" cy="2130559"/>
             <wp:effectExtent l="0" t="0" r="0" b="0"/>
             <wp:docPr id="644557787" name="Grafik 1"/>
             <wp:cNvGraphicFramePr>
@@ -6612,7 +6612,7 @@
                   <pic:spPr>
                     <a:xfrm>
                       <a:off x="0" y="0"/>
-                      <a:ext cx="5782310" cy="2133600"/>
+                      <a:ext cx="5782310" cy="2130559"/>
                     </a:xfrm>
                     <a:prstGeom prst="rect">
                       <a:avLst/>

</xml_diff>

<commit_message>
doku: Ausblick 2.6, Problemzuordnung 2.2, 5.2 manuelle Aktivitaeten, Tabelle 3, Kapitel 6, Beitragsliste, Inhaltsverzeichnis
</commit_message>
<xml_diff>
--- a/3_doku/Projektdokumentation.docx
+++ b/3_doku/Projektdokumentation.docx
@@ -343,6 +343,10 @@
         </w:tabs>
         <w:spacing w:after="40"/>
         <w:ind w:left="400"/>
+        <w:rPr>
+          <w:sz w:val="20"/>
+          <w:szCs w:val="20"/>
+        </w:rPr>
       </w:pPr>
       <w:r>
         <w:rPr>
@@ -366,6 +370,30 @@
           <w:tab w:val="right" w:leader="dot" w:pos="9026"/>
         </w:tabs>
         <w:spacing w:after="40"/>
+        <w:ind w:left="400"/>
+      </w:pPr>
+      <w:r>
+        <w:rPr>
+          <w:sz w:val="20"/>
+          <w:szCs w:val="20"/>
+        </w:rPr>
+        <w:t>2.6 Ausblick</w:t>
+      </w:r>
+      <w:r>
+        <w:rPr>
+          <w:sz w:val="20"/>
+          <w:szCs w:val="20"/>
+        </w:rPr>
+        <w:tab/>
+        <w:t>5</w:t>
+      </w:r>
+    </w:p>
+    <w:p>
+      <w:pPr>
+        <w:tabs>
+          <w:tab w:val="right" w:leader="dot" w:pos="9026"/>
+        </w:tabs>
+        <w:spacing w:after="40"/>
       </w:pPr>
       <w:r>
         <w:rPr>
@@ -665,6 +693,13 @@
           <w:sz w:val="20"/>
           <w:szCs w:val="20"/>
         </w:rPr>
+        <w:tab/>
+      </w:r>
+      <w:r>
+        <w:rPr>
+          <w:sz w:val="20"/>
+          <w:szCs w:val="20"/>
+        </w:rPr>
         <w:t>13</w:t>
       </w:r>
     </w:p>
@@ -735,6 +770,13 @@
           <w:b/>
           <w:bCs/>
         </w:rPr>
+        <w:tab/>
+      </w:r>
+      <w:r>
+        <w:rPr>
+          <w:b/>
+          <w:bCs/>
+        </w:rPr>
         <w:t>17</w:t>
       </w:r>
     </w:p>
@@ -757,6 +799,13 @@
           <w:b/>
           <w:bCs/>
         </w:rPr>
+        <w:tab/>
+      </w:r>
+      <w:r>
+        <w:rPr>
+          <w:b/>
+          <w:bCs/>
+        </w:rPr>
         <w:t>18</w:t>
       </w:r>
     </w:p>
@@ -774,6 +823,13 @@
           <w:szCs w:val="20"/>
         </w:rPr>
         <w:t>7.1 Feedback des Dozenten und Umsetzung</w:t>
+      </w:r>
+      <w:r>
+        <w:rPr>
+          <w:sz w:val="20"/>
+          <w:szCs w:val="20"/>
+        </w:rPr>
+        <w:tab/>
       </w:r>
       <w:r>
         <w:rPr>
@@ -1540,7 +1596,13 @@
         <w:t xml:space="preserve">Erstellung </w:t>
       </w:r>
       <w:r>
-        <w:t>der BPMN-Diagramme 05 und 06, Fachkonzept (Ausgangslage, Solution Provider, Systemkontext, Zustandsautomat, KI-Sofortdiagnose), Pflege des Entscheidungslogs und Abstimmung der Prozessänderungen mit der Gruppe, Überarbeitung von Prozess 06, Automatisierungspotential, Probleme und Herausforderungen</w:t>
+        <w:t>der BPMN-Diagramme 05 und 06, Fachkonzept (Ausgangslage, Solution Provider, Systemkontext, Zustandsautomat, KI-Sofortdiagnose), Pflege des Entscheidungslogs und Abstimmung der Prozessänderungen mit der Gruppe,</w:t>
+      </w:r>
+      <w:r>
+        <w:t xml:space="preserve"> </w:t>
+      </w:r>
+      <w:r>
+        <w:t>Automatisierungspotential, Probleme und Herausforderungen</w:t>
       </w:r>
       <w:r>
         <w:t>.</w:t>
@@ -1563,16 +1625,16 @@
         <w:t xml:space="preserve">Kilian Platter: </w:t>
       </w:r>
       <w:r>
-        <w:t>Erstellun</w:t>
-      </w:r>
-      <w:r>
-        <w:t xml:space="preserve">g der Diagramme mit Korrekturen </w:t>
-      </w:r>
-      <w:r>
-        <w:t>(</w:t>
-      </w:r>
-      <w:r>
-        <w:t xml:space="preserve">Klassendiagramm, SD1 bis SD4 in Visual </w:t>
+        <w:t xml:space="preserve">Erstellung von </w:t>
+      </w:r>
+      <w:r>
+        <w:t>Klassendiagramm und Sequenzdiagramme</w:t>
+      </w:r>
+      <w:r>
+        <w:t>n</w:t>
+      </w:r>
+      <w:r>
+        <w:t xml:space="preserve"> SD1 bis SD4 in Visual </w:t>
       </w:r>
       <w:proofErr w:type="spellStart"/>
       <w:r>
@@ -1580,12 +1642,6 @@
       </w:r>
       <w:proofErr w:type="spellEnd"/>
       <w:r>
-        <w:t>, BPMN 10</w:t>
-      </w:r>
-      <w:r>
-        <w:t>)</w:t>
-      </w:r>
-      <w:r>
         <w:t>, Visual-</w:t>
       </w:r>
       <w:proofErr w:type="spellStart"/>
@@ -1594,10 +1650,7 @@
       </w:r>
       <w:proofErr w:type="spellEnd"/>
       <w:r>
-        <w:t>-Projekt und Konsistenzprüfung der Sequenzdiagramme gegen das Klassendiagramm, Sprint-Rituale und Trello-Board</w:t>
-      </w:r>
-      <w:r>
-        <w:t>.</w:t>
+        <w:t>-Projekt und Konsistenzprüfung der Sequenzdiagramme gegen das Klassendiagramm, Sprint-Rituale und Trello-Board.</w:t>
       </w:r>
     </w:p>
     <w:p>
@@ -1776,7 +1829,19 @@
         <w:jc w:val="both"/>
       </w:pPr>
       <w:r>
-        <w:t>Die Plattform besteht aus vier Modulen: einem Kundenportal mit App, einem Auftrags- und Werkstattmodul, einem Dispositionsmodul für die filialübergreifende Ersatzteilversorgung sowie einer Abrechnung mit Schnittstelle zur Buchhaltung. Zielkunden sind unabhängige Werkstätten und kleine Ketten mit zwei bis zehn Filialen im deutschsprachigen Raum. Als Geschäftsmodell ist ein monatliches Abonnement je Filiale mit den Stufen Basis (Auftragsverwaltung und Kundenkommunikation) und Pro (zusätzlich filialübergreifende Disposition und KI-Sofortdiagnose) vorgesehen; das Abonnement selbst ist nicht Gegenstand der Modelle. Unser Konzept verbindet Fahrrad-, E-Bike- und Elektronikreparaturen in einer Plattform mit gemeinsamem Ersatzteillager. Einen belegten Funktionsvergleich mit bestehenden Werkstattlösungen haben wir nicht erstellt.</w:t>
+        <w:t xml:space="preserve">Die Plattform besteht aus vier Modulen: einem Kundenportal mit App, einem Auftrags- und Werkstattmodul, einem Dispositionsmodul für die filialübergreifende Ersatzteilversorgung sowie einer Abrechnung mit Schnittstelle zur Buchhaltung. Zielkunden sind unabhängige Werkstätten und kleine Ketten mit zwei bis zehn Filialen im deutschsprachigen Raum. Als Geschäftsmodell ist ein monatliches Abonnement je Filiale mit den Stufen Basis (Auftragsverwaltung und Kundenkommunikation) und Pro (zusätzlich filialübergreifende Disposition und KI-Sofortdiagnose) vorgesehen; das Abonnement selbst ist nicht Gegenstand der Modelle. Unser Konzept verbindet Fahrrad-, E-Bike- und Elektronikreparaturen in einer Plattform mit gemeinsamem Ersatzteillager. </w:t>
+      </w:r>
+      <w:r>
+        <w:t>Ein Funktionsvergleich mit bestehenden Werkstattlösungen war nicht Gegenstand der Fallstudie; das Alleinstellungsmerkmal begründen wir in Abschnitt 2.5.</w:t>
+      </w:r>
+    </w:p>
+    <w:p>
+      <w:pPr>
+        <w:spacing w:after="120" w:line="276" w:lineRule="auto"/>
+        <w:jc w:val="both"/>
+      </w:pPr>
+      <w:r>
+        <w:t>Jedes der vier Probleme aus Abschnitt 2.1 greift ein Modul auf. Die fehlende Kundeninformation löst das Kundenportal: Der Kunde gibt den KVA in der App frei und wird benachrichtigt, sobald sein Gerät abholbereit ist (Prozesse 04 und 08, UC07 und UC15). Den fehlenden zentralen Status ersetzt der Reparaturauftrag im Auftrags- und Werkstattmodul, dessen Zustände alle Prozesse teilen (Abschnitt 2.4, UC03 und UC14). Gegen getrennte Bestellungen je Filiale prüft das Dispositionsmodul zuerst die Bestände aller Filialen und bestellt nur Fehlteile (Prozesse 05 und 06, UC08 bis UC10). Die Auslastung der Techniker macht die Terminplanung sichtbar, in der die Werkstattleitung Termine vergibt und Techniker zuweist (Prozess 02, UC17).</w:t>
       </w:r>
     </w:p>
     <w:p>
@@ -1794,7 +1859,11 @@
         <w:jc w:val="both"/>
       </w:pPr>
       <w:r>
-        <w:t>Abbildung 1 stellt den Systemkontext und die Systemgrenze dar. Innerhalb der Systemgrenze liegt die RepairFlow-Plattform. Der Werkstattbetrieb ist als Mandant angebunden, seine Rollen Service / Annahme, Techniker, Werkstattleitung und Ersatzteil-Disposition arbeiten in der Oberfläche der Plattform. Der Kunde nutzt das Kundenportal. Mit dem Lieferanten tauscht RepairFlow Bestellungen, Bestätigungen, Lieferungen und Retouren aus. Der KI-Diagnosedienst ist ein externer Dienst, den die Plattform zur Auswertung von Foto, Video und Ton aufruft. Außerhalb der Systemgrenze liegen die physische Reparatur, die Systeme der Lieferanten und die Buchhaltung, an die nur über eine Exportschnittstelle übergeben wird.</w:t>
+        <w:t xml:space="preserve">Abbildung 1 stellt den Systemkontext und die Systemgrenze dar. Innerhalb der Systemgrenze liegt die RepairFlow-Plattform. Der Werkstattbetrieb ist als Mandant angebunden, seine Rollen Service / Annahme, Techniker, Werkstattleitung und Ersatzteil-Disposition arbeiten in der Oberfläche der Plattform. Der Kunde nutzt das Kundenportal. Mit dem Lieferanten tauscht RepairFlow Bestellungen, </w:t>
+      </w:r>
+      <w:r>
+        <w:lastRenderedPageBreak/>
+        <w:t>Bestätigungen, Lieferungen und Retouren aus. Der KI-Diagnosedienst ist ein externer Dienst, den die Plattform zur Auswertung von Foto, Video und Ton aufruft. Außerhalb der Systemgrenze liegen die physische Reparatur, die Systeme der Lieferanten und die Buchhaltung, an die nur über eine Exportschnittstelle übergeben wird.</w:t>
       </w:r>
     </w:p>
     <w:p>
@@ -1807,9 +1876,8 @@
         <w:rPr>
           <w:noProof/>
         </w:rPr>
-        <w:lastRenderedPageBreak/>
         <w:drawing>
-          <wp:inline distT="0" distB="0" distL="0" distR="0" wp14:anchorId="5524A09C" wp14:editId="593FF88E">
+          <wp:inline distT="0" distB="0" distL="0" distR="0" wp14:anchorId="5524A09C" wp14:editId="3DA087AB">
             <wp:extent cx="5901493" cy="3184933"/>
             <wp:effectExtent l="0" t="0" r="4445" b="0"/>
             <wp:docPr id="1" name="Picture 1"/>
@@ -1920,7 +1988,11 @@
         <w:jc w:val="both"/>
       </w:pPr>
       <w:r>
-        <w:t>Ein Teil davon ist heute machbar, etwa das Erkennen sichtbarer Schäden wie eines gebrochenen Displays per Bildanalyse. Die Auswertung von Motorgeräuschen und die Schätzung von Arbeitszeiten aus einem Video sind Vision. Deshalb bleibt der Vorschlag im Modell unverbindlich: Der KVA hat den Status „vorläufig“, und bei nicht auswertbaren Medien fragt das System nach einer besseren Aufnahme. In den Modellen erscheint das Merkmal als Prozess 01, als Use Cases „Sofortdiagnose anfordern“, „Voranmeldung bestätigen“ und „Diagnosevorschlag prüfen“, als Klassen Voranmeldung, Medienanhang und KIDiagnosevorschlag sowie als Sequenzdiagramm SD1.</w:t>
+        <w:t xml:space="preserve">Ein Teil davon ist heute machbar, etwa das Erkennen sichtbarer Schäden wie eines gebrochenen Displays per Bildanalyse. Die Auswertung von Motorgeräuschen und die Schätzung von Arbeitszeiten </w:t>
+      </w:r>
+      <w:r>
+        <w:lastRenderedPageBreak/>
+        <w:t>aus einem Video sind Vision. Deshalb bleibt der Vorschlag im Modell unverbindlich: Der KVA hat den Status „vorläufig“, und bei nicht auswertbaren Medien fragt das System nach einer besseren Aufnahme. In den Modellen erscheint das Merkmal als Prozess 01, als Use Cases „Sofortdiagnose anfordern“, „Voranmeldung bestätigen“ und „Diagnosevorschlag prüfen“, als Klassen Voranmeldung, Medienanhang und KIDiagnosevorschlag sowie als Sequenzdiagramm SD1.</w:t>
       </w:r>
     </w:p>
     <w:p>
@@ -1930,7 +2002,42 @@
         <w:spacing w:after="120"/>
       </w:pPr>
       <w:r>
-        <w:lastRenderedPageBreak/>
+        <w:t>2.</w:t>
+      </w:r>
+      <w:r>
+        <w:t>6</w:t>
+      </w:r>
+      <w:r>
+        <w:t xml:space="preserve"> Ausblick</w:t>
+      </w:r>
+    </w:p>
+    <w:p>
+      <w:pPr>
+        <w:spacing w:line="276" w:lineRule="auto"/>
+        <w:jc w:val="both"/>
+        <w:rPr>
+          <w:b/>
+          <w:bCs/>
+        </w:rPr>
+      </w:pPr>
+      <w:r>
+        <w:t>Über die modellierten Prozesse hinaus sehen wir drei Erweiterungen, die auf den Daten der Plattform aufbauen. Eine KI-gestützte Disposition prognostiziert den Bedarf je Filiale und Saison, damit Teile vor der Nachfrage im Lager liegen. Ein Techniker-Copilot schlägt Reparaturschritte und den Aufwand aus der Historie ähnlicher Aufträge vor. Eine digitale Geräteakte bewahrt die Reparaturgeschichte jedes Geräts über alle Filialen und Besitzer hinweg. Diese Erweiterungen sind nicht Gegenstand der Modelle.</w:t>
+      </w:r>
+      <w:r>
+        <w:rPr>
+          <w:b/>
+          <w:bCs/>
+        </w:rPr>
+        <w:tab/>
+      </w:r>
+    </w:p>
+    <w:p>
+      <w:pPr>
+        <w:pStyle w:val="berschrift1"/>
+        <w:keepNext/>
+        <w:spacing w:after="120"/>
+      </w:pPr>
+      <w:r>
         <w:t>3 Vorgehen bei der Umsetzung</w:t>
       </w:r>
     </w:p>
@@ -2598,6 +2705,7 @@
         <w:spacing w:after="60" w:line="264" w:lineRule="auto"/>
       </w:pPr>
       <w:r>
+        <w:lastRenderedPageBreak/>
         <w:t>BPMN-Datenobjekte tragen die Klassennamen des Klassendiagramms, im Diagramm zur Lesbarkeit mit Bindestrich getrennt und bei Bedarf mit Zustand in eckigen Klammern, zum Beispiel „Reparatur-auftrag [freigegeben]“.</w:t>
       </w:r>
     </w:p>
@@ -2665,7 +2773,6 @@
         <w:keepNext/>
       </w:pPr>
       <w:r>
-        <w:lastRenderedPageBreak/>
         <w:t>3.2 Qualitätssicherung</w:t>
       </w:r>
     </w:p>
@@ -2736,6 +2843,7 @@
         <w:keepNext/>
       </w:pPr>
       <w:r>
+        <w:lastRenderedPageBreak/>
         <w:t>4.2 Sprintplan und Verlauf</w:t>
       </w:r>
     </w:p>
@@ -3295,17 +3403,11 @@
             </w:pPr>
             <w:r>
               <w:rPr>
-                <w:sz w:val="19"/>
-                <w:szCs w:val="19"/>
-              </w:rPr>
-              <w:t>UI-Umbau</w:t>
-            </w:r>
-            <w:r>
-              <w:rPr>
-                <w:sz w:val="19"/>
-                <w:szCs w:val="19"/>
-              </w:rPr>
-              <w:t xml:space="preserve"> nach dem Gespräch am 22.10. </w:t>
+                <w:color w:val="000000"/>
+                <w:sz w:val="19"/>
+                <w:szCs w:val="19"/>
+              </w:rPr>
+              <w:t>Generalprobe durchgeführt; nach dem Coaching am 22.10. Oberflächenklassen in Klassen- und Sequenzdiagrammen ergänzt.</w:t>
             </w:r>
           </w:p>
         </w:tc>
@@ -3410,7 +3512,7 @@
                 <w:sz w:val="19"/>
                 <w:szCs w:val="19"/>
               </w:rPr>
-              <w:t>Präsentation am 27.10.2026 in Raum B458, Abgabe bis 13.11.2026 über Moodle.</w:t>
+              <w:t>Präsentation am 27.10.2026, Abgabe bis 13.11.2026 über Moodle.</w:t>
             </w:r>
             <w:r>
               <w:rPr>
@@ -3426,7 +3528,7 @@
                 <w:sz w:val="19"/>
                 <w:szCs w:val="19"/>
               </w:rPr>
-              <w:t>.</w:t>
+              <w:t xml:space="preserve"> und Dokumentation. </w:t>
             </w:r>
           </w:p>
         </w:tc>
@@ -3454,7 +3556,6 @@
         <w:keepNext/>
       </w:pPr>
       <w:r>
-        <w:lastRenderedPageBreak/>
         <w:t>4.3 Aufgabensteuerung und Repository</w:t>
       </w:r>
     </w:p>
@@ -3545,6 +3646,7 @@
                 <w:sz w:val="19"/>
                 <w:szCs w:val="19"/>
               </w:rPr>
+              <w:lastRenderedPageBreak/>
               <w:t>Risiko</w:t>
             </w:r>
           </w:p>
@@ -4355,6 +4457,7 @@
                 <w:sz w:val="19"/>
                 <w:szCs w:val="19"/>
               </w:rPr>
+              <w:lastRenderedPageBreak/>
               <w:t>Nr</w:t>
             </w:r>
           </w:p>
@@ -6386,11 +6489,14 @@
           <w:b/>
           <w:bCs/>
         </w:rPr>
+        <w:t xml:space="preserve">01 KI-Sofortdiagnose und Voranmeldung. </w:t>
+      </w:r>
+      <w:r>
+        <w:t xml:space="preserve">Aus Foto, Video oder Ton des Kunden entstehen Voranmeldung, KI-Diagnosevorschlag, vorläufiger KVA und Terminvorschlag. Nicht auswertbare </w:t>
+      </w:r>
+      <w:r>
         <w:lastRenderedPageBreak/>
-        <w:t xml:space="preserve">01 KI-Sofortdiagnose und Voranmeldung. </w:t>
-      </w:r>
-      <w:r>
-        <w:t>Aus Foto, Video oder Ton des Kunden entstehen Voranmeldung, KI-Diagnosevorschlag, vorläufiger KVA und Terminvorschlag. Nicht auswertbare Medien fordert das System neu an. Bestätigt der Kunde, werden die Teile vorreserviert; ist ein Teil nirgends verfügbar, erhält die Voranmeldung einen Hinweis auf Nachbestellung. Lehnt der Kunde ab oder bleibt eine Antwort sieben Tage aus, wird die Voranmeldung verworfen, bei Fristablauf mit Hinweis an den Kunden.</w:t>
+        <w:t>Medien fordert das System neu an. Bestätigt der Kunde, werden die Teile vorreserviert; ist ein Teil nirgends verfügbar, erhält die Voranmeldung einen Hinweis auf Nachbestellung. Lehnt der Kunde ab oder bleibt eine Antwort sieben Tage aus, wird die Voranmeldung verworfen, bei Fristablauf mit Hinweis an den Kunden.</w:t>
       </w:r>
     </w:p>
     <w:p>
@@ -6583,7 +6689,7 @@
         </w:rPr>
         <w:lastRenderedPageBreak/>
         <w:drawing>
-          <wp:inline distT="0" distB="0" distL="0" distR="0" wp14:anchorId="0F60C88C" wp14:editId="1C9F8959">
+          <wp:inline distT="0" distB="0" distL="0" distR="0" wp14:anchorId="0F60C88C" wp14:editId="52EF33BC">
             <wp:extent cx="5782310" cy="2130559"/>
             <wp:effectExtent l="0" t="0" r="0" b="0"/>
             <wp:docPr id="644557787" name="Grafik 1"/>
@@ -6650,7 +6756,7 @@
           <w:noProof/>
         </w:rPr>
         <w:drawing>
-          <wp:inline distT="0" distB="0" distL="0" distR="0" wp14:anchorId="2C7C0B39" wp14:editId="525D9143">
+          <wp:inline distT="0" distB="0" distL="0" distR="0" wp14:anchorId="2C7C0B39" wp14:editId="16659AC5">
             <wp:extent cx="5782310" cy="2223965"/>
             <wp:effectExtent l="0" t="0" r="0" b="5080"/>
             <wp:docPr id="1426216721" name="Grafik 3"/>
@@ -6793,10 +6899,28 @@
     </w:p>
     <w:p>
       <w:pPr>
+        <w:spacing w:after="60" w:line="264" w:lineRule="auto"/>
+        <w:jc w:val="both"/>
+      </w:pPr>
+      <w:r>
+        <w:t xml:space="preserve">Manuell bleiben bewusst die neun Arbeiten am Gerät und an der Ware: Sichtprüfung, Kennzeichnen und Einlagern sowie der Transport zu einer anderen Filiale bei der Annahme, die Reparatur und Nacharbeit selbst, die Mangelprüfung bei einer Reklamation, das Holen aus dem Lager und die Übergabe an den Kunden sowie das Verpacken und Versenden einer Retoure. Sie liegen nach Abschnitt 2.3 außerhalb der Systemgrenze; </w:t>
+      </w:r>
+      <w:proofErr w:type="spellStart"/>
+      <w:r>
+        <w:t>RepairFlow</w:t>
+      </w:r>
+      <w:proofErr w:type="spellEnd"/>
+      <w:r>
+        <w:t xml:space="preserve"> erfasst nur ihr Ergebnis, zum Beispiel den Reparaturschritt mit Arbeitszeit.</w:t>
+      </w:r>
+    </w:p>
+    <w:p>
+      <w:pPr>
         <w:pStyle w:val="berschrift2"/>
         <w:keepNext/>
       </w:pPr>
       <w:r>
+        <w:lastRenderedPageBreak/>
         <w:t>5.3 Use-Case-Diagramm</w:t>
       </w:r>
     </w:p>
@@ -6806,10 +6930,7 @@
         <w:jc w:val="both"/>
       </w:pPr>
       <w:r>
-        <w:t xml:space="preserve">Das Use-Case-Diagramm (Abbildung 4) zeigt, was RepairFlow aus Sicht seiner Benutzer leistet. Es enthält 19 Use Cases und 17 Akteure: den Kunden, 15 Mitarbeiterrollen und den KI-Diagnosedienst als externes System. Der Lieferant ist kein Akteur, sondern eine Black Box ohne Zugang zu RepairFlow; wie </w:t>
-      </w:r>
-      <w:r>
-        <w:t>in den Prozessmodellen kommt er nur über Nachrichten vor. Jeder Use Case hat genau eine Rolle als primären Akteur; die Nummern UC01 bis UC19 dienen nur der Zuordnung in den Tabellen, im Diagramm stehen die Namen. Diese Struktur geht auf einen Hinweis des Dozenten vom 15.10.2026 zurück: Unsere erste Fassung hatte acht Akteure mit bis zu acht Verbindungen, etwa den Techniker an Diagnosevorschlag, Diagnosebefund, KVA, Reparatur und Fertigmeldung. Statt eines Akteurs mit vielen Linien gibt es jetzt je Use Case eine Rolle, zum Beispiel Diagnoseprüfer, Diagnostiker, Kalkulator, Reparateur und Endkontrolleur anstelle des Technikers. Welche Person eine Rolle ausfüllt, regelt das Organigramm des Werkstattbetriebs; im Modell sind das die Unterklassen von Mitarbeiter (Tabelle 7). Der Kunde ist einmal dargestellt und mit UC01, UC02 und UC07 verbunden. UC08 „Ersatzteil-Verfügbarkeit prüfen“ wird nur über include erreicht und hat deshalb keinen eigenen Akteur.</w:t>
+        <w:t>Das Use-Case-Diagramm (Abbildung 4) zeigt, was RepairFlow aus Sicht seiner Benutzer leistet. Es enthält 19 Use Cases und 17 Akteure: den Kunden, 15 Mitarbeiterrollen und den KI-Diagnosedienst als externes System. Der Lieferant ist kein Akteur, sondern eine Black Box ohne Zugang zu RepairFlow; wie in den Prozessmodellen kommt er nur über Nachrichten vor. Jeder Use Case hat genau eine Rolle als primären Akteur; die Nummern UC01 bis UC19 dienen nur der Zuordnung in den Tabellen, im Diagramm stehen die Namen. Diese Struktur geht auf einen Hinweis des Dozenten vom 15.10.2026 zurück: Unsere erste Fassung hatte acht Akteure mit bis zu acht Verbindungen, etwa den Techniker an Diagnosevorschlag, Diagnosebefund, KVA, Reparatur und Fertigmeldung. Statt eines Akteurs mit vielen Linien gibt es jetzt je Use Case eine Rolle, zum Beispiel Diagnoseprüfer, Diagnostiker, Kalkulator, Reparateur und Endkontrolleur anstelle des Technikers. Welche Person eine Rolle ausfüllt, regelt das Organigramm des Werkstattbetriebs; im Modell sind das die Unterklassen von Mitarbeiter (Tabelle 7). Der Kunde ist einmal dargestellt und mit UC01, UC02 und UC07 verbunden. UC08 „Ersatzteil-Verfügbarkeit prüfen“ wird nur über include erreicht und hat deshalb keinen eigenen Akteur.</w:t>
       </w:r>
     </w:p>
     <w:tbl>
@@ -8761,11 +8882,8 @@
         <w:jc w:val="both"/>
       </w:pPr>
       <w:r>
-        <w:t xml:space="preserve">Zwei include-Beziehungen stehen für Teilschritte, die immer ausgeführt werden: „Sofortdiagnose anfordern“ und „Ersatzteile disponieren und reservieren“ schließen „Ersatzteil-Verfügbarkeit prüfen“ ein. Sechs extend-Beziehungen beschreiben bedingtes Verhalten. So erweitert „Lieferantenbestellung </w:t>
-      </w:r>
-      <w:r>
         <w:lastRenderedPageBreak/>
-        <w:t>auslösen“ die Disposition nur, wenn Fehlteile vorhanden sind, und „Retoure abwickeln“ den Wareneingang nur bei mangelhafter Lieferung.</w:t>
+        <w:t>Zwei include-Beziehungen stehen für Teilschritte, die immer ausgeführt werden: „Sofortdiagnose anfordern“ und „Ersatzteile disponieren und reservieren“ schließen „Ersatzteil-Verfügbarkeit prüfen“ ein. Sechs extend-Beziehungen beschreiben bedingtes Verhalten. So erweitert „Lieferantenbestellung auslösen“ die Disposition nur, wenn Fehlteile vorhanden sind, und „Retoure abwickeln“ den Wareneingang nur bei mangelhafter Lieferung.</w:t>
       </w:r>
     </w:p>
     <w:p>
@@ -8778,6 +8896,7 @@
         <w:rPr>
           <w:noProof/>
         </w:rPr>
+        <w:lastRenderedPageBreak/>
         <w:drawing>
           <wp:inline distT="0" distB="0" distL="0" distR="0" wp14:anchorId="768D9E83" wp14:editId="3206FFA0">
             <wp:extent cx="3021910" cy="7919998"/>
@@ -8819,8 +8938,6 @@
       <w:pPr>
         <w:spacing w:before="60" w:after="200"/>
         <w:jc w:val="center"/>
-      </w:pPr>
-      <w:r>
         <w:rPr>
           <w:i/>
           <w:iCs/>
@@ -8828,21 +8945,53 @@
           <w:sz w:val="18"/>
           <w:szCs w:val="18"/>
         </w:rPr>
-        <w:t>Abbildung 4: Use-Case-Diagramm RepairFlow</w:t>
-      </w:r>
+      </w:pPr>
+      <w:r>
+        <w:rPr>
+          <w:i/>
+          <w:iCs/>
+          <w:color w:val="595959"/>
+          <w:sz w:val="18"/>
+          <w:szCs w:val="18"/>
+        </w:rPr>
+        <w:t xml:space="preserve">Abbildung 4: Use-Case-Diagramm </w:t>
+      </w:r>
+      <w:proofErr w:type="spellStart"/>
+      <w:r>
+        <w:rPr>
+          <w:i/>
+          <w:iCs/>
+          <w:color w:val="595959"/>
+          <w:sz w:val="18"/>
+          <w:szCs w:val="18"/>
+        </w:rPr>
+        <w:t>RepairFlow</w:t>
+      </w:r>
+      <w:proofErr w:type="spellEnd"/>
+      <w:r>
+        <w:rPr>
+          <w:i/>
+          <w:iCs/>
+          <w:color w:val="595959"/>
+          <w:sz w:val="18"/>
+          <w:szCs w:val="18"/>
+        </w:rPr>
+        <w:br/>
+      </w:r>
+    </w:p>
+    <w:p>
+      <w:pPr>
+        <w:spacing w:before="60" w:after="200"/>
+        <w:jc w:val="center"/>
+      </w:pPr>
     </w:p>
     <w:p>
       <w:pPr>
         <w:pStyle w:val="berschrift2"/>
         <w:keepNext/>
       </w:pPr>
-    </w:p>
-    <w:p>
-      <w:pPr>
-        <w:pStyle w:val="berschrift2"/>
-        <w:keepNext/>
-      </w:pPr>
-      <w:r>
+      <w:r>
+        <w:lastRenderedPageBreak/>
         <w:t>5.4 Klassendiagramm</w:t>
       </w:r>
     </w:p>
@@ -9071,7 +9220,7 @@
         </w:rPr>
         <w:lastRenderedPageBreak/>
         <w:drawing>
-          <wp:inline distT="0" distB="0" distL="0" distR="0" wp14:anchorId="128BF440" wp14:editId="79C6B801">
+          <wp:inline distT="0" distB="0" distL="0" distR="0" wp14:anchorId="128BF440" wp14:editId="79A6FDDA">
             <wp:extent cx="7578721" cy="5750355"/>
             <wp:effectExtent l="0" t="0" r="3810" b="3810"/>
             <wp:docPr id="1600717457" name="Grafik 4"/>
@@ -10038,7 +10187,7 @@
         </w:rPr>
         <w:lastRenderedPageBreak/>
         <w:drawing>
-          <wp:inline distT="0" distB="0" distL="0" distR="0" wp14:anchorId="307C6272" wp14:editId="47E410A2">
+          <wp:inline distT="0" distB="0" distL="0" distR="0" wp14:anchorId="307C6272" wp14:editId="33E880EE">
             <wp:extent cx="5782310" cy="4117005"/>
             <wp:effectExtent l="0" t="0" r="0" b="0"/>
             <wp:docPr id="248347308" name="Grafik 5"/>
@@ -10107,7 +10256,7 @@
           <w:noProof/>
         </w:rPr>
         <w:drawing>
-          <wp:inline distT="0" distB="0" distL="0" distR="0" wp14:anchorId="05AB1227" wp14:editId="5480FE0D">
+          <wp:inline distT="0" distB="0" distL="0" distR="0" wp14:anchorId="05AB1227" wp14:editId="6271697B">
             <wp:extent cx="5782310" cy="3721705"/>
             <wp:effectExtent l="0" t="0" r="0" b="0"/>
             <wp:docPr id="5075578" name="Grafik 6"/>
@@ -11561,7 +11710,13 @@
         <w:t xml:space="preserve">Am 05.10.2026 legten zwei Pull Requests </w:t>
       </w:r>
       <w:r>
-        <w:t xml:space="preserve">in unserem privaten Repo </w:t>
+        <w:t>in unserem privaten Repo</w:t>
+      </w:r>
+      <w:r>
+        <w:t>sitory</w:t>
+      </w:r>
+      <w:r>
+        <w:t xml:space="preserve"> </w:t>
       </w:r>
       <w:r>
         <w:t>parallel eine Entscheidung mit derselben Nummer an. Die Konflikte wurden an zwei Stellen gleichzeitig gelöst. Seitdem holen wir vor jeder neuen Entscheidung den aktuellen Stand und nehmen die nächste freie Nummer.</w:t>
@@ -11613,19 +11768,8 @@
     <w:p>
       <w:pPr>
         <w:jc w:val="both"/>
-        <w:rPr>
-          <w:rFonts w:ascii="Calibri" w:eastAsia="Calibri" w:hAnsi="Calibri" w:cs="Calibri"/>
-          <w:color w:val="auto"/>
-          <w:sz w:val="22"/>
-          <w:szCs w:val="22"/>
-          <w:lang w:eastAsia="en-GB"/>
-        </w:rPr>
-      </w:pPr>
-      <w:r>
-        <w:rPr>
-          <w:color w:val="auto"/>
-          <w:lang w:eastAsia="en-GB"/>
-        </w:rPr>
+      </w:pPr>
+      <w:r>
         <w:t>Im Coaching am 22.10.2026 wies der Dozent darauf hin, dass in den Sequenzdiagrammen zwischen Akteur und Fachobjekt ein Objekt der Benutzeroberfläche fehlt und dass offen bleibt, wie die Oberfläche an das richtige Objekt kommt. Wir haben die Klassen KundenApp und Werkstattoberflaeche mit den Methoden der Benutzeraktionen ergänzt und den Werkstattbetrieb um Suchoperationen erweitert, die zu einer eingegebenen Nummer das Objekt liefern. Alle sechs Sequenzdiagramme folgen jetzt dem Muster Akteur, Oberfläche, Fachobjekt (Abschnitte 5.4 und 5.5).</w:t>
       </w:r>
     </w:p>

</xml_diff>

<commit_message>
fix: Korrekturen aus der Pruefung vom 25.10. (Folien 2, 11, 14, 24, Sprechtext, Doku Kap. 1 und 5, READMEs, TODO)
</commit_message>
<xml_diff>
--- a/3_doku/Projektdokumentation.docx
+++ b/3_doku/Projektdokumentation.docx
@@ -1625,7 +1625,7 @@
         <w:t xml:space="preserve">Kilian Platter: </w:t>
       </w:r>
       <w:r>
-        <w:t xml:space="preserve">Erstellung von </w:t>
+        <w:t xml:space="preserve">Erstellung des BPMN-Diagramms 10, von </w:t>
       </w:r>
       <w:r>
         <w:t>Klassendiagramm und Sequenzdiagramme</w:t>
@@ -1716,13 +1716,6 @@
       <w:r>
         <w:t>.</w:t>
       </w:r>
-    </w:p>
-    <w:p>
-      <w:pPr>
-        <w:pStyle w:val="Listenabsatz"/>
-        <w:spacing w:after="60" w:line="264" w:lineRule="auto"/>
-        <w:ind w:left="540"/>
-      </w:pPr>
     </w:p>
     <w:p>
       <w:pPr>
@@ -2027,7 +2020,6 @@
           <w:b/>
           <w:bCs/>
         </w:rPr>
-        <w:tab/>
       </w:r>
     </w:p>
     <w:p>
@@ -2485,7 +2477,6 @@
                 <w:sz w:val="19"/>
                 <w:szCs w:val="19"/>
               </w:rPr>
-              <w:t xml:space="preserve"> </w:t>
             </w:r>
           </w:p>
         </w:tc>
@@ -3297,7 +3288,7 @@
                 <w:sz w:val="19"/>
                 <w:szCs w:val="19"/>
               </w:rPr>
-              <w:t xml:space="preserve">QA-Befunde behoben, Zuständigkeiten für die Fertigstellung festgelegt, Use-Case-Diagramm nach dem Dozentenhinweis auf Rollen umgestellt. </w:t>
+              <w:t>QA-Befunde behoben, Zuständigkeiten für die Fertigstellung festgelegt, Use-Case-Diagramm nach dem Dozentenhinweis auf Rollen umgestellt.</w:t>
             </w:r>
           </w:p>
         </w:tc>
@@ -3527,7 +3518,7 @@
                 <w:sz w:val="19"/>
                 <w:szCs w:val="19"/>
               </w:rPr>
-              <w:t xml:space="preserve"> und Dokumentation. </w:t>
+              <w:t xml:space="preserve"> und Dokumentation.</w:t>
             </w:r>
           </w:p>
         </w:tc>
@@ -9109,10 +9100,10 @@
           <w:b/>
           <w:bCs/>
         </w:rPr>
-        <w:t>Oberflächen als Klassen</w:t>
-      </w:r>
-      <w:r>
-        <w:t>. Zwischen den Benutzern und den Fachobjekten stehen zwei</w:t>
+        <w:t xml:space="preserve">Oberflächen als Klassen. </w:t>
+      </w:r>
+      <w:r>
+        <w:t>Zwischen den Benutzern und den Fachobjekten stehen zwei</w:t>
       </w:r>
       <w:r>
         <w:t xml:space="preserve"> Oberflächenklassen: Der Kunde arbeitet in der </w:t>
@@ -9201,6 +9192,9 @@
         </w:sectPr>
       </w:pPr>
       <w:r>
+        <w:rPr>
+          <w:b/>
+        </w:rPr>
         <w:t xml:space="preserve">Nacharbeit als neuer Auftrag. </w:t>
       </w:r>
       <w:r>
@@ -9301,7 +9295,7 @@
         <w:jc w:val="both"/>
       </w:pPr>
       <w:r>
-        <w:t xml:space="preserve">Für sechs Use Cases haben wir Sequenzdiagramme erstellt, gefordert waren fünf (Tabelle 8). Jedes folgt einem Prozess. Die erste Lebenslinie ist die Rolle des Use Case aus Abbildung 4; weitere beteiligte Rollen tragen ihren Namen aus dem Use-Case-Diagramm; der Werkstattleiter, der dort keine Rolle hat, erscheint als Objekt seiner Klasse (: Werkstattleiter) mit seinen Operationen. </w:t>
+        <w:t xml:space="preserve">Für sechs Use Cases haben wir Sequenzdiagramme erstellt, gefordert waren fünf (Tabelle 8). Jedes folgt einem Prozess. Die erste Lebenslinie ist die Rolle des Use Case aus Abbildung 4; weitere beteiligte Rollen tragen ihren Namen aus dem Use-Case-Diagramm; der Werkstattleiter, für dessen Freigaben es im Use-Case-Diagramm keine eigene Rolle gibt, erscheint als Objekt seiner Klasse (:Werkstattleiter) mit seinen Operationen. </w:t>
       </w:r>
       <w:r>
         <w:t xml:space="preserve">Die Rolle spricht nie direkt mit dem Fachobjekt, sondern immer mit der Oberfläche </w:t>
@@ -9618,7 +9612,7 @@
                 <w:sz w:val="19"/>
                 <w:szCs w:val="19"/>
               </w:rPr>
-              <w:t>Bei Ablehnung oder nach sieben Tagen ohne Antwort wird die Voranmeldung verworfen.</w:t>
+              <w:t>Bei Ablehnung oder nach sieben Tagen ohne Antwort wird die Voranmeldung verworfen</w:t>
             </w:r>
           </w:p>
         </w:tc>
@@ -11552,9 +11546,7 @@
         <w:jc w:val="both"/>
       </w:pPr>
       <w:r>
-        <w:rPr>
-          <w:i/>
-        </w:rPr>
+        <w:rPr/>
         <w:t>Die Fristen sind festgelegt: Ein nicht abgeholtes Gerät wird nach der vierten Erinnerung verwertet, eine offene Rechnung nach der dritten erfolglosen Mahnung an das Inkasso übergeben und eine Bestellung nach der zweiten erfolglosen Liefermahnung storniert. Verwertete Geräte erhalten keinen eigenen Wert in AuftragStatus, weil die Verwertung ein Prozessende in Prozess 08 ist und kein Zustand des Auftrags.</w:t>
       </w:r>
     </w:p>
@@ -11658,7 +11650,7 @@
         <w:t>wir</w:t>
       </w:r>
       <w:r>
-        <w:t xml:space="preserve"> konnten Visual Paradigm nicht nutzen. Die gesamte UML-Arbeit lag damit bei zwei Personen, die übrigen haben die Diagramme anhand der Exporte geprüft. Dazu kommt, dass der Teamwork-Server der DHBW nur über das Lehre-VPN erreichbar ist. </w:t>
+        <w:t xml:space="preserve"> konnten Visual Paradigm nicht nutzen. Die gesamte UML-Arbeit lag damit bei zwei Personen, die übrigen haben die Diagramme anhand der Exporte geprüft. Dazu kommt, dass der Teamwork-Server der DHBW nur über das Lehre-VPN erreichbar ist.</w:t>
       </w:r>
     </w:p>
     <w:p>
@@ -11674,7 +11666,7 @@
         <w:t xml:space="preserve">Überschriebene Diagramme. </w:t>
       </w:r>
       <w:r>
-        <w:t xml:space="preserve">Viel Zeit hat uns ein Fehler beim Abgleich mit dem Teamwork-Server gekostet: Beim Update wurden das Use-Case-Diagramm und das Klassendiagramm mit älteren Versionen aus dem Repository überlagert. Aktuelle und alte Elemente lagen danach übereinander, Beziehungen waren doppelt vorhanden, und ein Aufräumen von Hand brachte bei jedem weiteren Abgleich neue Überlagerungen. Lösbar war das nur, indem wir beide Diagramme im Repository vollständig neu angelegt haben. Seitdem gilt: vor jeder Sitzung Update, nach jeder Änderung sofort Commit, und nie zwei Personen gleichzeitig im selben Diagramm. </w:t>
+        <w:t>Viel Zeit hat uns ein Fehler beim Abgleich mit dem Teamwork-Server gekostet: Beim Update wurden das Use-Case-Diagramm und das Klassendiagramm mit älteren Versionen aus dem Repository überlagert. Aktuelle und alte Elemente lagen danach übereinander, Beziehungen waren doppelt vorhanden, und ein Aufräumen von Hand brachte bei jedem weiteren Abgleich neue Überlagerungen. Lösbar war das nur, indem wir beide Diagramme im Repository vollständig neu angelegt haben. Seitdem gilt: vor jeder Sitzung Update, nach jeder Änderung sofort Commit, und nie zwei Personen gleichzeitig im selben Diagramm.</w:t>
       </w:r>
     </w:p>
     <w:p>
@@ -11690,7 +11682,7 @@
         <w:t xml:space="preserve">Camunda Modeler. </w:t>
       </w:r>
       <w:r>
-        <w:t xml:space="preserve">Der Modeler meldet für Camunda 8 fehlende technische Angaben wie Task-Definitionen oder Timer-Ausdrücke als Fehler. Wir haben die Diagramme entsprechend ergänzt, bis das Problems-Panel keine Einträge mehr zeigte. </w:t>
+        <w:t>Der Modeler meldet für Camunda 8 fehlende technische Angaben wie Task-Definitionen oder Timer-Ausdrücke als Fehler. Wir haben die Diagramme entsprechend ergänzt, bis das Problems-Panel keine Einträge mehr zeigte.</w:t>
       </w:r>
     </w:p>
     <w:p>
@@ -11774,26 +11766,20 @@
     </w:p>
     <w:p>
       <w:pPr>
+        <w:pStyle w:val="berschrift2"/>
+        <w:keepNext/>
+      </w:pPr>
+      <w:r>
+        <w:t>7.2 Unser Feedback zur Fallstudie</w:t>
+      </w:r>
+    </w:p>
+    <w:p>
+      <w:pPr>
         <w:spacing w:after="120" w:line="276" w:lineRule="auto"/>
         <w:jc w:val="both"/>
       </w:pPr>
-    </w:p>
-    <w:p>
-      <w:pPr>
-        <w:pStyle w:val="berschrift2"/>
-        <w:keepNext/>
-      </w:pPr>
-      <w:r>
-        <w:t>7.2 Unser Feedback zur Fallstudie</w:t>
-      </w:r>
-    </w:p>
-    <w:p>
-      <w:pPr>
-        <w:spacing w:after="120" w:line="276" w:lineRule="auto"/>
-        <w:jc w:val="both"/>
-      </w:pPr>
-      <w:r>
-        <w:t xml:space="preserve">Am meisten gebracht hat uns, ein Szenario durchgehend von der Prozessanalyse bis zum Sequenzdiagramm zu modellieren. Erst dabei wurde sichtbar, wie eng BPMN, Use Cases und Klassenmodell zusammenhängen. Die Reviews im Zweierteam und die gemeinsamen Prüfungen in den Gruppenterminen haben mehr Fehler gefunden, als wir beim Modellieren selbst bemerkt hätten. </w:t>
+      <w:r>
+        <w:t>Am meisten gebracht hat uns, ein Szenario durchgehend von der Prozessanalyse bis zum Sequenzdiagramm zu modellieren. Erst dabei wurde sichtbar, wie eng BPMN, Use Cases und Klassenmodell zusammenhängen. Die Reviews im Zweierteam und die gemeinsamen Prüfungen in den Gruppenterminen haben mehr Fehler gefunden, als wir beim Modellieren selbst bemerkt hätten.</w:t>
       </w:r>
     </w:p>
     <w:p>

</xml_diff>

<commit_message>
docs: Sprechtext Folie 9/10 und Ueberschriften, Doku Use-Case-Satz, TODO Entscheidungen
</commit_message>
<xml_diff>
--- a/3_doku/Projektdokumentation.docx
+++ b/3_doku/Projektdokumentation.docx
@@ -2738,10 +2738,10 @@
         <w:t xml:space="preserve">Die Beteiligten erscheinen in BPMN als Pool (Kunde) oder Lane (Service / Annahme, Techniker, Ersatzteil-Disposition, Werkstattleitung), </w:t>
       </w:r>
       <w:r>
-        <w:t>jeder Use Case hat genau eine Rolle als Hauptakteur</w:t>
-      </w:r>
-      <w:r>
-        <w:t xml:space="preserve"> (Tabelle 7), in den Sequenzdiagrammen als Akteure mit demselben Rollennamen und im Klassendiagramm als Unterklassen von Mitarbeiter. Welche Rolle zu welcher Klasse und Lane gehört, legt Tabelle 7 fest.</w:t>
+        <w:t>jeder direkt ausgelöste Use Case hat genau eine Rolle als Hauptakteur (Tabelle 7)</w:t>
+      </w:r>
+      <w:r>
+        <w:t>, in den Sequenzdiagrammen als Akteure mit demselben Rollennamen und im Klassendiagramm als Unterklassen von Mitarbeiter. Welche Rolle zu welcher Klasse und Lane gehört, legt Tabelle 7 fest.</w:t>
       </w:r>
     </w:p>
     <w:p>
@@ -6920,7 +6920,7 @@
         <w:jc w:val="both"/>
       </w:pPr>
       <w:r>
-        <w:t>Das Use-Case-Diagramm (Abbildung 4) zeigt, was RepairFlow aus Sicht seiner Benutzer leistet. Es enthält 19 Use Cases und 17 Akteure: den Kunden, 15 Mitarbeiterrollen und den KI-Diagnosedienst als externes System. Der Lieferant ist kein Akteur, sondern eine Black Box ohne Zugang zu RepairFlow; wie in den Prozessmodellen kommt er nur über Nachrichten vor. Jeder Use Case hat genau eine Rolle als primären Akteur; die Nummern UC01 bis UC19 dienen nur der Zuordnung in den Tabellen, im Diagramm stehen die Namen. Diese Struktur geht auf einen Hinweis des Dozenten vom 15.10.2026 zurück: Unsere erste Fassung hatte acht Akteure mit bis zu acht Verbindungen, etwa den Techniker an Diagnosevorschlag, Diagnosebefund, KVA, Reparatur und Fertigmeldung. Statt eines Akteurs mit vielen Linien gibt es jetzt je Use Case eine Rolle, zum Beispiel Diagnoseprüfer, Diagnostiker, Kalkulator, Reparateur und Endkontrolleur anstelle des Technikers. Welche Person eine Rolle ausfüllt, regelt das Organigramm des Werkstattbetriebs; im Modell sind das die Unterklassen von Mitarbeiter (Tabelle 7). Der Kunde ist einmal dargestellt und mit UC01, UC02 und UC07 verbunden. UC08 „Ersatzteil-Verfügbarkeit prüfen“ wird nur über include erreicht und hat deshalb keinen eigenen Akteur.</w:t>
+        <w:t>Das Use-Case-Diagramm (Abbildung 4) zeigt, was RepairFlow aus Sicht seiner Benutzer leistet. Es enthält 19 Use Cases und 17 Akteure: den Kunden, 15 Mitarbeiterrollen und den KI-Diagnosedienst als externes System. Der Lieferant ist kein Akteur, sondern eine Black Box ohne Zugang zu RepairFlow; wie in den Prozessmodellen kommt er nur über Nachrichten vor. Jeder direkt ausgelöste Use Case hat genau eine Rolle als primären Akteur; die Nummern UC01 bis UC19 dienen nur der Zuordnung in den Tabellen, im Diagramm stehen die Namen. Diese Struktur geht auf einen Hinweis des Dozenten vom 15.10.2026 zurück: Unsere erste Fassung hatte acht Akteure mit bis zu acht Verbindungen, etwa den Techniker an Diagnosevorschlag, Diagnosebefund, KVA, Reparatur und Fertigmeldung. Statt eines Akteurs mit vielen Linien gibt es jetzt je Use Case eine Rolle, zum Beispiel Diagnoseprüfer, Diagnostiker, Kalkulator, Reparateur und Endkontrolleur anstelle des Technikers. Welche Person eine Rolle ausfüllt, regelt das Organigramm des Werkstattbetriebs; im Modell sind das die Unterklassen von Mitarbeiter (Tabelle 7). Der Kunde ist einmal dargestellt und mit UC01, UC02 und UC07 verbunden. UC08 „Ersatzteil-Verfügbarkeit prüfen“ wird nur über include erreicht und hat deshalb keinen eigenen Akteur.</w:t>
       </w:r>
     </w:p>
     <w:tbl>

</xml_diff>

<commit_message>
fix: SD3, SD5, SD6 an P05, P09, P06 angeglichen, Klassendiagramm bereinigt, BPMN-Texte, Doku und Sprechtext nachgezogen
</commit_message>
<xml_diff>
--- a/3_doku/Projektdokumentation.docx
+++ b/3_doku/Projektdokumentation.docx
@@ -2709,7 +2709,7 @@
         <w:spacing w:after="60" w:line="264" w:lineRule="auto"/>
       </w:pPr>
       <w:r>
-        <w:t>Aktivitäten heißen Verb mit Objekt („Kundendaten erfassen“), Ereignisse stehen im Partizip Perfekt („Auftrag angenommen“).</w:t>
+        <w:t>Aktivitäten heißen Verb mit Objekt („Kundendaten erfassen“), Ereignisse stehen im Partizip Perfekt („Auftrag eingeplant“).</w:t>
       </w:r>
     </w:p>
     <w:p>
@@ -4389,7 +4389,7 @@
         <w:jc w:val="both"/>
       </w:pPr>
       <w:r>
-        <w:t>Wir haben zehn Soll-Prozesse unseres Pilotkunden als Kollaborationsdiagramme modelliert (Tabelle 6). Zusammen enthalten sie 143 Aktivitäten im Werkstatt-Pool, im Schnitt 14,3 je Diagramm. Hinzu kommen 28 Aktivitäten in den Abläufen des Kunden, 48 Nachrichtenflüsse sowie 58 Datenobjekte und 14 Datenspeicher.</w:t>
+        <w:t>Wir haben zehn Soll-Prozesse unseres Pilotkunden als Kollaborationsdiagramme modelliert (Tabelle 6). Zusammen enthalten sie 143 Aktivitäten im Werkstatt-Pool, im Schnitt 14,3 je Diagramm. Hinzu kommen 29 Aktivitäten in den Abläufen des Kunden, 48 Nachrichtenflüsse sowie 58 Datenobjekte und 14 Datenspeicher.</w:t>
       </w:r>
     </w:p>
     <w:tbl>
@@ -4901,7 +4901,7 @@
                 <w:sz w:val="19"/>
                 <w:szCs w:val="19"/>
               </w:rPr>
-              <w:t>Auftrag angenommen</w:t>
+              <w:t>Auftrag eingeplant</w:t>
             </w:r>
           </w:p>
         </w:tc>
@@ -6546,7 +6546,7 @@
         <w:t xml:space="preserve">04 Kostenvoranschlag und Kundenfreigabe. </w:t>
       </w:r>
       <w:r>
-        <w:t>Der KVA wird berechnet, geprüft und versendet. Bleibt die Antwort drei Tage aus, wird er mit Erinnerung erneut gesendet. Nach dem dritten Fristablauf ohne Antwort gilt er als abgelehnt.</w:t>
+        <w:t>Der KVA wird berechnet, geprüft und versendet. Bleibt die Antwort drei Tage aus, wird er mit Erinnerung erneut gesendet. Nach dem dritten Fristablauf ohne Antwort gilt er als abgelehnt. Ist die Frist abgelaufen oder sind nach der Freigabe nicht alle Teile beschaffbar, erhält der Kunde eine Reparaturabsage, und der KVA verfällt auch in seinem Ablauf.</w:t>
       </w:r>
     </w:p>
     <w:p>
@@ -6747,7 +6747,7 @@
         </w:rPr>
         <w:drawing>
           <wp:inline distT="0" distB="0" distL="0" distR="0" wp14:anchorId="2C7C0B39" wp14:editId="16659AC5">
-            <wp:extent cx="5782310" cy="2223965"/>
+            <wp:extent cx="5782310" cy="2222367"/>
             <wp:effectExtent l="0" t="0" r="0" b="5080"/>
             <wp:docPr id="1426216721" name="Grafik 3"/>
             <wp:cNvGraphicFramePr>
@@ -6775,7 +6775,7 @@
                   <pic:spPr>
                     <a:xfrm>
                       <a:off x="0" y="0"/>
-                      <a:ext cx="5782310" cy="2223965"/>
+                      <a:ext cx="5782310" cy="2222367"/>
                     </a:xfrm>
                     <a:prstGeom prst="rect">
                       <a:avLst/>
@@ -9146,7 +9146,7 @@
       </w:r>
       <w:proofErr w:type="gramEnd"/>
       <w:r>
-        <w:t>). Ein Benutzer gibt dabei keine Objekte ein, sondern Merkmale wie die Auftragsnummer. Die Oberfläche sucht das Objekt über den Werkstattbetrieb, der als Mandant alle Aufträge, Bestellungen und Reklamationen seiner Filialen kennt (</w:t>
+        <w:t>). Ein Benutzer gibt dabei keine Objekte ein, sondern Merkmale wie die Auftragsnummer. Die Oberfläche sucht das Objekt über den Werkstattbetrieb, der als Mandant alle Aufträge und Reklamationen seiner Filialen kennt (</w:t>
       </w:r>
       <w:proofErr w:type="spellStart"/>
       <w:proofErr w:type="gramStart"/>
@@ -9214,7 +9214,7 @@
         <w:lastRenderedPageBreak/>
         <w:drawing>
           <wp:inline distT="0" distB="0" distL="0" distR="0" wp14:anchorId="128BF440" wp14:editId="79A6FDDA">
-            <wp:extent cx="7578721" cy="5750355"/>
+            <wp:extent cx="7578721" cy="5749374"/>
             <wp:effectExtent l="0" t="0" r="3810" b="3810"/>
             <wp:docPr id="1600717457" name="Grafik 4"/>
             <wp:cNvGraphicFramePr>
@@ -9242,7 +9242,7 @@
                   <pic:spPr>
                     <a:xfrm>
                       <a:off x="0" y="0"/>
-                      <a:ext cx="7587707" cy="5756107"/>
+                      <a:ext cx="7587707" cy="5749374"/>
                     </a:xfrm>
                     <a:prstGeom prst="rect">
                       <a:avLst/>
@@ -9822,7 +9822,7 @@
                 <w:sz w:val="19"/>
                 <w:szCs w:val="19"/>
               </w:rPr>
-              <w:t>Prüfung je Teil in einer Schleife: eigener Bestand, andere Filiale oder Fehlteil; Vorreservierung aus der Sofortdiagnose; Meldebestand; Fehlteile führen zu UC10</w:t>
+              <w:t>Prüfung je Teil in einer Schleife: eigener Bestand, andere Filiale nur bei zu wenig eigenem Bestand, sonst Fehlteil; Vorreservierung aus der Sofortdiagnose; Meldebestand; Reparaturbeginn nur bei der ersten Disposition; Fehlteile führen zu UC10</w:t>
             </w:r>
           </w:p>
         </w:tc>
@@ -10032,7 +10032,7 @@
                 <w:sz w:val="19"/>
                 <w:szCs w:val="19"/>
               </w:rPr>
-              <w:t>Mangelprüfung, Gewährleistung, Nacharbeitsauftrag nur nach Freigabe oder Annahme</w:t>
+              <w:t>Mangelprüfung, Gewährleistung, Nacharbeitsauftrag nur nach Freigabe oder Annahme; Ablehnung durch den Kunden über die KundenApp, bei Fristablauf oder fehlenden Teilen über die Werkstattoberfläche</w:t>
             </w:r>
           </w:p>
         </w:tc>
@@ -10137,7 +10137,7 @@
                 <w:sz w:val="19"/>
                 <w:szCs w:val="19"/>
               </w:rPr>
-              <w:t>Bündelung, Freigabe durch den Werkstattleiter ab Freigabegrenze, Bestellung, Bestätigung oder Storno nach zwei Mahnungen; Nachrichten an den Lieferanten als Lost Messages</w:t>
+              <w:t>Bündelung, Freigabe durch den Werkstattleiter ab Freigabegrenze, Bestellung; Bestätigung, Mahnung und Storno nach zwei Mahnungen laufen automatisch wie in Prozess 06; Nachrichten an den Lieferanten als Lost Messages</w:t>
             </w:r>
           </w:p>
         </w:tc>
@@ -10250,7 +10250,7 @@
         </w:rPr>
         <w:drawing>
           <wp:inline distT="0" distB="0" distL="0" distR="0" wp14:anchorId="05AB1227" wp14:editId="6271697B">
-            <wp:extent cx="5782310" cy="3721705"/>
+            <wp:extent cx="5782310" cy="3691366"/>
             <wp:effectExtent l="0" t="0" r="0" b="0"/>
             <wp:docPr id="5075578" name="Grafik 6"/>
             <wp:cNvGraphicFramePr>
@@ -10278,7 +10278,7 @@
                   <pic:spPr>
                     <a:xfrm>
                       <a:off x="0" y="0"/>
-                      <a:ext cx="5782310" cy="3721705"/>
+                      <a:ext cx="5782310" cy="3691366"/>
                     </a:xfrm>
                     <a:prstGeom prst="rect">
                       <a:avLst/>

</xml_diff>

<commit_message>
fix: Befunde der Diagrammpruefung (SD1, SD2, SD5, Klassendiagramm, Doku Tabellen 7 und 8, Abb. 5 und 6, Folie 19, Sprechtext)
</commit_message>
<xml_diff>
--- a/3_doku/Projektdokumentation.docx
+++ b/3_doku/Projektdokumentation.docx
@@ -8844,7 +8844,7 @@
                 <w:sz w:val="19"/>
                 <w:szCs w:val="19"/>
               </w:rPr>
-              <w:t>Nachrichtenfluss in Prozess 01</w:t>
+              <w:t>Business Rule Task „KI-Diagnosevorschlag erstellen“ in Prozess 01 (Lane Service / Annahme)</w:t>
             </w:r>
           </w:p>
         </w:tc>
@@ -9717,7 +9717,7 @@
                 <w:sz w:val="19"/>
                 <w:szCs w:val="19"/>
               </w:rPr>
-              <w:t>Versand, Erinnerung nach je drei Tagen, Ablehnung nach dem dritten Fristablauf, Freigabe startet die Disposition, Ablehnung führt zur Abholung; sind nach der Freigabe nicht alle Teile beschaffbar, wird der Auftrag abgelehnt und das Gerät zur Abholung gegeben</w:t>
+              <w:t>Versand, Erinnerung nach je drei Tagen, Ablehnung mit Reparaturabsage nach dem dritten Fristablauf, Freigabe startet die Disposition, Ablehnung führt zur Abholung; sind nach der Freigabe nicht alle Teile beschaffbar, wird der Auftrag abgelehnt und das Gerät zur Abholung gegeben</w:t>
             </w:r>
           </w:p>
         </w:tc>
@@ -10181,7 +10181,7 @@
         <w:lastRenderedPageBreak/>
         <w:drawing>
           <wp:inline distT="0" distB="0" distL="0" distR="0" wp14:anchorId="307C6272" wp14:editId="33E880EE">
-            <wp:extent cx="5782310" cy="4117005"/>
+            <wp:extent cx="5782310" cy="4187190"/>
             <wp:effectExtent l="0" t="0" r="0" b="0"/>
             <wp:docPr id="248347308" name="Grafik 5"/>
             <wp:cNvGraphicFramePr>
@@ -10209,7 +10209,7 @@
                   <pic:spPr>
                     <a:xfrm>
                       <a:off x="0" y="0"/>
-                      <a:ext cx="5782310" cy="4117005"/>
+                      <a:ext cx="5782310" cy="4187190"/>
                     </a:xfrm>
                     <a:prstGeom prst="rect">
                       <a:avLst/>

</xml_diff>

<commit_message>
fix: Optik der Sequenzdiagramme SD1, SD2, SD3, SD5, Doku Abb. 6 und 7
</commit_message>
<xml_diff>
--- a/3_doku/Projektdokumentation.docx
+++ b/3_doku/Projektdokumentation.docx
@@ -10250,7 +10250,7 @@
         </w:rPr>
         <w:drawing>
           <wp:inline distT="0" distB="0" distL="0" distR="0" wp14:anchorId="05AB1227" wp14:editId="6271697B">
-            <wp:extent cx="5782310" cy="3691366"/>
+            <wp:extent cx="5782310" cy="3683052"/>
             <wp:effectExtent l="0" t="0" r="0" b="0"/>
             <wp:docPr id="5075578" name="Grafik 6"/>
             <wp:cNvGraphicFramePr>
@@ -10278,7 +10278,7 @@
                   <pic:spPr>
                     <a:xfrm>
                       <a:off x="0" y="0"/>
-                      <a:ext cx="5782310" cy="3691366"/>
+                      <a:ext cx="5782310" cy="3683052"/>
                     </a:xfrm>
                     <a:prstGeom prst="rect">
                       <a:avLst/>

</xml_diff>

<commit_message>
docs: Doku nach Pruefung vom 27.10.
- 5.1: Absaetze 04, 09 und 10 an P04/P09/P10 angepasst
- 5.5: letzter Satz ohne break; Tabelle 8 Zeilen SD1, SD5, SD6 neu
- Abb. 3 (P04), Abb. 5 (Klassendiagramm), Abb. 6 (SD1), Abb. 7 (SD3) getauscht
Inhaltsverzeichnis in Word aktualisieren
</commit_message>
<xml_diff>
--- a/3_doku/Projektdokumentation.docx
+++ b/3_doku/Projektdokumentation.docx
@@ -207,12 +207,6 @@
           <w:bCs/>
         </w:rPr>
         <w:t>1 Mitglieder der Gruppe und Rollen</w:t>
-      </w:r>
-      <w:r>
-        <w:rPr>
-          <w:b/>
-          <w:bCs/>
-        </w:rPr>
         <w:tab/>
         <w:t>2</w:t>
       </w:r>
@@ -230,12 +224,6 @@
           <w:bCs/>
         </w:rPr>
         <w:t>2 Das Projekt RepairFlow</w:t>
-      </w:r>
-      <w:r>
-        <w:rPr>
-          <w:b/>
-          <w:bCs/>
-        </w:rPr>
         <w:tab/>
         <w:t>3</w:t>
       </w:r>
@@ -254,12 +242,6 @@
           <w:szCs w:val="20"/>
         </w:rPr>
         <w:t>2.1 Ausgangslage und Problem</w:t>
-      </w:r>
-      <w:r>
-        <w:rPr>
-          <w:sz w:val="20"/>
-          <w:szCs w:val="20"/>
-        </w:rPr>
         <w:tab/>
         <w:t>3</w:t>
       </w:r>
@@ -278,12 +260,6 @@
           <w:szCs w:val="20"/>
         </w:rPr>
         <w:t>2.2 RepairFlow als Solution Provider</w:t>
-      </w:r>
-      <w:r>
-        <w:rPr>
-          <w:sz w:val="20"/>
-          <w:szCs w:val="20"/>
-        </w:rPr>
         <w:tab/>
         <w:t>3</w:t>
       </w:r>
@@ -302,12 +278,6 @@
           <w:szCs w:val="20"/>
         </w:rPr>
         <w:t>2.3 Systemkontext und Systemgrenze</w:t>
-      </w:r>
-      <w:r>
-        <w:rPr>
-          <w:sz w:val="20"/>
-          <w:szCs w:val="20"/>
-        </w:rPr>
         <w:tab/>
         <w:t>3</w:t>
       </w:r>
@@ -326,12 +296,6 @@
           <w:szCs w:val="20"/>
         </w:rPr>
         <w:t>2.4 Der Reparaturauftrag als roter Faden</w:t>
-      </w:r>
-      <w:r>
-        <w:rPr>
-          <w:sz w:val="20"/>
-          <w:szCs w:val="20"/>
-        </w:rPr>
         <w:tab/>
         <w:t>4</w:t>
       </w:r>
@@ -354,12 +318,6 @@
           <w:szCs w:val="20"/>
         </w:rPr>
         <w:t>2.5 Alleinstellungsmerkmal: die KI-Sofortdiagnose</w:t>
-      </w:r>
-      <w:r>
-        <w:rPr>
-          <w:sz w:val="20"/>
-          <w:szCs w:val="20"/>
-        </w:rPr>
         <w:tab/>
         <w:t>4</w:t>
       </w:r>
@@ -378,12 +336,6 @@
           <w:szCs w:val="20"/>
         </w:rPr>
         <w:t>2.6 Ausblick</w:t>
-      </w:r>
-      <w:r>
-        <w:rPr>
-          <w:sz w:val="20"/>
-          <w:szCs w:val="20"/>
-        </w:rPr>
         <w:tab/>
         <w:t>5</w:t>
       </w:r>
@@ -401,12 +353,6 @@
           <w:bCs/>
         </w:rPr>
         <w:t>3 Vorgehen bei der Umsetzung</w:t>
-      </w:r>
-      <w:r>
-        <w:rPr>
-          <w:b/>
-          <w:bCs/>
-        </w:rPr>
         <w:tab/>
         <w:t>5</w:t>
       </w:r>
@@ -425,12 +371,6 @@
           <w:szCs w:val="20"/>
         </w:rPr>
         <w:t>3.1 Werkzeuge und Konventionen</w:t>
-      </w:r>
-      <w:r>
-        <w:rPr>
-          <w:sz w:val="20"/>
-          <w:szCs w:val="20"/>
-        </w:rPr>
         <w:tab/>
         <w:t>5</w:t>
       </w:r>
@@ -449,12 +389,6 @@
           <w:szCs w:val="20"/>
         </w:rPr>
         <w:t>3.2 Qualitätssicherung</w:t>
-      </w:r>
-      <w:r>
-        <w:rPr>
-          <w:sz w:val="20"/>
-          <w:szCs w:val="20"/>
-        </w:rPr>
         <w:tab/>
         <w:t>6</w:t>
       </w:r>
@@ -472,12 +406,6 @@
           <w:bCs/>
         </w:rPr>
         <w:t>4 Projektmanagement</w:t>
-      </w:r>
-      <w:r>
-        <w:rPr>
-          <w:b/>
-          <w:bCs/>
-        </w:rPr>
         <w:tab/>
         <w:t>6</w:t>
       </w:r>
@@ -496,12 +424,6 @@
           <w:szCs w:val="20"/>
         </w:rPr>
         <w:t>4.1 Vorgehensmodell und Kommunikation</w:t>
-      </w:r>
-      <w:r>
-        <w:rPr>
-          <w:sz w:val="20"/>
-          <w:szCs w:val="20"/>
-        </w:rPr>
         <w:tab/>
         <w:t>6</w:t>
       </w:r>
@@ -520,12 +442,6 @@
           <w:szCs w:val="20"/>
         </w:rPr>
         <w:t>4.2 Sprintplan und Verlauf</w:t>
-      </w:r>
-      <w:r>
-        <w:rPr>
-          <w:sz w:val="20"/>
-          <w:szCs w:val="20"/>
-        </w:rPr>
         <w:tab/>
         <w:t>6</w:t>
       </w:r>
@@ -544,12 +460,6 @@
           <w:szCs w:val="20"/>
         </w:rPr>
         <w:t>4.3 Aufgabensteuerung und Repository</w:t>
-      </w:r>
-      <w:r>
-        <w:rPr>
-          <w:sz w:val="20"/>
-          <w:szCs w:val="20"/>
-        </w:rPr>
         <w:tab/>
         <w:t>7</w:t>
       </w:r>
@@ -568,12 +478,6 @@
           <w:szCs w:val="20"/>
         </w:rPr>
         <w:t>4.4 Risiken</w:t>
-      </w:r>
-      <w:r>
-        <w:rPr>
-          <w:sz w:val="20"/>
-          <w:szCs w:val="20"/>
-        </w:rPr>
         <w:tab/>
         <w:t>7</w:t>
       </w:r>
@@ -591,12 +495,6 @@
           <w:bCs/>
         </w:rPr>
         <w:t>5 Überblick über die erstellten Artefakte</w:t>
-      </w:r>
-      <w:r>
-        <w:rPr>
-          <w:b/>
-          <w:bCs/>
-        </w:rPr>
         <w:tab/>
         <w:t>7</w:t>
       </w:r>
@@ -615,12 +513,6 @@
           <w:szCs w:val="20"/>
         </w:rPr>
         <w:t>5.1 Geschäftsprozessmodell (BPMN)</w:t>
-      </w:r>
-      <w:r>
-        <w:rPr>
-          <w:sz w:val="20"/>
-          <w:szCs w:val="20"/>
-        </w:rPr>
         <w:tab/>
         <w:t>7</w:t>
       </w:r>
@@ -639,12 +531,6 @@
           <w:szCs w:val="20"/>
         </w:rPr>
         <w:t>5.2 Automatisierungspotential</w:t>
-      </w:r>
-      <w:r>
-        <w:rPr>
-          <w:sz w:val="20"/>
-          <w:szCs w:val="20"/>
-        </w:rPr>
         <w:tab/>
         <w:t>10</w:t>
       </w:r>
@@ -663,12 +549,6 @@
           <w:szCs w:val="20"/>
         </w:rPr>
         <w:t>5.3 Use-Case-Diagramm</w:t>
-      </w:r>
-      <w:r>
-        <w:rPr>
-          <w:sz w:val="20"/>
-          <w:szCs w:val="20"/>
-        </w:rPr>
         <w:tab/>
         <w:t>10</w:t>
       </w:r>
@@ -687,19 +567,7 @@
           <w:szCs w:val="20"/>
         </w:rPr>
         <w:t>5.4 Klassendiagramm</w:t>
-      </w:r>
-      <w:r>
-        <w:rPr>
-          <w:sz w:val="20"/>
-          <w:szCs w:val="20"/>
-        </w:rPr>
         <w:tab/>
-      </w:r>
-      <w:r>
-        <w:rPr>
-          <w:sz w:val="20"/>
-          <w:szCs w:val="20"/>
-        </w:rPr>
         <w:t>13</w:t>
       </w:r>
     </w:p>
@@ -717,12 +585,6 @@
           <w:szCs w:val="20"/>
         </w:rPr>
         <w:t>5.5 Sequenzdiagramme</w:t>
-      </w:r>
-      <w:r>
-        <w:rPr>
-          <w:sz w:val="20"/>
-          <w:szCs w:val="20"/>
-        </w:rPr>
         <w:tab/>
         <w:t>15</w:t>
       </w:r>
@@ -741,12 +603,6 @@
           <w:szCs w:val="20"/>
         </w:rPr>
         <w:t>5.6 Konsistenz zwischen den Modellen</w:t>
-      </w:r>
-      <w:r>
-        <w:rPr>
-          <w:sz w:val="20"/>
-          <w:szCs w:val="20"/>
-        </w:rPr>
         <w:tab/>
         <w:t>17</w:t>
       </w:r>
@@ -764,19 +620,7 @@
           <w:bCs/>
         </w:rPr>
         <w:t>6 Probleme und Herausforderungen</w:t>
-      </w:r>
-      <w:r>
-        <w:rPr>
-          <w:b/>
-          <w:bCs/>
-        </w:rPr>
         <w:tab/>
-      </w:r>
-      <w:r>
-        <w:rPr>
-          <w:b/>
-          <w:bCs/>
-        </w:rPr>
         <w:t>17</w:t>
       </w:r>
     </w:p>
@@ -793,19 +637,7 @@
           <w:bCs/>
         </w:rPr>
         <w:t>7 Feedback</w:t>
-      </w:r>
-      <w:r>
-        <w:rPr>
-          <w:b/>
-          <w:bCs/>
-        </w:rPr>
         <w:tab/>
-      </w:r>
-      <w:r>
-        <w:rPr>
-          <w:b/>
-          <w:bCs/>
-        </w:rPr>
         <w:t>18</w:t>
       </w:r>
     </w:p>
@@ -823,19 +655,7 @@
           <w:szCs w:val="20"/>
         </w:rPr>
         <w:t>7.1 Feedback des Dozenten und Umsetzung</w:t>
-      </w:r>
-      <w:r>
-        <w:rPr>
-          <w:sz w:val="20"/>
-          <w:szCs w:val="20"/>
-        </w:rPr>
         <w:tab/>
-      </w:r>
-      <w:r>
-        <w:rPr>
-          <w:sz w:val="20"/>
-          <w:szCs w:val="20"/>
-        </w:rPr>
         <w:t>18</w:t>
       </w:r>
     </w:p>
@@ -853,12 +673,6 @@
           <w:szCs w:val="20"/>
         </w:rPr>
         <w:t>7.2 Unser Feedback zur Fallstudie</w:t>
-      </w:r>
-      <w:r>
-        <w:rPr>
-          <w:sz w:val="20"/>
-          <w:szCs w:val="20"/>
-        </w:rPr>
         <w:tab/>
         <w:t>19</w:t>
       </w:r>
@@ -1509,10 +1323,7 @@
         <w:jc w:val="both"/>
       </w:pPr>
       <w:r>
-        <w:t>Die Gruppenmitglieder haben folgende Beiträge erarbeitet</w:t>
-      </w:r>
-      <w:r>
-        <w:t>:</w:t>
+        <w:t>Die Gruppenmitglieder haben folgende Beiträge erarbeitet:</w:t>
       </w:r>
     </w:p>
     <w:p>
@@ -1532,22 +1343,7 @@
         <w:t xml:space="preserve">Nina Sattler: </w:t>
       </w:r>
       <w:r>
-        <w:t xml:space="preserve">Gesamtplanung und Terminsteuerung, </w:t>
-      </w:r>
-      <w:r>
-        <w:t xml:space="preserve">Erstellung </w:t>
-      </w:r>
-      <w:r>
-        <w:t>der BPMN-Diagramme 07 und 08, Redaktion der Projektdokumentation (</w:t>
-      </w:r>
-      <w:r>
-        <w:t xml:space="preserve">Kapitel, </w:t>
-      </w:r>
-      <w:r>
-        <w:t>Abbildungen, Inhaltsverzeichnis, PDF), Zusammenstellung des Abgabe-Archivs</w:t>
-      </w:r>
-      <w:r>
-        <w:t>.</w:t>
+        <w:t xml:space="preserve">Gesamtplanung und Terminsteuerung, Erstellung der BPMN-Diagramme 07 und 08, Redaktion der Projektdokumentation (Kapitel, Abbildungen, Inhaltsverzeichnis, PDF), Zusammenstellung des Abgabe-Archivs.</w:t>
       </w:r>
     </w:p>
     <w:p>
@@ -1567,13 +1363,7 @@
         <w:t xml:space="preserve">David Leismann: </w:t>
       </w:r>
       <w:r>
-        <w:t xml:space="preserve">Erstellung </w:t>
-      </w:r>
-      <w:r>
-        <w:t>der BPMN-Diagramme 03 und 04, Abgleich der Use Cases und Sequenzdiagramme mit den Prozessen, Überarbeitung der Prozesse 05 und 06, Use-Case-Diagramm mit Rollenstruktur sowie SD5 und SD6 in Visual Paradigm</w:t>
-      </w:r>
-      <w:r>
-        <w:t>, Klassendiagramm.</w:t>
+        <w:t xml:space="preserve">Erstellung der BPMN-Diagramme 03 und 04, Abgleich der Use Cases und Sequenzdiagramme mit den Prozessen, Überarbeitung der Prozesse 05 und 06, Use-Case-Diagramm mit Rollenstruktur sowie SD5 und SD6 in Visual Paradigm, Klassendiagramm.</w:t>
       </w:r>
     </w:p>
     <w:p>
@@ -1593,19 +1383,7 @@
         <w:t xml:space="preserve">Adrian Wenzler: </w:t>
       </w:r>
       <w:r>
-        <w:t xml:space="preserve">Erstellung </w:t>
-      </w:r>
-      <w:r>
-        <w:t>der BPMN-Diagramme 05 und 06, Fachkonzept (Ausgangslage, Solution Provider, Systemkontext, Zustandsautomat, KI-Sofortdiagnose), Pflege des Entscheidungslogs und Abstimmung der Prozessänderungen mit der Gruppe,</w:t>
-      </w:r>
-      <w:r>
-        <w:t xml:space="preserve"> </w:t>
-      </w:r>
-      <w:r>
-        <w:t>Automatisierungspotential, Probleme und Herausforderungen</w:t>
-      </w:r>
-      <w:r>
-        <w:t>.</w:t>
+        <w:t xml:space="preserve">Erstellung der BPMN-Diagramme 05 und 06, Fachkonzept (Ausgangslage, Solution Provider, Systemkontext, Zustandsautomat, KI-Sofortdiagnose), Pflege des Entscheidungslogs und Abstimmung der Prozessänderungen mit der Gruppe, Automatisierungspotential, Probleme und Herausforderungen.</w:t>
       </w:r>
     </w:p>
     <w:p>
@@ -1625,32 +1403,7 @@
         <w:t xml:space="preserve">Kilian Platter: </w:t>
       </w:r>
       <w:r>
-        <w:t xml:space="preserve">Erstellung des BPMN-Diagramms 10, von </w:t>
-      </w:r>
-      <w:r>
-        <w:t>Klassendiagramm und Sequenzdiagramme</w:t>
-      </w:r>
-      <w:r>
-        <w:t>n</w:t>
-      </w:r>
-      <w:r>
-        <w:t xml:space="preserve"> SD1 bis SD4 in Visual </w:t>
-      </w:r>
-      <w:proofErr w:type="spellStart"/>
-      <w:r>
-        <w:t>Paradigm</w:t>
-      </w:r>
-      <w:proofErr w:type="spellEnd"/>
-      <w:r>
-        <w:t>, Visual-</w:t>
-      </w:r>
-      <w:proofErr w:type="spellStart"/>
-      <w:r>
-        <w:t>Paradigm</w:t>
-      </w:r>
-      <w:proofErr w:type="spellEnd"/>
-      <w:r>
-        <w:t>-Projekt und Konsistenzprüfung der Sequenzdiagramme gegen das Klassendiagramm, Sprint-Rituale und Trello-Board.</w:t>
+        <w:t xml:space="preserve">Erstellung des BPMN-Diagramms 10, von Klassendiagramm und Sequenzdiagrammen SD1 bis SD4 in Visual Paradigm, Visual-Paradigm-Projekt und Konsistenzprüfung der Sequenzdiagramme gegen das Klassendiagramm, Sprint-Rituale und Trello-Board.</w:t>
       </w:r>
     </w:p>
     <w:p>
@@ -1670,28 +1423,7 @@
         <w:t xml:space="preserve">Maximilian Ewald: </w:t>
       </w:r>
       <w:r>
-        <w:t xml:space="preserve">Erstellung </w:t>
-      </w:r>
-      <w:r>
-        <w:t>der BPMN-Diagramme 01</w:t>
-      </w:r>
-      <w:r>
-        <w:t xml:space="preserve">, </w:t>
-      </w:r>
-      <w:r>
-        <w:t>02</w:t>
-      </w:r>
-      <w:r>
-        <w:t xml:space="preserve"> und 09</w:t>
-      </w:r>
-      <w:r>
-        <w:t>, alle zehn BPMN-Dateien im Camunda Modeler (Anreicherung für Camunda 8, Prüfung im Problems-Panel, PNG-Export), Prozesskennzahlen und Beschreibung der Prozesse</w:t>
-      </w:r>
-      <w:r>
-        <w:t>, Erstellung der PowerPoint</w:t>
-      </w:r>
-      <w:r>
-        <w:t>-Präsentation.</w:t>
+        <w:t xml:space="preserve">Erstellung der BPMN-Diagramme 01, 02 und 09, alle zehn BPMN-Dateien im Camunda Modeler (Anreicherung für Camunda 8, Prüfung im Problems-Panel, PNG-Export), Prozesskennzahlen und Beschreibung der Prozesse, Erstellung der PowerPoint-Präsentation.</w:t>
       </w:r>
     </w:p>
     <w:p>
@@ -1711,10 +1443,7 @@
         <w:t xml:space="preserve">Jakob Schwan: </w:t>
       </w:r>
       <w:r>
-        <w:t>Review der Prozesse 09 und 10, Behebung der Logikfehler in den Prozessen 07 und 08, Fehleranalyse und Korrektur der Prozesse 01 bis 05 sowie der Logikfehler in Prozess 06, QA-Checkliste und Review aller Pull Requests, Konventionen und Konsistenz der Modelle</w:t>
-      </w:r>
-      <w:r>
-        <w:t>.</w:t>
+        <w:t>Review der Prozesse 09 und 10, Behebung der Logikfehler in den Prozessen 07 und 08, Fehleranalyse und Korrektur der Prozesse 01 bis 05 sowie der Logikfehler in Prozess 06, QA-Checkliste und Review aller Pull Requests, Konventionen und Konsistenz der Modelle.</w:t>
       </w:r>
     </w:p>
     <w:p>
@@ -1822,10 +1551,7 @@
         <w:jc w:val="both"/>
       </w:pPr>
       <w:r>
-        <w:t xml:space="preserve">Die Plattform besteht aus vier Modulen: einem Kundenportal mit App, einem Auftrags- und Werkstattmodul, einem Dispositionsmodul für die filialübergreifende Ersatzteilversorgung sowie einer Abrechnung mit Schnittstelle zur Buchhaltung. Zielkunden sind unabhängige Werkstätten und kleine Ketten mit zwei bis zehn Filialen im deutschsprachigen Raum. Als Geschäftsmodell ist ein monatliches Abonnement je Filiale mit den Stufen Basis (Auftragsverwaltung und Kundenkommunikation) und Pro (zusätzlich filialübergreifende Disposition und KI-Sofortdiagnose) vorgesehen; das Abonnement selbst ist nicht Gegenstand der Modelle. Unser Konzept verbindet Fahrrad-, E-Bike- und Elektronikreparaturen in einer Plattform mit gemeinsamem Ersatzteillager. </w:t>
-      </w:r>
-      <w:r>
-        <w:t>Ein Funktionsvergleich mit bestehenden Werkstattlösungen war nicht Gegenstand der Fallstudie; das Alleinstellungsmerkmal begründen wir in Abschnitt 2.5.</w:t>
+        <w:t xml:space="preserve">Die Plattform besteht aus vier Modulen: einem Kundenportal mit App, einem Auftrags- und Werkstattmodul, einem Dispositionsmodul für die filialübergreifende Ersatzteilversorgung sowie einer Abrechnung mit Schnittstelle zur Buchhaltung. Zielkunden sind unabhängige Werkstätten und kleine Ketten mit zwei bis zehn Filialen im deutschsprachigen Raum. Als Geschäftsmodell ist ein monatliches Abonnement je Filiale mit den Stufen Basis (Auftragsverwaltung und Kundenkommunikation) und Pro (zusätzlich filialübergreifende Disposition und KI-Sofortdiagnose) vorgesehen; das Abonnement selbst ist nicht Gegenstand der Modelle. Unser Konzept verbindet Fahrrad-, E-Bike- und Elektronikreparaturen in einer Plattform mit gemeinsamem Ersatzteillager. Ein Funktionsvergleich mit bestehenden Werkstattlösungen war nicht Gegenstand der Fallstudie; das Alleinstellungsmerkmal begründen wir in Abschnitt 2.5.</w:t>
       </w:r>
     </w:p>
     <w:p>
@@ -1853,8 +1579,6 @@
       </w:pPr>
       <w:r>
         <w:t xml:space="preserve">Abbildung 1 stellt den Systemkontext und die Systemgrenze dar. Innerhalb der Systemgrenze liegt die RepairFlow-Plattform. Der Werkstattbetrieb ist als Mandant angebunden, seine Rollen Service / Annahme, Techniker, Werkstattleitung und Ersatzteil-Disposition arbeiten in der Oberfläche der Plattform. Der Kunde nutzt das Kundenportal. Mit dem Lieferanten tauscht RepairFlow Bestellungen, </w:t>
-      </w:r>
-      <w:r>
         <w:lastRenderedPageBreak/>
         <w:t>Bestätigungen, Lieferungen und Retouren aus. Der KI-Diagnosedienst ist ein externer Dienst, den die Plattform zur Auswertung von Foto, Video und Ton aufruft. Außerhalb der Systemgrenze liegen die physische Reparatur, die Systeme der Lieferanten und die Buchhaltung, an die nur über eine Exportschnittstelle übergeben wird.</w:t>
       </w:r>
@@ -1982,8 +1706,6 @@
       </w:pPr>
       <w:r>
         <w:t xml:space="preserve">Ein Teil davon ist heute machbar, etwa das Erkennen sichtbarer Schäden wie eines gebrochenen Displays per Bildanalyse. Die Auswertung von Motorgeräuschen und die Schätzung von Arbeitszeiten </w:t>
-      </w:r>
-      <w:r>
         <w:lastRenderedPageBreak/>
         <w:t>aus einem Video sind Vision. Deshalb bleibt der Vorschlag im Modell unverbindlich: Der KVA hat den Status „vorläufig“, und bei nicht auswertbaren Medien fragt das System nach einer besseren Aufnahme. In den Modellen erscheint das Merkmal als Prozess 01, als Use Cases „Sofortdiagnose anfordern“, „Voranmeldung bestätigen“ und „Diagnosevorschlag prüfen“, als Klassen Voranmeldung, Medienanhang und KIDiagnosevorschlag sowie als Sequenzdiagramm SD1.</w:t>
       </w:r>
@@ -1994,13 +1716,7 @@
         <w:keepNext/>
       </w:pPr>
       <w:r>
-        <w:t>2.</w:t>
-      </w:r>
-      <w:r>
-        <w:t>6</w:t>
-      </w:r>
-      <w:r>
-        <w:t xml:space="preserve"> Ausblick</w:t>
+        <w:t xml:space="preserve">2.6 Ausblick</w:t>
       </w:r>
     </w:p>
     <w:p>
@@ -2735,13 +2451,7 @@
         <w:spacing w:after="60" w:line="264" w:lineRule="auto"/>
       </w:pPr>
       <w:r>
-        <w:t xml:space="preserve">Die Beteiligten erscheinen in BPMN als Pool (Kunde) oder Lane (Service / Annahme, Techniker, Ersatzteil-Disposition, Werkstattleitung), </w:t>
-      </w:r>
-      <w:r>
-        <w:t>jeder direkt ausgelöste Use Case hat genau eine Rolle als Hauptakteur (Tabelle 7)</w:t>
-      </w:r>
-      <w:r>
-        <w:t>, in den Sequenzdiagrammen als Akteure mit demselben Rollennamen und im Klassendiagramm als Unterklassen von Mitarbeiter. Welche Rolle zu welcher Klasse und Lane gehört, legt Tabelle 7 fest.</w:t>
+        <w:t xml:space="preserve">Die Beteiligten erscheinen in BPMN als Pool (Kunde) oder Lane (Service / Annahme, Techniker, Ersatzteil-Disposition, Werkstattleitung), jeder direkt ausgelöste Use Case hat genau eine Rolle als Hauptakteur (Tabelle 7), in den Sequenzdiagrammen als Akteure mit demselben Rollennamen und im Klassendiagramm als Unterklassen von Mitarbeiter. Welche Rolle zu welcher Klasse und Lane gehört, legt Tabelle 7 fest.</w:t>
       </w:r>
     </w:p>
     <w:p>
@@ -2818,13 +2528,7 @@
         <w:jc w:val="both"/>
       </w:pPr>
       <w:r>
-        <w:t>Den Takt geben die vier Gruppentermine in Präsenz vor (jeweils 4:15 Stunden). Jeder Termin verbindet Review und Retrospektive des vergangenen Sprints mit dem Planning des nächsten, und Hinweise aus dem Coaching fließen direkt in die Planung ein.</w:t>
-      </w:r>
-      <w:r>
-        <w:t xml:space="preserve"> Tabelle 3 zeigt den Verlauf der vier Sprints.</w:t>
-      </w:r>
-      <w:r>
-        <w:t xml:space="preserve"> Zwischen den Terminen arbeiten wir asynchron. Abgestimmt wird in einer WhatsApp-Gruppe, Dateien teilen wir nur über das GitHub-Repository.</w:t>
+        <w:t xml:space="preserve">Den Takt geben die vier Gruppentermine in Präsenz vor (jeweils 4:15 Stunden). Jeder Termin verbindet Review und Retrospektive des vergangenen Sprints mit dem Planning des nächsten, und Hinweise aus dem Coaching fließen direkt in die Planung ein. Tabelle 3 zeigt den Verlauf der vier Sprints. Zwischen den Terminen arbeiten wir asynchron. Abgestimmt wird in einer WhatsApp-Gruppe, Dateien teilen wir nur über das GitHub-Repository.</w:t>
       </w:r>
     </w:p>
     <w:p>
@@ -3502,23 +3206,7 @@
                 <w:sz w:val="19"/>
                 <w:szCs w:val="19"/>
               </w:rPr>
-              <w:t>Präsentation am 27.10.2026, Abgabe bis 13.11.2026 über Moodle.</w:t>
-            </w:r>
-            <w:r>
-              <w:rPr>
-                <w:color w:val="000000"/>
-                <w:sz w:val="19"/>
-                <w:szCs w:val="19"/>
-              </w:rPr>
-              <w:t xml:space="preserve"> Weitere Anpassungen in VP</w:t>
-            </w:r>
-            <w:r>
-              <w:rPr>
-                <w:color w:val="000000"/>
-                <w:sz w:val="19"/>
-                <w:szCs w:val="19"/>
-              </w:rPr>
-              <w:t xml:space="preserve"> und Dokumentation.</w:t>
+              <w:t xml:space="preserve">Präsentation am 27.10.2026, Abgabe bis 13.11.2026 über Moodle. Weitere Anpassungen in VP und Dokumentation.</w:t>
             </w:r>
           </w:p>
         </w:tc>
@@ -6483,8 +6171,6 @@
       </w:r>
       <w:r>
         <w:t xml:space="preserve">Aus Foto, Video oder Ton des Kunden entstehen Voranmeldung, KI-Diagnosevorschlag, vorläufiger KVA und Terminvorschlag. Nicht auswertbare </w:t>
-      </w:r>
-      <w:r>
         <w:lastRenderedPageBreak/>
         <w:t>Medien fordert das System neu an. Bestätigt der Kunde, werden die Teile vorreserviert; ist ein Teil nirgends verfügbar, erhält die Voranmeldung einen Hinweis auf Nachbestellung. Lehnt der Kunde ab oder bleibt eine Antwort sieben Tage aus, wird die Voranmeldung verworfen, bei Fristablauf mit Hinweis an den Kunden.</w:t>
       </w:r>
@@ -6546,7 +6232,7 @@
         <w:t xml:space="preserve">04 Kostenvoranschlag und Kundenfreigabe. </w:t>
       </w:r>
       <w:r>
-        <w:t>Der KVA wird berechnet, geprüft und versendet. Bleibt die Antwort drei Tage aus, wird er mit Erinnerung erneut gesendet. Nach dem dritten Fristablauf ohne Antwort gilt er als abgelehnt. Ist die Frist abgelaufen oder sind nach der Freigabe nicht alle Teile beschaffbar, erhält der Kunde eine Reparaturabsage, und der KVA verfällt auch in seinem Ablauf.</w:t>
+        <w:t>Der KVA wird berechnet, geprüft und versendet. Bleibt die Antwort drei Tage aus, wird er mit Erinnerung erneut gesendet. Nach dem dritten Fristablauf ohne Antwort gilt er als abgelehnt. Dann erhält der Kunde eine Reparaturabsage, und der KVA verfällt auch in seinem Ablauf. Nach einer Freigabe wartet der Kunde auf den Reparaturbeginn; sind nicht alle Teile beschaffbar, erhält er stattdessen eine Reparaturabsage.</w:t>
       </w:r>
     </w:p>
     <w:p>
@@ -6646,7 +6332,7 @@
         <w:t xml:space="preserve">09 Reklamation und Gewährleistung. </w:t>
       </w:r>
       <w:r>
-        <w:t>Der Mangel wird geprüft und die Gewährleistung bewertet. Kostenfreie Nacharbeit gibt die Werkstattleitung frei, sonst entscheidet der Kunde über ein Angebot. Lehnt er ab, antwortet er nicht oder ist ein Teil nicht beschaffbar, erhält er eine Absage.</w:t>
+        <w:t>Der Mangel wird geprüft und die Gewährleistung bewertet. Kostenfreie Nacharbeit gibt die Werkstattleitung frei, sonst entscheidet der Kunde über ein Angebot. Lehnt er ab, antwortet er nicht oder ist ein Teil nicht beschaffbar, erhält er eine Absage. Ist ein Lieferantenteil defekt, wird es nach der Abholung über Prozess 10 retourniert, der Kunde wartet nicht darauf.</w:t>
       </w:r>
     </w:p>
     <w:p>
@@ -6666,7 +6352,7 @@
         <w:t xml:space="preserve">10 Ersatzteil-Retoure. </w:t>
       </w:r>
       <w:r>
-        <w:t>Defekte Lieferantenteile werden angemeldet und zurückgesendet. Danach folgt eine Gutschrift oder eine Ersatzlieferung, die Prozess 06 prüft und bucht. Ohne Antwort nach der Eskalation wird das Teil abgeschrieben.</w:t>
+        <w:t>Defekte Lieferantenteile werden angemeldet und zurückgesendet. Danach folgt eine Gutschrift oder eine Ersatzlieferung. Kommt das Teil aus dem Wareneingang (Prozess 06), prüft und bucht Prozess 06 die Ersatzlieferung; kommt es aus einer Reklamation (Prozess 09), war es bereits verbaut, und die Ersatzlieferung geht als normaler Wareneingang ins Lager. Ohne Antwort nach der Eskalation wird das Teil abgeschrieben.</w:t>
       </w:r>
     </w:p>
     <w:p>
@@ -6747,7 +6433,7 @@
         </w:rPr>
         <w:drawing>
           <wp:inline distT="0" distB="0" distL="0" distR="0" wp14:anchorId="2C7C0B39" wp14:editId="16659AC5">
-            <wp:extent cx="5782310" cy="2222367"/>
+            <wp:extent cx="5782310" cy="2223289"/>
             <wp:effectExtent l="0" t="0" r="0" b="5080"/>
             <wp:docPr id="1426216721" name="Grafik 3"/>
             <wp:cNvGraphicFramePr>
@@ -6775,7 +6461,7 @@
                   <pic:spPr>
                     <a:xfrm>
                       <a:off x="0" y="0"/>
-                      <a:ext cx="5782310" cy="2222367"/>
+                      <a:ext cx="5782310" cy="2223289"/>
                     </a:xfrm>
                     <a:prstGeom prst="rect">
                       <a:avLst/>
@@ -6893,15 +6579,7 @@
         <w:jc w:val="both"/>
       </w:pPr>
       <w:r>
-        <w:t xml:space="preserve">Manuell bleiben bewusst die neun Arbeiten am Gerät und an der Ware: Sichtprüfung, Kennzeichnen und Einlagern sowie der Transport zu einer anderen Filiale bei der Annahme, die Reparatur und Nacharbeit selbst, die Mangelprüfung bei einer Reklamation, das Holen aus dem Lager und die Übergabe an den Kunden sowie das Verpacken und Versenden einer Retoure. Sie liegen nach Abschnitt 2.3 außerhalb der Systemgrenze; </w:t>
-      </w:r>
-      <w:proofErr w:type="spellStart"/>
-      <w:r>
-        <w:t>RepairFlow</w:t>
-      </w:r>
-      <w:proofErr w:type="spellEnd"/>
-      <w:r>
-        <w:t xml:space="preserve"> erfasst nur ihr Ergebnis, zum Beispiel den Reparaturschritt mit Arbeitszeit.</w:t>
+        <w:t xml:space="preserve">Manuell bleiben bewusst die neun Arbeiten am Gerät und an der Ware: Sichtprüfung, Kennzeichnen und Einlagern sowie der Transport zu einer anderen Filiale bei der Annahme, die Reparatur und Nacharbeit selbst, die Mangelprüfung bei einer Reklamation, das Holen aus dem Lager und die Übergabe an den Kunden sowie das Verpacken und Versenden einer Retoure. Sie liegen nach Abschnitt 2.3 außerhalb der Systemgrenze; RepairFlow erfasst nur ihr Ergebnis, zum Beispiel den Reparaturschritt mit Arbeitszeit.</w:t>
       </w:r>
     </w:p>
     <w:p>
@@ -8944,28 +8622,7 @@
           <w:sz w:val="18"/>
           <w:szCs w:val="18"/>
         </w:rPr>
-        <w:t xml:space="preserve">Abbildung 4: Use-Case-Diagramm </w:t>
-      </w:r>
-      <w:proofErr w:type="spellStart"/>
-      <w:r>
-        <w:rPr>
-          <w:i/>
-          <w:iCs/>
-          <w:color w:val="595959"/>
-          <w:sz w:val="18"/>
-          <w:szCs w:val="18"/>
-        </w:rPr>
-        <w:t>RepairFlow</w:t>
-      </w:r>
-      <w:proofErr w:type="spellEnd"/>
-      <w:r>
-        <w:rPr>
-          <w:i/>
-          <w:iCs/>
-          <w:color w:val="595959"/>
-          <w:sz w:val="18"/>
-          <w:szCs w:val="18"/>
-        </w:rPr>
+        <w:t xml:space="preserve">Abbildung 4: Use-Case-Diagramm RepairFlow</w:t>
         <w:br/>
       </w:r>
     </w:p>
@@ -8991,19 +8648,7 @@
         <w:jc w:val="both"/>
       </w:pPr>
       <w:r>
-        <w:t>Das Klassendiagramm (Abbildung 5) umfasst 2</w:t>
-      </w:r>
-      <w:r>
-        <w:t>9</w:t>
-      </w:r>
-      <w:r>
-        <w:t xml:space="preserve"> Klassen, darunter die abstrakten Klassen Person und Mitarbeiter, sowie sieben Aufzählungen und </w:t>
-      </w:r>
-      <w:r>
-        <w:t>40</w:t>
-      </w:r>
-      <w:r>
-        <w:t xml:space="preserve"> Assoziationen. Wichtige Entwurfsentscheidungen sind:</w:t>
+        <w:t xml:space="preserve">Das Klassendiagramm (Abbildung 5) umfasst 29 Klassen, darunter die abstrakten Klassen Person und Mitarbeiter, sowie sieben Aufzählungen und 40 Assoziationen. Wichtige Entwurfsentscheidungen sind:</w:t>
       </w:r>
     </w:p>
     <w:p>
@@ -9103,74 +8748,7 @@
         <w:t xml:space="preserve">Oberflächen als Klassen. </w:t>
       </w:r>
       <w:r>
-        <w:t>Zwischen den Benutzern und den Fachobjekten stehen zwei</w:t>
-      </w:r>
-      <w:r>
-        <w:t xml:space="preserve"> Oberflächenklassen: Der Kunde arbeitet in der </w:t>
-      </w:r>
-      <w:proofErr w:type="spellStart"/>
-      <w:r>
-        <w:t>KundenApp</w:t>
-      </w:r>
-      <w:proofErr w:type="spellEnd"/>
-      <w:r>
-        <w:t>, die Mitarbeiter in der Werkstattoberfl</w:t>
-      </w:r>
-      <w:r>
-        <w:t>ä</w:t>
-      </w:r>
-      <w:r>
-        <w:t xml:space="preserve">che. Ihre Methoden entsprechen den Aktionen der Benutzer, zum Beispiel </w:t>
-      </w:r>
-      <w:proofErr w:type="spellStart"/>
-      <w:proofErr w:type="gramStart"/>
-      <w:r>
-        <w:t>gibKvaFrei</w:t>
-      </w:r>
-      <w:proofErr w:type="spellEnd"/>
-      <w:r>
-        <w:t>(</w:t>
-      </w:r>
-      <w:proofErr w:type="gramEnd"/>
-      <w:r>
-        <w:t xml:space="preserve">) oder </w:t>
-      </w:r>
-      <w:proofErr w:type="spellStart"/>
-      <w:proofErr w:type="gramStart"/>
-      <w:r>
-        <w:t>meldeFertig</w:t>
-      </w:r>
-      <w:proofErr w:type="spellEnd"/>
-      <w:r>
-        <w:t>(</w:t>
-      </w:r>
-      <w:proofErr w:type="gramEnd"/>
-      <w:r>
-        <w:t>). Ein Benutzer gibt dabei keine Objekte ein, sondern Merkmale wie die Auftragsnummer. Die Oberfläche sucht das Objekt über den Werkstattbetrieb, der als Mandant alle Aufträge und Reklamationen seiner Filialen kennt (</w:t>
-      </w:r>
-      <w:proofErr w:type="spellStart"/>
-      <w:proofErr w:type="gramStart"/>
-      <w:r>
-        <w:t>sucheAuftrag</w:t>
-      </w:r>
-      <w:proofErr w:type="spellEnd"/>
-      <w:r>
-        <w:t>(</w:t>
-      </w:r>
-      <w:proofErr w:type="gramEnd"/>
-      <w:r>
-        <w:t xml:space="preserve">)), und arbeitet mit dem zurückgegebenen Objekt weiter. Der Kunde findet über </w:t>
-      </w:r>
-      <w:proofErr w:type="spellStart"/>
-      <w:r>
-        <w:t>sucheAuftrag</w:t>
-      </w:r>
-      <w:proofErr w:type="spellEnd"/>
-      <w:r>
-        <w:t>() nur seine eigenen Auftr</w:t>
-      </w:r>
-      <w:r>
-        <w:t>äge.</w:t>
+        <w:t xml:space="preserve">Zwischen den Benutzern und den Fachobjekten stehen zwei Oberflächenklassen: Der Kunde arbeitet in der KundenApp, die Mitarbeiter in der Werkstattoberfläche. Ihre Methoden entsprechen den Aktionen der Benutzer, zum Beispiel gibKvaFrei() oder meldeFertig(). Ein Benutzer gibt dabei keine Objekte ein, sondern Merkmale wie die Auftragsnummer. Die Oberfläche sucht das Objekt über den Werkstattbetrieb, der als Mandant alle Aufträge und Reklamationen seiner Filialen kennt (sucheAuftrag()), und arbeitet mit dem zurückgegebenen Objekt weiter. Der Kunde findet über sucheAuftrag() nur seine eigenen Aufträge.</w:t>
       </w:r>
     </w:p>
     <w:p>
@@ -9214,7 +8792,7 @@
         <w:lastRenderedPageBreak/>
         <w:drawing>
           <wp:inline distT="0" distB="0" distL="0" distR="0" wp14:anchorId="128BF440" wp14:editId="79A6FDDA">
-            <wp:extent cx="7578721" cy="5749374"/>
+            <wp:extent cx="7578721" cy="5750609"/>
             <wp:effectExtent l="0" t="0" r="3810" b="3810"/>
             <wp:docPr id="1600717457" name="Grafik 4"/>
             <wp:cNvGraphicFramePr>
@@ -9242,7 +8820,7 @@
                   <pic:spPr>
                     <a:xfrm>
                       <a:off x="0" y="0"/>
-                      <a:ext cx="7587707" cy="5749374"/>
+                      <a:ext cx="7587707" cy="5750609"/>
                     </a:xfrm>
                     <a:prstGeom prst="rect">
                       <a:avLst/>
@@ -9295,64 +8873,7 @@
         <w:jc w:val="both"/>
       </w:pPr>
       <w:r>
-        <w:t xml:space="preserve">Für sechs Use Cases haben wir Sequenzdiagramme erstellt, gefordert waren fünf (Tabelle 8). Jedes folgt einem Prozess. Die erste Lebenslinie ist die Rolle des Use Case aus Abbildung 4; weitere beteiligte Rollen tragen ihren Namen aus dem Use-Case-Diagramm; der Werkstattleiter, für dessen Freigaben es im Use-Case-Diagramm keine eigene Rolle gibt, erscheint als Objekt seiner Klasse (:Werkstattleiter) mit seinen Operationen. </w:t>
-      </w:r>
-      <w:r>
-        <w:t xml:space="preserve">Die Rolle spricht nie direkt mit dem Fachobjekt, sondern immer mit der Oberfläche </w:t>
-      </w:r>
-      <w:proofErr w:type="gramStart"/>
-      <w:r>
-        <w:t>(:</w:t>
-      </w:r>
-      <w:proofErr w:type="spellStart"/>
-      <w:r>
-        <w:t>KundenApp</w:t>
-      </w:r>
-      <w:proofErr w:type="spellEnd"/>
-      <w:proofErr w:type="gramEnd"/>
-      <w:r>
-        <w:t xml:space="preserve"> </w:t>
-      </w:r>
-      <w:proofErr w:type="gramStart"/>
-      <w:r>
-        <w:t>oder :</w:t>
-      </w:r>
-      <w:proofErr w:type="spellStart"/>
-      <w:r>
-        <w:t>Werkstattoberfl</w:t>
-      </w:r>
-      <w:r>
-        <w:t>ae</w:t>
-      </w:r>
-      <w:r>
-        <w:t>che</w:t>
-      </w:r>
-      <w:proofErr w:type="spellEnd"/>
-      <w:proofErr w:type="gramEnd"/>
-      <w:r>
-        <w:t>). Die Oberfläche öffnet das benötigte Objekt über seine Nummer, ruft dessen Operationen auf und zeigt das Ergebnis an (</w:t>
-      </w:r>
-      <w:proofErr w:type="spellStart"/>
-      <w:proofErr w:type="gramStart"/>
-      <w:r>
-        <w:t>anzeigenErgebnis</w:t>
-      </w:r>
-      <w:proofErr w:type="spellEnd"/>
-      <w:r>
-        <w:t>(</w:t>
-      </w:r>
-      <w:proofErr w:type="gramEnd"/>
-      <w:r>
-        <w:t>))</w:t>
-      </w:r>
-      <w:r>
-        <w:t xml:space="preserve">. Wo zwischen </w:t>
-      </w:r>
-      <w:r>
-        <w:t xml:space="preserve">zwei Schritten Zeit vergeht, etwa nach einer Nacharbeit, wird das Objekt neu gesucht. </w:t>
-      </w:r>
-      <w:r>
-        <w:t>Der Lieferant liegt außerhalb des Systems, Nachrichten an ihn sind in SD6 Lost bzw. Found Messages. Die übrigen Lebenslinien sind Objekte der Klassen, Botschaften an Objekte sind Operationen des Klassendiagramms. Kombinierte Fragmente bilden Verzweigungen (alt, opt), Schleifen (loop), Abbrüche (break) und Verweise auf andere Use Cases (ref) ab.</w:t>
+        <w:t xml:space="preserve">Für sechs Use Cases haben wir Sequenzdiagramme erstellt, gefordert waren fünf (Tabelle 8). Jedes folgt einem Prozess. Die erste Lebenslinie ist die Rolle des Use Case aus Abbildung 4; weitere beteiligte Rollen tragen ihren Namen aus dem Use-Case-Diagramm; der Werkstattleiter, für dessen Freigaben es im Use-Case-Diagramm keine eigene Rolle gibt, erscheint als Objekt seiner Klasse (:Werkstattleiter) mit seinen Operationen. Die Rolle spricht nie direkt mit dem Fachobjekt, sondern immer mit der Oberfläche (:KundenApp oder :Werkstattoberflaeche). Die Oberfläche öffnet das benötigte Objekt über seine Nummer, ruft dessen Operationen auf und zeigt das Ergebnis an (anzeigenErgebnis()). Wo zwischen zwei Schritten Zeit vergeht, etwa nach einer Nacharbeit, wird das Objekt neu gesucht. Der Lieferant liegt außerhalb des Systems, Nachrichten an ihn sind in SD6 Lost bzw. Found Messages. Die übrigen Lebenslinien sind Objekte der Klassen, Botschaften an Objekte sind Operationen des Klassendiagramms. Kombinierte Fragmente bilden Verzweigungen (alt, opt), Schleifen (loop) und Verweise auf andere Use Cases (ref) ab.</w:t>
       </w:r>
     </w:p>
     <w:tbl>
@@ -9596,23 +9117,7 @@
                 <w:sz w:val="19"/>
                 <w:szCs w:val="19"/>
               </w:rPr>
-              <w:t>Medienprüfung mit Nachreichen, KI-Vorschlag, vorläufiger KVA, Vorreservierung erst nach Bestätigung</w:t>
-            </w:r>
-            <w:r>
-              <w:rPr>
-                <w:color w:val="000000"/>
-                <w:sz w:val="19"/>
-                <w:szCs w:val="19"/>
-              </w:rPr>
-              <w:t xml:space="preserve">. </w:t>
-            </w:r>
-            <w:r>
-              <w:rPr>
-                <w:color w:val="000000"/>
-                <w:sz w:val="19"/>
-                <w:szCs w:val="19"/>
-              </w:rPr>
-              <w:t>Bei Ablehnung oder nach sieben Tagen ohne Antwort wird die Voranmeldung verworfen</w:t>
+              <w:t xml:space="preserve">Medienprüfung mit Nachreichen; ohne neue Aufnahme nach sieben Tagen wird die Voranmeldung verworfen, sonst KI-Vorschlag, vorläufiger KVA, Vorreservierung erst nach Bestätigung. Bei Ablehnung oder nach sieben Tagen ohne Antwort wird die Voranmeldung verworfen</w:t>
             </w:r>
           </w:p>
         </w:tc>
@@ -10032,7 +9537,7 @@
                 <w:sz w:val="19"/>
                 <w:szCs w:val="19"/>
               </w:rPr>
-              <w:t>Mangelprüfung, Gewährleistung, Nacharbeitsauftrag nur nach Freigabe oder Annahme; Ablehnung durch den Kunden über die KundenApp, bei Fristablauf oder fehlenden Teilen über die Werkstattoberfläche</w:t>
+              <w:t>Mangelprüfung und Gewährleistung; sonst Angebot an den Kunden mit Annahme, Ablehnung oder drei Tagen ohne Antwort. Vor der Nacharbeit Disposition (ref UC09), bei nicht beschaffbaren Teilen Absage über die Werkstattoberfläche</w:t>
             </w:r>
           </w:p>
         </w:tc>
@@ -10137,7 +9642,7 @@
                 <w:sz w:val="19"/>
                 <w:szCs w:val="19"/>
               </w:rPr>
-              <w:t>Bündelung, Freigabe durch den Werkstattleiter ab Freigabegrenze, Bestellung; Bestätigung, Mahnung und Storno nach zwei Mahnungen laufen automatisch wie in Prozess 06; Nachrichten an den Lieferanten als Lost Messages</w:t>
+              <w:t>Bündelung, Freigabe durch den Werkstattleiter ab Freigabegrenze, Bestellung; ohne Bestätigung innerhalb von drei Tagen oder nach zwei erfolglosen Mahnungen Storno, sonst Wareneingang; Nachrichten an den Lieferanten als Lost Messages, die Auftragsbestätigung als Found Message</w:t>
             </w:r>
           </w:p>
         </w:tc>
@@ -10181,7 +9686,7 @@
         <w:lastRenderedPageBreak/>
         <w:drawing>
           <wp:inline distT="0" distB="0" distL="0" distR="0" wp14:anchorId="307C6272" wp14:editId="33E880EE">
-            <wp:extent cx="5782310" cy="4187190"/>
+            <wp:extent cx="5782310" cy="4071513"/>
             <wp:effectExtent l="0" t="0" r="0" b="0"/>
             <wp:docPr id="248347308" name="Grafik 5"/>
             <wp:cNvGraphicFramePr>
@@ -10209,7 +9714,7 @@
                   <pic:spPr>
                     <a:xfrm>
                       <a:off x="0" y="0"/>
-                      <a:ext cx="5782310" cy="4187190"/>
+                      <a:ext cx="5782310" cy="4071513"/>
                     </a:xfrm>
                     <a:prstGeom prst="rect">
                       <a:avLst/>
@@ -10250,7 +9755,7 @@
         </w:rPr>
         <w:drawing>
           <wp:inline distT="0" distB="0" distL="0" distR="0" wp14:anchorId="05AB1227" wp14:editId="6271697B">
-            <wp:extent cx="5782310" cy="3683052"/>
+            <wp:extent cx="5782310" cy="3682770"/>
             <wp:effectExtent l="0" t="0" r="0" b="0"/>
             <wp:docPr id="5075578" name="Grafik 6"/>
             <wp:cNvGraphicFramePr>
@@ -10278,7 +9783,7 @@
                   <pic:spPr>
                     <a:xfrm>
                       <a:off x="0" y="0"/>
-                      <a:ext cx="5782310" cy="3683052"/>
+                      <a:ext cx="5782310" cy="3682770"/>
                     </a:xfrm>
                     <a:prstGeom prst="rect">
                       <a:avLst/>
@@ -10323,13 +9828,7 @@
         <w:jc w:val="both"/>
       </w:pPr>
       <w:r>
-        <w:t>Tabelle 9 ordnet jedem Prozess seine Use Cases, zentralen Klassen und Sequenzdiagramme zu. BPMN-Datenobjekte tragen die Klassennamen, jede Rolle des Use-Case-Diagramms gehört zu genau einer Lane und einer Mitarbeiterklasse</w:t>
-      </w:r>
-      <w:r>
-        <w:t>; Ausnahmen zeigt Tabelle 7</w:t>
-      </w:r>
-      <w:r>
-        <w:t>, und die Zustände des Reparaturauftrags folgen in allen Modellen AuftragStatus.</w:t>
+        <w:t>Tabelle 9 ordnet jedem Prozess seine Use Cases, zentralen Klassen und Sequenzdiagramme zu. BPMN-Datenobjekte tragen die Klassennamen, jede Rolle des Use-Case-Diagramms gehört zu genau einer Lane und einer Mitarbeiterklasse; Ausnahmen zeigt Tabelle 7, und die Zustände des Reparaturauftrags folgen in allen Modellen AuftragStatus.</w:t>
       </w:r>
     </w:p>
     <w:tbl>
@@ -11605,13 +11104,7 @@
         <w:t xml:space="preserve">Lücken zwischen den Prozessen. </w:t>
       </w:r>
       <w:r>
-        <w:t xml:space="preserve">Eine </w:t>
-      </w:r>
-      <w:r>
-        <w:t>Kontrolle</w:t>
-      </w:r>
-      <w:r>
-        <w:t xml:space="preserve"> am 05.10.2026 zeigte, dass abgelehnte Aufträge nie abgeholt wurden und Warteschleifen keinen Ausstieg hatten. Seitdem läuft jede Rückgabe über Prozess 08, und jede Warteschleife hat einen Ausstieg.</w:t>
+        <w:t xml:space="preserve">Eine Kontrolle am 05.10.2026 zeigte, dass abgelehnte Aufträge nie abgeholt wurden und Warteschleifen keinen Ausstieg hatten. Seitdem läuft jede Rückgabe über Prozess 08, und jede Warteschleife hat einen Ausstieg.</w:t>
       </w:r>
     </w:p>
     <w:p>
@@ -11644,13 +11137,7 @@
         <w:t xml:space="preserve">Werkzeuge. </w:t>
       </w:r>
       <w:r>
-        <w:t xml:space="preserve">Visual Paradigm war unser größtes Werkzeugproblem. Vier von sechs Gruppenmitgliedern arbeiten mit Firmen-Laptops, auf denen keine zusätzlichen Programme installiert werden dürfen; </w:t>
-      </w:r>
-      <w:r>
-        <w:t>wir</w:t>
-      </w:r>
-      <w:r>
-        <w:t xml:space="preserve"> konnten Visual Paradigm nicht nutzen. Die gesamte UML-Arbeit lag damit bei zwei Personen, die übrigen haben die Diagramme anhand der Exporte geprüft. Dazu kommt, dass der Teamwork-Server der DHBW nur über das Lehre-VPN erreichbar ist.</w:t>
+        <w:t xml:space="preserve">Visual Paradigm war unser größtes Werkzeugproblem. Vier von sechs Gruppenmitgliedern arbeiten mit Firmen-Laptops, auf denen keine zusätzlichen Programme installiert werden dürfen; wir konnten Visual Paradigm nicht nutzen. Die gesamte UML-Arbeit lag damit bei zwei Personen, die übrigen haben die Diagramme anhand der Exporte geprüft. Dazu kommt, dass der Teamwork-Server der DHBW nur über das Lehre-VPN erreichbar ist.</w:t>
       </w:r>
     </w:p>
     <w:p>
@@ -11698,19 +11185,7 @@
         <w:t xml:space="preserve">Zusammenarbeit. </w:t>
       </w:r>
       <w:r>
-        <w:t xml:space="preserve">Am 05.10.2026 legten zwei Pull Requests </w:t>
-      </w:r>
-      <w:r>
-        <w:t>in unserem privaten Repo</w:t>
-      </w:r>
-      <w:r>
-        <w:t>sitory</w:t>
-      </w:r>
-      <w:r>
-        <w:t xml:space="preserve"> </w:t>
-      </w:r>
-      <w:r>
-        <w:t>parallel eine Entscheidung mit derselben Nummer an. Die Konflikte wurden an zwei Stellen gleichzeitig gelöst. Seitdem holen wir vor jeder neuen Entscheidung den aktuellen Stand und nehmen die nächste freie Nummer.</w:t>
+        <w:t xml:space="preserve">Am 05.10.2026 legten zwei Pull Requests in unserem privaten Repository parallel eine Entscheidung mit derselben Nummer an. Die Konflikte wurden an zwei Stellen gleichzeitig gelöst. Seitdem holen wir vor jeder neuen Entscheidung den aktuellen Stand und nehmen die nächste freie Nummer.</w:t>
       </w:r>
     </w:p>
     <w:p>
@@ -11747,13 +11222,7 @@
         <w:jc w:val="both"/>
       </w:pPr>
       <w:r>
-        <w:t>Im Coaching am 15.10.2026 sah der Dozent das Use-Case-Diagramm als zu</w:t>
-      </w:r>
-      <w:r>
-        <w:t xml:space="preserve"> stark vernetzt</w:t>
-      </w:r>
-      <w:r>
-        <w:t xml:space="preserve"> an: Einzelne Akteure hingen an bis zu acht Use Cases. Sein Vorschlag war, je Use Case eine Rolle anzustreben, Akteure bei Bedarf mehrfach darzustellen und die Zuordnung der Rollen zu Personen einem Organigramm zu überlassen. Wir haben das Diagramm auf 15 Mitarbeiterrollen umgebaut und die Rollen in Tabelle 7 den Klassen und Lanes zugeordnet (Abschnitt 5.3).</w:t>
+        <w:t xml:space="preserve">Im Coaching am 15.10.2026 sah der Dozent das Use-Case-Diagramm als zu stark vernetzt an: Einzelne Akteure hingen an bis zu acht Use Cases. Sein Vorschlag war, je Use Case eine Rolle anzustreben, Akteure bei Bedarf mehrfach darzustellen und die Zuordnung der Rollen zu Personen einem Organigramm zu überlassen. Wir haben das Diagramm auf 15 Mitarbeiterrollen umgebaut und die Rollen in Tabelle 7 den Klassen und Lanes zugeordnet (Abschnitt 5.3).</w:t>
       </w:r>
     </w:p>
     <w:p>

</xml_diff>

<commit_message>
docs: Inhaltsverzeichnis der Doku an die Seitenzahlen in Word angepasst
</commit_message>
<xml_diff>
--- a/3_doku/Projektdokumentation.docx
+++ b/3_doku/Projektdokumentation.docx
@@ -443,7 +443,7 @@
         </w:rPr>
         <w:t>4.2 Sprintplan und Verlauf</w:t>
         <w:tab/>
-        <w:t>6</w:t>
+        <w:t>7</w:t>
       </w:r>
     </w:p>
     <w:p>
@@ -496,7 +496,7 @@
         </w:rPr>
         <w:t>5 Überblick über die erstellten Artefakte</w:t>
         <w:tab/>
-        <w:t>7</w:t>
+        <w:t>8</w:t>
       </w:r>
     </w:p>
     <w:p>
@@ -514,7 +514,7 @@
         </w:rPr>
         <w:t>5.1 Geschäftsprozessmodell (BPMN)</w:t>
         <w:tab/>
-        <w:t>7</w:t>
+        <w:t>8</w:t>
       </w:r>
     </w:p>
     <w:p>
@@ -532,7 +532,7 @@
         </w:rPr>
         <w:t>5.2 Automatisierungspotential</w:t>
         <w:tab/>
-        <w:t>10</w:t>
+        <w:t>11</w:t>
       </w:r>
     </w:p>
     <w:p>
@@ -550,7 +550,7 @@
         </w:rPr>
         <w:t>5.3 Use-Case-Diagramm</w:t>
         <w:tab/>
-        <w:t>10</w:t>
+        <w:t>12</w:t>
       </w:r>
     </w:p>
     <w:p>
@@ -568,7 +568,7 @@
         </w:rPr>
         <w:t>5.4 Klassendiagramm</w:t>
         <w:tab/>
-        <w:t>13</w:t>
+        <w:t>15</w:t>
       </w:r>
     </w:p>
     <w:p>
@@ -586,7 +586,7 @@
         </w:rPr>
         <w:t>5.5 Sequenzdiagramme</w:t>
         <w:tab/>
-        <w:t>15</w:t>
+        <w:t>17</w:t>
       </w:r>
     </w:p>
     <w:p>
@@ -604,7 +604,7 @@
         </w:rPr>
         <w:t>5.6 Konsistenz zwischen den Modellen</w:t>
         <w:tab/>
-        <w:t>17</w:t>
+        <w:t>18</w:t>
       </w:r>
     </w:p>
     <w:p>
@@ -621,7 +621,7 @@
         </w:rPr>
         <w:t>6 Probleme und Herausforderungen</w:t>
         <w:tab/>
-        <w:t>17</w:t>
+        <w:t>19</w:t>
       </w:r>
     </w:p>
     <w:p>
@@ -638,7 +638,7 @@
         </w:rPr>
         <w:t>7 Feedback</w:t>
         <w:tab/>
-        <w:t>18</w:t>
+        <w:t>20</w:t>
       </w:r>
     </w:p>
     <w:p>
@@ -656,7 +656,7 @@
         </w:rPr>
         <w:t>7.1 Feedback des Dozenten und Umsetzung</w:t>
         <w:tab/>
-        <w:t>18</w:t>
+        <w:t>20</w:t>
       </w:r>
     </w:p>
     <w:p>
@@ -674,7 +674,7 @@
         </w:rPr>
         <w:t>7.2 Unser Feedback zur Fallstudie</w:t>
         <w:tab/>
-        <w:t>19</w:t>
+        <w:t>21</w:t>
       </w:r>
     </w:p>
     <w:p>

</xml_diff>

<commit_message>
fix: Nachpruefung 28.10. (P04 Randereignis statt Ereignis-Teilprozess, SD5 ohne Abruf im Zweig angenommen, SD6 Bedingung bestaetigt und lieferbar, Doku/README/TODO)
</commit_message>
<xml_diff>
--- a/3_doku/Projektdokumentation.docx
+++ b/3_doku/Projektdokumentation.docx
@@ -4077,7 +4077,7 @@
         <w:jc w:val="both"/>
       </w:pPr>
       <w:r>
-        <w:t>Wir haben zehn Soll-Prozesse unseres Pilotkunden als Kollaborationsdiagramme modelliert (Tabelle 6). Zusammen enthalten sie 143 Aktivitäten im Werkstatt-Pool, im Schnitt 14,3 je Diagramm. Hinzu kommen 29 Aktivitäten in den Abläufen des Kunden, 49 Nachrichtenflüsse sowie 58 Datenobjekte und 14 Datenspeicher.</w:t>
+        <w:t>Wir haben zehn Soll-Prozesse unseres Pilotkunden als Kollaborationsdiagramme modelliert (Tabelle 6). Zusammen enthalten sie 143 Aktivitäten im Werkstatt-Pool, im Schnitt 14,3 je Diagramm. Hinzu kommen 28 Aktivitäten in den Abläufen des Kunden, 49 Nachrichtenflüsse sowie 58 Datenobjekte und 14 Datenspeicher.</w:t>
       </w:r>
     </w:p>
     <w:tbl>
@@ -9642,7 +9642,7 @@
                 <w:sz w:val="19"/>
                 <w:szCs w:val="19"/>
               </w:rPr>
-              <w:t>Bündelung, Freigabe durch den Werkstattleiter ab Freigabegrenze, Bestellung; ohne Bestätigung innerhalb von drei Tagen oder nach zwei erfolglosen Mahnungen Storno, sonst Wareneingang; Nachrichten an den Lieferanten als Lost Messages, die Auftragsbestätigung als Found Message</w:t>
+              <w:t>Bündelung, Freigabe durch den Werkstattleiter ab Freigabegrenze, Bestellung; ohne Bestätigung innerhalb von drei Tagen, bei nicht lieferbaren Teilen oder nach zwei erfolglosen Mahnungen Storno, sonst Wareneingang; Nachrichten an den Lieferanten als Lost Messages, die Auftragsbestätigung als Found Message</w:t>
             </w:r>
           </w:p>
         </w:tc>

</xml_diff>

<commit_message>
docs: Abb. 3 durch neuen P04-Export ersetzt (Randereignis statt Ereignis-Teilprozess)
</commit_message>
<xml_diff>
--- a/3_doku/Projektdokumentation.docx
+++ b/3_doku/Projektdokumentation.docx
@@ -307,10 +307,6 @@
         </w:tabs>
         <w:spacing w:after="40"/>
         <w:ind w:left="400"/>
-        <w:rPr>
-          <w:sz w:val="20"/>
-          <w:szCs w:val="20"/>
-        </w:rPr>
       </w:pPr>
       <w:r>
         <w:rPr>
@@ -328,24 +324,6 @@
           <w:tab w:val="right" w:leader="dot" w:pos="9026"/>
         </w:tabs>
         <w:spacing w:after="40"/>
-        <w:ind w:left="400"/>
-      </w:pPr>
-      <w:r>
-        <w:rPr>
-          <w:sz w:val="20"/>
-          <w:szCs w:val="20"/>
-        </w:rPr>
-        <w:t>2.6 Ausblick</w:t>
-        <w:tab/>
-        <w:t>5</w:t>
-      </w:r>
-    </w:p>
-    <w:p>
-      <w:pPr>
-        <w:tabs>
-          <w:tab w:val="right" w:leader="dot" w:pos="9026"/>
-        </w:tabs>
-        <w:spacing w:after="40"/>
       </w:pPr>
       <w:r>
         <w:rPr>
@@ -443,7 +421,7 @@
         </w:rPr>
         <w:t>4.2 Sprintplan und Verlauf</w:t>
         <w:tab/>
-        <w:t>7</w:t>
+        <w:t>6</w:t>
       </w:r>
     </w:p>
     <w:p>
@@ -496,7 +474,7 @@
         </w:rPr>
         <w:t>5 Überblick über die erstellten Artefakte</w:t>
         <w:tab/>
-        <w:t>8</w:t>
+        <w:t>7</w:t>
       </w:r>
     </w:p>
     <w:p>
@@ -514,7 +492,7 @@
         </w:rPr>
         <w:t>5.1 Geschäftsprozessmodell (BPMN)</w:t>
         <w:tab/>
-        <w:t>8</w:t>
+        <w:t>7</w:t>
       </w:r>
     </w:p>
     <w:p>
@@ -532,7 +510,7 @@
         </w:rPr>
         <w:t>5.2 Automatisierungspotential</w:t>
         <w:tab/>
-        <w:t>11</w:t>
+        <w:t>10</w:t>
       </w:r>
     </w:p>
     <w:p>
@@ -550,7 +528,7 @@
         </w:rPr>
         <w:t>5.3 Use-Case-Diagramm</w:t>
         <w:tab/>
-        <w:t>12</w:t>
+        <w:t>10</w:t>
       </w:r>
     </w:p>
     <w:p>
@@ -568,7 +546,7 @@
         </w:rPr>
         <w:t>5.4 Klassendiagramm</w:t>
         <w:tab/>
-        <w:t>15</w:t>
+        <w:t>12</w:t>
       </w:r>
     </w:p>
     <w:p>
@@ -586,7 +564,7 @@
         </w:rPr>
         <w:t>5.5 Sequenzdiagramme</w:t>
         <w:tab/>
-        <w:t>17</w:t>
+        <w:t>15</w:t>
       </w:r>
     </w:p>
     <w:p>
@@ -604,7 +582,7 @@
         </w:rPr>
         <w:t>5.6 Konsistenz zwischen den Modellen</w:t>
         <w:tab/>
-        <w:t>18</w:t>
+        <w:t>17</w:t>
       </w:r>
     </w:p>
     <w:p>
@@ -621,7 +599,7 @@
         </w:rPr>
         <w:t>6 Probleme und Herausforderungen</w:t>
         <w:tab/>
-        <w:t>19</w:t>
+        <w:t>18</w:t>
       </w:r>
     </w:p>
     <w:p>
@@ -638,7 +616,7 @@
         </w:rPr>
         <w:t>7 Feedback</w:t>
         <w:tab/>
-        <w:t>20</w:t>
+        <w:t>19</w:t>
       </w:r>
     </w:p>
     <w:p>
@@ -656,7 +634,7 @@
         </w:rPr>
         <w:t>7.1 Feedback des Dozenten und Umsetzung</w:t>
         <w:tab/>
-        <w:t>20</w:t>
+        <w:t>19</w:t>
       </w:r>
     </w:p>
     <w:p>
@@ -674,7 +652,7 @@
         </w:rPr>
         <w:t>7.2 Unser Feedback zur Fallstudie</w:t>
         <w:tab/>
-        <w:t>21</w:t>
+        <w:t>19</w:t>
       </w:r>
     </w:p>
     <w:p>
@@ -889,7 +867,7 @@
                 <w:sz w:val="19"/>
                 <w:szCs w:val="19"/>
               </w:rPr>
-              <w:t>Gesamtplanung und Termine; Redaktion der Projektdokumentation; Abgabe-Archiv</w:t>
+              <w:t>Gesamtplanung und Termine; Redaktion der Projektdokumentation (Abbildungen, PDF); Abgabe-Archiv</w:t>
             </w:r>
           </w:p>
         </w:tc>
@@ -944,7 +922,7 @@
                 <w:sz w:val="19"/>
                 <w:szCs w:val="19"/>
               </w:rPr>
-              <w:t>Stellvertretende Projektleitung, UML</w:t>
+              <w:t>Stellvertretende Projektleitung, Backup-Beauftragter</w:t>
             </w:r>
           </w:p>
         </w:tc>
@@ -969,7 +947,7 @@
                 <w:sz w:val="19"/>
                 <w:szCs w:val="19"/>
               </w:rPr>
-              <w:t>Sicherung von Git-Repository und VP-Server; Use-Case-Diagramm und Sequenzdiagramme SD5 und SD6 in Visual Paradigm</w:t>
+              <w:t xml:space="preserve">Sicherung von Git-Repository und VP-Server; Use-Case-Diagramm und Sequenzdiagramme SD5 und SD6 in Visual Paradigm</w:t>
             </w:r>
           </w:p>
         </w:tc>
@@ -1129,7 +1107,24 @@
                 <w:sz w:val="19"/>
                 <w:szCs w:val="19"/>
               </w:rPr>
-              <w:t>Sprint-Rituale und Trello-Board; Klassendiagramm, SD1 bis SD4, Visual-Paradigm-Projekt und Konsistenz der UML-Modelle</w:t>
+              <w:t xml:space="preserve">Sprint-Rituale und Trello-Board; Klassendiagramm, SD1 </w:t>
+            </w:r>
+            <w:r>
+              <w:rPr>
+                <w:color w:val="000000"/>
+                <w:sz w:val="19"/>
+                <w:szCs w:val="19"/>
+                <w:lang w:val="de-DE"/>
+              </w:rPr>
+              <w:t>bis</w:t>
+            </w:r>
+            <w:r>
+              <w:rPr>
+                <w:color w:val="000000"/>
+                <w:sz w:val="19"/>
+                <w:szCs w:val="19"/>
+              </w:rPr>
+              <w:t xml:space="preserve"> SD4, Visual-Paradigm-Projekt und Konsistenz der UML-Modelle</w:t>
             </w:r>
           </w:p>
         </w:tc>
@@ -1282,6 +1277,9 @@
             <w:pPr>
               <w:keepNext/>
               <w:spacing w:after="40" w:line="252" w:lineRule="auto"/>
+              <w:rPr>
+                <w:lang w:val="de-DE"/>
+              </w:rPr>
             </w:pPr>
             <w:r>
               <w:rPr>
@@ -1315,15 +1313,18 @@
       <w:pPr>
         <w:spacing w:after="120" w:line="276" w:lineRule="auto"/>
         <w:jc w:val="both"/>
-      </w:pPr>
-    </w:p>
-    <w:p>
-      <w:pPr>
-        <w:spacing w:after="120" w:line="276" w:lineRule="auto"/>
-        <w:jc w:val="both"/>
-      </w:pPr>
-      <w:r>
-        <w:t>Die Gruppenmitglieder haben folgende Beiträge erarbeitet:</w:t>
+        <w:rPr>
+          <w:lang w:val="de-DE"/>
+        </w:rPr>
+      </w:pPr>
+      <w:r>
+        <w:t>Die Gruppenmitglieder haben folgende Beiträge erarbeitet. Grundlage sind die Aufgabenverteilungen vom 02.09., 05.10. und 15.10.2026</w:t>
+      </w:r>
+      <w:r>
+        <w:rPr>
+          <w:lang w:val="de-DE"/>
+        </w:rPr>
+        <w:t>.</w:t>
       </w:r>
     </w:p>
     <w:p>
@@ -1343,7 +1344,7 @@
         <w:t xml:space="preserve">Nina Sattler: </w:t>
       </w:r>
       <w:r>
-        <w:t xml:space="preserve">Gesamtplanung und Terminsteuerung, Erstellung der BPMN-Diagramme 07 und 08, Redaktion der Projektdokumentation (Kapitel, Abbildungen, Inhaltsverzeichnis, PDF), Zusammenstellung des Abgabe-Archivs.</w:t>
+        <w:t>Gesamtplanung und Terminsteuerung, Prüfung der BPMN-Diagramme 07 und 08, Redaktion der Projektdokumentation (Abbildungen, Inhaltsverzeichnis, PDF), Zusammenstellung des Abgabe-Archivs; in der Präsentation Einleitung, Geschäftsmodell und Fazit.</w:t>
       </w:r>
     </w:p>
     <w:p>
@@ -1363,7 +1364,7 @@
         <w:t xml:space="preserve">David Leismann: </w:t>
       </w:r>
       <w:r>
-        <w:t xml:space="preserve">Erstellung der BPMN-Diagramme 03 und 04, Abgleich der Use Cases und Sequenzdiagramme mit den Prozessen, Überarbeitung der Prozesse 05 und 06, Use-Case-Diagramm mit Rollenstruktur sowie SD5 und SD6 in Visual Paradigm, Klassendiagramm.</w:t>
+        <w:t>Prüfung der BPMN-Diagramme 03 und 04, Abgleich der Use Cases und Sequenzdiagramme mit den Prozessen, Überarbeitung der Prozesse 05 und 06, Use-Case-Diagramm mit Rollenstruktur sowie SD5 und SD6 in Visual Paradigm; in der Präsentation Problem, Auftragsreise, Rollen und Use Cases.</w:t>
       </w:r>
     </w:p>
     <w:p>
@@ -1383,7 +1384,7 @@
         <w:t xml:space="preserve">Adrian Wenzler: </w:t>
       </w:r>
       <w:r>
-        <w:t xml:space="preserve">Erstellung der BPMN-Diagramme 05 und 06, Fachkonzept (Ausgangslage, Solution Provider, Systemkontext, Zustandsautomat, KI-Sofortdiagnose), Pflege des Entscheidungslogs und Abstimmung der Prozessänderungen mit der Gruppe, Automatisierungspotential, Probleme und Herausforderungen.</w:t>
+        <w:t>Prüfung der BPMN-Diagramme 05 und 06, Fachkonzept (Ausgangslage, Solution Provider, Systemkontext, Zustandsautomat, KI-Sofortdiagnose), Pflege des Entscheidungslogs und Abstimmung der Prozessänderungen mit der Gruppe, Überarbeitung von Prozess 06, Automatisierungspotential, Probleme und Herausforderungen; in der Präsentation Lösung, Nutzenversprechen und KI-Sofortdiagnose.</w:t>
       </w:r>
     </w:p>
     <w:p>
@@ -1403,7 +1404,7 @@
         <w:t xml:space="preserve">Kilian Platter: </w:t>
       </w:r>
       <w:r>
-        <w:t xml:space="preserve">Erstellung des BPMN-Diagramms 10, von Klassendiagramm und Sequenzdiagrammen SD1 bis SD4 in Visual Paradigm, Visual-Paradigm-Projekt und Konsistenzprüfung der Sequenzdiagramme gegen das Klassendiagramm, Sprint-Rituale und Trello-Board.</w:t>
+        <w:t>fachliche Prüfung der Diagramme mit Korrekturen, Klassendiagramm, SD1 bis SD4 in Visual Paradigm, Visual-Paradigm-Projekt und Konsistenzprüfung der Sequenzdiagramme gegen das Klassendiagramm, Sprint-Rituale und Trello-Board; in der Präsentation Datenmodell sowie Vorgehen und Projektmanagement.</w:t>
       </w:r>
     </w:p>
     <w:p>
@@ -1423,7 +1424,7 @@
         <w:t xml:space="preserve">Maximilian Ewald: </w:t>
       </w:r>
       <w:r>
-        <w:t xml:space="preserve">Erstellung der BPMN-Diagramme 01, 02 und 09, alle zehn BPMN-Dateien im Camunda Modeler (Anreicherung für Camunda 8, Prüfung im Problems-Panel, PNG-Export), Prozesskennzahlen und Beschreibung der Prozesse, Erstellung der PowerPoint-Präsentation.</w:t>
+        <w:t>Prüfung der BPMN-Diagramme 01 und 02, alle zehn BPMN-Dateien im Camunda Modeler (Anreicherung für Camunda 8, Prüfung im Problems-Panel, PNG-Export), Prozesskennzahlen und Beschreibung der Prozesse; in der Präsentation Ergebnisse, Prozesslandkarte und Prozess-Highlights.</w:t>
       </w:r>
     </w:p>
     <w:p>
@@ -1440,10 +1441,11 @@
           <w:b/>
           <w:bCs/>
         </w:rPr>
+        <w:lastRenderedPageBreak/>
         <w:t xml:space="preserve">Jakob Schwan: </w:t>
       </w:r>
       <w:r>
-        <w:t>Review der Prozesse 09 und 10, Behebung der Logikfehler in den Prozessen 07 und 08, Fehleranalyse und Korrektur der Prozesse 01 bis 05 sowie der Logikfehler in Prozess 06, QA-Checkliste und Review aller Pull Requests, Konventionen und Konsistenz der Modelle.</w:t>
+        <w:t>Review der Prozesse 09 und 10, Behebung der Logikfehler in den Prozessen 07 und 08, Fehleranalyse und Korrektur der Prozesse 01 bis 05 sowie der Logikfehler in Prozess 06, QA-Checkliste und Review aller Pull Requests, Konventionen und Konsistenz der Modelle; in der Präsentation Qualität, Herausforderungen und Lernerfahrungen.</w:t>
       </w:r>
     </w:p>
     <w:p>
@@ -1453,7 +1455,6 @@
         <w:spacing w:after="120"/>
       </w:pPr>
       <w:r>
-        <w:lastRenderedPageBreak/>
         <w:t>2 Das Projekt RepairFlow</w:t>
       </w:r>
     </w:p>
@@ -1551,7 +1552,16 @@
         <w:jc w:val="both"/>
       </w:pPr>
       <w:r>
-        <w:t xml:space="preserve">Die Plattform besteht aus vier Modulen: einem Kundenportal mit App, einem Auftrags- und Werkstattmodul, einem Dispositionsmodul für die filialübergreifende Ersatzteilversorgung sowie einer Abrechnung mit Schnittstelle zur Buchhaltung. Zielkunden sind unabhängige Werkstätten und kleine Ketten mit zwei bis zehn Filialen im deutschsprachigen Raum. Als Geschäftsmodell ist ein monatliches Abonnement je Filiale mit den Stufen Basis (Auftragsverwaltung und Kundenkommunikation) und Pro (zusätzlich filialübergreifende Disposition und KI-Sofortdiagnose) vorgesehen; das Abonnement selbst ist nicht Gegenstand der Modelle. Unser Konzept verbindet Fahrrad-, E-Bike- und Elektronikreparaturen in einer Plattform mit gemeinsamem Ersatzteillager. Ein Funktionsvergleich mit bestehenden Werkstattlösungen war nicht Gegenstand der Fallstudie; das Alleinstellungsmerkmal begründen wir in Abschnitt 2.5.</w:t>
+        <w:t>Die Plattform besteht aus vier Modulen: einem Kundenportal mit App, einem Auftrags- und Werkstattmodul, einem Dispositionsmodul für die filialübergreifende Ersatzteilversorgung sowie einer Abrechnung mit Schnittstelle zur Buchhaltung. Zielkunden sind unabhängige Werkstätten und kleine Ketten mit zwei bis zehn Filialen im deutschsprachigen Raum. Als Geschäftsmodell ist ein monatliches Abonnement je Filiale mit den Stufen Basis (Auftragsverwaltung und Kundenkommunikation) und Pro (zusätzlich filialübergreifende Disposition und KI-Sofortdiagnose) vorgesehen; das Abonnement selbst ist nicht Gegenstand der Modelle. Unser Konzept verbindet Fahrrad-, E-Bike- und Elektronikreparaturen in einer Plattform mit gemeinsamem Ersatzteillager. Einen belegten Funktionsvergleich mit bestehenden Werkstattlösungen haben wir nicht erstellt.</w:t>
+      </w:r>
+    </w:p>
+    <w:p>
+      <w:pPr>
+        <w:pStyle w:val="berschrift2"/>
+        <w:keepNext/>
+      </w:pPr>
+      <w:r>
+        <w:t>2.3 Systemkontext und Systemgrenze</w:t>
       </w:r>
     </w:p>
     <w:p>
@@ -1560,27 +1570,7 @@
         <w:jc w:val="both"/>
       </w:pPr>
       <w:r>
-        <w:t>Jedes der vier Probleme aus Abschnitt 2.1 greift ein Modul auf. Die fehlende Kundeninformation löst das Kundenportal: Der Kunde gibt den KVA in der App frei und wird benachrichtigt, sobald sein Gerät abholbereit ist (Prozesse 04 und 08, UC07 und UC15). Den fehlenden zentralen Status ersetzt der Reparaturauftrag im Auftrags- und Werkstattmodul, dessen Zustände alle Prozesse teilen (Abschnitt 2.4, UC03 und UC14). Gegen getrennte Bestellungen je Filiale prüft das Dispositionsmodul zuerst die Bestände aller Filialen und bestellt nur Fehlteile (Prozesse 05 und 06, UC08 bis UC10). Die Auslastung der Techniker macht die Terminplanung sichtbar, in der die Werkstattleitung Termine vergibt und Techniker zuweist (Prozess 02, UC17).</w:t>
-      </w:r>
-    </w:p>
-    <w:p>
-      <w:pPr>
-        <w:pStyle w:val="berschrift2"/>
-        <w:keepNext/>
-      </w:pPr>
-      <w:r>
-        <w:t>2.3 Systemkontext und Systemgrenze</w:t>
-      </w:r>
-    </w:p>
-    <w:p>
-      <w:pPr>
-        <w:spacing w:after="120" w:line="276" w:lineRule="auto"/>
-        <w:jc w:val="both"/>
-      </w:pPr>
-      <w:r>
-        <w:t xml:space="preserve">Abbildung 1 stellt den Systemkontext und die Systemgrenze dar. Innerhalb der Systemgrenze liegt die RepairFlow-Plattform. Der Werkstattbetrieb ist als Mandant angebunden, seine Rollen Service / Annahme, Techniker, Werkstattleitung und Ersatzteil-Disposition arbeiten in der Oberfläche der Plattform. Der Kunde nutzt das Kundenportal. Mit dem Lieferanten tauscht RepairFlow Bestellungen, </w:t>
-        <w:lastRenderedPageBreak/>
-        <w:t>Bestätigungen, Lieferungen und Retouren aus. Der KI-Diagnosedienst ist ein externer Dienst, den die Plattform zur Auswertung von Foto, Video und Ton aufruft. Außerhalb der Systemgrenze liegen die physische Reparatur, die Systeme der Lieferanten und die Buchhaltung, an die nur über eine Exportschnittstelle übergeben wird.</w:t>
+        <w:t>Abbildung 1 stellt den Systemkontext und die Systemgrenze dar. Innerhalb der Systemgrenze liegt die RepairFlow-Plattform. Der Werkstattbetrieb ist als Mandant angebunden, seine Rollen Service/Annahme, Techniker, Werkstattleitung und Ersatzteil-Disposition arbeiten in der Oberfläche der Plattform. Der Kunde nutzt das Kundenportal. Mit dem Lieferanten tauscht RepairFlow Bestellungen, Bestätigungen, Lieferungen und Retouren aus. Der KI-Diagnosedienst ist ein externer Dienst, den die Plattform zur Auswertung von Foto, Video und Ton aufruft. Außerhalb der Systemgrenze liegen die physische Reparatur, die Systeme der Lieferanten und die Buchhaltung, an die nur über eine Exportschnittstelle übergeben wird.</w:t>
       </w:r>
     </w:p>
     <w:p>
@@ -1593,8 +1583,9 @@
         <w:rPr>
           <w:noProof/>
         </w:rPr>
+        <w:lastRenderedPageBreak/>
         <w:drawing>
-          <wp:inline distT="0" distB="0" distL="0" distR="0" wp14:anchorId="5524A09C" wp14:editId="3DA087AB">
+          <wp:inline distT="0" distB="0" distL="0" distR="0" wp14:anchorId="5524A09C" wp14:editId="12BED571">
             <wp:extent cx="5901493" cy="3184933"/>
             <wp:effectExtent l="0" t="0" r="4445" b="0"/>
             <wp:docPr id="1" name="Picture 1"/>
@@ -1705,37 +1696,7 @@
         <w:jc w:val="both"/>
       </w:pPr>
       <w:r>
-        <w:t xml:space="preserve">Ein Teil davon ist heute machbar, etwa das Erkennen sichtbarer Schäden wie eines gebrochenen Displays per Bildanalyse. Die Auswertung von Motorgeräuschen und die Schätzung von Arbeitszeiten </w:t>
-        <w:lastRenderedPageBreak/>
-        <w:t>aus einem Video sind Vision. Deshalb bleibt der Vorschlag im Modell unverbindlich: Der KVA hat den Status „vorläufig“, und bei nicht auswertbaren Medien fragt das System nach einer besseren Aufnahme. In den Modellen erscheint das Merkmal als Prozess 01, als Use Cases „Sofortdiagnose anfordern“, „Voranmeldung bestätigen“ und „Diagnosevorschlag prüfen“, als Klassen Voranmeldung, Medienanhang und KIDiagnosevorschlag sowie als Sequenzdiagramm SD1.</w:t>
-      </w:r>
-    </w:p>
-    <w:p>
-      <w:pPr>
-        <w:pStyle w:val="berschrift2"/>
-        <w:keepNext/>
-      </w:pPr>
-      <w:r>
-        <w:t xml:space="preserve">2.6 Ausblick</w:t>
-      </w:r>
-    </w:p>
-    <w:p>
-      <w:pPr>
-        <w:spacing w:line="276" w:lineRule="auto"/>
-        <w:jc w:val="both"/>
-        <w:rPr>
-          <w:b/>
-          <w:bCs/>
-        </w:rPr>
-      </w:pPr>
-      <w:r>
-        <w:t>Über die modellierten Prozesse hinaus sehen wir drei Erweiterungen, die auf den Daten der Plattform aufbauen. Eine KI-gestützte Disposition prognostiziert den Bedarf je Filiale und Saison, damit Teile vor der Nachfrage im Lager liegen. Ein Techniker-Copilot schlägt Reparaturschritte und den Aufwand aus der Historie ähnlicher Aufträge vor. Eine digitale Geräteakte bewahrt die Reparaturgeschichte jedes Geräts über alle Filialen und Besitzer hinweg. Diese Erweiterungen sind nicht Gegenstand der Modelle.</w:t>
-      </w:r>
-      <w:r>
-        <w:rPr>
-          <w:b/>
-          <w:bCs/>
-        </w:rPr>
+        <w:t xml:space="preserve">Ein Teil davon ist heute machbar, etwa das Erkennen sichtbarer Schäden wie eines gebrochenen Displays per Bildanalyse. Die Auswertung von Motorgeräuschen und die Schätzung von Arbeitszeiten aus einem Video sind Vision. Deshalb bleibt der Vorschlag im Modell unverbindlich: Der KVA hat den Status „vorläufig“, und bei nicht auswertbaren Medien fragt das System nach einer besseren Aufnahme. In den Modellen erscheint das Merkmal als Prozess 01, als Use Cases „Sofortdiagnose anfordern“, „Voranmeldung bestätigen“ und „Diagnosevorschlag prüfen“, als Klassen Voranmeldung, Medienanhang und KIDiagnosevorschlag sowie als Sequenzdiagramm SD1.</w:t>
       </w:r>
     </w:p>
     <w:p>
@@ -1745,6 +1706,7 @@
         <w:spacing w:after="120"/>
       </w:pPr>
       <w:r>
+        <w:lastRenderedPageBreak/>
         <w:t>3 Vorgehen bei der Umsetzung</w:t>
       </w:r>
     </w:p>
@@ -2192,7 +2154,9 @@
                 <w:color w:val="000000"/>
                 <w:sz w:val="19"/>
                 <w:szCs w:val="19"/>
-              </w:rPr>
+                <w:shd w:val="clear" w:color="auto" w:fill="FFF2A8"/>
+              </w:rPr>
+              <w:t xml:space="preserve"> </w:t>
             </w:r>
           </w:p>
         </w:tc>
@@ -2389,7 +2353,7 @@
         <w:jc w:val="both"/>
       </w:pPr>
       <w:r>
-        <w:t>Die BPMN-Diagramme haben wir im Camunda Modeler (Camunda 8) erstellt. Automatisierte Aktivitäten tragen Task-Definitionen, Timer haben ISO-Dauern und Verzweigungen FEEL-Bedingungen, damit der Modeler die Diagramme ohne Fehlermeldung prüft. Das UML-Modell liegt in Visual Paradigm 18 auf dem Teamwork-Server der DHBW (Repository WWI25B4G1). Die Sequenzdiagramme sind dort als Unterdiagramme ihrer Use Cases angelegt. Als gemeinsame Ablage für BPMN-Dateien, Dokumentation, Entscheidungslog und Präsentation nutzen wir ein GitHub-Repository. Die Aufgaben steuern wir über ein Trello-Board.</w:t>
+        <w:t xml:space="preserve">Die BPMN-Diagramme haben wir im Camunda Modeler (Camunda 8) erstellt. Automatisierte Aktivitäten tragen Task-Definitionen, Timer haben ISO-Dauern und Verzweigungen FEEL-Bedingungen, damit der Modeler die Diagramme ohne Fehlermeldung prüft. Das UML-Modell liegt in Visual Paradigm 18 auf dem Teamwork-Server der DHBW (Repository WWI25B4G1). Die Sequenzdiagramme sind dort als Unterdiagramme ihrer Use Cases angelegt. Als gemeinsame Ablage für BPMN-Dateien, Dokumentation, Entscheidungslog und Präsentation nutzen wir ein GitHub-Repository. Die Aufgaben steuern wir über ein Trello-Board.</w:t>
       </w:r>
     </w:p>
     <w:p>
@@ -2411,7 +2375,6 @@
         <w:spacing w:after="60" w:line="264" w:lineRule="auto"/>
       </w:pPr>
       <w:r>
-        <w:lastRenderedPageBreak/>
         <w:t>BPMN-Datenobjekte tragen die Klassennamen des Klassendiagramms, im Diagramm zur Lesbarkeit mit Bindestrich getrennt und bei Bedarf mit Zustand in eckigen Klammern, zum Beispiel „Reparatur-auftrag [freigegeben]“.</w:t>
       </w:r>
     </w:p>
@@ -2425,7 +2388,7 @@
         <w:spacing w:after="60" w:line="264" w:lineRule="auto"/>
       </w:pPr>
       <w:r>
-        <w:t>Aktivitäten heißen Verb mit Objekt („Kundendaten erfassen“), Ereignisse stehen im Partizip Perfekt („Auftrag eingeplant“).</w:t>
+        <w:t>Aktivitäten heißen Verb mit Objekt („Kundendaten erfassen“), Ereignisse stehen im Partizip Perfekt („Auftrag angenommen“).</w:t>
       </w:r>
     </w:p>
     <w:p>
@@ -2451,7 +2414,7 @@
         <w:spacing w:after="60" w:line="264" w:lineRule="auto"/>
       </w:pPr>
       <w:r>
-        <w:t xml:space="preserve">Die Beteiligten erscheinen in BPMN als Pool (Kunde) oder Lane (Service / Annahme, Techniker, Ersatzteil-Disposition, Werkstattleitung), jeder direkt ausgelöste Use Case hat genau eine Rolle als Hauptakteur (Tabelle 7), in den Sequenzdiagrammen als Akteure mit demselben Rollennamen und im Klassendiagramm als Unterklassen von Mitarbeiter. Welche Rolle zu welcher Klasse und Lane gehört, legt Tabelle 7 fest.</w:t>
+        <w:t xml:space="preserve">Die Beteiligten erscheinen in BPMN als Pool (Kunde) oder Lane (Service / Annahme, Techniker, Ersatzteil-Disposition, Werkstattleitung), im Use-Case-Diagramm als Rollen mit genau einem Use Case je Rolle (Tabelle 7), in den Sequenzdiagrammen als Akteure mit demselben Rollennamen und im Klassendiagramm als Unterklassen von Mitarbeiter. Welche Rolle zu welcher Klasse und Lane gehört, legt Tabelle 7 fest.</w:t>
       </w:r>
     </w:p>
     <w:p>
@@ -2473,6 +2436,7 @@
         <w:keepNext/>
       </w:pPr>
       <w:r>
+        <w:lastRenderedPageBreak/>
         <w:t>3.2 Qualitätssicherung</w:t>
       </w:r>
     </w:p>
@@ -2491,7 +2455,7 @@
         <w:jc w:val="both"/>
       </w:pPr>
       <w:r>
-        <w:t>Jedes Diagramm ist denselben Weg gegangen: Entwurf im Zweierteam, gegenseitiges Review, Abstimmung im Gruppentermin und erst dann die Umsetzung über einen Pull Request. In Sprint 1 fanden wir dabei vor allem fachliche Fehler, etwa abweichende Begriffe zwischen Prozess- und Klassenmodell, die wir gegenseitig überarbeitet haben. In Sprint 2 ergab die gemeinsame Prüfung in der Gesamtgruppe nur noch kleinere Fehler in den Details. Die Korrekturen sind im Entscheidungslog festgehalten.</w:t>
+        <w:t xml:space="preserve">Jedes Diagramm ist denselben Weg gegangen: Entwurf im Zweierteam, gegenseitiges Review, Abstimmung im Gruppentermin und erst dann die Umsetzung über einen Pull Request. In Sprint 1 fanden wir dabei vor allem fachliche Fehler, etwa abweichende Begriffe zwischen Prozess- und Klassenmodell, die wir gegenseitig überarbeitet haben. In Sprint 2 ergab die gemeinsame Prüfung in der Gesamtgruppe nur noch kleinere Fehler in den Details. Die Korrekturen sind im Entscheidungslog festgehalten.</w:t>
       </w:r>
     </w:p>
     <w:p>
@@ -2528,7 +2492,7 @@
         <w:jc w:val="both"/>
       </w:pPr>
       <w:r>
-        <w:t xml:space="preserve">Den Takt geben die vier Gruppentermine in Präsenz vor (jeweils 4:15 Stunden). Jeder Termin verbindet Review und Retrospektive des vergangenen Sprints mit dem Planning des nächsten, und Hinweise aus dem Coaching fließen direkt in die Planung ein. Tabelle 3 zeigt den Verlauf der vier Sprints. Zwischen den Terminen arbeiten wir asynchron. Abgestimmt wird in einer WhatsApp-Gruppe, Dateien teilen wir nur über das GitHub-Repository.</w:t>
+        <w:t>Den Takt geben die vier Gruppentermine in Präsenz vor (jeweils 4:15 Stunden). Jeder Termin verbindet Review und Retrospektive des vergangenen Sprints mit dem Planning des nächsten, und Hinweise aus dem Coaching fließen direkt in die Planung ein. Zwischen den Terminen arbeiten wir asynchron. Abgestimmt wird in einer WhatsApp-Gruppe, Dateien teilen wir nur über das GitHub-Repository.</w:t>
       </w:r>
     </w:p>
     <w:p>
@@ -2537,7 +2501,6 @@
         <w:keepNext/>
       </w:pPr>
       <w:r>
-        <w:lastRenderedPageBreak/>
         <w:t>4.2 Sprintplan und Verlauf</w:t>
       </w:r>
     </w:p>
@@ -2992,7 +2955,7 @@
                 <w:sz w:val="19"/>
                 <w:szCs w:val="19"/>
               </w:rPr>
-              <w:t>QA-Befunde behoben, Zuständigkeiten für die Fertigstellung festgelegt, Use-Case-Diagramm nach dem Dozentenhinweis auf Rollen umgestellt.</w:t>
+              <w:t xml:space="preserve">QA-Befunde behoben, Zuständigkeiten für die Fertigstellung festgelegt, Use-Case-Diagramm nach dem Dozentenhinweis auf Rollen umgestellt. </w:t>
             </w:r>
           </w:p>
         </w:tc>
@@ -3090,18 +3053,16 @@
             <w:pPr>
               <w:keepNext/>
               <w:spacing w:after="40" w:line="252" w:lineRule="auto"/>
-              <w:rPr>
-                <w:sz w:val="19"/>
-                <w:szCs w:val="19"/>
-              </w:rPr>
-            </w:pPr>
-            <w:r>
-              <w:rPr>
-                <w:color w:val="000000"/>
-                <w:sz w:val="19"/>
-                <w:szCs w:val="19"/>
-              </w:rPr>
-              <w:t>Generalprobe durchgeführt; nach dem Coaching am 22.10. Oberflächenklassen in Klassen- und Sequenzdiagrammen ergänzt.</w:t>
+            </w:pPr>
+            <w:r>
+              <w:rPr>
+                <w:i/>
+                <w:color w:val="000000"/>
+                <w:sz w:val="19"/>
+                <w:szCs w:val="19"/>
+                <w:shd w:val="clear" w:color="auto" w:fill="FFF2A8"/>
+              </w:rPr>
+              <w:t>[Ergebnis nach dem 22.10. ergänzen]</w:t>
             </w:r>
           </w:p>
         </w:tc>
@@ -3206,7 +3167,7 @@
                 <w:sz w:val="19"/>
                 <w:szCs w:val="19"/>
               </w:rPr>
-              <w:t xml:space="preserve">Präsentation am 27.10.2026, Abgabe bis 13.11.2026 über Moodle. Weitere Anpassungen in VP und Dokumentation.</w:t>
+              <w:t>Präsentation am 27.10.2026 in Raum B458, Abgabe bis 13.11.2026 über Moodle.</w:t>
             </w:r>
           </w:p>
         </w:tc>
@@ -3234,6 +3195,7 @@
         <w:keepNext/>
       </w:pPr>
       <w:r>
+        <w:lastRenderedPageBreak/>
         <w:t>4.3 Aufgabensteuerung und Repository</w:t>
       </w:r>
     </w:p>
@@ -3243,7 +3205,7 @@
         <w:jc w:val="both"/>
       </w:pPr>
       <w:r>
-        <w:t>Das Trello-Board hat eine Liste je Termin. Jede Karte nennt eine verantwortliche Person und, wo ein Diagramm entsteht, den Teampartner als Prüfer. Änderungen am Repository laufen über einen festen Git-Ablauf: aktuellen Stand holen, eigener Branch je Aufgabe, Pull Request, Review durch eine zweite Person und Merge. Commit-Nachrichten tragen einen Termin-Stempel mit Terminnummer und Datum, etwa [T04 2026-10-05] für den Gruppentermin am 05.10.2026. Entscheidungen, die mehrere Personen betreffen, halten wir im Entscheidungslog fest. Word- und PowerPoint-Dateien lassen sich nicht automatisch zusammenführen, deshalb kündigen wir ihre Bearbeitung vorher in der WhatsApp-Gruppe an.</w:t>
+        <w:t xml:space="preserve">Das Trello-Board hat eine Liste je Termin. Jede Karte nennt eine verantwortliche Person und, wo ein Diagramm entsteht, den Teampartner als Prüfer. Änderungen am Repository laufen über einen festen Git-Ablauf: aktuellen Stand holen, eigener Branch je Aufgabe, Pull Request, Review durch eine zweite Person und Merge. Commit-Nachrichten tragen einen Termin-Stempel mit Terminnummer und Datum, etwa [T04 2026-10-05] für den Gruppentermin am 05.10.2026. Entscheidungen, die mehrere Personen betreffen, halten wir im Entscheidungslog fest. Word- und PowerPoint-Dateien lassen sich nicht automatisch zusammenführen, deshalb kündigen wir ihre Bearbeitung vorher in der WhatsApp-Gruppe an.</w:t>
       </w:r>
     </w:p>
     <w:p>
@@ -3324,7 +3286,6 @@
                 <w:sz w:val="19"/>
                 <w:szCs w:val="19"/>
               </w:rPr>
-              <w:lastRenderedPageBreak/>
               <w:t>Risiko</w:t>
             </w:r>
           </w:p>
@@ -4077,7 +4038,9 @@
         <w:jc w:val="both"/>
       </w:pPr>
       <w:r>
-        <w:t>Wir haben zehn Soll-Prozesse unseres Pilotkunden als Kollaborationsdiagramme modelliert (Tabelle 6). Zusammen enthalten sie 143 Aktivitäten im Werkstatt-Pool, im Schnitt 14,3 je Diagramm. Hinzu kommen 28 Aktivitäten in den Abläufen des Kunden, 49 Nachrichtenflüsse sowie 58 Datenobjekte und 14 Datenspeicher.</w:t>
+        <w:t xml:space="preserve">Wir haben zehn Soll-Prozesse unseres Pilotkunden als Kollaborationsdiagramme modelliert (Tabelle 6). Zusammen enthalten sie 133 Aktivitäten im Werkstatt-Pool, im Schnitt 13,3 je Diagramm. Hinzu </w:t>
+        <w:lastRenderedPageBreak/>
+        <w:t>kommen 26 Aktivitäten in den Abläufen des Kunden, 42 Nachrichtenflüsse sowie 51 Datenobjekte und 12 Datenspeicher.</w:t>
       </w:r>
     </w:p>
     <w:tbl>
@@ -4135,7 +4098,6 @@
                 <w:sz w:val="19"/>
                 <w:szCs w:val="19"/>
               </w:rPr>
-              <w:lastRenderedPageBreak/>
               <w:t>Nr</w:t>
             </w:r>
           </w:p>
@@ -4459,7 +4421,7 @@
                 <w:sz w:val="19"/>
                 <w:szCs w:val="19"/>
               </w:rPr>
-              <w:t>14</w:t>
+              <w:t>12</w:t>
             </w:r>
           </w:p>
         </w:tc>
@@ -4484,7 +4446,7 @@
                 <w:sz w:val="19"/>
                 <w:szCs w:val="19"/>
               </w:rPr>
-              <w:t>14 (100 %)</w:t>
+              <w:t>12 (100 %)</w:t>
             </w:r>
           </w:p>
         </w:tc>
@@ -4564,7 +4526,7 @@
                 <w:sz w:val="19"/>
                 <w:szCs w:val="19"/>
               </w:rPr>
-              <w:t>Gerät abgegeben</w:t>
+              <w:t>Kunde erschienen</w:t>
             </w:r>
           </w:p>
         </w:tc>
@@ -4589,7 +4551,7 @@
                 <w:sz w:val="19"/>
                 <w:szCs w:val="19"/>
               </w:rPr>
-              <w:t>Auftrag eingeplant</w:t>
+              <w:t>Auftrag angenommen</w:t>
             </w:r>
           </w:p>
         </w:tc>
@@ -4639,7 +4601,7 @@
                 <w:sz w:val="19"/>
                 <w:szCs w:val="19"/>
               </w:rPr>
-              <w:t>16</w:t>
+              <w:t>12</w:t>
             </w:r>
           </w:p>
         </w:tc>
@@ -4664,7 +4626,7 @@
                 <w:sz w:val="19"/>
                 <w:szCs w:val="19"/>
               </w:rPr>
-              <w:t>7 (44 %)</w:t>
+              <w:t>4 (33 %)</w:t>
             </w:r>
           </w:p>
         </w:tc>
@@ -4819,7 +4781,7 @@
                 <w:sz w:val="19"/>
                 <w:szCs w:val="19"/>
               </w:rPr>
-              <w:t>13</w:t>
+              <w:t>12</w:t>
             </w:r>
           </w:p>
         </w:tc>
@@ -4844,7 +4806,7 @@
                 <w:sz w:val="19"/>
                 <w:szCs w:val="19"/>
               </w:rPr>
-              <w:t>6 (46 %)</w:t>
+              <w:t>5 (42 %)</w:t>
             </w:r>
           </w:p>
         </w:tc>
@@ -4999,7 +4961,7 @@
                 <w:sz w:val="19"/>
                 <w:szCs w:val="19"/>
               </w:rPr>
-              <w:t>12</w:t>
+              <w:t>11</w:t>
             </w:r>
           </w:p>
         </w:tc>
@@ -5024,7 +4986,7 @@
                 <w:sz w:val="19"/>
                 <w:szCs w:val="19"/>
               </w:rPr>
-              <w:t>8 (67 %)</w:t>
+              <w:t>7 (64 %)</w:t>
             </w:r>
           </w:p>
         </w:tc>
@@ -5104,7 +5066,7 @@
                 <w:sz w:val="19"/>
                 <w:szCs w:val="19"/>
               </w:rPr>
-              <w:t>Teilebedarf freigegeben</w:t>
+              <w:t>KVA freigegeben</w:t>
             </w:r>
           </w:p>
         </w:tc>
@@ -5179,7 +5141,7 @@
                 <w:sz w:val="19"/>
                 <w:szCs w:val="19"/>
               </w:rPr>
-              <w:t>16</w:t>
+              <w:t>15</w:t>
             </w:r>
           </w:p>
         </w:tc>
@@ -5204,7 +5166,7 @@
                 <w:sz w:val="19"/>
                 <w:szCs w:val="19"/>
               </w:rPr>
-              <w:t>12 (75 %)</w:t>
+              <w:t>12 (80 %)</w:t>
             </w:r>
           </w:p>
         </w:tc>
@@ -5359,7 +5321,7 @@
                 <w:sz w:val="19"/>
                 <w:szCs w:val="19"/>
               </w:rPr>
-              <w:t>17</w:t>
+              <w:t>15</w:t>
             </w:r>
           </w:p>
         </w:tc>
@@ -5384,7 +5346,7 @@
                 <w:sz w:val="19"/>
                 <w:szCs w:val="19"/>
               </w:rPr>
-              <w:t>11 (65 %)</w:t>
+              <w:t>9 (60 %)</w:t>
             </w:r>
           </w:p>
         </w:tc>
@@ -5489,7 +5451,7 @@
                 <w:sz w:val="19"/>
                 <w:szCs w:val="19"/>
               </w:rPr>
-              <w:t>Gerät abholbereit</w:t>
+              <w:t>Reparatur abgeschlossen</w:t>
             </w:r>
           </w:p>
         </w:tc>
@@ -5564,7 +5526,7 @@
                 <w:sz w:val="19"/>
                 <w:szCs w:val="19"/>
               </w:rPr>
-              <w:t>6 (46 %)</w:t>
+              <w:t>5 (38 %)</w:t>
             </w:r>
           </w:p>
         </w:tc>
@@ -5899,7 +5861,7 @@
                 <w:sz w:val="19"/>
                 <w:szCs w:val="19"/>
               </w:rPr>
-              <w:t>16</w:t>
+              <w:t>15</w:t>
             </w:r>
           </w:p>
         </w:tc>
@@ -5924,7 +5886,7 @@
                 <w:sz w:val="19"/>
                 <w:szCs w:val="19"/>
               </w:rPr>
-              <w:t>8 (50 %)</w:t>
+              <w:t>8 (53 %)</w:t>
             </w:r>
           </w:p>
         </w:tc>
@@ -6079,7 +6041,7 @@
                 <w:sz w:val="19"/>
                 <w:szCs w:val="19"/>
               </w:rPr>
-              <w:t>9</w:t>
+              <w:t>11</w:t>
             </w:r>
           </w:p>
         </w:tc>
@@ -6104,7 +6066,7 @@
                 <w:sz w:val="19"/>
                 <w:szCs w:val="19"/>
               </w:rPr>
-              <w:t>6 (67 %)</w:t>
+              <w:t>8 (73 %)</w:t>
             </w:r>
           </w:p>
         </w:tc>
@@ -6132,7 +6094,7 @@
         <w:jc w:val="both"/>
       </w:pPr>
       <w:r>
-        <w:t>Der Pool Werkstattbetrieb enthält den ausführbaren Prozess. Seine Lanes sind die Rollen Service / Annahme, Techniker, Werkstattleitung und Ersatzteil-Disposition. Kunde und Lieferant sind eigene Pools, mit denen nur über Nachrichtenflüsse kommuniziert wird. Der Kunde hat in den Prozessen 01 bis 09 einen eigenen, nicht ausführbaren Ablauf. So ist sichtbar, wann er antwortet und wie der Vorgang für ihn endet. Den Lieferanten modellieren wir als Black Box, weil wir seine internen Abläufe nicht kennen. Für die Software gibt es keine eigene Lane. Ob RepairFlow einen Schritt allein erledigt, zeigt der Aktivitätstyp: Service Task (automatisch), Business Rule Task (Regel oder KI), Send Task und Receive Task (Nachricht über die Plattform), User Task (Mitarbeiter in der Plattform) und Manual Task (außerhalb der Software).</w:t>
+        <w:t>Der Pool Werkstattbetrieb enthält den ausführbaren Prozess. Seine Lanes sind die Rollen Service/Annahme, Techniker, Werkstattleitung und Ersatzteil-Disposition. Kunde und Lieferant sind eigene Pools, mit denen nur über Nachrichtenflüsse kommuniziert wird. Der Kunde hat in den Prozessen 01 bis 09 einen eigenen, nicht ausführbaren Ablauf. So ist sichtbar, wann er antwortet und wie der Vorgang für ihn endet. Den Lieferanten modellieren wir als Black Box, weil wir seine internen Abläufe nicht kennen. Für die Software gibt es keine eigene Lane. Ob RepairFlow einen Schritt allein erledigt, zeigt der Aktivitätstyp: Service Task (automatisch), Business Rule Task (Regel oder KI), Send- und Receive Task (Nachricht über die Plattform), User Task (Mitarbeiter in der Plattform) und Manual Task (außerhalb der Software).</w:t>
       </w:r>
     </w:p>
     <w:p>
@@ -6141,7 +6103,7 @@
         <w:jc w:val="both"/>
       </w:pPr>
       <w:r>
-        <w:t>Die Prozesse greifen über Aufruf-Aktivitäten ineinander. Ein freigegebener KVA (04) oder eine Nacharbeit aus einer Reklamation (09) startet die Disposition (05), Fehlteile lösen die Bestellung aus (06), und die Rückgabe jedes Geräts läuft über Prozess 08, auch nach einer Ablehnung oder Reklamation. Prozess 07 endet deshalb mit „Gerät abholbereit“, dem Startereignis von Prozess 08. Jede Warteschleife hat einen Ausstieg. Bleibt der KVA dreimal drei Tage ohne Antwort, gilt er als abgelehnt, ausstehende Lieferungen werden zweimal angemahnt, bevor storniert wird, und nach der zweiten erfolglosen Nacharbeit wird ein Auftrag abgelehnt. Abbildung 2 und Abbildung 3 zeigen zwei der zehn Diagramme. Alle Diagramme liegen vollständig in BPMN-WWI25B4-Gruppe1.zip.</w:t>
+        <w:t>Die Prozesse greifen über Aufruf-Aktivitäten ineinander. Ein freigegebener KVA (04) startet die Disposition (05), Fehlteile lösen die Bestellung aus (06), und die Rückgabe jedes Geräts läuft über Prozess 08, auch nach einer Ablehnung oder Reklamation. Jede Warteschleife hat einen Ausstieg. Bleibt der KVA dreimal drei Tage ohne Antwort, gilt er als abgelehnt, ausstehende Lieferungen werden zweimal angemahnt, bevor storniert wird, und nach der zweiten erfolglosen Nacharbeit wird ein Auftrag abgelehnt. Abbildung 2 und Abbildung 3 zeigen zwei der zehn Diagramme. Alle Diagramme liegen vollständig in BPMN-WWI25B4-Gruppe1.zip.</w:t>
       </w:r>
     </w:p>
     <w:p>
@@ -6167,12 +6129,11 @@
           <w:b/>
           <w:bCs/>
         </w:rPr>
+        <w:lastRenderedPageBreak/>
         <w:t xml:space="preserve">01 KI-Sofortdiagnose und Voranmeldung. </w:t>
       </w:r>
       <w:r>
-        <w:t xml:space="preserve">Aus Foto, Video oder Ton des Kunden entstehen Voranmeldung, KI-Diagnosevorschlag, vorläufiger KVA und Terminvorschlag. Nicht auswertbare </w:t>
-        <w:lastRenderedPageBreak/>
-        <w:t>Medien fordert das System neu an. Bestätigt der Kunde, werden die Teile vorreserviert; ist ein Teil nirgends verfügbar, erhält die Voranmeldung einen Hinweis auf Nachbestellung. Lehnt der Kunde ab oder bleibt eine Antwort sieben Tage aus, wird die Voranmeldung verworfen, bei Fristablauf mit Hinweis an den Kunden.</w:t>
+        <w:t>Aus Foto, Video oder Ton des Kunden entstehen Voranmeldung, KI-Diagnosevorschlag, vorläufiger KVA und Terminvorschlag. Nicht auswertbare Medien fordert das System neu an. Ohne Antwort binnen sieben Tagen wird die Voranmeldung verworfen.</w:t>
       </w:r>
     </w:p>
     <w:p>
@@ -6232,7 +6193,7 @@
         <w:t xml:space="preserve">04 Kostenvoranschlag und Kundenfreigabe. </w:t>
       </w:r>
       <w:r>
-        <w:t>Der KVA wird berechnet, geprüft und versendet. Bleibt die Antwort drei Tage aus, wird er mit Erinnerung erneut gesendet. Nach dem dritten Fristablauf ohne Antwort gilt er als abgelehnt. Dann erhält der Kunde eine Reparaturabsage, und der KVA verfällt auch in seinem Ablauf. Nach einer Freigabe wartet der Kunde auf den Reparaturbeginn; sind nicht alle Teile beschaffbar, erhält er stattdessen eine Reparaturabsage.</w:t>
+        <w:t>Der KVA wird berechnet, geprüft und versendet. Bleibt die Antwort drei Tage aus, wird er mit Erinnerung erneut gesendet. Nach dem dritten Fristablauf ohne Antwort gilt er als abgelehnt.</w:t>
       </w:r>
     </w:p>
     <w:p>
@@ -6272,7 +6233,7 @@
         <w:t xml:space="preserve">06 Ersatzteil-Bestellung. </w:t>
       </w:r>
       <w:r>
-        <w:t>Fehlteile und Nachbestellvorschläge werden gebündelt bestellt, oberhalb einer Freigabegrenze erst nach Freigabe. Ohne Bestätigung wird storniert und ein anderer Lieferant gesucht. Bleibt die Lieferung über den Liefertermin hinaus aus, wird sie angemahnt und eine Nachfrist von 14 Tagen gesetzt; nach der zweiten erfolglosen Mahnung wird ebenfalls storniert. Der Wareneingang wird erst geprüft und nur mangelfreie Ware gebucht, auch bei einer Ersatzlieferung.</w:t>
+        <w:t>Fehlteile und Nachbestellvorschläge werden gebündelt bestellt, oberhalb einer Freigabegrenze erst nach Freigabe. Ohne Bestätigung oder nach zwei erfolglosen Mahnungen wird storniert und ein anderer Lieferant gesucht.</w:t>
       </w:r>
     </w:p>
     <w:p>
@@ -6332,7 +6293,7 @@
         <w:t xml:space="preserve">09 Reklamation und Gewährleistung. </w:t>
       </w:r>
       <w:r>
-        <w:t>Der Mangel wird geprüft und die Gewährleistung bewertet. Kostenfreie Nacharbeit gibt die Werkstattleitung frei, sonst entscheidet der Kunde über ein Angebot. Lehnt er ab, antwortet er nicht oder ist ein Teil nicht beschaffbar, erhält er eine Absage. Ist ein Lieferantenteil defekt, wird es nach der Abholung über Prozess 10 retourniert, der Kunde wartet nicht darauf.</w:t>
+        <w:t>Der Mangel wird geprüft und die Gewährleistung bewertet. Kostenfreie Nacharbeit gibt die Werkstattleitung frei, sonst entscheidet der Kunde über ein Angebot.</w:t>
       </w:r>
     </w:p>
     <w:p>
@@ -6352,7 +6313,7 @@
         <w:t xml:space="preserve">10 Ersatzteil-Retoure. </w:t>
       </w:r>
       <w:r>
-        <w:t>Defekte Lieferantenteile werden angemeldet und zurückgesendet. Danach folgt eine Gutschrift oder eine Ersatzlieferung. Kommt das Teil aus dem Wareneingang (Prozess 06), prüft und bucht Prozess 06 die Ersatzlieferung; kommt es aus einer Reklamation (Prozess 09), war es bereits verbaut, und die Ersatzlieferung geht als normaler Wareneingang ins Lager. Ohne Antwort nach der Eskalation wird das Teil abgeschrieben.</w:t>
+        <w:t>Defekte Lieferantenteile werden angemeldet und zurückgesendet. Danach folgt eine Gutschrift oder eine Ersatzlieferung, ohne Antwort nach der Eskalation wird das Teil abgeschrieben.</w:t>
       </w:r>
     </w:p>
     <w:p>
@@ -6363,12 +6324,11 @@
         <w:rPr>
           <w:noProof/>
         </w:rPr>
-        <w:lastRenderedPageBreak/>
         <w:drawing>
-          <wp:inline distT="0" distB="0" distL="0" distR="0" wp14:anchorId="0F60C88C" wp14:editId="52EF33BC">
-            <wp:extent cx="5782310" cy="2130559"/>
+          <wp:inline distT="0" distB="0" distL="0" distR="0" wp14:anchorId="19D2E60F" wp14:editId="4AD0833F">
+            <wp:extent cx="5760000" cy="2063184"/>
             <wp:effectExtent l="0" t="0" r="0" b="0"/>
-            <wp:docPr id="644557787" name="Grafik 1"/>
+            <wp:docPr id="3" name="Picture 3"/>
             <wp:cNvGraphicFramePr>
               <a:graphicFrameLocks xmlns:a="http://schemas.openxmlformats.org/drawingml/2006/main" noChangeAspect="1"/>
             </wp:cNvGraphicFramePr>
@@ -6376,17 +6336,11 @@
               <a:graphicData uri="http://schemas.openxmlformats.org/drawingml/2006/picture">
                 <pic:pic xmlns:pic="http://schemas.openxmlformats.org/drawingml/2006/picture">
                   <pic:nvPicPr>
-                    <pic:cNvPr id="644557787" name="Grafik 644557787"/>
+                    <pic:cNvPr id="0" name="p01-sofortdiagnose.png"/>
                     <pic:cNvPicPr/>
                   </pic:nvPicPr>
                   <pic:blipFill>
-                    <a:blip r:embed="rId8" cstate="print">
-                      <a:extLst>
-                        <a:ext uri="{28A0092B-C50C-407E-A947-70E740481C1C}">
-                          <a14:useLocalDpi xmlns:a14="http://schemas.microsoft.com/office/drawing/2010/main" val="0"/>
-                        </a:ext>
-                      </a:extLst>
-                    </a:blip>
+                    <a:blip r:embed="rId8"/>
                     <a:stretch>
                       <a:fillRect/>
                     </a:stretch>
@@ -6394,7 +6348,7 @@
                   <pic:spPr>
                     <a:xfrm>
                       <a:off x="0" y="0"/>
-                      <a:ext cx="5782310" cy="2130559"/>
+                      <a:ext cx="5760000" cy="2063184"/>
                     </a:xfrm>
                     <a:prstGeom prst="rect">
                       <a:avLst/>
@@ -6431,11 +6385,12 @@
         <w:rPr>
           <w:noProof/>
         </w:rPr>
+        <w:lastRenderedPageBreak/>
         <w:drawing>
-          <wp:inline distT="0" distB="0" distL="0" distR="0" wp14:anchorId="2C7C0B39" wp14:editId="16659AC5">
-            <wp:extent cx="5782310" cy="2223289"/>
-            <wp:effectExtent l="0" t="0" r="0" b="5080"/>
-            <wp:docPr id="1426216721" name="Grafik 3"/>
+          <wp:inline distT="0" distB="0" distL="0" distR="0" wp14:anchorId="3C47F1C3" wp14:editId="2F129291">
+            <wp:extent cx="5760000" cy="2323330"/>
+            <wp:effectExtent l="0" t="0" r="0" b="0"/>
+            <wp:docPr id="2" name="Picture 2"/>
             <wp:cNvGraphicFramePr>
               <a:graphicFrameLocks xmlns:a="http://schemas.openxmlformats.org/drawingml/2006/main" noChangeAspect="1"/>
             </wp:cNvGraphicFramePr>
@@ -6443,17 +6398,11 @@
               <a:graphicData uri="http://schemas.openxmlformats.org/drawingml/2006/picture">
                 <pic:pic xmlns:pic="http://schemas.openxmlformats.org/drawingml/2006/picture">
                   <pic:nvPicPr>
-                    <pic:cNvPr id="1426216721" name="Grafik 1426216721"/>
+                    <pic:cNvPr id="0" name="p04-kostenvoranschlag.png"/>
                     <pic:cNvPicPr/>
                   </pic:nvPicPr>
                   <pic:blipFill>
-                    <a:blip r:embed="rId9" cstate="print">
-                      <a:extLst>
-                        <a:ext uri="{28A0092B-C50C-407E-A947-70E740481C1C}">
-                          <a14:useLocalDpi xmlns:a14="http://schemas.microsoft.com/office/drawing/2010/main" val="0"/>
-                        </a:ext>
-                      </a:extLst>
-                    </a:blip>
+                    <a:blip r:embed="rId9"/>
                     <a:stretch>
                       <a:fillRect/>
                     </a:stretch>
@@ -6461,7 +6410,7 @@
                   <pic:spPr>
                     <a:xfrm>
                       <a:off x="0" y="0"/>
-                      <a:ext cx="5782310" cy="2223289"/>
+                      <a:ext cx="5760000" cy="2323330"/>
                     </a:xfrm>
                     <a:prstGeom prst="rect">
                       <a:avLst/>
@@ -6505,7 +6454,7 @@
         <w:jc w:val="both"/>
       </w:pPr>
       <w:r>
-        <w:t>Von den 143 Aktivitäten sind 89 automatisiert, regelbasiert oder Nachrichten der Plattform, also rund 62 Prozent. 34 weitere sind Benutzer-Aktivitäten in der Plattform. Neun manuelle Aktivitäten liegen außerhalb der Software, zehn rufen einen anderen Prozess auf, und eine ist der Mehrfach-Teilprozess für die Prüfung je Ersatzteil. Die Software automatisiert vor allem:</w:t>
+        <w:t>Von den 133 Aktivitäten sind 81 automatisiert, regelbasiert oder Nachrichten der Plattform, also rund 61 Prozent. 33 weitere sind Benutzer-Aktivitäten in der Plattform. Neun manuelle Aktivitäten liegen außerhalb der Software, neun rufen einen anderen Prozess auf, und eine ist der Mehrfach-Teilprozess für die Prüfung je Ersatzteil. Die Software automatisiert vor allem:</w:t>
       </w:r>
     </w:p>
     <w:p>
@@ -6575,20 +6524,10 @@
     </w:p>
     <w:p>
       <w:pPr>
-        <w:spacing w:after="60" w:line="264" w:lineRule="auto"/>
-        <w:jc w:val="both"/>
-      </w:pPr>
-      <w:r>
-        <w:t xml:space="preserve">Manuell bleiben bewusst die neun Arbeiten am Gerät und an der Ware: Sichtprüfung, Kennzeichnen und Einlagern sowie der Transport zu einer anderen Filiale bei der Annahme, die Reparatur und Nacharbeit selbst, die Mangelprüfung bei einer Reklamation, das Holen aus dem Lager und die Übergabe an den Kunden sowie das Verpacken und Versenden einer Retoure. Sie liegen nach Abschnitt 2.3 außerhalb der Systemgrenze; RepairFlow erfasst nur ihr Ergebnis, zum Beispiel den Reparaturschritt mit Arbeitszeit.</w:t>
-      </w:r>
-    </w:p>
-    <w:p>
-      <w:pPr>
         <w:pStyle w:val="berschrift2"/>
         <w:keepNext/>
       </w:pPr>
       <w:r>
-        <w:lastRenderedPageBreak/>
         <w:t>5.3 Use-Case-Diagramm</w:t>
       </w:r>
     </w:p>
@@ -6598,7 +6537,7 @@
         <w:jc w:val="both"/>
       </w:pPr>
       <w:r>
-        <w:t>Das Use-Case-Diagramm (Abbildung 4) zeigt, was RepairFlow aus Sicht seiner Benutzer leistet. Es enthält 19 Use Cases und 17 Akteure: den Kunden, 15 Mitarbeiterrollen und den KI-Diagnosedienst als externes System. Der Lieferant ist kein Akteur, sondern eine Black Box ohne Zugang zu RepairFlow; wie in den Prozessmodellen kommt er nur über Nachrichten vor. Jeder direkt ausgelöste Use Case hat genau eine Rolle als primären Akteur; die Nummern UC01 bis UC19 dienen nur der Zuordnung in den Tabellen, im Diagramm stehen die Namen. Diese Struktur geht auf einen Hinweis des Dozenten vom 15.10.2026 zurück: Unsere erste Fassung hatte acht Akteure mit bis zu acht Verbindungen, etwa den Techniker an Diagnosevorschlag, Diagnosebefund, KVA, Reparatur und Fertigmeldung. Statt eines Akteurs mit vielen Linien gibt es jetzt je Use Case eine Rolle, zum Beispiel Diagnoseprüfer, Diagnostiker, Kalkulator, Reparateur und Endkontrolleur anstelle des Technikers. Welche Person eine Rolle ausfüllt, regelt das Organigramm des Werkstattbetriebs; im Modell sind das die Unterklassen von Mitarbeiter (Tabelle 7). Der Kunde ist einmal dargestellt und mit UC01, UC02 und UC07 verbunden. UC08 „Ersatzteil-Verfügbarkeit prüfen“ wird nur über include erreicht und hat deshalb keinen eigenen Akteur.</w:t>
+        <w:t xml:space="preserve">Das Use-Case-Diagramm (Abbildung 4) zeigt, was RepairFlow aus Sicht seiner Benutzer leistet. Es enthält 19 Use Cases und 17 Akteure: den Kunden, 15 Mitarbeiterrollen und den KI-Diagnosedienst als externes System. Der Lieferant ist kein Akteur, sondern eine Black Box ohne Zugang zu RepairFlow; wie in den Prozessmodellen kommt er nur über Nachrichten vor. Jeder Use Case hat genau eine Rolle als primären Akteur; die Nummern UC01 bis UC19 dienen nur der Zuordnung in den Tabellen, im Diagramm stehen die Namen. Diese Struktur geht auf einen Hinweis des Dozenten vom 15.10.2026 zurück: Unsere erste Fassung hatte acht Akteure mit bis zu acht Verbindungen, etwa den Techniker an Diagnose, KVA, Reparatur, Fertigmeldung und Reklamation. Statt eines Akteurs mit vielen Linien gibt es jetzt je Use Case eine Rolle, zum Beispiel Diagnoseprüfer, Diagnostiker, Kalkulator, Reparateur und Endkontrolleur anstelle des Technikers. Welche Person eine Rolle ausfüllt, regelt das Organigramm des Werkstattbetriebs; im Modell sind das die Unterklassen von Mitarbeiter (Tabelle 7). Der Kunde ist einmal dargestellt und mit UC01, UC02 und UC07 verbunden. UC08 „Ersatzteil-Verfügbarkeit prüfen“ wird nur über include erreicht und hat deshalb keinen eigenen Akteur.</w:t>
       </w:r>
     </w:p>
     <w:tbl>
@@ -6619,10 +6558,10 @@
         <w:tblLook w:val="04A0" w:firstRow="1" w:lastRow="0" w:firstColumn="1" w:lastColumn="0" w:noHBand="0" w:noVBand="1"/>
       </w:tblPr>
       <w:tblGrid>
-        <w:gridCol w:w="2197"/>
-        <w:gridCol w:w="3365"/>
-        <w:gridCol w:w="1899"/>
-        <w:gridCol w:w="1899"/>
+        <w:gridCol w:w="2200"/>
+        <w:gridCol w:w="3360"/>
+        <w:gridCol w:w="1900"/>
+        <w:gridCol w:w="1900"/>
       </w:tblGrid>
       <w:tr>
         <w:trPr>
@@ -6653,6 +6592,7 @@
                 <w:sz w:val="19"/>
                 <w:szCs w:val="19"/>
               </w:rPr>
+              <w:lastRenderedPageBreak/>
               <w:t>Rolle (Akteur)</w:t>
             </w:r>
           </w:p>
@@ -8522,7 +8462,7 @@
                 <w:sz w:val="19"/>
                 <w:szCs w:val="19"/>
               </w:rPr>
-              <w:t>Business Rule Task „KI-Diagnosevorschlag erstellen“ in Prozess 01 (Lane Service / Annahme)</w:t>
+              <w:t>Nachrichtenfluss in Prozess 01</w:t>
             </w:r>
           </w:p>
         </w:tc>
@@ -8550,7 +8490,6 @@
         <w:jc w:val="both"/>
       </w:pPr>
       <w:r>
-        <w:lastRenderedPageBreak/>
         <w:t>Zwei include-Beziehungen stehen für Teilschritte, die immer ausgeführt werden: „Sofortdiagnose anfordern“ und „Ersatzteile disponieren und reservieren“ schließen „Ersatzteil-Verfügbarkeit prüfen“ ein. Sechs extend-Beziehungen beschreiben bedingtes Verhalten. So erweitert „Lieferantenbestellung auslösen“ die Disposition nur, wenn Fehlteile vorhanden sind, und „Retoure abwickeln“ den Wareneingang nur bei mangelhafter Lieferung.</w:t>
       </w:r>
     </w:p>
@@ -8567,7 +8506,7 @@
         <w:lastRenderedPageBreak/>
         <w:drawing>
           <wp:inline distT="0" distB="0" distL="0" distR="0" wp14:anchorId="768D9E83" wp14:editId="3206FFA0">
-            <wp:extent cx="3021910" cy="7919998"/>
+            <wp:extent cx="3021910" cy="7920000"/>
             <wp:effectExtent l="0" t="0" r="0" b="0"/>
             <wp:docPr id="200" name="Picture 200"/>
             <wp:cNvGraphicFramePr>
@@ -8589,7 +8528,7 @@
                   <pic:spPr>
                     <a:xfrm>
                       <a:off x="0" y="0"/>
-                      <a:ext cx="3021910" cy="7919998"/>
+                      <a:ext cx="3021910" cy="7920000"/>
                     </a:xfrm>
                     <a:prstGeom prst="rect">
                       <a:avLst/>
@@ -8606,6 +8545,8 @@
       <w:pPr>
         <w:spacing w:before="60" w:after="200"/>
         <w:jc w:val="center"/>
+      </w:pPr>
+      <w:r>
         <w:rPr>
           <w:i/>
           <w:iCs/>
@@ -8613,24 +8554,8 @@
           <w:sz w:val="18"/>
           <w:szCs w:val="18"/>
         </w:rPr>
-      </w:pPr>
-      <w:r>
-        <w:rPr>
-          <w:i/>
-          <w:iCs/>
-          <w:color w:val="595959"/>
-          <w:sz w:val="18"/>
-          <w:szCs w:val="18"/>
-        </w:rPr>
-        <w:t xml:space="preserve">Abbildung 4: Use-Case-Diagramm RepairFlow</w:t>
-        <w:br/>
-      </w:r>
-    </w:p>
-    <w:p>
-      <w:pPr>
-        <w:spacing w:before="60" w:after="200"/>
-        <w:jc w:val="center"/>
-      </w:pPr>
+        <w:t>Abbildung 4: Use-Case-Diagramm RepairFlow</w:t>
+      </w:r>
     </w:p>
     <w:p>
       <w:pPr>
@@ -8638,7 +8563,6 @@
         <w:keepNext/>
       </w:pPr>
       <w:r>
-        <w:lastRenderedPageBreak/>
         <w:t>5.4 Klassendiagramm</w:t>
       </w:r>
     </w:p>
@@ -8648,7 +8572,7 @@
         <w:jc w:val="both"/>
       </w:pPr>
       <w:r>
-        <w:t xml:space="preserve">Das Klassendiagramm (Abbildung 5) umfasst 29 Klassen, darunter die abstrakten Klassen Person und Mitarbeiter, sowie sieben Aufzählungen und 40 Assoziationen. Wichtige Entwurfsentscheidungen sind:</w:t>
+        <w:t>Das Klassendiagramm (Abbildung 5) umfasst 27 Klassen, darunter die abstrakten Klassen Person und Mitarbeiter, sowie sieben Aufzählungen und 36 Assoziationen. Wichtige Entwurfsentscheidungen sind:</w:t>
       </w:r>
     </w:p>
     <w:p>
@@ -8665,6 +8589,7 @@
           <w:b/>
           <w:bCs/>
         </w:rPr>
+        <w:lastRenderedPageBreak/>
         <w:t xml:space="preserve">Reparaturauftrag im Zentrum. </w:t>
       </w:r>
       <w:r>
@@ -8728,27 +8653,7 @@
         <w:t xml:space="preserve">Mandant und Rollen. </w:t>
       </w:r>
       <w:r>
-        <w:t>Der Werkstattbetrieb steht als Mandant über Filialen und Mitarbeitern. Die Unterklassen von Mitarbeiter (Servicemitarbeiter, Techniker, Disponent, Werkstattleiter) entsprechen den Lanes, bündeln die 14 Mitarbeiterrollen des Use-Case-Diagramms (Tabelle 7) und tragen die Operationen dieser Rollen. Der Betriebsadministrator wirkt direkt auf den Mandanten Werkstattbetrieb.</w:t>
-      </w:r>
-    </w:p>
-    <w:p>
-      <w:pPr>
-        <w:pStyle w:val="Listenabsatz"/>
-        <w:numPr>
-          <w:ilvl w:val="0"/>
-          <w:numId w:val="2"/>
-        </w:numPr>
-        <w:spacing w:after="60" w:line="264" w:lineRule="auto"/>
-      </w:pPr>
-      <w:r>
-        <w:rPr>
-          <w:b/>
-          <w:bCs/>
-        </w:rPr>
-        <w:t xml:space="preserve">Oberflächen als Klassen. </w:t>
-      </w:r>
-      <w:r>
-        <w:t xml:space="preserve">Zwischen den Benutzern und den Fachobjekten stehen zwei Oberflächenklassen: Der Kunde arbeitet in der KundenApp, die Mitarbeiter in der Werkstattoberfläche. Ihre Methoden entsprechen den Aktionen der Benutzer, zum Beispiel gibKvaFrei() oder meldeFertig(). Ein Benutzer gibt dabei keine Objekte ein, sondern Merkmale wie die Auftragsnummer. Die Oberfläche sucht das Objekt über den Werkstattbetrieb, der als Mandant alle Aufträge und Reklamationen seiner Filialen kennt (sucheAuftrag()), und arbeitet mit dem zurückgegebenen Objekt weiter. Der Kunde findet über sucheAuftrag() nur seine eigenen Aufträge.</w:t>
+        <w:t>Der Werkstattbetrieb steht als Mandant über Filialen und Mitarbeitern. Die Unterklassen von Mitarbeiter (Servicemitarbeiter, Techniker, Disponent, Werkstattleiter) entsprechen den Lanes, bündeln die Rollen des Use-Case-Diagramms (Tabelle 7) und tragen die Operationen dieser Rollen.</w:t>
       </w:r>
     </w:p>
     <w:p>
@@ -8772,6 +8677,7 @@
       <w:r>
         <w:rPr>
           <w:b/>
+          <w:bCs/>
         </w:rPr>
         <w:t xml:space="preserve">Nacharbeit als neuer Auftrag. </w:t>
       </w:r>
@@ -8791,10 +8697,10 @@
         </w:rPr>
         <w:lastRenderedPageBreak/>
         <w:drawing>
-          <wp:inline distT="0" distB="0" distL="0" distR="0" wp14:anchorId="128BF440" wp14:editId="79A6FDDA">
-            <wp:extent cx="7578721" cy="5750609"/>
-            <wp:effectExtent l="0" t="0" r="3810" b="3810"/>
-            <wp:docPr id="1600717457" name="Grafik 4"/>
+          <wp:inline distT="0" distB="0" distL="0" distR="0" wp14:anchorId="51897684" wp14:editId="2194742E">
+            <wp:extent cx="6984737" cy="5472000"/>
+            <wp:effectExtent l="0" t="0" r="0" b="0"/>
+            <wp:docPr id="201" name="Picture 201"/>
             <wp:cNvGraphicFramePr>
               <a:graphicFrameLocks xmlns:a="http://schemas.openxmlformats.org/drawingml/2006/main" noChangeAspect="1"/>
             </wp:cNvGraphicFramePr>
@@ -8802,17 +8708,11 @@
               <a:graphicData uri="http://schemas.openxmlformats.org/drawingml/2006/picture">
                 <pic:pic xmlns:pic="http://schemas.openxmlformats.org/drawingml/2006/picture">
                   <pic:nvPicPr>
-                    <pic:cNvPr id="1600717457" name="Grafik 1600717457"/>
+                    <pic:cNvPr id="0" name="klassendiagramm.png"/>
                     <pic:cNvPicPr/>
                   </pic:nvPicPr>
                   <pic:blipFill>
-                    <a:blip r:embed="rId13" cstate="print">
-                      <a:extLst>
-                        <a:ext uri="{28A0092B-C50C-407E-A947-70E740481C1C}">
-                          <a14:useLocalDpi xmlns:a14="http://schemas.microsoft.com/office/drawing/2010/main" val="0"/>
-                        </a:ext>
-                      </a:extLst>
-                    </a:blip>
+                    <a:blip r:embed="rId13"/>
                     <a:stretch>
                       <a:fillRect/>
                     </a:stretch>
@@ -8820,7 +8720,7 @@
                   <pic:spPr>
                     <a:xfrm>
                       <a:off x="0" y="0"/>
-                      <a:ext cx="7587707" cy="5750609"/>
+                      <a:ext cx="6984737" cy="5472000"/>
                     </a:xfrm>
                     <a:prstGeom prst="rect">
                       <a:avLst/>
@@ -8873,7 +8773,7 @@
         <w:jc w:val="both"/>
       </w:pPr>
       <w:r>
-        <w:t xml:space="preserve">Für sechs Use Cases haben wir Sequenzdiagramme erstellt, gefordert waren fünf (Tabelle 8). Jedes folgt einem Prozess. Die erste Lebenslinie ist die Rolle des Use Case aus Abbildung 4; weitere beteiligte Rollen tragen ihren Namen aus dem Use-Case-Diagramm; der Werkstattleiter, für dessen Freigaben es im Use-Case-Diagramm keine eigene Rolle gibt, erscheint als Objekt seiner Klasse (:Werkstattleiter) mit seinen Operationen. Die Rolle spricht nie direkt mit dem Fachobjekt, sondern immer mit der Oberfläche (:KundenApp oder :Werkstattoberflaeche). Die Oberfläche öffnet das benötigte Objekt über seine Nummer, ruft dessen Operationen auf und zeigt das Ergebnis an (anzeigenErgebnis()). Wo zwischen zwei Schritten Zeit vergeht, etwa nach einer Nacharbeit, wird das Objekt neu gesucht. Der Lieferant liegt außerhalb des Systems, Nachrichten an ihn sind in SD6 Lost bzw. Found Messages. Die übrigen Lebenslinien sind Objekte der Klassen, Botschaften an Objekte sind Operationen des Klassendiagramms. Kombinierte Fragmente bilden Verzweigungen (alt, opt), Schleifen (loop) und Verweise auf andere Use Cases (ref) ab.</w:t>
+        <w:t xml:space="preserve">Für sechs Use Cases haben wir Sequenzdiagramme erstellt, gefordert waren fünf (Tabelle 8). Jedes folgt einem Prozess. Die erste Lebenslinie ist die Rolle des Use Case aus Abbildung 4; weitere beteiligte Rollen tragen ihren Namen aus dem Use-Case-Diagramm; der Werkstattleiter, der dort keine Rolle hat, erscheint als Objekt seiner Klasse (: Werkstattleiter) mit seinen Operationen. Der Lieferant liegt außerhalb des Systems, Nachrichten an ihn sind in SD6 Lost bzw. Found Messages. Die übrigen Lebenslinien sind Objekte der Klassen, Botschaften an Objekte sind Operationen des Klassendiagramms. Kombinierte Fragmente bilden Verzweigungen (alt, opt), Schleifen (loop), Abbrüche (break) und Verweise auf andere Use Cases (ref) ab.</w:t>
       </w:r>
     </w:p>
     <w:tbl>
@@ -9117,7 +9017,7 @@
                 <w:sz w:val="19"/>
                 <w:szCs w:val="19"/>
               </w:rPr>
-              <w:t xml:space="preserve">Medienprüfung mit Nachreichen; ohne neue Aufnahme nach sieben Tagen wird die Voranmeldung verworfen, sonst KI-Vorschlag, vorläufiger KVA, Vorreservierung erst nach Bestätigung. Bei Ablehnung oder nach sieben Tagen ohne Antwort wird die Voranmeldung verworfen</w:t>
+              <w:t>Medienprüfung mit Nachreichen, KI-Vorschlag, vorläufiger KVA, Terminvorschlag, Vorreservierung erst nach Bestätigung</w:t>
             </w:r>
           </w:p>
         </w:tc>
@@ -9222,7 +9122,7 @@
                 <w:sz w:val="19"/>
                 <w:szCs w:val="19"/>
               </w:rPr>
-              <w:t>Versand, Erinnerung nach je drei Tagen, Ablehnung mit Reparaturabsage nach dem dritten Fristablauf, Freigabe startet die Disposition, Ablehnung führt zur Abholung; sind nach der Freigabe nicht alle Teile beschaffbar, wird der Auftrag abgelehnt und das Gerät zur Abholung gegeben</w:t>
+              <w:t>Versand, Erinnerung nach je drei Tagen, Ablehnung nach dem dritten Fristablauf, Freigabe startet die Disposition, Ablehnung führt zur Abholung</w:t>
             </w:r>
           </w:p>
         </w:tc>
@@ -9327,7 +9227,7 @@
                 <w:sz w:val="19"/>
                 <w:szCs w:val="19"/>
               </w:rPr>
-              <w:t>Prüfung je Teil in einer Schleife: eigener Bestand, andere Filiale nur bei zu wenig eigenem Bestand, sonst Fehlteil; Vorreservierung aus der Sofortdiagnose; Meldebestand; Reparaturbeginn nur bei der ersten Disposition; Fehlteile führen zu UC10</w:t>
+              <w:t>Prüfung je Teil in einer Schleife: eigener Bestand, andere Filiale oder Fehlteil; Vorreservierung aus der Sofortdiagnose; Meldebestand; Fehlteile führen zu UC10</w:t>
             </w:r>
           </w:p>
         </w:tc>
@@ -9537,7 +9437,7 @@
                 <w:sz w:val="19"/>
                 <w:szCs w:val="19"/>
               </w:rPr>
-              <w:t>Mangelprüfung und Gewährleistung; sonst Angebot an den Kunden mit Annahme, Ablehnung oder drei Tagen ohne Antwort. Vor der Nacharbeit Disposition (ref UC09), bei nicht beschaffbaren Teilen Absage über die Werkstattoberfläche</w:t>
+              <w:t>Mangelprüfung, Gewährleistung, Nacharbeitsauftrag nur nach Freigabe oder Annahme</w:t>
             </w:r>
           </w:p>
         </w:tc>
@@ -9642,7 +9542,7 @@
                 <w:sz w:val="19"/>
                 <w:szCs w:val="19"/>
               </w:rPr>
-              <w:t>Bündelung, Freigabe durch den Werkstattleiter ab Freigabegrenze, Bestellung; ohne Bestätigung innerhalb von drei Tagen, bei nicht lieferbaren Teilen oder nach zwei erfolglosen Mahnungen Storno, sonst Wareneingang; Nachrichten an den Lieferanten als Lost Messages, die Auftragsbestätigung als Found Message</w:t>
+              <w:t>Bündelung, Freigabe durch den Werkstattleiter ab Freigabegrenze, Bestellung, Bestätigung oder Storno nach zwei Mahnungen; Nachrichten an den Lieferanten als Lost Messages</w:t>
             </w:r>
           </w:p>
         </w:tc>
@@ -9685,10 +9585,10 @@
         </w:rPr>
         <w:lastRenderedPageBreak/>
         <w:drawing>
-          <wp:inline distT="0" distB="0" distL="0" distR="0" wp14:anchorId="307C6272" wp14:editId="33E880EE">
-            <wp:extent cx="5782310" cy="4071513"/>
+          <wp:inline distT="0" distB="0" distL="0" distR="0" wp14:anchorId="5739D476" wp14:editId="6098A535">
+            <wp:extent cx="5760000" cy="4820068"/>
             <wp:effectExtent l="0" t="0" r="0" b="0"/>
-            <wp:docPr id="248347308" name="Grafik 5"/>
+            <wp:docPr id="202" name="Picture 202"/>
             <wp:cNvGraphicFramePr>
               <a:graphicFrameLocks xmlns:a="http://schemas.openxmlformats.org/drawingml/2006/main" noChangeAspect="1"/>
             </wp:cNvGraphicFramePr>
@@ -9696,17 +9596,11 @@
               <a:graphicData uri="http://schemas.openxmlformats.org/drawingml/2006/picture">
                 <pic:pic xmlns:pic="http://schemas.openxmlformats.org/drawingml/2006/picture">
                   <pic:nvPicPr>
-                    <pic:cNvPr id="248347308" name="Grafik 248347308"/>
+                    <pic:cNvPr id="0" name="sequenz-01-sofortdiagnose.png"/>
                     <pic:cNvPicPr/>
                   </pic:nvPicPr>
                   <pic:blipFill>
-                    <a:blip r:embed="rId16" cstate="print">
-                      <a:extLst>
-                        <a:ext uri="{28A0092B-C50C-407E-A947-70E740481C1C}">
-                          <a14:useLocalDpi xmlns:a14="http://schemas.microsoft.com/office/drawing/2010/main" val="0"/>
-                        </a:ext>
-                      </a:extLst>
-                    </a:blip>
+                    <a:blip r:embed="rId16"/>
                     <a:stretch>
                       <a:fillRect/>
                     </a:stretch>
@@ -9714,7 +9608,7 @@
                   <pic:spPr>
                     <a:xfrm>
                       <a:off x="0" y="0"/>
-                      <a:ext cx="5782310" cy="4071513"/>
+                      <a:ext cx="5760000" cy="4820068"/>
                     </a:xfrm>
                     <a:prstGeom prst="rect">
                       <a:avLst/>
@@ -9753,11 +9647,12 @@
         <w:rPr>
           <w:noProof/>
         </w:rPr>
+        <w:lastRenderedPageBreak/>
         <w:drawing>
-          <wp:inline distT="0" distB="0" distL="0" distR="0" wp14:anchorId="05AB1227" wp14:editId="6271697B">
-            <wp:extent cx="5782310" cy="3682770"/>
+          <wp:inline distT="0" distB="0" distL="0" distR="0" wp14:anchorId="5B06C323" wp14:editId="2D78EA3C">
+            <wp:extent cx="5760000" cy="4324140"/>
             <wp:effectExtent l="0" t="0" r="0" b="0"/>
-            <wp:docPr id="5075578" name="Grafik 6"/>
+            <wp:docPr id="203" name="Picture 203"/>
             <wp:cNvGraphicFramePr>
               <a:graphicFrameLocks xmlns:a="http://schemas.openxmlformats.org/drawingml/2006/main" noChangeAspect="1"/>
             </wp:cNvGraphicFramePr>
@@ -9765,17 +9660,11 @@
               <a:graphicData uri="http://schemas.openxmlformats.org/drawingml/2006/picture">
                 <pic:pic xmlns:pic="http://schemas.openxmlformats.org/drawingml/2006/picture">
                   <pic:nvPicPr>
-                    <pic:cNvPr id="5075578" name="Grafik 5075578"/>
+                    <pic:cNvPr id="0" name="sequenz-03-reservierung.png"/>
                     <pic:cNvPicPr/>
                   </pic:nvPicPr>
                   <pic:blipFill>
-                    <a:blip r:embed="rId17" cstate="print">
-                      <a:extLst>
-                        <a:ext uri="{28A0092B-C50C-407E-A947-70E740481C1C}">
-                          <a14:useLocalDpi xmlns:a14="http://schemas.microsoft.com/office/drawing/2010/main" val="0"/>
-                        </a:ext>
-                      </a:extLst>
-                    </a:blip>
+                    <a:blip r:embed="rId17"/>
                     <a:stretch>
                       <a:fillRect/>
                     </a:stretch>
@@ -9783,7 +9672,7 @@
                   <pic:spPr>
                     <a:xfrm>
                       <a:off x="0" y="0"/>
-                      <a:ext cx="5782310" cy="3682770"/>
+                      <a:ext cx="5760000" cy="4324140"/>
                     </a:xfrm>
                     <a:prstGeom prst="rect">
                       <a:avLst/>
@@ -9818,7 +9707,6 @@
         <w:keepNext/>
       </w:pPr>
       <w:r>
-        <w:lastRenderedPageBreak/>
         <w:t>5.6 Konsistenz zwischen den Modellen</w:t>
       </w:r>
     </w:p>
@@ -9828,7 +9716,7 @@
         <w:jc w:val="both"/>
       </w:pPr>
       <w:r>
-        <w:t>Tabelle 9 ordnet jedem Prozess seine Use Cases, zentralen Klassen und Sequenzdiagramme zu. BPMN-Datenobjekte tragen die Klassennamen, jede Rolle des Use-Case-Diagramms gehört zu genau einer Lane und einer Mitarbeiterklasse; Ausnahmen zeigt Tabelle 7, und die Zustände des Reparaturauftrags folgen in allen Modellen AuftragStatus.</w:t>
+        <w:t>Tabelle 9 ordnet jedem Prozess seine Use Cases, zentralen Klassen und Sequenzdiagramme zu. BPMN-Datenobjekte tragen die Klassennamen, jede Rolle des Use-Case-Diagramms gehört zu genau einer Lane und einer Mitarbeiterklasse (Tabelle 7), und die Zustände des Reparaturauftrags folgen in allen Modellen AuftragStatus.</w:t>
       </w:r>
     </w:p>
     <w:tbl>
@@ -9883,6 +9771,7 @@
                 <w:sz w:val="19"/>
                 <w:szCs w:val="19"/>
               </w:rPr>
+              <w:lastRenderedPageBreak/>
               <w:t>Prozess (BPMN)</w:t>
             </w:r>
           </w:p>
@@ -11045,7 +10934,9 @@
         <w:jc w:val="both"/>
       </w:pPr>
       <w:r>
-        <w:rPr/>
+        <w:rPr>
+          <w:i/>
+        </w:rPr>
         <w:t>Die Fristen sind festgelegt: Ein nicht abgeholtes Gerät wird nach der vierten Erinnerung verwertet, eine offene Rechnung nach der dritten erfolglosen Mahnung an das Inkasso übergeben und eine Bestellung nach der zweiten erfolglosen Liefermahnung storniert. Verwertete Geräte erhalten keinen eigenen Wert in AuftragStatus, weil die Verwertung ein Prozessende in Prozess 08 ist und kein Zustand des Auftrags.</w:t>
       </w:r>
     </w:p>
@@ -11072,7 +10963,7 @@
         <w:t xml:space="preserve">Perspektive. </w:t>
       </w:r>
       <w:r>
-        <w:t>In der ersten Fassung waren wir gleichzeitig Werkstatt und Softwareanbieter. Erst die Rückfrage des Dozenten hat uns dazu gebracht, das zu klären. Die Prozesse blieben gültig, Texte, Use Cases und Klassenmodell mussten wir aber anpassen.</w:t>
+        <w:t>In der ersten Fassung waren wir gleichzeitig Werkstatt und Softwareanbieter. Erst die Rückfrage des Dozenten hat uns dazu gebracht, das zu klären. Die Prozesse blieben gültig, Texte, Use Cases und Klassenmodell (Mandant) mussten wir aber anpassen.</w:t>
       </w:r>
     </w:p>
     <w:p>
@@ -11104,7 +10995,7 @@
         <w:t xml:space="preserve">Lücken zwischen den Prozessen. </w:t>
       </w:r>
       <w:r>
-        <w:t xml:space="preserve">Eine Kontrolle am 05.10.2026 zeigte, dass abgelehnte Aufträge nie abgeholt wurden und Warteschleifen keinen Ausstieg hatten. Seitdem läuft jede Rückgabe über Prozess 08, und jede Warteschleife hat einen Ausstieg.</w:t>
+        <w:t>Die Prüfung am 05.10.2026 zeigte, dass abgelehnte Aufträge nie abgeholt wurden und Warteschleifen keinen Ausstieg hatten. Seitdem läuft jede Rückgabe über Prozess 08, und jede Warteschleife hat einen Ausstieg.</w:t>
       </w:r>
     </w:p>
     <w:p>
@@ -11137,7 +11028,7 @@
         <w:t xml:space="preserve">Werkzeuge. </w:t>
       </w:r>
       <w:r>
-        <w:t xml:space="preserve">Visual Paradigm war unser größtes Werkzeugproblem. Vier von sechs Gruppenmitgliedern arbeiten mit Firmen-Laptops, auf denen keine zusätzlichen Programme installiert werden dürfen; wir konnten Visual Paradigm nicht nutzen. Die gesamte UML-Arbeit lag damit bei zwei Personen, die übrigen haben die Diagramme anhand der Exporte geprüft. Dazu kommt, dass der Teamwork-Server der DHBW nur über das Lehre-VPN erreichbar ist.</w:t>
+        <w:t xml:space="preserve">Visual Paradigm war unser größtes Werkzeugproblem. Vier von sechs Gruppenmitgliedern arbeiten mit Firmen-Laptops, auf denen keine zusätzlichen Programme installiert werden dürfen; sie konnten Visual Paradigm nicht nutzen. Die gesamte UML-Arbeit lag damit bei zwei Personen, die übrigen haben die Diagramme anhand der Exporte geprüft. Dazu kommt, dass der Teamwork-Server der DHBW nur über das Lehre-VPN erreichbar ist. </w:t>
       </w:r>
     </w:p>
     <w:p>
@@ -11153,7 +11044,7 @@
         <w:t xml:space="preserve">Überschriebene Diagramme. </w:t>
       </w:r>
       <w:r>
-        <w:t>Viel Zeit hat uns ein Fehler beim Abgleich mit dem Teamwork-Server gekostet: Beim Update wurden das Use-Case-Diagramm und das Klassendiagramm mit älteren Versionen aus dem Repository überlagert. Aktuelle und alte Elemente lagen danach übereinander, Beziehungen waren doppelt vorhanden, und ein Aufräumen von Hand brachte bei jedem weiteren Abgleich neue Überlagerungen. Lösbar war das nur, indem wir beide Diagramme im Repository vollständig neu angelegt haben. Seitdem gilt: vor jeder Sitzung Update, nach jeder Änderung sofort Commit, und nie zwei Personen gleichzeitig im selben Diagramm.</w:t>
+        <w:t xml:space="preserve">Viel Zeit hat uns ein Fehler beim Abgleich mit dem Teamwork-Server gekostet: Beim Update wurden das Use-Case-Diagramm und das Klassendiagramm mit älteren Versionen aus dem Repository überlagert. Aktuelle und alte Elemente lagen danach übereinander, Beziehungen waren doppelt vorhanden, und ein Aufräumen von Hand brachte bei jedem weiteren Abgleich neue Überlagerungen. Lösbar war das nur, indem wir beide Diagramme im Repository vollständig neu angelegt haben. Seitdem gilt: vor jeder Sitzung Update, nach jeder Änderung sofort Commit, und nie zwei Personen gleichzeitig im selben Diagramm. </w:t>
       </w:r>
     </w:p>
     <w:p>
@@ -11169,7 +11060,7 @@
         <w:t xml:space="preserve">Camunda Modeler. </w:t>
       </w:r>
       <w:r>
-        <w:t>Der Modeler meldet für Camunda 8 fehlende technische Angaben wie Task-Definitionen oder Timer-Ausdrücke als Fehler. Wir haben die Diagramme entsprechend ergänzt, bis das Problems-Panel keine Einträge mehr zeigte.</w:t>
+        <w:t xml:space="preserve">Der Modeler meldet für Camunda 8 fehlende technische Angaben wie Task-Definitionen oder Timer-Ausdrücke als Fehler. Wir haben die Diagramme entsprechend ergänzt, bis das Problems-Panel keine Einträge mehr zeigte. </w:t>
       </w:r>
     </w:p>
     <w:p>
@@ -11185,7 +11076,7 @@
         <w:t xml:space="preserve">Zusammenarbeit. </w:t>
       </w:r>
       <w:r>
-        <w:t xml:space="preserve">Am 05.10.2026 legten zwei Pull Requests in unserem privaten Repository parallel eine Entscheidung mit derselben Nummer an. Die Konflikte wurden an zwei Stellen gleichzeitig gelöst. Seitdem holen wir vor jeder neuen Entscheidung den aktuellen Stand und nehmen die nächste freie Nummer.</w:t>
+        <w:t>Am 05.10.2026 legten zwei Pull Requests parallel eine Entscheidung mit derselben Nummer an. Die Konflikte wurden an zwei Stellen gleichzeitig gelöst. Seitdem holen wir vor jeder neuen Entscheidung den aktuellen Stand und nehmen die nächste freie Nummer.</w:t>
       </w:r>
     </w:p>
     <w:p>
@@ -11222,15 +11113,7 @@
         <w:jc w:val="both"/>
       </w:pPr>
       <w:r>
-        <w:t xml:space="preserve">Im Coaching am 15.10.2026 sah der Dozent das Use-Case-Diagramm als zu stark vernetzt an: Einzelne Akteure hingen an bis zu acht Use Cases. Sein Vorschlag war, je Use Case eine Rolle anzustreben, Akteure bei Bedarf mehrfach darzustellen und die Zuordnung der Rollen zu Personen einem Organigramm zu überlassen. Wir haben das Diagramm auf 15 Mitarbeiterrollen umgebaut und die Rollen in Tabelle 7 den Klassen und Lanes zugeordnet (Abschnitt 5.3).</w:t>
-      </w:r>
-    </w:p>
-    <w:p>
-      <w:pPr>
-        <w:jc w:val="both"/>
-      </w:pPr>
-      <w:r>
-        <w:t>Im Coaching am 22.10.2026 wies der Dozent darauf hin, dass in den Sequenzdiagrammen zwischen Akteur und Fachobjekt ein Objekt der Benutzeroberfläche fehlt und dass offen bleibt, wie die Oberfläche an das richtige Objekt kommt. Wir haben die Klassen KundenApp und Werkstattoberflaeche mit den Methoden der Benutzeraktionen ergänzt und den Werkstattbetrieb um Suchoperationen erweitert, die zu einer eingegebenen Nummer das Objekt liefern. Alle sechs Sequenzdiagramme folgen jetzt dem Muster Akteur, Oberfläche, Fachobjekt (Abschnitte 5.4 und 5.5).</w:t>
+        <w:t>Im Coaching am 15.10.2026 sah der Dozent das Use-Case-Diagramm als zu verbunden an: Einzelne Akteure hingen an bis zu acht Use Cases. Sein Vorschlag war, je Use Case eine Rolle anzustreben, Akteure bei Bedarf mehrfach darzustellen und die Zuordnung der Rollen zu Personen einem Organigramm zu überlassen. Wir haben das Diagramm auf 15 Mitarbeiterrollen umgebaut und die Rollen in Tabelle 7 den Klassen und Lanes zugeordnet (Abschnitt 5.3).</w:t>
       </w:r>
     </w:p>
     <w:p>
@@ -11248,7 +11131,7 @@
         <w:jc w:val="both"/>
       </w:pPr>
       <w:r>
-        <w:t>Am meisten gebracht hat uns, ein Szenario durchgehend von der Prozessanalyse bis zum Sequenzdiagramm zu modellieren. Erst dabei wurde sichtbar, wie eng BPMN, Use Cases und Klassenmodell zusammenhängen. Die Reviews im Zweierteam und die gemeinsamen Prüfungen in den Gruppenterminen haben mehr Fehler gefunden, als wir beim Modellieren selbst bemerkt hätten.</w:t>
+        <w:t xml:space="preserve">Am meisten gebracht hat uns, ein Szenario durchgehend von der Prozessanalyse bis zum Sequenzdiagramm zu modellieren. Erst dabei wurde sichtbar, wie eng BPMN, Use Cases und Klassenmodell zusammenhängen. Die Reviews im Zweierteam und die gemeinsamen Prüfungen in den Gruppenterminen haben mehr Fehler gefunden, als wir beim Modellieren selbst bemerkt hätten. </w:t>
       </w:r>
     </w:p>
     <w:p>
@@ -11502,23 +11385,13 @@
       </w:pBdr>
       <w:jc w:val="right"/>
     </w:pPr>
-    <w:proofErr w:type="spellStart"/>
     <w:r>
       <w:rPr>
         <w:color w:val="595959"/>
         <w:sz w:val="18"/>
         <w:szCs w:val="18"/>
       </w:rPr>
-      <w:t>RepairFlow</w:t>
-    </w:r>
-    <w:proofErr w:type="spellEnd"/>
-    <w:r>
-      <w:rPr>
-        <w:color w:val="595959"/>
-        <w:sz w:val="18"/>
-        <w:szCs w:val="18"/>
-      </w:rPr>
-      <w:t xml:space="preserve"> · Fallstudie Systemanalyse · WWI25B4 · Gruppe 1</w:t>
+      <w:t>RepairFlow · Fallstudie Systemanalyse · WWI25B4 · Gruppe 1</w:t>
     </w:r>
   </w:p>
 </w:hdr>
@@ -11533,23 +11406,13 @@
       </w:pBdr>
       <w:jc w:val="right"/>
     </w:pPr>
-    <w:proofErr w:type="spellStart"/>
     <w:r>
       <w:rPr>
         <w:color w:val="595959"/>
         <w:sz w:val="18"/>
         <w:szCs w:val="18"/>
       </w:rPr>
-      <w:t>RepairFlow</w:t>
-    </w:r>
-    <w:proofErr w:type="spellEnd"/>
-    <w:r>
-      <w:rPr>
-        <w:color w:val="595959"/>
-        <w:sz w:val="18"/>
-        <w:szCs w:val="18"/>
-      </w:rPr>
-      <w:t xml:space="preserve"> · Fallstudie Systemanalyse · WWI25B4 · Gruppe 1</w:t>
+      <w:t>RepairFlow · Fallstudie Systemanalyse · WWI25B4 · Gruppe 1</w:t>
     </w:r>
   </w:p>
 </w:hdr>
@@ -11564,23 +11427,13 @@
       </w:pBdr>
       <w:jc w:val="right"/>
     </w:pPr>
-    <w:proofErr w:type="spellStart"/>
     <w:r>
       <w:rPr>
         <w:color w:val="595959"/>
         <w:sz w:val="18"/>
         <w:szCs w:val="18"/>
       </w:rPr>
-      <w:t>RepairFlow</w:t>
-    </w:r>
-    <w:proofErr w:type="spellEnd"/>
-    <w:r>
-      <w:rPr>
-        <w:color w:val="595959"/>
-        <w:sz w:val="18"/>
-        <w:szCs w:val="18"/>
-      </w:rPr>
-      <w:t xml:space="preserve"> · Fallstudie Systemanalyse · WWI25B4 · Gruppe 1</w:t>
+      <w:t>RepairFlow · Fallstudie Systemanalyse · WWI25B4 · Gruppe 1</w:t>
     </w:r>
   </w:p>
 </w:hdr>
@@ -11805,7 +11658,7 @@
         <w:rFonts w:ascii="Calibri" w:eastAsia="Calibri" w:hAnsi="Calibri" w:cs="Calibri"/>
         <w:sz w:val="22"/>
         <w:szCs w:val="22"/>
-        <w:lang w:val="de-DE" w:eastAsia="en-GB" w:bidi="ar-SA"/>
+        <w:lang w:eastAsia="en-GB" w:bidi="ar-SA"/>
       </w:rPr>
     </w:rPrDefault>
     <w:pPrDefault/>
@@ -12422,18 +12275,6 @@
       <w:szCs w:val="20"/>
     </w:rPr>
   </w:style>
-  <w:style w:type="paragraph" w:customStyle="1" w:styleId="p1">
-    <w:name w:val="p1"/>
-    <w:basedOn w:val="Standard"/>
-    <w:rsid w:val="000102FA"/>
-    <w:rPr>
-      <w:rFonts w:ascii="Helvetica" w:eastAsia="Times New Roman" w:hAnsi="Helvetica" w:cs="Times New Roman"/>
-      <w:color w:val="000000"/>
-      <w:sz w:val="18"/>
-      <w:szCs w:val="18"/>
-      <w:lang w:eastAsia="de-DE"/>
-    </w:rPr>
-  </w:style>
 </w:styles>
 </file>
 

</xml_diff>

<commit_message>
fix: Doku auf Stand 17956fc zurueckgesetzt (bbe0967 hatte eine alte Fassung eingecheckt), Abb. 3 mit aktuellem P04-Export; VPP-Stand im UML-README
</commit_message>
<xml_diff>
--- a/3_doku/Projektdokumentation.docx
+++ b/3_doku/Projektdokumentation.docx
@@ -307,6 +307,10 @@
         </w:tabs>
         <w:spacing w:after="40"/>
         <w:ind w:left="400"/>
+        <w:rPr>
+          <w:sz w:val="20"/>
+          <w:szCs w:val="20"/>
+        </w:rPr>
       </w:pPr>
       <w:r>
         <w:rPr>
@@ -324,6 +328,24 @@
           <w:tab w:val="right" w:leader="dot" w:pos="9026"/>
         </w:tabs>
         <w:spacing w:after="40"/>
+        <w:ind w:left="400"/>
+      </w:pPr>
+      <w:r>
+        <w:rPr>
+          <w:sz w:val="20"/>
+          <w:szCs w:val="20"/>
+        </w:rPr>
+        <w:t>2.6 Ausblick</w:t>
+        <w:tab/>
+        <w:t>5</w:t>
+      </w:r>
+    </w:p>
+    <w:p>
+      <w:pPr>
+        <w:tabs>
+          <w:tab w:val="right" w:leader="dot" w:pos="9026"/>
+        </w:tabs>
+        <w:spacing w:after="40"/>
       </w:pPr>
       <w:r>
         <w:rPr>
@@ -421,7 +443,7 @@
         </w:rPr>
         <w:t>4.2 Sprintplan und Verlauf</w:t>
         <w:tab/>
-        <w:t>6</w:t>
+        <w:t>7</w:t>
       </w:r>
     </w:p>
     <w:p>
@@ -474,7 +496,7 @@
         </w:rPr>
         <w:t>5 Überblick über die erstellten Artefakte</w:t>
         <w:tab/>
-        <w:t>7</w:t>
+        <w:t>8</w:t>
       </w:r>
     </w:p>
     <w:p>
@@ -492,7 +514,7 @@
         </w:rPr>
         <w:t>5.1 Geschäftsprozessmodell (BPMN)</w:t>
         <w:tab/>
-        <w:t>7</w:t>
+        <w:t>8</w:t>
       </w:r>
     </w:p>
     <w:p>
@@ -510,7 +532,7 @@
         </w:rPr>
         <w:t>5.2 Automatisierungspotential</w:t>
         <w:tab/>
-        <w:t>10</w:t>
+        <w:t>11</w:t>
       </w:r>
     </w:p>
     <w:p>
@@ -528,7 +550,7 @@
         </w:rPr>
         <w:t>5.3 Use-Case-Diagramm</w:t>
         <w:tab/>
-        <w:t>10</w:t>
+        <w:t>12</w:t>
       </w:r>
     </w:p>
     <w:p>
@@ -546,7 +568,7 @@
         </w:rPr>
         <w:t>5.4 Klassendiagramm</w:t>
         <w:tab/>
-        <w:t>12</w:t>
+        <w:t>15</w:t>
       </w:r>
     </w:p>
     <w:p>
@@ -564,7 +586,7 @@
         </w:rPr>
         <w:t>5.5 Sequenzdiagramme</w:t>
         <w:tab/>
-        <w:t>15</w:t>
+        <w:t>17</w:t>
       </w:r>
     </w:p>
     <w:p>
@@ -582,7 +604,7 @@
         </w:rPr>
         <w:t>5.6 Konsistenz zwischen den Modellen</w:t>
         <w:tab/>
-        <w:t>17</w:t>
+        <w:t>18</w:t>
       </w:r>
     </w:p>
     <w:p>
@@ -599,7 +621,7 @@
         </w:rPr>
         <w:t>6 Probleme und Herausforderungen</w:t>
         <w:tab/>
-        <w:t>18</w:t>
+        <w:t>19</w:t>
       </w:r>
     </w:p>
     <w:p>
@@ -616,7 +638,7 @@
         </w:rPr>
         <w:t>7 Feedback</w:t>
         <w:tab/>
-        <w:t>19</w:t>
+        <w:t>20</w:t>
       </w:r>
     </w:p>
     <w:p>
@@ -634,7 +656,7 @@
         </w:rPr>
         <w:t>7.1 Feedback des Dozenten und Umsetzung</w:t>
         <w:tab/>
-        <w:t>19</w:t>
+        <w:t>20</w:t>
       </w:r>
     </w:p>
     <w:p>
@@ -652,7 +674,7 @@
         </w:rPr>
         <w:t>7.2 Unser Feedback zur Fallstudie</w:t>
         <w:tab/>
-        <w:t>19</w:t>
+        <w:t>21</w:t>
       </w:r>
     </w:p>
     <w:p>
@@ -867,7 +889,7 @@
                 <w:sz w:val="19"/>
                 <w:szCs w:val="19"/>
               </w:rPr>
-              <w:t>Gesamtplanung und Termine; Redaktion der Projektdokumentation (Abbildungen, PDF); Abgabe-Archiv</w:t>
+              <w:t>Gesamtplanung und Termine; Redaktion der Projektdokumentation; Abgabe-Archiv</w:t>
             </w:r>
           </w:p>
         </w:tc>
@@ -922,7 +944,7 @@
                 <w:sz w:val="19"/>
                 <w:szCs w:val="19"/>
               </w:rPr>
-              <w:t>Stellvertretende Projektleitung, Backup-Beauftragter</w:t>
+              <w:t>Stellvertretende Projektleitung, UML</w:t>
             </w:r>
           </w:p>
         </w:tc>
@@ -947,7 +969,7 @@
                 <w:sz w:val="19"/>
                 <w:szCs w:val="19"/>
               </w:rPr>
-              <w:t xml:space="preserve">Sicherung von Git-Repository und VP-Server; Use-Case-Diagramm und Sequenzdiagramme SD5 und SD6 in Visual Paradigm</w:t>
+              <w:t>Sicherung von Git-Repository und VP-Server; Use-Case-Diagramm und Sequenzdiagramme SD5 und SD6 in Visual Paradigm</w:t>
             </w:r>
           </w:p>
         </w:tc>
@@ -1107,24 +1129,7 @@
                 <w:sz w:val="19"/>
                 <w:szCs w:val="19"/>
               </w:rPr>
-              <w:t xml:space="preserve">Sprint-Rituale und Trello-Board; Klassendiagramm, SD1 </w:t>
-            </w:r>
-            <w:r>
-              <w:rPr>
-                <w:color w:val="000000"/>
-                <w:sz w:val="19"/>
-                <w:szCs w:val="19"/>
-                <w:lang w:val="de-DE"/>
-              </w:rPr>
-              <w:t>bis</w:t>
-            </w:r>
-            <w:r>
-              <w:rPr>
-                <w:color w:val="000000"/>
-                <w:sz w:val="19"/>
-                <w:szCs w:val="19"/>
-              </w:rPr>
-              <w:t xml:space="preserve"> SD4, Visual-Paradigm-Projekt und Konsistenz der UML-Modelle</w:t>
+              <w:t>Sprint-Rituale und Trello-Board; Klassendiagramm, SD1 bis SD4, Visual-Paradigm-Projekt und Konsistenz der UML-Modelle</w:t>
             </w:r>
           </w:p>
         </w:tc>
@@ -1277,9 +1282,6 @@
             <w:pPr>
               <w:keepNext/>
               <w:spacing w:after="40" w:line="252" w:lineRule="auto"/>
-              <w:rPr>
-                <w:lang w:val="de-DE"/>
-              </w:rPr>
             </w:pPr>
             <w:r>
               <w:rPr>
@@ -1313,18 +1315,15 @@
       <w:pPr>
         <w:spacing w:after="120" w:line="276" w:lineRule="auto"/>
         <w:jc w:val="both"/>
-        <w:rPr>
-          <w:lang w:val="de-DE"/>
-        </w:rPr>
-      </w:pPr>
-      <w:r>
-        <w:t>Die Gruppenmitglieder haben folgende Beiträge erarbeitet. Grundlage sind die Aufgabenverteilungen vom 02.09., 05.10. und 15.10.2026</w:t>
-      </w:r>
-      <w:r>
-        <w:rPr>
-          <w:lang w:val="de-DE"/>
-        </w:rPr>
-        <w:t>.</w:t>
+      </w:pPr>
+    </w:p>
+    <w:p>
+      <w:pPr>
+        <w:spacing w:after="120" w:line="276" w:lineRule="auto"/>
+        <w:jc w:val="both"/>
+      </w:pPr>
+      <w:r>
+        <w:t>Die Gruppenmitglieder haben folgende Beiträge erarbeitet:</w:t>
       </w:r>
     </w:p>
     <w:p>
@@ -1344,7 +1343,7 @@
         <w:t xml:space="preserve">Nina Sattler: </w:t>
       </w:r>
       <w:r>
-        <w:t>Gesamtplanung und Terminsteuerung, Prüfung der BPMN-Diagramme 07 und 08, Redaktion der Projektdokumentation (Abbildungen, Inhaltsverzeichnis, PDF), Zusammenstellung des Abgabe-Archivs; in der Präsentation Einleitung, Geschäftsmodell und Fazit.</w:t>
+        <w:t xml:space="preserve">Gesamtplanung und Terminsteuerung, Erstellung der BPMN-Diagramme 07 und 08, Redaktion der Projektdokumentation (Kapitel, Abbildungen, Inhaltsverzeichnis, PDF), Zusammenstellung des Abgabe-Archivs.</w:t>
       </w:r>
     </w:p>
     <w:p>
@@ -1364,7 +1363,7 @@
         <w:t xml:space="preserve">David Leismann: </w:t>
       </w:r>
       <w:r>
-        <w:t>Prüfung der BPMN-Diagramme 03 und 04, Abgleich der Use Cases und Sequenzdiagramme mit den Prozessen, Überarbeitung der Prozesse 05 und 06, Use-Case-Diagramm mit Rollenstruktur sowie SD5 und SD6 in Visual Paradigm; in der Präsentation Problem, Auftragsreise, Rollen und Use Cases.</w:t>
+        <w:t xml:space="preserve">Erstellung der BPMN-Diagramme 03 und 04, Abgleich der Use Cases und Sequenzdiagramme mit den Prozessen, Überarbeitung der Prozesse 05 und 06, Use-Case-Diagramm mit Rollenstruktur sowie SD5 und SD6 in Visual Paradigm, Klassendiagramm.</w:t>
       </w:r>
     </w:p>
     <w:p>
@@ -1384,7 +1383,7 @@
         <w:t xml:space="preserve">Adrian Wenzler: </w:t>
       </w:r>
       <w:r>
-        <w:t>Prüfung der BPMN-Diagramme 05 und 06, Fachkonzept (Ausgangslage, Solution Provider, Systemkontext, Zustandsautomat, KI-Sofortdiagnose), Pflege des Entscheidungslogs und Abstimmung der Prozessänderungen mit der Gruppe, Überarbeitung von Prozess 06, Automatisierungspotential, Probleme und Herausforderungen; in der Präsentation Lösung, Nutzenversprechen und KI-Sofortdiagnose.</w:t>
+        <w:t xml:space="preserve">Erstellung der BPMN-Diagramme 05 und 06, Fachkonzept (Ausgangslage, Solution Provider, Systemkontext, Zustandsautomat, KI-Sofortdiagnose), Pflege des Entscheidungslogs und Abstimmung der Prozessänderungen mit der Gruppe, Automatisierungspotential, Probleme und Herausforderungen.</w:t>
       </w:r>
     </w:p>
     <w:p>
@@ -1404,7 +1403,7 @@
         <w:t xml:space="preserve">Kilian Platter: </w:t>
       </w:r>
       <w:r>
-        <w:t>fachliche Prüfung der Diagramme mit Korrekturen, Klassendiagramm, SD1 bis SD4 in Visual Paradigm, Visual-Paradigm-Projekt und Konsistenzprüfung der Sequenzdiagramme gegen das Klassendiagramm, Sprint-Rituale und Trello-Board; in der Präsentation Datenmodell sowie Vorgehen und Projektmanagement.</w:t>
+        <w:t xml:space="preserve">Erstellung des BPMN-Diagramms 10, von Klassendiagramm und Sequenzdiagrammen SD1 bis SD4 in Visual Paradigm, Visual-Paradigm-Projekt und Konsistenzprüfung der Sequenzdiagramme gegen das Klassendiagramm, Sprint-Rituale und Trello-Board.</w:t>
       </w:r>
     </w:p>
     <w:p>
@@ -1424,7 +1423,7 @@
         <w:t xml:space="preserve">Maximilian Ewald: </w:t>
       </w:r>
       <w:r>
-        <w:t>Prüfung der BPMN-Diagramme 01 und 02, alle zehn BPMN-Dateien im Camunda Modeler (Anreicherung für Camunda 8, Prüfung im Problems-Panel, PNG-Export), Prozesskennzahlen und Beschreibung der Prozesse; in der Präsentation Ergebnisse, Prozesslandkarte und Prozess-Highlights.</w:t>
+        <w:t xml:space="preserve">Erstellung der BPMN-Diagramme 01, 02 und 09, alle zehn BPMN-Dateien im Camunda Modeler (Anreicherung für Camunda 8, Prüfung im Problems-Panel, PNG-Export), Prozesskennzahlen und Beschreibung der Prozesse, Erstellung der PowerPoint-Präsentation.</w:t>
       </w:r>
     </w:p>
     <w:p>
@@ -1441,11 +1440,10 @@
           <w:b/>
           <w:bCs/>
         </w:rPr>
-        <w:lastRenderedPageBreak/>
         <w:t xml:space="preserve">Jakob Schwan: </w:t>
       </w:r>
       <w:r>
-        <w:t>Review der Prozesse 09 und 10, Behebung der Logikfehler in den Prozessen 07 und 08, Fehleranalyse und Korrektur der Prozesse 01 bis 05 sowie der Logikfehler in Prozess 06, QA-Checkliste und Review aller Pull Requests, Konventionen und Konsistenz der Modelle; in der Präsentation Qualität, Herausforderungen und Lernerfahrungen.</w:t>
+        <w:t>Review der Prozesse 09 und 10, Behebung der Logikfehler in den Prozessen 07 und 08, Fehleranalyse und Korrektur der Prozesse 01 bis 05 sowie der Logikfehler in Prozess 06, QA-Checkliste und Review aller Pull Requests, Konventionen und Konsistenz der Modelle.</w:t>
       </w:r>
     </w:p>
     <w:p>
@@ -1455,6 +1453,7 @@
         <w:spacing w:after="120"/>
       </w:pPr>
       <w:r>
+        <w:lastRenderedPageBreak/>
         <w:t>2 Das Projekt RepairFlow</w:t>
       </w:r>
     </w:p>
@@ -1552,7 +1551,16 @@
         <w:jc w:val="both"/>
       </w:pPr>
       <w:r>
-        <w:t>Die Plattform besteht aus vier Modulen: einem Kundenportal mit App, einem Auftrags- und Werkstattmodul, einem Dispositionsmodul für die filialübergreifende Ersatzteilversorgung sowie einer Abrechnung mit Schnittstelle zur Buchhaltung. Zielkunden sind unabhängige Werkstätten und kleine Ketten mit zwei bis zehn Filialen im deutschsprachigen Raum. Als Geschäftsmodell ist ein monatliches Abonnement je Filiale mit den Stufen Basis (Auftragsverwaltung und Kundenkommunikation) und Pro (zusätzlich filialübergreifende Disposition und KI-Sofortdiagnose) vorgesehen; das Abonnement selbst ist nicht Gegenstand der Modelle. Unser Konzept verbindet Fahrrad-, E-Bike- und Elektronikreparaturen in einer Plattform mit gemeinsamem Ersatzteillager. Einen belegten Funktionsvergleich mit bestehenden Werkstattlösungen haben wir nicht erstellt.</w:t>
+        <w:t xml:space="preserve">Die Plattform besteht aus vier Modulen: einem Kundenportal mit App, einem Auftrags- und Werkstattmodul, einem Dispositionsmodul für die filialübergreifende Ersatzteilversorgung sowie einer Abrechnung mit Schnittstelle zur Buchhaltung. Zielkunden sind unabhängige Werkstätten und kleine Ketten mit zwei bis zehn Filialen im deutschsprachigen Raum. Als Geschäftsmodell ist ein monatliches Abonnement je Filiale mit den Stufen Basis (Auftragsverwaltung und Kundenkommunikation) und Pro (zusätzlich filialübergreifende Disposition und KI-Sofortdiagnose) vorgesehen; das Abonnement selbst ist nicht Gegenstand der Modelle. Unser Konzept verbindet Fahrrad-, E-Bike- und Elektronikreparaturen in einer Plattform mit gemeinsamem Ersatzteillager. Ein Funktionsvergleich mit bestehenden Werkstattlösungen war nicht Gegenstand der Fallstudie; das Alleinstellungsmerkmal begründen wir in Abschnitt 2.5.</w:t>
+      </w:r>
+    </w:p>
+    <w:p>
+      <w:pPr>
+        <w:spacing w:after="120" w:line="276" w:lineRule="auto"/>
+        <w:jc w:val="both"/>
+      </w:pPr>
+      <w:r>
+        <w:t>Jedes der vier Probleme aus Abschnitt 2.1 greift ein Modul auf. Die fehlende Kundeninformation löst das Kundenportal: Der Kunde gibt den KVA in der App frei und wird benachrichtigt, sobald sein Gerät abholbereit ist (Prozesse 04 und 08, UC07 und UC15). Den fehlenden zentralen Status ersetzt der Reparaturauftrag im Auftrags- und Werkstattmodul, dessen Zustände alle Prozesse teilen (Abschnitt 2.4, UC03 und UC14). Gegen getrennte Bestellungen je Filiale prüft das Dispositionsmodul zuerst die Bestände aller Filialen und bestellt nur Fehlteile (Prozesse 05 und 06, UC08 bis UC10). Die Auslastung der Techniker macht die Terminplanung sichtbar, in der die Werkstattleitung Termine vergibt und Techniker zuweist (Prozess 02, UC17).</w:t>
       </w:r>
     </w:p>
     <w:p>
@@ -1570,7 +1578,9 @@
         <w:jc w:val="both"/>
       </w:pPr>
       <w:r>
-        <w:t>Abbildung 1 stellt den Systemkontext und die Systemgrenze dar. Innerhalb der Systemgrenze liegt die RepairFlow-Plattform. Der Werkstattbetrieb ist als Mandant angebunden, seine Rollen Service/Annahme, Techniker, Werkstattleitung und Ersatzteil-Disposition arbeiten in der Oberfläche der Plattform. Der Kunde nutzt das Kundenportal. Mit dem Lieferanten tauscht RepairFlow Bestellungen, Bestätigungen, Lieferungen und Retouren aus. Der KI-Diagnosedienst ist ein externer Dienst, den die Plattform zur Auswertung von Foto, Video und Ton aufruft. Außerhalb der Systemgrenze liegen die physische Reparatur, die Systeme der Lieferanten und die Buchhaltung, an die nur über eine Exportschnittstelle übergeben wird.</w:t>
+        <w:t xml:space="preserve">Abbildung 1 stellt den Systemkontext und die Systemgrenze dar. Innerhalb der Systemgrenze liegt die RepairFlow-Plattform. Der Werkstattbetrieb ist als Mandant angebunden, seine Rollen Service / Annahme, Techniker, Werkstattleitung und Ersatzteil-Disposition arbeiten in der Oberfläche der Plattform. Der Kunde nutzt das Kundenportal. Mit dem Lieferanten tauscht RepairFlow Bestellungen, </w:t>
+        <w:lastRenderedPageBreak/>
+        <w:t>Bestätigungen, Lieferungen und Retouren aus. Der KI-Diagnosedienst ist ein externer Dienst, den die Plattform zur Auswertung von Foto, Video und Ton aufruft. Außerhalb der Systemgrenze liegen die physische Reparatur, die Systeme der Lieferanten und die Buchhaltung, an die nur über eine Exportschnittstelle übergeben wird.</w:t>
       </w:r>
     </w:p>
     <w:p>
@@ -1583,9 +1593,8 @@
         <w:rPr>
           <w:noProof/>
         </w:rPr>
-        <w:lastRenderedPageBreak/>
         <w:drawing>
-          <wp:inline distT="0" distB="0" distL="0" distR="0" wp14:anchorId="5524A09C" wp14:editId="12BED571">
+          <wp:inline distT="0" distB="0" distL="0" distR="0" wp14:anchorId="5524A09C" wp14:editId="3DA087AB">
             <wp:extent cx="5901493" cy="3184933"/>
             <wp:effectExtent l="0" t="0" r="4445" b="0"/>
             <wp:docPr id="1" name="Picture 1"/>
@@ -1696,7 +1705,37 @@
         <w:jc w:val="both"/>
       </w:pPr>
       <w:r>
-        <w:t xml:space="preserve">Ein Teil davon ist heute machbar, etwa das Erkennen sichtbarer Schäden wie eines gebrochenen Displays per Bildanalyse. Die Auswertung von Motorgeräuschen und die Schätzung von Arbeitszeiten aus einem Video sind Vision. Deshalb bleibt der Vorschlag im Modell unverbindlich: Der KVA hat den Status „vorläufig“, und bei nicht auswertbaren Medien fragt das System nach einer besseren Aufnahme. In den Modellen erscheint das Merkmal als Prozess 01, als Use Cases „Sofortdiagnose anfordern“, „Voranmeldung bestätigen“ und „Diagnosevorschlag prüfen“, als Klassen Voranmeldung, Medienanhang und KIDiagnosevorschlag sowie als Sequenzdiagramm SD1.</w:t>
+        <w:t xml:space="preserve">Ein Teil davon ist heute machbar, etwa das Erkennen sichtbarer Schäden wie eines gebrochenen Displays per Bildanalyse. Die Auswertung von Motorgeräuschen und die Schätzung von Arbeitszeiten </w:t>
+        <w:lastRenderedPageBreak/>
+        <w:t>aus einem Video sind Vision. Deshalb bleibt der Vorschlag im Modell unverbindlich: Der KVA hat den Status „vorläufig“, und bei nicht auswertbaren Medien fragt das System nach einer besseren Aufnahme. In den Modellen erscheint das Merkmal als Prozess 01, als Use Cases „Sofortdiagnose anfordern“, „Voranmeldung bestätigen“ und „Diagnosevorschlag prüfen“, als Klassen Voranmeldung, Medienanhang und KIDiagnosevorschlag sowie als Sequenzdiagramm SD1.</w:t>
+      </w:r>
+    </w:p>
+    <w:p>
+      <w:pPr>
+        <w:pStyle w:val="berschrift2"/>
+        <w:keepNext/>
+      </w:pPr>
+      <w:r>
+        <w:t xml:space="preserve">2.6 Ausblick</w:t>
+      </w:r>
+    </w:p>
+    <w:p>
+      <w:pPr>
+        <w:spacing w:line="276" w:lineRule="auto"/>
+        <w:jc w:val="both"/>
+        <w:rPr>
+          <w:b/>
+          <w:bCs/>
+        </w:rPr>
+      </w:pPr>
+      <w:r>
+        <w:t>Über die modellierten Prozesse hinaus sehen wir drei Erweiterungen, die auf den Daten der Plattform aufbauen. Eine KI-gestützte Disposition prognostiziert den Bedarf je Filiale und Saison, damit Teile vor der Nachfrage im Lager liegen. Ein Techniker-Copilot schlägt Reparaturschritte und den Aufwand aus der Historie ähnlicher Aufträge vor. Eine digitale Geräteakte bewahrt die Reparaturgeschichte jedes Geräts über alle Filialen und Besitzer hinweg. Diese Erweiterungen sind nicht Gegenstand der Modelle.</w:t>
+      </w:r>
+      <w:r>
+        <w:rPr>
+          <w:b/>
+          <w:bCs/>
+        </w:rPr>
       </w:r>
     </w:p>
     <w:p>
@@ -1706,7 +1745,6 @@
         <w:spacing w:after="120"/>
       </w:pPr>
       <w:r>
-        <w:lastRenderedPageBreak/>
         <w:t>3 Vorgehen bei der Umsetzung</w:t>
       </w:r>
     </w:p>
@@ -2154,9 +2192,7 @@
                 <w:color w:val="000000"/>
                 <w:sz w:val="19"/>
                 <w:szCs w:val="19"/>
-                <w:shd w:val="clear" w:color="auto" w:fill="FFF2A8"/>
-              </w:rPr>
-              <w:t xml:space="preserve"> </w:t>
+              </w:rPr>
             </w:r>
           </w:p>
         </w:tc>
@@ -2353,7 +2389,7 @@
         <w:jc w:val="both"/>
       </w:pPr>
       <w:r>
-        <w:t xml:space="preserve">Die BPMN-Diagramme haben wir im Camunda Modeler (Camunda 8) erstellt. Automatisierte Aktivitäten tragen Task-Definitionen, Timer haben ISO-Dauern und Verzweigungen FEEL-Bedingungen, damit der Modeler die Diagramme ohne Fehlermeldung prüft. Das UML-Modell liegt in Visual Paradigm 18 auf dem Teamwork-Server der DHBW (Repository WWI25B4G1). Die Sequenzdiagramme sind dort als Unterdiagramme ihrer Use Cases angelegt. Als gemeinsame Ablage für BPMN-Dateien, Dokumentation, Entscheidungslog und Präsentation nutzen wir ein GitHub-Repository. Die Aufgaben steuern wir über ein Trello-Board.</w:t>
+        <w:t>Die BPMN-Diagramme haben wir im Camunda Modeler (Camunda 8) erstellt. Automatisierte Aktivitäten tragen Task-Definitionen, Timer haben ISO-Dauern und Verzweigungen FEEL-Bedingungen, damit der Modeler die Diagramme ohne Fehlermeldung prüft. Das UML-Modell liegt in Visual Paradigm 18 auf dem Teamwork-Server der DHBW (Repository WWI25B4G1). Die Sequenzdiagramme sind dort als Unterdiagramme ihrer Use Cases angelegt. Als gemeinsame Ablage für BPMN-Dateien, Dokumentation, Entscheidungslog und Präsentation nutzen wir ein GitHub-Repository. Die Aufgaben steuern wir über ein Trello-Board.</w:t>
       </w:r>
     </w:p>
     <w:p>
@@ -2375,6 +2411,7 @@
         <w:spacing w:after="60" w:line="264" w:lineRule="auto"/>
       </w:pPr>
       <w:r>
+        <w:lastRenderedPageBreak/>
         <w:t>BPMN-Datenobjekte tragen die Klassennamen des Klassendiagramms, im Diagramm zur Lesbarkeit mit Bindestrich getrennt und bei Bedarf mit Zustand in eckigen Klammern, zum Beispiel „Reparatur-auftrag [freigegeben]“.</w:t>
       </w:r>
     </w:p>
@@ -2388,7 +2425,7 @@
         <w:spacing w:after="60" w:line="264" w:lineRule="auto"/>
       </w:pPr>
       <w:r>
-        <w:t>Aktivitäten heißen Verb mit Objekt („Kundendaten erfassen“), Ereignisse stehen im Partizip Perfekt („Auftrag angenommen“).</w:t>
+        <w:t>Aktivitäten heißen Verb mit Objekt („Kundendaten erfassen“), Ereignisse stehen im Partizip Perfekt („Auftrag eingeplant“).</w:t>
       </w:r>
     </w:p>
     <w:p>
@@ -2414,7 +2451,7 @@
         <w:spacing w:after="60" w:line="264" w:lineRule="auto"/>
       </w:pPr>
       <w:r>
-        <w:t xml:space="preserve">Die Beteiligten erscheinen in BPMN als Pool (Kunde) oder Lane (Service / Annahme, Techniker, Ersatzteil-Disposition, Werkstattleitung), im Use-Case-Diagramm als Rollen mit genau einem Use Case je Rolle (Tabelle 7), in den Sequenzdiagrammen als Akteure mit demselben Rollennamen und im Klassendiagramm als Unterklassen von Mitarbeiter. Welche Rolle zu welcher Klasse und Lane gehört, legt Tabelle 7 fest.</w:t>
+        <w:t xml:space="preserve">Die Beteiligten erscheinen in BPMN als Pool (Kunde) oder Lane (Service / Annahme, Techniker, Ersatzteil-Disposition, Werkstattleitung), jeder direkt ausgelöste Use Case hat genau eine Rolle als Hauptakteur (Tabelle 7), in den Sequenzdiagrammen als Akteure mit demselben Rollennamen und im Klassendiagramm als Unterklassen von Mitarbeiter. Welche Rolle zu welcher Klasse und Lane gehört, legt Tabelle 7 fest.</w:t>
       </w:r>
     </w:p>
     <w:p>
@@ -2436,7 +2473,6 @@
         <w:keepNext/>
       </w:pPr>
       <w:r>
-        <w:lastRenderedPageBreak/>
         <w:t>3.2 Qualitätssicherung</w:t>
       </w:r>
     </w:p>
@@ -2455,7 +2491,7 @@
         <w:jc w:val="both"/>
       </w:pPr>
       <w:r>
-        <w:t xml:space="preserve">Jedes Diagramm ist denselben Weg gegangen: Entwurf im Zweierteam, gegenseitiges Review, Abstimmung im Gruppentermin und erst dann die Umsetzung über einen Pull Request. In Sprint 1 fanden wir dabei vor allem fachliche Fehler, etwa abweichende Begriffe zwischen Prozess- und Klassenmodell, die wir gegenseitig überarbeitet haben. In Sprint 2 ergab die gemeinsame Prüfung in der Gesamtgruppe nur noch kleinere Fehler in den Details. Die Korrekturen sind im Entscheidungslog festgehalten.</w:t>
+        <w:t>Jedes Diagramm ist denselben Weg gegangen: Entwurf im Zweierteam, gegenseitiges Review, Abstimmung im Gruppentermin und erst dann die Umsetzung über einen Pull Request. In Sprint 1 fanden wir dabei vor allem fachliche Fehler, etwa abweichende Begriffe zwischen Prozess- und Klassenmodell, die wir gegenseitig überarbeitet haben. In Sprint 2 ergab die gemeinsame Prüfung in der Gesamtgruppe nur noch kleinere Fehler in den Details. Die Korrekturen sind im Entscheidungslog festgehalten.</w:t>
       </w:r>
     </w:p>
     <w:p>
@@ -2492,7 +2528,7 @@
         <w:jc w:val="both"/>
       </w:pPr>
       <w:r>
-        <w:t>Den Takt geben die vier Gruppentermine in Präsenz vor (jeweils 4:15 Stunden). Jeder Termin verbindet Review und Retrospektive des vergangenen Sprints mit dem Planning des nächsten, und Hinweise aus dem Coaching fließen direkt in die Planung ein. Zwischen den Terminen arbeiten wir asynchron. Abgestimmt wird in einer WhatsApp-Gruppe, Dateien teilen wir nur über das GitHub-Repository.</w:t>
+        <w:t xml:space="preserve">Den Takt geben die vier Gruppentermine in Präsenz vor (jeweils 4:15 Stunden). Jeder Termin verbindet Review und Retrospektive des vergangenen Sprints mit dem Planning des nächsten, und Hinweise aus dem Coaching fließen direkt in die Planung ein. Tabelle 3 zeigt den Verlauf der vier Sprints. Zwischen den Terminen arbeiten wir asynchron. Abgestimmt wird in einer WhatsApp-Gruppe, Dateien teilen wir nur über das GitHub-Repository.</w:t>
       </w:r>
     </w:p>
     <w:p>
@@ -2501,6 +2537,7 @@
         <w:keepNext/>
       </w:pPr>
       <w:r>
+        <w:lastRenderedPageBreak/>
         <w:t>4.2 Sprintplan und Verlauf</w:t>
       </w:r>
     </w:p>
@@ -2955,7 +2992,7 @@
                 <w:sz w:val="19"/>
                 <w:szCs w:val="19"/>
               </w:rPr>
-              <w:t xml:space="preserve">QA-Befunde behoben, Zuständigkeiten für die Fertigstellung festgelegt, Use-Case-Diagramm nach dem Dozentenhinweis auf Rollen umgestellt. </w:t>
+              <w:t>QA-Befunde behoben, Zuständigkeiten für die Fertigstellung festgelegt, Use-Case-Diagramm nach dem Dozentenhinweis auf Rollen umgestellt.</w:t>
             </w:r>
           </w:p>
         </w:tc>
@@ -3053,16 +3090,18 @@
             <w:pPr>
               <w:keepNext/>
               <w:spacing w:after="40" w:line="252" w:lineRule="auto"/>
-            </w:pPr>
-            <w:r>
-              <w:rPr>
-                <w:i/>
-                <w:color w:val="000000"/>
-                <w:sz w:val="19"/>
-                <w:szCs w:val="19"/>
-                <w:shd w:val="clear" w:color="auto" w:fill="FFF2A8"/>
-              </w:rPr>
-              <w:t>[Ergebnis nach dem 22.10. ergänzen]</w:t>
+              <w:rPr>
+                <w:sz w:val="19"/>
+                <w:szCs w:val="19"/>
+              </w:rPr>
+            </w:pPr>
+            <w:r>
+              <w:rPr>
+                <w:color w:val="000000"/>
+                <w:sz w:val="19"/>
+                <w:szCs w:val="19"/>
+              </w:rPr>
+              <w:t>Generalprobe durchgeführt; nach dem Coaching am 22.10. Oberflächenklassen in Klassen- und Sequenzdiagrammen ergänzt.</w:t>
             </w:r>
           </w:p>
         </w:tc>
@@ -3167,7 +3206,7 @@
                 <w:sz w:val="19"/>
                 <w:szCs w:val="19"/>
               </w:rPr>
-              <w:t>Präsentation am 27.10.2026 in Raum B458, Abgabe bis 13.11.2026 über Moodle.</w:t>
+              <w:t xml:space="preserve">Präsentation am 27.10.2026, Abgabe bis 13.11.2026 über Moodle. Weitere Anpassungen in VP und Dokumentation.</w:t>
             </w:r>
           </w:p>
         </w:tc>
@@ -3195,7 +3234,6 @@
         <w:keepNext/>
       </w:pPr>
       <w:r>
-        <w:lastRenderedPageBreak/>
         <w:t>4.3 Aufgabensteuerung und Repository</w:t>
       </w:r>
     </w:p>
@@ -3205,7 +3243,7 @@
         <w:jc w:val="both"/>
       </w:pPr>
       <w:r>
-        <w:t xml:space="preserve">Das Trello-Board hat eine Liste je Termin. Jede Karte nennt eine verantwortliche Person und, wo ein Diagramm entsteht, den Teampartner als Prüfer. Änderungen am Repository laufen über einen festen Git-Ablauf: aktuellen Stand holen, eigener Branch je Aufgabe, Pull Request, Review durch eine zweite Person und Merge. Commit-Nachrichten tragen einen Termin-Stempel mit Terminnummer und Datum, etwa [T04 2026-10-05] für den Gruppentermin am 05.10.2026. Entscheidungen, die mehrere Personen betreffen, halten wir im Entscheidungslog fest. Word- und PowerPoint-Dateien lassen sich nicht automatisch zusammenführen, deshalb kündigen wir ihre Bearbeitung vorher in der WhatsApp-Gruppe an.</w:t>
+        <w:t>Das Trello-Board hat eine Liste je Termin. Jede Karte nennt eine verantwortliche Person und, wo ein Diagramm entsteht, den Teampartner als Prüfer. Änderungen am Repository laufen über einen festen Git-Ablauf: aktuellen Stand holen, eigener Branch je Aufgabe, Pull Request, Review durch eine zweite Person und Merge. Commit-Nachrichten tragen einen Termin-Stempel mit Terminnummer und Datum, etwa [T04 2026-10-05] für den Gruppentermin am 05.10.2026. Entscheidungen, die mehrere Personen betreffen, halten wir im Entscheidungslog fest. Word- und PowerPoint-Dateien lassen sich nicht automatisch zusammenführen, deshalb kündigen wir ihre Bearbeitung vorher in der WhatsApp-Gruppe an.</w:t>
       </w:r>
     </w:p>
     <w:p>
@@ -3286,6 +3324,7 @@
                 <w:sz w:val="19"/>
                 <w:szCs w:val="19"/>
               </w:rPr>
+              <w:lastRenderedPageBreak/>
               <w:t>Risiko</w:t>
             </w:r>
           </w:p>
@@ -4038,9 +4077,7 @@
         <w:jc w:val="both"/>
       </w:pPr>
       <w:r>
-        <w:t xml:space="preserve">Wir haben zehn Soll-Prozesse unseres Pilotkunden als Kollaborationsdiagramme modelliert (Tabelle 6). Zusammen enthalten sie 133 Aktivitäten im Werkstatt-Pool, im Schnitt 13,3 je Diagramm. Hinzu </w:t>
-        <w:lastRenderedPageBreak/>
-        <w:t>kommen 26 Aktivitäten in den Abläufen des Kunden, 42 Nachrichtenflüsse sowie 51 Datenobjekte und 12 Datenspeicher.</w:t>
+        <w:t>Wir haben zehn Soll-Prozesse unseres Pilotkunden als Kollaborationsdiagramme modelliert (Tabelle 6). Zusammen enthalten sie 143 Aktivitäten im Werkstatt-Pool, im Schnitt 14,3 je Diagramm. Hinzu kommen 28 Aktivitäten in den Abläufen des Kunden, 49 Nachrichtenflüsse sowie 58 Datenobjekte und 14 Datenspeicher.</w:t>
       </w:r>
     </w:p>
     <w:tbl>
@@ -4098,6 +4135,7 @@
                 <w:sz w:val="19"/>
                 <w:szCs w:val="19"/>
               </w:rPr>
+              <w:lastRenderedPageBreak/>
               <w:t>Nr</w:t>
             </w:r>
           </w:p>
@@ -4421,7 +4459,7 @@
                 <w:sz w:val="19"/>
                 <w:szCs w:val="19"/>
               </w:rPr>
-              <w:t>12</w:t>
+              <w:t>14</w:t>
             </w:r>
           </w:p>
         </w:tc>
@@ -4446,7 +4484,7 @@
                 <w:sz w:val="19"/>
                 <w:szCs w:val="19"/>
               </w:rPr>
-              <w:t>12 (100 %)</w:t>
+              <w:t>14 (100 %)</w:t>
             </w:r>
           </w:p>
         </w:tc>
@@ -4526,7 +4564,7 @@
                 <w:sz w:val="19"/>
                 <w:szCs w:val="19"/>
               </w:rPr>
-              <w:t>Kunde erschienen</w:t>
+              <w:t>Gerät abgegeben</w:t>
             </w:r>
           </w:p>
         </w:tc>
@@ -4551,7 +4589,7 @@
                 <w:sz w:val="19"/>
                 <w:szCs w:val="19"/>
               </w:rPr>
-              <w:t>Auftrag angenommen</w:t>
+              <w:t>Auftrag eingeplant</w:t>
             </w:r>
           </w:p>
         </w:tc>
@@ -4601,7 +4639,7 @@
                 <w:sz w:val="19"/>
                 <w:szCs w:val="19"/>
               </w:rPr>
-              <w:t>12</w:t>
+              <w:t>16</w:t>
             </w:r>
           </w:p>
         </w:tc>
@@ -4626,7 +4664,7 @@
                 <w:sz w:val="19"/>
                 <w:szCs w:val="19"/>
               </w:rPr>
-              <w:t>4 (33 %)</w:t>
+              <w:t>7 (44 %)</w:t>
             </w:r>
           </w:p>
         </w:tc>
@@ -4781,7 +4819,7 @@
                 <w:sz w:val="19"/>
                 <w:szCs w:val="19"/>
               </w:rPr>
-              <w:t>12</w:t>
+              <w:t>13</w:t>
             </w:r>
           </w:p>
         </w:tc>
@@ -4806,7 +4844,7 @@
                 <w:sz w:val="19"/>
                 <w:szCs w:val="19"/>
               </w:rPr>
-              <w:t>5 (42 %)</w:t>
+              <w:t>6 (46 %)</w:t>
             </w:r>
           </w:p>
         </w:tc>
@@ -4961,7 +4999,7 @@
                 <w:sz w:val="19"/>
                 <w:szCs w:val="19"/>
               </w:rPr>
-              <w:t>11</w:t>
+              <w:t>12</w:t>
             </w:r>
           </w:p>
         </w:tc>
@@ -4986,7 +5024,7 @@
                 <w:sz w:val="19"/>
                 <w:szCs w:val="19"/>
               </w:rPr>
-              <w:t>7 (64 %)</w:t>
+              <w:t>8 (67 %)</w:t>
             </w:r>
           </w:p>
         </w:tc>
@@ -5066,7 +5104,7 @@
                 <w:sz w:val="19"/>
                 <w:szCs w:val="19"/>
               </w:rPr>
-              <w:t>KVA freigegeben</w:t>
+              <w:t>Teilebedarf freigegeben</w:t>
             </w:r>
           </w:p>
         </w:tc>
@@ -5141,7 +5179,7 @@
                 <w:sz w:val="19"/>
                 <w:szCs w:val="19"/>
               </w:rPr>
-              <w:t>15</w:t>
+              <w:t>16</w:t>
             </w:r>
           </w:p>
         </w:tc>
@@ -5166,7 +5204,7 @@
                 <w:sz w:val="19"/>
                 <w:szCs w:val="19"/>
               </w:rPr>
-              <w:t>12 (80 %)</w:t>
+              <w:t>12 (75 %)</w:t>
             </w:r>
           </w:p>
         </w:tc>
@@ -5321,7 +5359,7 @@
                 <w:sz w:val="19"/>
                 <w:szCs w:val="19"/>
               </w:rPr>
-              <w:t>15</w:t>
+              <w:t>17</w:t>
             </w:r>
           </w:p>
         </w:tc>
@@ -5346,7 +5384,7 @@
                 <w:sz w:val="19"/>
                 <w:szCs w:val="19"/>
               </w:rPr>
-              <w:t>9 (60 %)</w:t>
+              <w:t>11 (65 %)</w:t>
             </w:r>
           </w:p>
         </w:tc>
@@ -5451,7 +5489,7 @@
                 <w:sz w:val="19"/>
                 <w:szCs w:val="19"/>
               </w:rPr>
-              <w:t>Reparatur abgeschlossen</w:t>
+              <w:t>Gerät abholbereit</w:t>
             </w:r>
           </w:p>
         </w:tc>
@@ -5526,7 +5564,7 @@
                 <w:sz w:val="19"/>
                 <w:szCs w:val="19"/>
               </w:rPr>
-              <w:t>5 (38 %)</w:t>
+              <w:t>6 (46 %)</w:t>
             </w:r>
           </w:p>
         </w:tc>
@@ -5861,7 +5899,7 @@
                 <w:sz w:val="19"/>
                 <w:szCs w:val="19"/>
               </w:rPr>
-              <w:t>15</w:t>
+              <w:t>16</w:t>
             </w:r>
           </w:p>
         </w:tc>
@@ -5886,7 +5924,7 @@
                 <w:sz w:val="19"/>
                 <w:szCs w:val="19"/>
               </w:rPr>
-              <w:t>8 (53 %)</w:t>
+              <w:t>8 (50 %)</w:t>
             </w:r>
           </w:p>
         </w:tc>
@@ -6041,7 +6079,7 @@
                 <w:sz w:val="19"/>
                 <w:szCs w:val="19"/>
               </w:rPr>
-              <w:t>11</w:t>
+              <w:t>9</w:t>
             </w:r>
           </w:p>
         </w:tc>
@@ -6066,7 +6104,7 @@
                 <w:sz w:val="19"/>
                 <w:szCs w:val="19"/>
               </w:rPr>
-              <w:t>8 (73 %)</w:t>
+              <w:t>6 (67 %)</w:t>
             </w:r>
           </w:p>
         </w:tc>
@@ -6094,7 +6132,7 @@
         <w:jc w:val="both"/>
       </w:pPr>
       <w:r>
-        <w:t>Der Pool Werkstattbetrieb enthält den ausführbaren Prozess. Seine Lanes sind die Rollen Service/Annahme, Techniker, Werkstattleitung und Ersatzteil-Disposition. Kunde und Lieferant sind eigene Pools, mit denen nur über Nachrichtenflüsse kommuniziert wird. Der Kunde hat in den Prozessen 01 bis 09 einen eigenen, nicht ausführbaren Ablauf. So ist sichtbar, wann er antwortet und wie der Vorgang für ihn endet. Den Lieferanten modellieren wir als Black Box, weil wir seine internen Abläufe nicht kennen. Für die Software gibt es keine eigene Lane. Ob RepairFlow einen Schritt allein erledigt, zeigt der Aktivitätstyp: Service Task (automatisch), Business Rule Task (Regel oder KI), Send- und Receive Task (Nachricht über die Plattform), User Task (Mitarbeiter in der Plattform) und Manual Task (außerhalb der Software).</w:t>
+        <w:t>Der Pool Werkstattbetrieb enthält den ausführbaren Prozess. Seine Lanes sind die Rollen Service / Annahme, Techniker, Werkstattleitung und Ersatzteil-Disposition. Kunde und Lieferant sind eigene Pools, mit denen nur über Nachrichtenflüsse kommuniziert wird. Der Kunde hat in den Prozessen 01 bis 09 einen eigenen, nicht ausführbaren Ablauf. So ist sichtbar, wann er antwortet und wie der Vorgang für ihn endet. Den Lieferanten modellieren wir als Black Box, weil wir seine internen Abläufe nicht kennen. Für die Software gibt es keine eigene Lane. Ob RepairFlow einen Schritt allein erledigt, zeigt der Aktivitätstyp: Service Task (automatisch), Business Rule Task (Regel oder KI), Send Task und Receive Task (Nachricht über die Plattform), User Task (Mitarbeiter in der Plattform) und Manual Task (außerhalb der Software).</w:t>
       </w:r>
     </w:p>
     <w:p>
@@ -6103,7 +6141,7 @@
         <w:jc w:val="both"/>
       </w:pPr>
       <w:r>
-        <w:t>Die Prozesse greifen über Aufruf-Aktivitäten ineinander. Ein freigegebener KVA (04) startet die Disposition (05), Fehlteile lösen die Bestellung aus (06), und die Rückgabe jedes Geräts läuft über Prozess 08, auch nach einer Ablehnung oder Reklamation. Jede Warteschleife hat einen Ausstieg. Bleibt der KVA dreimal drei Tage ohne Antwort, gilt er als abgelehnt, ausstehende Lieferungen werden zweimal angemahnt, bevor storniert wird, und nach der zweiten erfolglosen Nacharbeit wird ein Auftrag abgelehnt. Abbildung 2 und Abbildung 3 zeigen zwei der zehn Diagramme. Alle Diagramme liegen vollständig in BPMN-WWI25B4-Gruppe1.zip.</w:t>
+        <w:t>Die Prozesse greifen über Aufruf-Aktivitäten ineinander. Ein freigegebener KVA (04) oder eine Nacharbeit aus einer Reklamation (09) startet die Disposition (05), Fehlteile lösen die Bestellung aus (06), und die Rückgabe jedes Geräts läuft über Prozess 08, auch nach einer Ablehnung oder Reklamation. Prozess 07 endet deshalb mit „Gerät abholbereit“, dem Startereignis von Prozess 08. Jede Warteschleife hat einen Ausstieg. Bleibt der KVA dreimal drei Tage ohne Antwort, gilt er als abgelehnt, ausstehende Lieferungen werden zweimal angemahnt, bevor storniert wird, und nach der zweiten erfolglosen Nacharbeit wird ein Auftrag abgelehnt. Abbildung 2 und Abbildung 3 zeigen zwei der zehn Diagramme. Alle Diagramme liegen vollständig in BPMN-WWI25B4-Gruppe1.zip.</w:t>
       </w:r>
     </w:p>
     <w:p>
@@ -6129,11 +6167,12 @@
           <w:b/>
           <w:bCs/>
         </w:rPr>
+        <w:t xml:space="preserve">01 KI-Sofortdiagnose und Voranmeldung. </w:t>
+      </w:r>
+      <w:r>
+        <w:t xml:space="preserve">Aus Foto, Video oder Ton des Kunden entstehen Voranmeldung, KI-Diagnosevorschlag, vorläufiger KVA und Terminvorschlag. Nicht auswertbare </w:t>
         <w:lastRenderedPageBreak/>
-        <w:t xml:space="preserve">01 KI-Sofortdiagnose und Voranmeldung. </w:t>
-      </w:r>
-      <w:r>
-        <w:t>Aus Foto, Video oder Ton des Kunden entstehen Voranmeldung, KI-Diagnosevorschlag, vorläufiger KVA und Terminvorschlag. Nicht auswertbare Medien fordert das System neu an. Ohne Antwort binnen sieben Tagen wird die Voranmeldung verworfen.</w:t>
+        <w:t>Medien fordert das System neu an. Bestätigt der Kunde, werden die Teile vorreserviert; ist ein Teil nirgends verfügbar, erhält die Voranmeldung einen Hinweis auf Nachbestellung. Lehnt der Kunde ab oder bleibt eine Antwort sieben Tage aus, wird die Voranmeldung verworfen, bei Fristablauf mit Hinweis an den Kunden.</w:t>
       </w:r>
     </w:p>
     <w:p>
@@ -6193,7 +6232,7 @@
         <w:t xml:space="preserve">04 Kostenvoranschlag und Kundenfreigabe. </w:t>
       </w:r>
       <w:r>
-        <w:t>Der KVA wird berechnet, geprüft und versendet. Bleibt die Antwort drei Tage aus, wird er mit Erinnerung erneut gesendet. Nach dem dritten Fristablauf ohne Antwort gilt er als abgelehnt.</w:t>
+        <w:t>Der KVA wird berechnet, geprüft und versendet. Bleibt die Antwort drei Tage aus, wird er mit Erinnerung erneut gesendet. Nach dem dritten Fristablauf ohne Antwort gilt er als abgelehnt. Dann erhält der Kunde eine Reparaturabsage, und der KVA verfällt auch in seinem Ablauf. Nach einer Freigabe wartet der Kunde auf den Reparaturbeginn; sind nicht alle Teile beschaffbar, erhält er stattdessen eine Reparaturabsage.</w:t>
       </w:r>
     </w:p>
     <w:p>
@@ -6233,7 +6272,7 @@
         <w:t xml:space="preserve">06 Ersatzteil-Bestellung. </w:t>
       </w:r>
       <w:r>
-        <w:t>Fehlteile und Nachbestellvorschläge werden gebündelt bestellt, oberhalb einer Freigabegrenze erst nach Freigabe. Ohne Bestätigung oder nach zwei erfolglosen Mahnungen wird storniert und ein anderer Lieferant gesucht.</w:t>
+        <w:t>Fehlteile und Nachbestellvorschläge werden gebündelt bestellt, oberhalb einer Freigabegrenze erst nach Freigabe. Ohne Bestätigung wird storniert und ein anderer Lieferant gesucht. Bleibt die Lieferung über den Liefertermin hinaus aus, wird sie angemahnt und eine Nachfrist von 14 Tagen gesetzt; nach der zweiten erfolglosen Mahnung wird ebenfalls storniert. Der Wareneingang wird erst geprüft und nur mangelfreie Ware gebucht, auch bei einer Ersatzlieferung.</w:t>
       </w:r>
     </w:p>
     <w:p>
@@ -6293,7 +6332,7 @@
         <w:t xml:space="preserve">09 Reklamation und Gewährleistung. </w:t>
       </w:r>
       <w:r>
-        <w:t>Der Mangel wird geprüft und die Gewährleistung bewertet. Kostenfreie Nacharbeit gibt die Werkstattleitung frei, sonst entscheidet der Kunde über ein Angebot.</w:t>
+        <w:t>Der Mangel wird geprüft und die Gewährleistung bewertet. Kostenfreie Nacharbeit gibt die Werkstattleitung frei, sonst entscheidet der Kunde über ein Angebot. Lehnt er ab, antwortet er nicht oder ist ein Teil nicht beschaffbar, erhält er eine Absage. Ist ein Lieferantenteil defekt, wird es nach der Abholung über Prozess 10 retourniert, der Kunde wartet nicht darauf.</w:t>
       </w:r>
     </w:p>
     <w:p>
@@ -6313,7 +6352,7 @@
         <w:t xml:space="preserve">10 Ersatzteil-Retoure. </w:t>
       </w:r>
       <w:r>
-        <w:t>Defekte Lieferantenteile werden angemeldet und zurückgesendet. Danach folgt eine Gutschrift oder eine Ersatzlieferung, ohne Antwort nach der Eskalation wird das Teil abgeschrieben.</w:t>
+        <w:t>Defekte Lieferantenteile werden angemeldet und zurückgesendet. Danach folgt eine Gutschrift oder eine Ersatzlieferung. Kommt das Teil aus dem Wareneingang (Prozess 06), prüft und bucht Prozess 06 die Ersatzlieferung; kommt es aus einer Reklamation (Prozess 09), war es bereits verbaut, und die Ersatzlieferung geht als normaler Wareneingang ins Lager. Ohne Antwort nach der Eskalation wird das Teil abgeschrieben.</w:t>
       </w:r>
     </w:p>
     <w:p>
@@ -6324,11 +6363,12 @@
         <w:rPr>
           <w:noProof/>
         </w:rPr>
+        <w:lastRenderedPageBreak/>
         <w:drawing>
-          <wp:inline distT="0" distB="0" distL="0" distR="0" wp14:anchorId="19D2E60F" wp14:editId="4AD0833F">
-            <wp:extent cx="5760000" cy="2063184"/>
+          <wp:inline distT="0" distB="0" distL="0" distR="0" wp14:anchorId="0F60C88C" wp14:editId="52EF33BC">
+            <wp:extent cx="5782310" cy="2130559"/>
             <wp:effectExtent l="0" t="0" r="0" b="0"/>
-            <wp:docPr id="3" name="Picture 3"/>
+            <wp:docPr id="644557787" name="Grafik 1"/>
             <wp:cNvGraphicFramePr>
               <a:graphicFrameLocks xmlns:a="http://schemas.openxmlformats.org/drawingml/2006/main" noChangeAspect="1"/>
             </wp:cNvGraphicFramePr>
@@ -6336,11 +6376,17 @@
               <a:graphicData uri="http://schemas.openxmlformats.org/drawingml/2006/picture">
                 <pic:pic xmlns:pic="http://schemas.openxmlformats.org/drawingml/2006/picture">
                   <pic:nvPicPr>
-                    <pic:cNvPr id="0" name="p01-sofortdiagnose.png"/>
+                    <pic:cNvPr id="644557787" name="Grafik 644557787"/>
                     <pic:cNvPicPr/>
                   </pic:nvPicPr>
                   <pic:blipFill>
-                    <a:blip r:embed="rId8"/>
+                    <a:blip r:embed="rId8" cstate="print">
+                      <a:extLst>
+                        <a:ext uri="{28A0092B-C50C-407E-A947-70E740481C1C}">
+                          <a14:useLocalDpi xmlns:a14="http://schemas.microsoft.com/office/drawing/2010/main" val="0"/>
+                        </a:ext>
+                      </a:extLst>
+                    </a:blip>
                     <a:stretch>
                       <a:fillRect/>
                     </a:stretch>
@@ -6348,7 +6394,7 @@
                   <pic:spPr>
                     <a:xfrm>
                       <a:off x="0" y="0"/>
-                      <a:ext cx="5760000" cy="2063184"/>
+                      <a:ext cx="5782310" cy="2130559"/>
                     </a:xfrm>
                     <a:prstGeom prst="rect">
                       <a:avLst/>
@@ -6385,12 +6431,11 @@
         <w:rPr>
           <w:noProof/>
         </w:rPr>
-        <w:lastRenderedPageBreak/>
         <w:drawing>
-          <wp:inline distT="0" distB="0" distL="0" distR="0" wp14:anchorId="3C47F1C3" wp14:editId="2F129291">
-            <wp:extent cx="5760000" cy="2323330"/>
-            <wp:effectExtent l="0" t="0" r="0" b="0"/>
-            <wp:docPr id="2" name="Picture 2"/>
+          <wp:inline distT="0" distB="0" distL="0" distR="0" wp14:anchorId="2C7C0B39" wp14:editId="16659AC5">
+            <wp:extent cx="5782310" cy="2223289"/>
+            <wp:effectExtent l="0" t="0" r="0" b="5080"/>
+            <wp:docPr id="1426216721" name="Grafik 3"/>
             <wp:cNvGraphicFramePr>
               <a:graphicFrameLocks xmlns:a="http://schemas.openxmlformats.org/drawingml/2006/main" noChangeAspect="1"/>
             </wp:cNvGraphicFramePr>
@@ -6398,11 +6443,17 @@
               <a:graphicData uri="http://schemas.openxmlformats.org/drawingml/2006/picture">
                 <pic:pic xmlns:pic="http://schemas.openxmlformats.org/drawingml/2006/picture">
                   <pic:nvPicPr>
-                    <pic:cNvPr id="0" name="p04-kostenvoranschlag.png"/>
+                    <pic:cNvPr id="1426216721" name="Grafik 1426216721"/>
                     <pic:cNvPicPr/>
                   </pic:nvPicPr>
                   <pic:blipFill>
-                    <a:blip r:embed="rId9"/>
+                    <a:blip r:embed="rId9" cstate="print">
+                      <a:extLst>
+                        <a:ext uri="{28A0092B-C50C-407E-A947-70E740481C1C}">
+                          <a14:useLocalDpi xmlns:a14="http://schemas.microsoft.com/office/drawing/2010/main" val="0"/>
+                        </a:ext>
+                      </a:extLst>
+                    </a:blip>
                     <a:stretch>
                       <a:fillRect/>
                     </a:stretch>
@@ -6410,7 +6461,7 @@
                   <pic:spPr>
                     <a:xfrm>
                       <a:off x="0" y="0"/>
-                      <a:ext cx="5760000" cy="2323330"/>
+                      <a:ext cx="5782310" cy="2223289"/>
                     </a:xfrm>
                     <a:prstGeom prst="rect">
                       <a:avLst/>
@@ -6454,7 +6505,7 @@
         <w:jc w:val="both"/>
       </w:pPr>
       <w:r>
-        <w:t>Von den 133 Aktivitäten sind 81 automatisiert, regelbasiert oder Nachrichten der Plattform, also rund 61 Prozent. 33 weitere sind Benutzer-Aktivitäten in der Plattform. Neun manuelle Aktivitäten liegen außerhalb der Software, neun rufen einen anderen Prozess auf, und eine ist der Mehrfach-Teilprozess für die Prüfung je Ersatzteil. Die Software automatisiert vor allem:</w:t>
+        <w:t>Von den 143 Aktivitäten sind 89 automatisiert, regelbasiert oder Nachrichten der Plattform, also rund 62 Prozent. 34 weitere sind Benutzer-Aktivitäten in der Plattform. Neun manuelle Aktivitäten liegen außerhalb der Software, zehn rufen einen anderen Prozess auf, und eine ist der Mehrfach-Teilprozess für die Prüfung je Ersatzteil. Die Software automatisiert vor allem:</w:t>
       </w:r>
     </w:p>
     <w:p>
@@ -6524,10 +6575,20 @@
     </w:p>
     <w:p>
       <w:pPr>
+        <w:spacing w:after="60" w:line="264" w:lineRule="auto"/>
+        <w:jc w:val="both"/>
+      </w:pPr>
+      <w:r>
+        <w:t xml:space="preserve">Manuell bleiben bewusst die neun Arbeiten am Gerät und an der Ware: Sichtprüfung, Kennzeichnen und Einlagern sowie der Transport zu einer anderen Filiale bei der Annahme, die Reparatur und Nacharbeit selbst, die Mangelprüfung bei einer Reklamation, das Holen aus dem Lager und die Übergabe an den Kunden sowie das Verpacken und Versenden einer Retoure. Sie liegen nach Abschnitt 2.3 außerhalb der Systemgrenze; RepairFlow erfasst nur ihr Ergebnis, zum Beispiel den Reparaturschritt mit Arbeitszeit.</w:t>
+      </w:r>
+    </w:p>
+    <w:p>
+      <w:pPr>
         <w:pStyle w:val="berschrift2"/>
         <w:keepNext/>
       </w:pPr>
       <w:r>
+        <w:lastRenderedPageBreak/>
         <w:t>5.3 Use-Case-Diagramm</w:t>
       </w:r>
     </w:p>
@@ -6537,7 +6598,7 @@
         <w:jc w:val="both"/>
       </w:pPr>
       <w:r>
-        <w:t xml:space="preserve">Das Use-Case-Diagramm (Abbildung 4) zeigt, was RepairFlow aus Sicht seiner Benutzer leistet. Es enthält 19 Use Cases und 17 Akteure: den Kunden, 15 Mitarbeiterrollen und den KI-Diagnosedienst als externes System. Der Lieferant ist kein Akteur, sondern eine Black Box ohne Zugang zu RepairFlow; wie in den Prozessmodellen kommt er nur über Nachrichten vor. Jeder Use Case hat genau eine Rolle als primären Akteur; die Nummern UC01 bis UC19 dienen nur der Zuordnung in den Tabellen, im Diagramm stehen die Namen. Diese Struktur geht auf einen Hinweis des Dozenten vom 15.10.2026 zurück: Unsere erste Fassung hatte acht Akteure mit bis zu acht Verbindungen, etwa den Techniker an Diagnose, KVA, Reparatur, Fertigmeldung und Reklamation. Statt eines Akteurs mit vielen Linien gibt es jetzt je Use Case eine Rolle, zum Beispiel Diagnoseprüfer, Diagnostiker, Kalkulator, Reparateur und Endkontrolleur anstelle des Technikers. Welche Person eine Rolle ausfüllt, regelt das Organigramm des Werkstattbetriebs; im Modell sind das die Unterklassen von Mitarbeiter (Tabelle 7). Der Kunde ist einmal dargestellt und mit UC01, UC02 und UC07 verbunden. UC08 „Ersatzteil-Verfügbarkeit prüfen“ wird nur über include erreicht und hat deshalb keinen eigenen Akteur.</w:t>
+        <w:t>Das Use-Case-Diagramm (Abbildung 4) zeigt, was RepairFlow aus Sicht seiner Benutzer leistet. Es enthält 19 Use Cases und 17 Akteure: den Kunden, 15 Mitarbeiterrollen und den KI-Diagnosedienst als externes System. Der Lieferant ist kein Akteur, sondern eine Black Box ohne Zugang zu RepairFlow; wie in den Prozessmodellen kommt er nur über Nachrichten vor. Jeder direkt ausgelöste Use Case hat genau eine Rolle als primären Akteur; die Nummern UC01 bis UC19 dienen nur der Zuordnung in den Tabellen, im Diagramm stehen die Namen. Diese Struktur geht auf einen Hinweis des Dozenten vom 15.10.2026 zurück: Unsere erste Fassung hatte acht Akteure mit bis zu acht Verbindungen, etwa den Techniker an Diagnosevorschlag, Diagnosebefund, KVA, Reparatur und Fertigmeldung. Statt eines Akteurs mit vielen Linien gibt es jetzt je Use Case eine Rolle, zum Beispiel Diagnoseprüfer, Diagnostiker, Kalkulator, Reparateur und Endkontrolleur anstelle des Technikers. Welche Person eine Rolle ausfüllt, regelt das Organigramm des Werkstattbetriebs; im Modell sind das die Unterklassen von Mitarbeiter (Tabelle 7). Der Kunde ist einmal dargestellt und mit UC01, UC02 und UC07 verbunden. UC08 „Ersatzteil-Verfügbarkeit prüfen“ wird nur über include erreicht und hat deshalb keinen eigenen Akteur.</w:t>
       </w:r>
     </w:p>
     <w:tbl>
@@ -6558,10 +6619,10 @@
         <w:tblLook w:val="04A0" w:firstRow="1" w:lastRow="0" w:firstColumn="1" w:lastColumn="0" w:noHBand="0" w:noVBand="1"/>
       </w:tblPr>
       <w:tblGrid>
-        <w:gridCol w:w="2200"/>
-        <w:gridCol w:w="3360"/>
-        <w:gridCol w:w="1900"/>
-        <w:gridCol w:w="1900"/>
+        <w:gridCol w:w="2197"/>
+        <w:gridCol w:w="3365"/>
+        <w:gridCol w:w="1899"/>
+        <w:gridCol w:w="1899"/>
       </w:tblGrid>
       <w:tr>
         <w:trPr>
@@ -6592,7 +6653,6 @@
                 <w:sz w:val="19"/>
                 <w:szCs w:val="19"/>
               </w:rPr>
-              <w:lastRenderedPageBreak/>
               <w:t>Rolle (Akteur)</w:t>
             </w:r>
           </w:p>
@@ -8462,7 +8522,7 @@
                 <w:sz w:val="19"/>
                 <w:szCs w:val="19"/>
               </w:rPr>
-              <w:t>Nachrichtenfluss in Prozess 01</w:t>
+              <w:t>Business Rule Task „KI-Diagnosevorschlag erstellen“ in Prozess 01 (Lane Service / Annahme)</w:t>
             </w:r>
           </w:p>
         </w:tc>
@@ -8490,6 +8550,7 @@
         <w:jc w:val="both"/>
       </w:pPr>
       <w:r>
+        <w:lastRenderedPageBreak/>
         <w:t>Zwei include-Beziehungen stehen für Teilschritte, die immer ausgeführt werden: „Sofortdiagnose anfordern“ und „Ersatzteile disponieren und reservieren“ schließen „Ersatzteil-Verfügbarkeit prüfen“ ein. Sechs extend-Beziehungen beschreiben bedingtes Verhalten. So erweitert „Lieferantenbestellung auslösen“ die Disposition nur, wenn Fehlteile vorhanden sind, und „Retoure abwickeln“ den Wareneingang nur bei mangelhafter Lieferung.</w:t>
       </w:r>
     </w:p>
@@ -8506,7 +8567,7 @@
         <w:lastRenderedPageBreak/>
         <w:drawing>
           <wp:inline distT="0" distB="0" distL="0" distR="0" wp14:anchorId="768D9E83" wp14:editId="3206FFA0">
-            <wp:extent cx="3021910" cy="7920000"/>
+            <wp:extent cx="3021910" cy="7919998"/>
             <wp:effectExtent l="0" t="0" r="0" b="0"/>
             <wp:docPr id="200" name="Picture 200"/>
             <wp:cNvGraphicFramePr>
@@ -8528,7 +8589,7 @@
                   <pic:spPr>
                     <a:xfrm>
                       <a:off x="0" y="0"/>
-                      <a:ext cx="3021910" cy="7920000"/>
+                      <a:ext cx="3021910" cy="7919998"/>
                     </a:xfrm>
                     <a:prstGeom prst="rect">
                       <a:avLst/>
@@ -8545,8 +8606,6 @@
       <w:pPr>
         <w:spacing w:before="60" w:after="200"/>
         <w:jc w:val="center"/>
-      </w:pPr>
-      <w:r>
         <w:rPr>
           <w:i/>
           <w:iCs/>
@@ -8554,8 +8613,24 @@
           <w:sz w:val="18"/>
           <w:szCs w:val="18"/>
         </w:rPr>
-        <w:t>Abbildung 4: Use-Case-Diagramm RepairFlow</w:t>
-      </w:r>
+      </w:pPr>
+      <w:r>
+        <w:rPr>
+          <w:i/>
+          <w:iCs/>
+          <w:color w:val="595959"/>
+          <w:sz w:val="18"/>
+          <w:szCs w:val="18"/>
+        </w:rPr>
+        <w:t xml:space="preserve">Abbildung 4: Use-Case-Diagramm RepairFlow</w:t>
+        <w:br/>
+      </w:r>
+    </w:p>
+    <w:p>
+      <w:pPr>
+        <w:spacing w:before="60" w:after="200"/>
+        <w:jc w:val="center"/>
+      </w:pPr>
     </w:p>
     <w:p>
       <w:pPr>
@@ -8563,6 +8638,7 @@
         <w:keepNext/>
       </w:pPr>
       <w:r>
+        <w:lastRenderedPageBreak/>
         <w:t>5.4 Klassendiagramm</w:t>
       </w:r>
     </w:p>
@@ -8572,7 +8648,7 @@
         <w:jc w:val="both"/>
       </w:pPr>
       <w:r>
-        <w:t>Das Klassendiagramm (Abbildung 5) umfasst 27 Klassen, darunter die abstrakten Klassen Person und Mitarbeiter, sowie sieben Aufzählungen und 36 Assoziationen. Wichtige Entwurfsentscheidungen sind:</w:t>
+        <w:t xml:space="preserve">Das Klassendiagramm (Abbildung 5) umfasst 29 Klassen, darunter die abstrakten Klassen Person und Mitarbeiter, sowie sieben Aufzählungen und 40 Assoziationen. Wichtige Entwurfsentscheidungen sind:</w:t>
       </w:r>
     </w:p>
     <w:p>
@@ -8589,7 +8665,6 @@
           <w:b/>
           <w:bCs/>
         </w:rPr>
-        <w:lastRenderedPageBreak/>
         <w:t xml:space="preserve">Reparaturauftrag im Zentrum. </w:t>
       </w:r>
       <w:r>
@@ -8653,7 +8728,27 @@
         <w:t xml:space="preserve">Mandant und Rollen. </w:t>
       </w:r>
       <w:r>
-        <w:t>Der Werkstattbetrieb steht als Mandant über Filialen und Mitarbeitern. Die Unterklassen von Mitarbeiter (Servicemitarbeiter, Techniker, Disponent, Werkstattleiter) entsprechen den Lanes, bündeln die Rollen des Use-Case-Diagramms (Tabelle 7) und tragen die Operationen dieser Rollen.</w:t>
+        <w:t>Der Werkstattbetrieb steht als Mandant über Filialen und Mitarbeitern. Die Unterklassen von Mitarbeiter (Servicemitarbeiter, Techniker, Disponent, Werkstattleiter) entsprechen den Lanes, bündeln die 14 Mitarbeiterrollen des Use-Case-Diagramms (Tabelle 7) und tragen die Operationen dieser Rollen. Der Betriebsadministrator wirkt direkt auf den Mandanten Werkstattbetrieb.</w:t>
+      </w:r>
+    </w:p>
+    <w:p>
+      <w:pPr>
+        <w:pStyle w:val="Listenabsatz"/>
+        <w:numPr>
+          <w:ilvl w:val="0"/>
+          <w:numId w:val="2"/>
+        </w:numPr>
+        <w:spacing w:after="60" w:line="264" w:lineRule="auto"/>
+      </w:pPr>
+      <w:r>
+        <w:rPr>
+          <w:b/>
+          <w:bCs/>
+        </w:rPr>
+        <w:t xml:space="preserve">Oberflächen als Klassen. </w:t>
+      </w:r>
+      <w:r>
+        <w:t xml:space="preserve">Zwischen den Benutzern und den Fachobjekten stehen zwei Oberflächenklassen: Der Kunde arbeitet in der KundenApp, die Mitarbeiter in der Werkstattoberfläche. Ihre Methoden entsprechen den Aktionen der Benutzer, zum Beispiel gibKvaFrei() oder meldeFertig(). Ein Benutzer gibt dabei keine Objekte ein, sondern Merkmale wie die Auftragsnummer. Die Oberfläche sucht das Objekt über den Werkstattbetrieb, der als Mandant alle Aufträge und Reklamationen seiner Filialen kennt (sucheAuftrag()), und arbeitet mit dem zurückgegebenen Objekt weiter. Der Kunde findet über sucheAuftrag() nur seine eigenen Aufträge.</w:t>
       </w:r>
     </w:p>
     <w:p>
@@ -8677,7 +8772,6 @@
       <w:r>
         <w:rPr>
           <w:b/>
-          <w:bCs/>
         </w:rPr>
         <w:t xml:space="preserve">Nacharbeit als neuer Auftrag. </w:t>
       </w:r>
@@ -8697,10 +8791,10 @@
         </w:rPr>
         <w:lastRenderedPageBreak/>
         <w:drawing>
-          <wp:inline distT="0" distB="0" distL="0" distR="0" wp14:anchorId="51897684" wp14:editId="2194742E">
-            <wp:extent cx="6984737" cy="5472000"/>
-            <wp:effectExtent l="0" t="0" r="0" b="0"/>
-            <wp:docPr id="201" name="Picture 201"/>
+          <wp:inline distT="0" distB="0" distL="0" distR="0" wp14:anchorId="128BF440" wp14:editId="79A6FDDA">
+            <wp:extent cx="7578721" cy="5750609"/>
+            <wp:effectExtent l="0" t="0" r="3810" b="3810"/>
+            <wp:docPr id="1600717457" name="Grafik 4"/>
             <wp:cNvGraphicFramePr>
               <a:graphicFrameLocks xmlns:a="http://schemas.openxmlformats.org/drawingml/2006/main" noChangeAspect="1"/>
             </wp:cNvGraphicFramePr>
@@ -8708,11 +8802,17 @@
               <a:graphicData uri="http://schemas.openxmlformats.org/drawingml/2006/picture">
                 <pic:pic xmlns:pic="http://schemas.openxmlformats.org/drawingml/2006/picture">
                   <pic:nvPicPr>
-                    <pic:cNvPr id="0" name="klassendiagramm.png"/>
+                    <pic:cNvPr id="1600717457" name="Grafik 1600717457"/>
                     <pic:cNvPicPr/>
                   </pic:nvPicPr>
                   <pic:blipFill>
-                    <a:blip r:embed="rId13"/>
+                    <a:blip r:embed="rId13" cstate="print">
+                      <a:extLst>
+                        <a:ext uri="{28A0092B-C50C-407E-A947-70E740481C1C}">
+                          <a14:useLocalDpi xmlns:a14="http://schemas.microsoft.com/office/drawing/2010/main" val="0"/>
+                        </a:ext>
+                      </a:extLst>
+                    </a:blip>
                     <a:stretch>
                       <a:fillRect/>
                     </a:stretch>
@@ -8720,7 +8820,7 @@
                   <pic:spPr>
                     <a:xfrm>
                       <a:off x="0" y="0"/>
-                      <a:ext cx="6984737" cy="5472000"/>
+                      <a:ext cx="7587707" cy="5750609"/>
                     </a:xfrm>
                     <a:prstGeom prst="rect">
                       <a:avLst/>
@@ -8773,7 +8873,7 @@
         <w:jc w:val="both"/>
       </w:pPr>
       <w:r>
-        <w:t xml:space="preserve">Für sechs Use Cases haben wir Sequenzdiagramme erstellt, gefordert waren fünf (Tabelle 8). Jedes folgt einem Prozess. Die erste Lebenslinie ist die Rolle des Use Case aus Abbildung 4; weitere beteiligte Rollen tragen ihren Namen aus dem Use-Case-Diagramm; der Werkstattleiter, der dort keine Rolle hat, erscheint als Objekt seiner Klasse (: Werkstattleiter) mit seinen Operationen. Der Lieferant liegt außerhalb des Systems, Nachrichten an ihn sind in SD6 Lost bzw. Found Messages. Die übrigen Lebenslinien sind Objekte der Klassen, Botschaften an Objekte sind Operationen des Klassendiagramms. Kombinierte Fragmente bilden Verzweigungen (alt, opt), Schleifen (loop), Abbrüche (break) und Verweise auf andere Use Cases (ref) ab.</w:t>
+        <w:t xml:space="preserve">Für sechs Use Cases haben wir Sequenzdiagramme erstellt, gefordert waren fünf (Tabelle 8). Jedes folgt einem Prozess. Die erste Lebenslinie ist die Rolle des Use Case aus Abbildung 4; weitere beteiligte Rollen tragen ihren Namen aus dem Use-Case-Diagramm; der Werkstattleiter, für dessen Freigaben es im Use-Case-Diagramm keine eigene Rolle gibt, erscheint als Objekt seiner Klasse (:Werkstattleiter) mit seinen Operationen. Die Rolle spricht nie direkt mit dem Fachobjekt, sondern immer mit der Oberfläche (:KundenApp oder :Werkstattoberflaeche). Die Oberfläche öffnet das benötigte Objekt über seine Nummer, ruft dessen Operationen auf und zeigt das Ergebnis an (anzeigenErgebnis()). Wo zwischen zwei Schritten Zeit vergeht, etwa nach einer Nacharbeit, wird das Objekt neu gesucht. Der Lieferant liegt außerhalb des Systems, Nachrichten an ihn sind in SD6 Lost bzw. Found Messages. Die übrigen Lebenslinien sind Objekte der Klassen, Botschaften an Objekte sind Operationen des Klassendiagramms. Kombinierte Fragmente bilden Verzweigungen (alt, opt), Schleifen (loop) und Verweise auf andere Use Cases (ref) ab.</w:t>
       </w:r>
     </w:p>
     <w:tbl>
@@ -9017,7 +9117,7 @@
                 <w:sz w:val="19"/>
                 <w:szCs w:val="19"/>
               </w:rPr>
-              <w:t>Medienprüfung mit Nachreichen, KI-Vorschlag, vorläufiger KVA, Terminvorschlag, Vorreservierung erst nach Bestätigung</w:t>
+              <w:t xml:space="preserve">Medienprüfung mit Nachreichen; ohne neue Aufnahme nach sieben Tagen wird die Voranmeldung verworfen, sonst KI-Vorschlag, vorläufiger KVA, Vorreservierung erst nach Bestätigung. Bei Ablehnung oder nach sieben Tagen ohne Antwort wird die Voranmeldung verworfen</w:t>
             </w:r>
           </w:p>
         </w:tc>
@@ -9122,7 +9222,7 @@
                 <w:sz w:val="19"/>
                 <w:szCs w:val="19"/>
               </w:rPr>
-              <w:t>Versand, Erinnerung nach je drei Tagen, Ablehnung nach dem dritten Fristablauf, Freigabe startet die Disposition, Ablehnung führt zur Abholung</w:t>
+              <w:t>Versand, Erinnerung nach je drei Tagen, Ablehnung mit Reparaturabsage nach dem dritten Fristablauf, Freigabe startet die Disposition, Ablehnung führt zur Abholung; sind nach der Freigabe nicht alle Teile beschaffbar, wird der Auftrag abgelehnt und das Gerät zur Abholung gegeben</w:t>
             </w:r>
           </w:p>
         </w:tc>
@@ -9227,7 +9327,7 @@
                 <w:sz w:val="19"/>
                 <w:szCs w:val="19"/>
               </w:rPr>
-              <w:t>Prüfung je Teil in einer Schleife: eigener Bestand, andere Filiale oder Fehlteil; Vorreservierung aus der Sofortdiagnose; Meldebestand; Fehlteile führen zu UC10</w:t>
+              <w:t>Prüfung je Teil in einer Schleife: eigener Bestand, andere Filiale nur bei zu wenig eigenem Bestand, sonst Fehlteil; Vorreservierung aus der Sofortdiagnose; Meldebestand; Reparaturbeginn nur bei der ersten Disposition; Fehlteile führen zu UC10</w:t>
             </w:r>
           </w:p>
         </w:tc>
@@ -9437,7 +9537,7 @@
                 <w:sz w:val="19"/>
                 <w:szCs w:val="19"/>
               </w:rPr>
-              <w:t>Mangelprüfung, Gewährleistung, Nacharbeitsauftrag nur nach Freigabe oder Annahme</w:t>
+              <w:t>Mangelprüfung und Gewährleistung; sonst Angebot an den Kunden mit Annahme, Ablehnung oder drei Tagen ohne Antwort. Vor der Nacharbeit Disposition (ref UC09), bei nicht beschaffbaren Teilen Absage über die Werkstattoberfläche</w:t>
             </w:r>
           </w:p>
         </w:tc>
@@ -9542,7 +9642,7 @@
                 <w:sz w:val="19"/>
                 <w:szCs w:val="19"/>
               </w:rPr>
-              <w:t>Bündelung, Freigabe durch den Werkstattleiter ab Freigabegrenze, Bestellung, Bestätigung oder Storno nach zwei Mahnungen; Nachrichten an den Lieferanten als Lost Messages</w:t>
+              <w:t>Bündelung, Freigabe durch den Werkstattleiter ab Freigabegrenze, Bestellung; ohne Bestätigung innerhalb von drei Tagen, bei nicht lieferbaren Teilen oder nach zwei erfolglosen Mahnungen Storno, sonst Wareneingang; Nachrichten an den Lieferanten als Lost Messages, die Auftragsbestätigung als Found Message</w:t>
             </w:r>
           </w:p>
         </w:tc>
@@ -9585,10 +9685,10 @@
         </w:rPr>
         <w:lastRenderedPageBreak/>
         <w:drawing>
-          <wp:inline distT="0" distB="0" distL="0" distR="0" wp14:anchorId="5739D476" wp14:editId="6098A535">
-            <wp:extent cx="5760000" cy="4820068"/>
+          <wp:inline distT="0" distB="0" distL="0" distR="0" wp14:anchorId="307C6272" wp14:editId="33E880EE">
+            <wp:extent cx="5782310" cy="4071513"/>
             <wp:effectExtent l="0" t="0" r="0" b="0"/>
-            <wp:docPr id="202" name="Picture 202"/>
+            <wp:docPr id="248347308" name="Grafik 5"/>
             <wp:cNvGraphicFramePr>
               <a:graphicFrameLocks xmlns:a="http://schemas.openxmlformats.org/drawingml/2006/main" noChangeAspect="1"/>
             </wp:cNvGraphicFramePr>
@@ -9596,11 +9696,17 @@
               <a:graphicData uri="http://schemas.openxmlformats.org/drawingml/2006/picture">
                 <pic:pic xmlns:pic="http://schemas.openxmlformats.org/drawingml/2006/picture">
                   <pic:nvPicPr>
-                    <pic:cNvPr id="0" name="sequenz-01-sofortdiagnose.png"/>
+                    <pic:cNvPr id="248347308" name="Grafik 248347308"/>
                     <pic:cNvPicPr/>
                   </pic:nvPicPr>
                   <pic:blipFill>
-                    <a:blip r:embed="rId16"/>
+                    <a:blip r:embed="rId16" cstate="print">
+                      <a:extLst>
+                        <a:ext uri="{28A0092B-C50C-407E-A947-70E740481C1C}">
+                          <a14:useLocalDpi xmlns:a14="http://schemas.microsoft.com/office/drawing/2010/main" val="0"/>
+                        </a:ext>
+                      </a:extLst>
+                    </a:blip>
                     <a:stretch>
                       <a:fillRect/>
                     </a:stretch>
@@ -9608,7 +9714,7 @@
                   <pic:spPr>
                     <a:xfrm>
                       <a:off x="0" y="0"/>
-                      <a:ext cx="5760000" cy="4820068"/>
+                      <a:ext cx="5782310" cy="4071513"/>
                     </a:xfrm>
                     <a:prstGeom prst="rect">
                       <a:avLst/>
@@ -9647,12 +9753,11 @@
         <w:rPr>
           <w:noProof/>
         </w:rPr>
-        <w:lastRenderedPageBreak/>
         <w:drawing>
-          <wp:inline distT="0" distB="0" distL="0" distR="0" wp14:anchorId="5B06C323" wp14:editId="2D78EA3C">
-            <wp:extent cx="5760000" cy="4324140"/>
+          <wp:inline distT="0" distB="0" distL="0" distR="0" wp14:anchorId="05AB1227" wp14:editId="6271697B">
+            <wp:extent cx="5782310" cy="3682770"/>
             <wp:effectExtent l="0" t="0" r="0" b="0"/>
-            <wp:docPr id="203" name="Picture 203"/>
+            <wp:docPr id="5075578" name="Grafik 6"/>
             <wp:cNvGraphicFramePr>
               <a:graphicFrameLocks xmlns:a="http://schemas.openxmlformats.org/drawingml/2006/main" noChangeAspect="1"/>
             </wp:cNvGraphicFramePr>
@@ -9660,11 +9765,17 @@
               <a:graphicData uri="http://schemas.openxmlformats.org/drawingml/2006/picture">
                 <pic:pic xmlns:pic="http://schemas.openxmlformats.org/drawingml/2006/picture">
                   <pic:nvPicPr>
-                    <pic:cNvPr id="0" name="sequenz-03-reservierung.png"/>
+                    <pic:cNvPr id="5075578" name="Grafik 5075578"/>
                     <pic:cNvPicPr/>
                   </pic:nvPicPr>
                   <pic:blipFill>
-                    <a:blip r:embed="rId17"/>
+                    <a:blip r:embed="rId17" cstate="print">
+                      <a:extLst>
+                        <a:ext uri="{28A0092B-C50C-407E-A947-70E740481C1C}">
+                          <a14:useLocalDpi xmlns:a14="http://schemas.microsoft.com/office/drawing/2010/main" val="0"/>
+                        </a:ext>
+                      </a:extLst>
+                    </a:blip>
                     <a:stretch>
                       <a:fillRect/>
                     </a:stretch>
@@ -9672,7 +9783,7 @@
                   <pic:spPr>
                     <a:xfrm>
                       <a:off x="0" y="0"/>
-                      <a:ext cx="5760000" cy="4324140"/>
+                      <a:ext cx="5782310" cy="3682770"/>
                     </a:xfrm>
                     <a:prstGeom prst="rect">
                       <a:avLst/>
@@ -9707,6 +9818,7 @@
         <w:keepNext/>
       </w:pPr>
       <w:r>
+        <w:lastRenderedPageBreak/>
         <w:t>5.6 Konsistenz zwischen den Modellen</w:t>
       </w:r>
     </w:p>
@@ -9716,7 +9828,7 @@
         <w:jc w:val="both"/>
       </w:pPr>
       <w:r>
-        <w:t>Tabelle 9 ordnet jedem Prozess seine Use Cases, zentralen Klassen und Sequenzdiagramme zu. BPMN-Datenobjekte tragen die Klassennamen, jede Rolle des Use-Case-Diagramms gehört zu genau einer Lane und einer Mitarbeiterklasse (Tabelle 7), und die Zustände des Reparaturauftrags folgen in allen Modellen AuftragStatus.</w:t>
+        <w:t>Tabelle 9 ordnet jedem Prozess seine Use Cases, zentralen Klassen und Sequenzdiagramme zu. BPMN-Datenobjekte tragen die Klassennamen, jede Rolle des Use-Case-Diagramms gehört zu genau einer Lane und einer Mitarbeiterklasse; Ausnahmen zeigt Tabelle 7, und die Zustände des Reparaturauftrags folgen in allen Modellen AuftragStatus.</w:t>
       </w:r>
     </w:p>
     <w:tbl>
@@ -9771,7 +9883,6 @@
                 <w:sz w:val="19"/>
                 <w:szCs w:val="19"/>
               </w:rPr>
-              <w:lastRenderedPageBreak/>
               <w:t>Prozess (BPMN)</w:t>
             </w:r>
           </w:p>
@@ -10934,9 +11045,7 @@
         <w:jc w:val="both"/>
       </w:pPr>
       <w:r>
-        <w:rPr>
-          <w:i/>
-        </w:rPr>
+        <w:rPr/>
         <w:t>Die Fristen sind festgelegt: Ein nicht abgeholtes Gerät wird nach der vierten Erinnerung verwertet, eine offene Rechnung nach der dritten erfolglosen Mahnung an das Inkasso übergeben und eine Bestellung nach der zweiten erfolglosen Liefermahnung storniert. Verwertete Geräte erhalten keinen eigenen Wert in AuftragStatus, weil die Verwertung ein Prozessende in Prozess 08 ist und kein Zustand des Auftrags.</w:t>
       </w:r>
     </w:p>
@@ -10963,7 +11072,7 @@
         <w:t xml:space="preserve">Perspektive. </w:t>
       </w:r>
       <w:r>
-        <w:t>In der ersten Fassung waren wir gleichzeitig Werkstatt und Softwareanbieter. Erst die Rückfrage des Dozenten hat uns dazu gebracht, das zu klären. Die Prozesse blieben gültig, Texte, Use Cases und Klassenmodell (Mandant) mussten wir aber anpassen.</w:t>
+        <w:t>In der ersten Fassung waren wir gleichzeitig Werkstatt und Softwareanbieter. Erst die Rückfrage des Dozenten hat uns dazu gebracht, das zu klären. Die Prozesse blieben gültig, Texte, Use Cases und Klassenmodell mussten wir aber anpassen.</w:t>
       </w:r>
     </w:p>
     <w:p>
@@ -10995,7 +11104,7 @@
         <w:t xml:space="preserve">Lücken zwischen den Prozessen. </w:t>
       </w:r>
       <w:r>
-        <w:t>Die Prüfung am 05.10.2026 zeigte, dass abgelehnte Aufträge nie abgeholt wurden und Warteschleifen keinen Ausstieg hatten. Seitdem läuft jede Rückgabe über Prozess 08, und jede Warteschleife hat einen Ausstieg.</w:t>
+        <w:t xml:space="preserve">Eine Kontrolle am 05.10.2026 zeigte, dass abgelehnte Aufträge nie abgeholt wurden und Warteschleifen keinen Ausstieg hatten. Seitdem läuft jede Rückgabe über Prozess 08, und jede Warteschleife hat einen Ausstieg.</w:t>
       </w:r>
     </w:p>
     <w:p>
@@ -11028,7 +11137,7 @@
         <w:t xml:space="preserve">Werkzeuge. </w:t>
       </w:r>
       <w:r>
-        <w:t xml:space="preserve">Visual Paradigm war unser größtes Werkzeugproblem. Vier von sechs Gruppenmitgliedern arbeiten mit Firmen-Laptops, auf denen keine zusätzlichen Programme installiert werden dürfen; sie konnten Visual Paradigm nicht nutzen. Die gesamte UML-Arbeit lag damit bei zwei Personen, die übrigen haben die Diagramme anhand der Exporte geprüft. Dazu kommt, dass der Teamwork-Server der DHBW nur über das Lehre-VPN erreichbar ist. </w:t>
+        <w:t xml:space="preserve">Visual Paradigm war unser größtes Werkzeugproblem. Vier von sechs Gruppenmitgliedern arbeiten mit Firmen-Laptops, auf denen keine zusätzlichen Programme installiert werden dürfen; wir konnten Visual Paradigm nicht nutzen. Die gesamte UML-Arbeit lag damit bei zwei Personen, die übrigen haben die Diagramme anhand der Exporte geprüft. Dazu kommt, dass der Teamwork-Server der DHBW nur über das Lehre-VPN erreichbar ist.</w:t>
       </w:r>
     </w:p>
     <w:p>
@@ -11044,7 +11153,7 @@
         <w:t xml:space="preserve">Überschriebene Diagramme. </w:t>
       </w:r>
       <w:r>
-        <w:t xml:space="preserve">Viel Zeit hat uns ein Fehler beim Abgleich mit dem Teamwork-Server gekostet: Beim Update wurden das Use-Case-Diagramm und das Klassendiagramm mit älteren Versionen aus dem Repository überlagert. Aktuelle und alte Elemente lagen danach übereinander, Beziehungen waren doppelt vorhanden, und ein Aufräumen von Hand brachte bei jedem weiteren Abgleich neue Überlagerungen. Lösbar war das nur, indem wir beide Diagramme im Repository vollständig neu angelegt haben. Seitdem gilt: vor jeder Sitzung Update, nach jeder Änderung sofort Commit, und nie zwei Personen gleichzeitig im selben Diagramm. </w:t>
+        <w:t>Viel Zeit hat uns ein Fehler beim Abgleich mit dem Teamwork-Server gekostet: Beim Update wurden das Use-Case-Diagramm und das Klassendiagramm mit älteren Versionen aus dem Repository überlagert. Aktuelle und alte Elemente lagen danach übereinander, Beziehungen waren doppelt vorhanden, und ein Aufräumen von Hand brachte bei jedem weiteren Abgleich neue Überlagerungen. Lösbar war das nur, indem wir beide Diagramme im Repository vollständig neu angelegt haben. Seitdem gilt: vor jeder Sitzung Update, nach jeder Änderung sofort Commit, und nie zwei Personen gleichzeitig im selben Diagramm.</w:t>
       </w:r>
     </w:p>
     <w:p>
@@ -11060,7 +11169,7 @@
         <w:t xml:space="preserve">Camunda Modeler. </w:t>
       </w:r>
       <w:r>
-        <w:t xml:space="preserve">Der Modeler meldet für Camunda 8 fehlende technische Angaben wie Task-Definitionen oder Timer-Ausdrücke als Fehler. Wir haben die Diagramme entsprechend ergänzt, bis das Problems-Panel keine Einträge mehr zeigte. </w:t>
+        <w:t>Der Modeler meldet für Camunda 8 fehlende technische Angaben wie Task-Definitionen oder Timer-Ausdrücke als Fehler. Wir haben die Diagramme entsprechend ergänzt, bis das Problems-Panel keine Einträge mehr zeigte.</w:t>
       </w:r>
     </w:p>
     <w:p>
@@ -11076,7 +11185,7 @@
         <w:t xml:space="preserve">Zusammenarbeit. </w:t>
       </w:r>
       <w:r>
-        <w:t>Am 05.10.2026 legten zwei Pull Requests parallel eine Entscheidung mit derselben Nummer an. Die Konflikte wurden an zwei Stellen gleichzeitig gelöst. Seitdem holen wir vor jeder neuen Entscheidung den aktuellen Stand und nehmen die nächste freie Nummer.</w:t>
+        <w:t xml:space="preserve">Am 05.10.2026 legten zwei Pull Requests in unserem privaten Repository parallel eine Entscheidung mit derselben Nummer an. Die Konflikte wurden an zwei Stellen gleichzeitig gelöst. Seitdem holen wir vor jeder neuen Entscheidung den aktuellen Stand und nehmen die nächste freie Nummer.</w:t>
       </w:r>
     </w:p>
     <w:p>
@@ -11113,7 +11222,15 @@
         <w:jc w:val="both"/>
       </w:pPr>
       <w:r>
-        <w:t>Im Coaching am 15.10.2026 sah der Dozent das Use-Case-Diagramm als zu verbunden an: Einzelne Akteure hingen an bis zu acht Use Cases. Sein Vorschlag war, je Use Case eine Rolle anzustreben, Akteure bei Bedarf mehrfach darzustellen und die Zuordnung der Rollen zu Personen einem Organigramm zu überlassen. Wir haben das Diagramm auf 15 Mitarbeiterrollen umgebaut und die Rollen in Tabelle 7 den Klassen und Lanes zugeordnet (Abschnitt 5.3).</w:t>
+        <w:t xml:space="preserve">Im Coaching am 15.10.2026 sah der Dozent das Use-Case-Diagramm als zu stark vernetzt an: Einzelne Akteure hingen an bis zu acht Use Cases. Sein Vorschlag war, je Use Case eine Rolle anzustreben, Akteure bei Bedarf mehrfach darzustellen und die Zuordnung der Rollen zu Personen einem Organigramm zu überlassen. Wir haben das Diagramm auf 15 Mitarbeiterrollen umgebaut und die Rollen in Tabelle 7 den Klassen und Lanes zugeordnet (Abschnitt 5.3).</w:t>
+      </w:r>
+    </w:p>
+    <w:p>
+      <w:pPr>
+        <w:jc w:val="both"/>
+      </w:pPr>
+      <w:r>
+        <w:t>Im Coaching am 22.10.2026 wies der Dozent darauf hin, dass in den Sequenzdiagrammen zwischen Akteur und Fachobjekt ein Objekt der Benutzeroberfläche fehlt und dass offen bleibt, wie die Oberfläche an das richtige Objekt kommt. Wir haben die Klassen KundenApp und Werkstattoberflaeche mit den Methoden der Benutzeraktionen ergänzt und den Werkstattbetrieb um Suchoperationen erweitert, die zu einer eingegebenen Nummer das Objekt liefern. Alle sechs Sequenzdiagramme folgen jetzt dem Muster Akteur, Oberfläche, Fachobjekt (Abschnitte 5.4 und 5.5).</w:t>
       </w:r>
     </w:p>
     <w:p>
@@ -11131,7 +11248,7 @@
         <w:jc w:val="both"/>
       </w:pPr>
       <w:r>
-        <w:t xml:space="preserve">Am meisten gebracht hat uns, ein Szenario durchgehend von der Prozessanalyse bis zum Sequenzdiagramm zu modellieren. Erst dabei wurde sichtbar, wie eng BPMN, Use Cases und Klassenmodell zusammenhängen. Die Reviews im Zweierteam und die gemeinsamen Prüfungen in den Gruppenterminen haben mehr Fehler gefunden, als wir beim Modellieren selbst bemerkt hätten. </w:t>
+        <w:t>Am meisten gebracht hat uns, ein Szenario durchgehend von der Prozessanalyse bis zum Sequenzdiagramm zu modellieren. Erst dabei wurde sichtbar, wie eng BPMN, Use Cases und Klassenmodell zusammenhängen. Die Reviews im Zweierteam und die gemeinsamen Prüfungen in den Gruppenterminen haben mehr Fehler gefunden, als wir beim Modellieren selbst bemerkt hätten.</w:t>
       </w:r>
     </w:p>
     <w:p>
@@ -11385,13 +11502,23 @@
       </w:pBdr>
       <w:jc w:val="right"/>
     </w:pPr>
+    <w:proofErr w:type="spellStart"/>
     <w:r>
       <w:rPr>
         <w:color w:val="595959"/>
         <w:sz w:val="18"/>
         <w:szCs w:val="18"/>
       </w:rPr>
-      <w:t>RepairFlow · Fallstudie Systemanalyse · WWI25B4 · Gruppe 1</w:t>
+      <w:t>RepairFlow</w:t>
+    </w:r>
+    <w:proofErr w:type="spellEnd"/>
+    <w:r>
+      <w:rPr>
+        <w:color w:val="595959"/>
+        <w:sz w:val="18"/>
+        <w:szCs w:val="18"/>
+      </w:rPr>
+      <w:t xml:space="preserve"> · Fallstudie Systemanalyse · WWI25B4 · Gruppe 1</w:t>
     </w:r>
   </w:p>
 </w:hdr>
@@ -11406,13 +11533,23 @@
       </w:pBdr>
       <w:jc w:val="right"/>
     </w:pPr>
+    <w:proofErr w:type="spellStart"/>
     <w:r>
       <w:rPr>
         <w:color w:val="595959"/>
         <w:sz w:val="18"/>
         <w:szCs w:val="18"/>
       </w:rPr>
-      <w:t>RepairFlow · Fallstudie Systemanalyse · WWI25B4 · Gruppe 1</w:t>
+      <w:t>RepairFlow</w:t>
+    </w:r>
+    <w:proofErr w:type="spellEnd"/>
+    <w:r>
+      <w:rPr>
+        <w:color w:val="595959"/>
+        <w:sz w:val="18"/>
+        <w:szCs w:val="18"/>
+      </w:rPr>
+      <w:t xml:space="preserve"> · Fallstudie Systemanalyse · WWI25B4 · Gruppe 1</w:t>
     </w:r>
   </w:p>
 </w:hdr>
@@ -11427,13 +11564,23 @@
       </w:pBdr>
       <w:jc w:val="right"/>
     </w:pPr>
+    <w:proofErr w:type="spellStart"/>
     <w:r>
       <w:rPr>
         <w:color w:val="595959"/>
         <w:sz w:val="18"/>
         <w:szCs w:val="18"/>
       </w:rPr>
-      <w:t>RepairFlow · Fallstudie Systemanalyse · WWI25B4 · Gruppe 1</w:t>
+      <w:t>RepairFlow</w:t>
+    </w:r>
+    <w:proofErr w:type="spellEnd"/>
+    <w:r>
+      <w:rPr>
+        <w:color w:val="595959"/>
+        <w:sz w:val="18"/>
+        <w:szCs w:val="18"/>
+      </w:rPr>
+      <w:t xml:space="preserve"> · Fallstudie Systemanalyse · WWI25B4 · Gruppe 1</w:t>
     </w:r>
   </w:p>
 </w:hdr>
@@ -11658,7 +11805,7 @@
         <w:rFonts w:ascii="Calibri" w:eastAsia="Calibri" w:hAnsi="Calibri" w:cs="Calibri"/>
         <w:sz w:val="22"/>
         <w:szCs w:val="22"/>
-        <w:lang w:eastAsia="en-GB" w:bidi="ar-SA"/>
+        <w:lang w:val="de-DE" w:eastAsia="en-GB" w:bidi="ar-SA"/>
       </w:rPr>
     </w:rPrDefault>
     <w:pPrDefault/>
@@ -12275,6 +12422,18 @@
       <w:szCs w:val="20"/>
     </w:rPr>
   </w:style>
+  <w:style w:type="paragraph" w:customStyle="1" w:styleId="p1">
+    <w:name w:val="p1"/>
+    <w:basedOn w:val="Standard"/>
+    <w:rsid w:val="000102FA"/>
+    <w:rPr>
+      <w:rFonts w:ascii="Helvetica" w:eastAsia="Times New Roman" w:hAnsi="Helvetica" w:cs="Times New Roman"/>
+      <w:color w:val="000000"/>
+      <w:sz w:val="18"/>
+      <w:szCs w:val="18"/>
+      <w:lang w:eastAsia="de-DE"/>
+    </w:rPr>
+  </w:style>
 </w:styles>
 </file>
 

</xml_diff>

<commit_message>
fix: P05 informiert erst nach der Bestellung ueber den Reparaturbeginn (SD3 entsprechend, Abb. 7, Tabelle 8); Team-Datei und BPMN-Konventionen aktualisiert
</commit_message>
<xml_diff>
--- a/3_doku/Projektdokumentation.docx
+++ b/3_doku/Projektdokumentation.docx
@@ -9327,7 +9327,7 @@
                 <w:sz w:val="19"/>
                 <w:szCs w:val="19"/>
               </w:rPr>
-              <w:t>Prüfung je Teil in einer Schleife: eigener Bestand, andere Filiale nur bei zu wenig eigenem Bestand, sonst Fehlteil; Vorreservierung aus der Sofortdiagnose; Meldebestand; Reparaturbeginn nur bei der ersten Disposition; Fehlteile führen zu UC10</w:t>
+              <w:t>Prüfung je Teil in einer Schleife: eigener Bestand, andere Filiale nur bei zu wenig eigenem Bestand, sonst Fehlteil; Vorreservierung aus der Sofortdiagnose; Meldebestand; Fehlteile führen zu UC10; danach Reparaturbeginn nur bei der ersten Disposition und wenn alle Teile beschaffbar sind</w:t>
             </w:r>
           </w:p>
         </w:tc>
@@ -9755,7 +9755,7 @@
         </w:rPr>
         <w:drawing>
           <wp:inline distT="0" distB="0" distL="0" distR="0" wp14:anchorId="05AB1227" wp14:editId="6271697B">
-            <wp:extent cx="5782310" cy="3682770"/>
+            <wp:extent cx="5782310" cy="4005573"/>
             <wp:effectExtent l="0" t="0" r="0" b="0"/>
             <wp:docPr id="5075578" name="Grafik 6"/>
             <wp:cNvGraphicFramePr>
@@ -9783,7 +9783,7 @@
                   <pic:spPr>
                     <a:xfrm>
                       <a:off x="0" y="0"/>
-                      <a:ext cx="5782310" cy="3682770"/>
+                      <a:ext cx="5782310" cy="4005573"/>
                     </a:xfrm>
                     <a:prstGeom prst="rect">
                       <a:avLst/>

</xml_diff>

<commit_message>
docs: Inhaltsverzeichnis 5.6 auf Seite 19
</commit_message>
<xml_diff>
--- a/3_doku/Projektdokumentation.docx
+++ b/3_doku/Projektdokumentation.docx
@@ -207,6 +207,12 @@
           <w:bCs/>
         </w:rPr>
         <w:t>1 Mitglieder der Gruppe und Rollen</w:t>
+      </w:r>
+      <w:r>
+        <w:rPr>
+          <w:b/>
+          <w:bCs/>
+        </w:rPr>
         <w:tab/>
         <w:t>2</w:t>
       </w:r>
@@ -224,6 +230,12 @@
           <w:bCs/>
         </w:rPr>
         <w:t>2 Das Projekt RepairFlow</w:t>
+      </w:r>
+      <w:r>
+        <w:rPr>
+          <w:b/>
+          <w:bCs/>
+        </w:rPr>
         <w:tab/>
         <w:t>3</w:t>
       </w:r>
@@ -242,6 +254,12 @@
           <w:szCs w:val="20"/>
         </w:rPr>
         <w:t>2.1 Ausgangslage und Problem</w:t>
+      </w:r>
+      <w:r>
+        <w:rPr>
+          <w:sz w:val="20"/>
+          <w:szCs w:val="20"/>
+        </w:rPr>
         <w:tab/>
         <w:t>3</w:t>
       </w:r>
@@ -260,6 +278,12 @@
           <w:szCs w:val="20"/>
         </w:rPr>
         <w:t>2.2 RepairFlow als Solution Provider</w:t>
+      </w:r>
+      <w:r>
+        <w:rPr>
+          <w:sz w:val="20"/>
+          <w:szCs w:val="20"/>
+        </w:rPr>
         <w:tab/>
         <w:t>3</w:t>
       </w:r>
@@ -278,6 +302,12 @@
           <w:szCs w:val="20"/>
         </w:rPr>
         <w:t>2.3 Systemkontext und Systemgrenze</w:t>
+      </w:r>
+      <w:r>
+        <w:rPr>
+          <w:sz w:val="20"/>
+          <w:szCs w:val="20"/>
+        </w:rPr>
         <w:tab/>
         <w:t>3</w:t>
       </w:r>
@@ -296,6 +326,12 @@
           <w:szCs w:val="20"/>
         </w:rPr>
         <w:t>2.4 Der Reparaturauftrag als roter Faden</w:t>
+      </w:r>
+      <w:r>
+        <w:rPr>
+          <w:sz w:val="20"/>
+          <w:szCs w:val="20"/>
+        </w:rPr>
         <w:tab/>
         <w:t>4</w:t>
       </w:r>
@@ -318,6 +354,12 @@
           <w:szCs w:val="20"/>
         </w:rPr>
         <w:t>2.5 Alleinstellungsmerkmal: die KI-Sofortdiagnose</w:t>
+      </w:r>
+      <w:r>
+        <w:rPr>
+          <w:sz w:val="20"/>
+          <w:szCs w:val="20"/>
+        </w:rPr>
         <w:tab/>
         <w:t>4</w:t>
       </w:r>
@@ -336,6 +378,12 @@
           <w:szCs w:val="20"/>
         </w:rPr>
         <w:t>2.6 Ausblick</w:t>
+      </w:r>
+      <w:r>
+        <w:rPr>
+          <w:sz w:val="20"/>
+          <w:szCs w:val="20"/>
+        </w:rPr>
         <w:tab/>
         <w:t>5</w:t>
       </w:r>
@@ -353,6 +401,12 @@
           <w:bCs/>
         </w:rPr>
         <w:t>3 Vorgehen bei der Umsetzung</w:t>
+      </w:r>
+      <w:r>
+        <w:rPr>
+          <w:b/>
+          <w:bCs/>
+        </w:rPr>
         <w:tab/>
         <w:t>5</w:t>
       </w:r>
@@ -371,6 +425,12 @@
           <w:szCs w:val="20"/>
         </w:rPr>
         <w:t>3.1 Werkzeuge und Konventionen</w:t>
+      </w:r>
+      <w:r>
+        <w:rPr>
+          <w:sz w:val="20"/>
+          <w:szCs w:val="20"/>
+        </w:rPr>
         <w:tab/>
         <w:t>5</w:t>
       </w:r>
@@ -389,6 +449,12 @@
           <w:szCs w:val="20"/>
         </w:rPr>
         <w:t>3.2 Qualitätssicherung</w:t>
+      </w:r>
+      <w:r>
+        <w:rPr>
+          <w:sz w:val="20"/>
+          <w:szCs w:val="20"/>
+        </w:rPr>
         <w:tab/>
         <w:t>6</w:t>
       </w:r>
@@ -406,6 +472,12 @@
           <w:bCs/>
         </w:rPr>
         <w:t>4 Projektmanagement</w:t>
+      </w:r>
+      <w:r>
+        <w:rPr>
+          <w:b/>
+          <w:bCs/>
+        </w:rPr>
         <w:tab/>
         <w:t>6</w:t>
       </w:r>
@@ -424,6 +496,12 @@
           <w:szCs w:val="20"/>
         </w:rPr>
         <w:t>4.1 Vorgehensmodell und Kommunikation</w:t>
+      </w:r>
+      <w:r>
+        <w:rPr>
+          <w:sz w:val="20"/>
+          <w:szCs w:val="20"/>
+        </w:rPr>
         <w:tab/>
         <w:t>6</w:t>
       </w:r>
@@ -442,6 +520,12 @@
           <w:szCs w:val="20"/>
         </w:rPr>
         <w:t>4.2 Sprintplan und Verlauf</w:t>
+      </w:r>
+      <w:r>
+        <w:rPr>
+          <w:sz w:val="20"/>
+          <w:szCs w:val="20"/>
+        </w:rPr>
         <w:tab/>
         <w:t>7</w:t>
       </w:r>
@@ -460,6 +544,12 @@
           <w:szCs w:val="20"/>
         </w:rPr>
         <w:t>4.3 Aufgabensteuerung und Repository</w:t>
+      </w:r>
+      <w:r>
+        <w:rPr>
+          <w:sz w:val="20"/>
+          <w:szCs w:val="20"/>
+        </w:rPr>
         <w:tab/>
         <w:t>7</w:t>
       </w:r>
@@ -478,6 +568,12 @@
           <w:szCs w:val="20"/>
         </w:rPr>
         <w:t>4.4 Risiken</w:t>
+      </w:r>
+      <w:r>
+        <w:rPr>
+          <w:sz w:val="20"/>
+          <w:szCs w:val="20"/>
+        </w:rPr>
         <w:tab/>
         <w:t>7</w:t>
       </w:r>
@@ -495,6 +591,12 @@
           <w:bCs/>
         </w:rPr>
         <w:t>5 Überblick über die erstellten Artefakte</w:t>
+      </w:r>
+      <w:r>
+        <w:rPr>
+          <w:b/>
+          <w:bCs/>
+        </w:rPr>
         <w:tab/>
         <w:t>8</w:t>
       </w:r>
@@ -513,6 +615,12 @@
           <w:szCs w:val="20"/>
         </w:rPr>
         <w:t>5.1 Geschäftsprozessmodell (BPMN)</w:t>
+      </w:r>
+      <w:r>
+        <w:rPr>
+          <w:sz w:val="20"/>
+          <w:szCs w:val="20"/>
+        </w:rPr>
         <w:tab/>
         <w:t>8</w:t>
       </w:r>
@@ -531,6 +639,12 @@
           <w:szCs w:val="20"/>
         </w:rPr>
         <w:t>5.2 Automatisierungspotential</w:t>
+      </w:r>
+      <w:r>
+        <w:rPr>
+          <w:sz w:val="20"/>
+          <w:szCs w:val="20"/>
+        </w:rPr>
         <w:tab/>
         <w:t>11</w:t>
       </w:r>
@@ -549,6 +663,12 @@
           <w:szCs w:val="20"/>
         </w:rPr>
         <w:t>5.3 Use-Case-Diagramm</w:t>
+      </w:r>
+      <w:r>
+        <w:rPr>
+          <w:sz w:val="20"/>
+          <w:szCs w:val="20"/>
+        </w:rPr>
         <w:tab/>
         <w:t>12</w:t>
       </w:r>
@@ -567,6 +687,12 @@
           <w:szCs w:val="20"/>
         </w:rPr>
         <w:t>5.4 Klassendiagramm</w:t>
+      </w:r>
+      <w:r>
+        <w:rPr>
+          <w:sz w:val="20"/>
+          <w:szCs w:val="20"/>
+        </w:rPr>
         <w:tab/>
         <w:t>15</w:t>
       </w:r>
@@ -585,6 +711,12 @@
           <w:szCs w:val="20"/>
         </w:rPr>
         <w:t>5.5 Sequenzdiagramme</w:t>
+      </w:r>
+      <w:r>
+        <w:rPr>
+          <w:sz w:val="20"/>
+          <w:szCs w:val="20"/>
+        </w:rPr>
         <w:tab/>
         <w:t>17</w:t>
       </w:r>
@@ -603,8 +735,21 @@
           <w:szCs w:val="20"/>
         </w:rPr>
         <w:t>5.6 Konsistenz zwischen den Modellen</w:t>
+      </w:r>
+      <w:r>
+        <w:rPr>
+          <w:sz w:val="20"/>
+          <w:szCs w:val="20"/>
+        </w:rPr>
         <w:tab/>
-        <w:t>18</w:t>
+        <w:t>1</w:t>
+      </w:r>
+      <w:r>
+        <w:rPr>
+          <w:sz w:val="20"/>
+          <w:szCs w:val="20"/>
+        </w:rPr>
+        <w:t>9</w:t>
       </w:r>
     </w:p>
     <w:p>
@@ -620,6 +765,12 @@
           <w:bCs/>
         </w:rPr>
         <w:t>6 Probleme und Herausforderungen</w:t>
+      </w:r>
+      <w:r>
+        <w:rPr>
+          <w:b/>
+          <w:bCs/>
+        </w:rPr>
         <w:tab/>
         <w:t>19</w:t>
       </w:r>
@@ -637,6 +788,12 @@
           <w:bCs/>
         </w:rPr>
         <w:t>7 Feedback</w:t>
+      </w:r>
+      <w:r>
+        <w:rPr>
+          <w:b/>
+          <w:bCs/>
+        </w:rPr>
         <w:tab/>
         <w:t>20</w:t>
       </w:r>
@@ -655,6 +812,12 @@
           <w:szCs w:val="20"/>
         </w:rPr>
         <w:t>7.1 Feedback des Dozenten und Umsetzung</w:t>
+      </w:r>
+      <w:r>
+        <w:rPr>
+          <w:sz w:val="20"/>
+          <w:szCs w:val="20"/>
+        </w:rPr>
         <w:tab/>
         <w:t>20</w:t>
       </w:r>
@@ -673,6 +836,12 @@
           <w:szCs w:val="20"/>
         </w:rPr>
         <w:t>7.2 Unser Feedback zur Fallstudie</w:t>
+      </w:r>
+      <w:r>
+        <w:rPr>
+          <w:sz w:val="20"/>
+          <w:szCs w:val="20"/>
+        </w:rPr>
         <w:tab/>
         <w:t>21</w:t>
       </w:r>
@@ -1343,7 +1512,7 @@
         <w:t xml:space="preserve">Nina Sattler: </w:t>
       </w:r>
       <w:r>
-        <w:t xml:space="preserve">Gesamtplanung und Terminsteuerung, Erstellung der BPMN-Diagramme 07 und 08, Redaktion der Projektdokumentation (Kapitel, Abbildungen, Inhaltsverzeichnis, PDF), Zusammenstellung des Abgabe-Archivs.</w:t>
+        <w:t>Gesamtplanung und Terminsteuerung, Erstellung der BPMN-Diagramme 07 und 08, Redaktion der Projektdokumentation (Kapitel, Abbildungen, Inhaltsverzeichnis, PDF), Zusammenstellung des Abgabe-Archivs.</w:t>
       </w:r>
     </w:p>
     <w:p>
@@ -1363,7 +1532,7 @@
         <w:t xml:space="preserve">David Leismann: </w:t>
       </w:r>
       <w:r>
-        <w:t xml:space="preserve">Erstellung der BPMN-Diagramme 03 und 04, Abgleich der Use Cases und Sequenzdiagramme mit den Prozessen, Überarbeitung der Prozesse 05 und 06, Use-Case-Diagramm mit Rollenstruktur sowie SD5 und SD6 in Visual Paradigm, Klassendiagramm.</w:t>
+        <w:t>Erstellung der BPMN-Diagramme 03 und 04, Abgleich der Use Cases und Sequenzdiagramme mit den Prozessen, Überarbeitung der Prozesse 05 und 06, Use-Case-Diagramm mit Rollenstruktur sowie SD5 und SD6 in Visual Paradigm, Klassendiagramm.</w:t>
       </w:r>
     </w:p>
     <w:p>
@@ -1383,7 +1552,7 @@
         <w:t xml:space="preserve">Adrian Wenzler: </w:t>
       </w:r>
       <w:r>
-        <w:t xml:space="preserve">Erstellung der BPMN-Diagramme 05 und 06, Fachkonzept (Ausgangslage, Solution Provider, Systemkontext, Zustandsautomat, KI-Sofortdiagnose), Pflege des Entscheidungslogs und Abstimmung der Prozessänderungen mit der Gruppe, Automatisierungspotential, Probleme und Herausforderungen.</w:t>
+        <w:t>Erstellung der BPMN-Diagramme 05 und 06, Fachkonzept (Ausgangslage, Solution Provider, Systemkontext, Zustandsautomat, KI-Sofortdiagnose), Pflege des Entscheidungslogs und Abstimmung der Prozessänderungen mit der Gruppe, Automatisierungspotential, Probleme und Herausforderungen.</w:t>
       </w:r>
     </w:p>
     <w:p>
@@ -1403,7 +1572,7 @@
         <w:t xml:space="preserve">Kilian Platter: </w:t>
       </w:r>
       <w:r>
-        <w:t xml:space="preserve">Erstellung des BPMN-Diagramms 10, von Klassendiagramm und Sequenzdiagrammen SD1 bis SD4 in Visual Paradigm, Visual-Paradigm-Projekt und Konsistenzprüfung der Sequenzdiagramme gegen das Klassendiagramm, Sprint-Rituale und Trello-Board.</w:t>
+        <w:t>Erstellung des BPMN-Diagramms 10, von Klassendiagramm und Sequenzdiagrammen SD1 bis SD4 in Visual Paradigm, Visual-Paradigm-Projekt und Konsistenzprüfung der Sequenzdiagramme gegen das Klassendiagramm, Sprint-Rituale und Trello-Board.</w:t>
       </w:r>
     </w:p>
     <w:p>
@@ -1423,7 +1592,7 @@
         <w:t xml:space="preserve">Maximilian Ewald: </w:t>
       </w:r>
       <w:r>
-        <w:t xml:space="preserve">Erstellung der BPMN-Diagramme 01, 02 und 09, alle zehn BPMN-Dateien im Camunda Modeler (Anreicherung für Camunda 8, Prüfung im Problems-Panel, PNG-Export), Prozesskennzahlen und Beschreibung der Prozesse, Erstellung der PowerPoint-Präsentation.</w:t>
+        <w:t>Erstellung der BPMN-Diagramme 01, 02 und 09, alle zehn BPMN-Dateien im Camunda Modeler (Anreicherung für Camunda 8, Prüfung im Problems-Panel, PNG-Export), Prozesskennzahlen und Beschreibung der Prozesse, Erstellung der PowerPoint-Präsentation.</w:t>
       </w:r>
     </w:p>
     <w:p>
@@ -1551,7 +1720,7 @@
         <w:jc w:val="both"/>
       </w:pPr>
       <w:r>
-        <w:t xml:space="preserve">Die Plattform besteht aus vier Modulen: einem Kundenportal mit App, einem Auftrags- und Werkstattmodul, einem Dispositionsmodul für die filialübergreifende Ersatzteilversorgung sowie einer Abrechnung mit Schnittstelle zur Buchhaltung. Zielkunden sind unabhängige Werkstätten und kleine Ketten mit zwei bis zehn Filialen im deutschsprachigen Raum. Als Geschäftsmodell ist ein monatliches Abonnement je Filiale mit den Stufen Basis (Auftragsverwaltung und Kundenkommunikation) und Pro (zusätzlich filialübergreifende Disposition und KI-Sofortdiagnose) vorgesehen; das Abonnement selbst ist nicht Gegenstand der Modelle. Unser Konzept verbindet Fahrrad-, E-Bike- und Elektronikreparaturen in einer Plattform mit gemeinsamem Ersatzteillager. Ein Funktionsvergleich mit bestehenden Werkstattlösungen war nicht Gegenstand der Fallstudie; das Alleinstellungsmerkmal begründen wir in Abschnitt 2.5.</w:t>
+        <w:t>Die Plattform besteht aus vier Modulen: einem Kundenportal mit App, einem Auftrags- und Werkstattmodul, einem Dispositionsmodul für die filialübergreifende Ersatzteilversorgung sowie einer Abrechnung mit Schnittstelle zur Buchhaltung. Zielkunden sind unabhängige Werkstätten und kleine Ketten mit zwei bis zehn Filialen im deutschsprachigen Raum. Als Geschäftsmodell ist ein monatliches Abonnement je Filiale mit den Stufen Basis (Auftragsverwaltung und Kundenkommunikation) und Pro (zusätzlich filialübergreifende Disposition und KI-Sofortdiagnose) vorgesehen; das Abonnement selbst ist nicht Gegenstand der Modelle. Unser Konzept verbindet Fahrrad-, E-Bike- und Elektronikreparaturen in einer Plattform mit gemeinsamem Ersatzteillager. Ein Funktionsvergleich mit bestehenden Werkstattlösungen war nicht Gegenstand der Fallstudie; das Alleinstellungsmerkmal begründen wir in Abschnitt 2.5.</w:t>
       </w:r>
     </w:p>
     <w:p>
@@ -1579,6 +1748,8 @@
       </w:pPr>
       <w:r>
         <w:t xml:space="preserve">Abbildung 1 stellt den Systemkontext und die Systemgrenze dar. Innerhalb der Systemgrenze liegt die RepairFlow-Plattform. Der Werkstattbetrieb ist als Mandant angebunden, seine Rollen Service / Annahme, Techniker, Werkstattleitung und Ersatzteil-Disposition arbeiten in der Oberfläche der Plattform. Der Kunde nutzt das Kundenportal. Mit dem Lieferanten tauscht RepairFlow Bestellungen, </w:t>
+      </w:r>
+      <w:r>
         <w:lastRenderedPageBreak/>
         <w:t>Bestätigungen, Lieferungen und Retouren aus. Der KI-Diagnosedienst ist ein externer Dienst, den die Plattform zur Auswertung von Foto, Video und Ton aufruft. Außerhalb der Systemgrenze liegen die physische Reparatur, die Systeme der Lieferanten und die Buchhaltung, an die nur über eine Exportschnittstelle übergeben wird.</w:t>
       </w:r>
@@ -1706,6 +1877,8 @@
       </w:pPr>
       <w:r>
         <w:t xml:space="preserve">Ein Teil davon ist heute machbar, etwa das Erkennen sichtbarer Schäden wie eines gebrochenen Displays per Bildanalyse. Die Auswertung von Motorgeräuschen und die Schätzung von Arbeitszeiten </w:t>
+      </w:r>
+      <w:r>
         <w:lastRenderedPageBreak/>
         <w:t>aus einem Video sind Vision. Deshalb bleibt der Vorschlag im Modell unverbindlich: Der KVA hat den Status „vorläufig“, und bei nicht auswertbaren Medien fragt das System nach einer besseren Aufnahme. In den Modellen erscheint das Merkmal als Prozess 01, als Use Cases „Sofortdiagnose anfordern“, „Voranmeldung bestätigen“ und „Diagnosevorschlag prüfen“, als Klassen Voranmeldung, Medienanhang und KIDiagnosevorschlag sowie als Sequenzdiagramm SD1.</w:t>
       </w:r>
@@ -1716,7 +1889,7 @@
         <w:keepNext/>
       </w:pPr>
       <w:r>
-        <w:t xml:space="preserve">2.6 Ausblick</w:t>
+        <w:t>2.6 Ausblick</w:t>
       </w:r>
     </w:p>
     <w:p>
@@ -1730,12 +1903,6 @@
       </w:pPr>
       <w:r>
         <w:t>Über die modellierten Prozesse hinaus sehen wir drei Erweiterungen, die auf den Daten der Plattform aufbauen. Eine KI-gestützte Disposition prognostiziert den Bedarf je Filiale und Saison, damit Teile vor der Nachfrage im Lager liegen. Ein Techniker-Copilot schlägt Reparaturschritte und den Aufwand aus der Historie ähnlicher Aufträge vor. Eine digitale Geräteakte bewahrt die Reparaturgeschichte jedes Geräts über alle Filialen und Besitzer hinweg. Diese Erweiterungen sind nicht Gegenstand der Modelle.</w:t>
-      </w:r>
-      <w:r>
-        <w:rPr>
-          <w:b/>
-          <w:bCs/>
-        </w:rPr>
       </w:r>
     </w:p>
     <w:p>
@@ -2186,14 +2353,6 @@
               </w:rPr>
               <w:t>Zehn Kollaborationsdiagramme mit Pools, Lanes, Datenobjekten und Datenspeichern; Prüfung im Zweierteam und mit dem Camunda-Linter.</w:t>
             </w:r>
-            <w:r>
-              <w:rPr>
-                <w:i/>
-                <w:color w:val="000000"/>
-                <w:sz w:val="19"/>
-                <w:szCs w:val="19"/>
-              </w:rPr>
-            </w:r>
           </w:p>
         </w:tc>
       </w:tr>
@@ -2451,7 +2610,7 @@
         <w:spacing w:after="60" w:line="264" w:lineRule="auto"/>
       </w:pPr>
       <w:r>
-        <w:t xml:space="preserve">Die Beteiligten erscheinen in BPMN als Pool (Kunde) oder Lane (Service / Annahme, Techniker, Ersatzteil-Disposition, Werkstattleitung), jeder direkt ausgelöste Use Case hat genau eine Rolle als Hauptakteur (Tabelle 7), in den Sequenzdiagrammen als Akteure mit demselben Rollennamen und im Klassendiagramm als Unterklassen von Mitarbeiter. Welche Rolle zu welcher Klasse und Lane gehört, legt Tabelle 7 fest.</w:t>
+        <w:t>Die Beteiligten erscheinen in BPMN als Pool (Kunde) oder Lane (Service / Annahme, Techniker, Ersatzteil-Disposition, Werkstattleitung), jeder direkt ausgelöste Use Case hat genau eine Rolle als Hauptakteur (Tabelle 7), in den Sequenzdiagrammen als Akteure mit demselben Rollennamen und im Klassendiagramm als Unterklassen von Mitarbeiter. Welche Rolle zu welcher Klasse und Lane gehört, legt Tabelle 7 fest.</w:t>
       </w:r>
     </w:p>
     <w:p>
@@ -2528,7 +2687,7 @@
         <w:jc w:val="both"/>
       </w:pPr>
       <w:r>
-        <w:t xml:space="preserve">Den Takt geben die vier Gruppentermine in Präsenz vor (jeweils 4:15 Stunden). Jeder Termin verbindet Review und Retrospektive des vergangenen Sprints mit dem Planning des nächsten, und Hinweise aus dem Coaching fließen direkt in die Planung ein. Tabelle 3 zeigt den Verlauf der vier Sprints. Zwischen den Terminen arbeiten wir asynchron. Abgestimmt wird in einer WhatsApp-Gruppe, Dateien teilen wir nur über das GitHub-Repository.</w:t>
+        <w:t>Den Takt geben die vier Gruppentermine in Präsenz vor (jeweils 4:15 Stunden). Jeder Termin verbindet Review und Retrospektive des vergangenen Sprints mit dem Planning des nächsten, und Hinweise aus dem Coaching fließen direkt in die Planung ein. Tabelle 3 zeigt den Verlauf der vier Sprints. Zwischen den Terminen arbeiten wir asynchron. Abgestimmt wird in einer WhatsApp-Gruppe, Dateien teilen wir nur über das GitHub-Repository.</w:t>
       </w:r>
     </w:p>
     <w:p>
@@ -3206,7 +3365,7 @@
                 <w:sz w:val="19"/>
                 <w:szCs w:val="19"/>
               </w:rPr>
-              <w:t xml:space="preserve">Präsentation am 27.10.2026, Abgabe bis 13.11.2026 über Moodle. Weitere Anpassungen in VP und Dokumentation.</w:t>
+              <w:t>Präsentation am 27.10.2026, Abgabe bis 13.11.2026 über Moodle. Weitere Anpassungen in VP und Dokumentation.</w:t>
             </w:r>
           </w:p>
         </w:tc>
@@ -6171,6 +6330,8 @@
       </w:r>
       <w:r>
         <w:t xml:space="preserve">Aus Foto, Video oder Ton des Kunden entstehen Voranmeldung, KI-Diagnosevorschlag, vorläufiger KVA und Terminvorschlag. Nicht auswertbare </w:t>
+      </w:r>
+      <w:r>
         <w:lastRenderedPageBreak/>
         <w:t>Medien fordert das System neu an. Bestätigt der Kunde, werden die Teile vorreserviert; ist ein Teil nirgends verfügbar, erhält die Voranmeldung einen Hinweis auf Nachbestellung. Lehnt der Kunde ab oder bleibt eine Antwort sieben Tage aus, wird die Voranmeldung verworfen, bei Fristablauf mit Hinweis an den Kunden.</w:t>
       </w:r>
@@ -6579,7 +6740,11 @@
         <w:jc w:val="both"/>
       </w:pPr>
       <w:r>
-        <w:t xml:space="preserve">Manuell bleiben bewusst die neun Arbeiten am Gerät und an der Ware: Sichtprüfung, Kennzeichnen und Einlagern sowie der Transport zu einer anderen Filiale bei der Annahme, die Reparatur und Nacharbeit selbst, die Mangelprüfung bei einer Reklamation, das Holen aus dem Lager und die Übergabe an den Kunden sowie das Verpacken und Versenden einer Retoure. Sie liegen nach Abschnitt 2.3 außerhalb der Systemgrenze; RepairFlow erfasst nur ihr Ergebnis, zum Beispiel den Reparaturschritt mit Arbeitszeit.</w:t>
+        <w:t xml:space="preserve">Manuell bleiben bewusst die neun Arbeiten am Gerät und an der Ware: Sichtprüfung, Kennzeichnen und Einlagern sowie der Transport zu einer anderen Filiale bei der Annahme, die Reparatur und Nacharbeit selbst, die Mangelprüfung bei einer Reklamation, das Holen aus dem Lager und die Übergabe an den Kunden sowie das Verpacken und Versenden einer Retoure. Sie liegen nach Abschnitt </w:t>
+      </w:r>
+      <w:r>
+        <w:lastRenderedPageBreak/>
+        <w:t>2.3 außerhalb der Systemgrenze; RepairFlow erfasst nur ihr Ergebnis, zum Beispiel den Reparaturschritt mit Arbeitszeit.</w:t>
       </w:r>
     </w:p>
     <w:p>
@@ -6588,7 +6753,6 @@
         <w:keepNext/>
       </w:pPr>
       <w:r>
-        <w:lastRenderedPageBreak/>
         <w:t>5.3 Use-Case-Diagramm</w:t>
       </w:r>
     </w:p>
@@ -6653,6 +6817,7 @@
                 <w:sz w:val="19"/>
                 <w:szCs w:val="19"/>
               </w:rPr>
+              <w:lastRenderedPageBreak/>
               <w:t>Rolle (Akteur)</w:t>
             </w:r>
           </w:p>
@@ -8550,7 +8715,6 @@
         <w:jc w:val="both"/>
       </w:pPr>
       <w:r>
-        <w:lastRenderedPageBreak/>
         <w:t>Zwei include-Beziehungen stehen für Teilschritte, die immer ausgeführt werden: „Sofortdiagnose anfordern“ und „Ersatzteile disponieren und reservieren“ schließen „Ersatzteil-Verfügbarkeit prüfen“ ein. Sechs extend-Beziehungen beschreiben bedingtes Verhalten. So erweitert „Lieferantenbestellung auslösen“ die Disposition nur, wenn Fehlteile vorhanden sind, und „Retoure abwickeln“ den Wareneingang nur bei mangelhafter Lieferung.</w:t>
       </w:r>
     </w:p>
@@ -8622,7 +8786,16 @@
           <w:sz w:val="18"/>
           <w:szCs w:val="18"/>
         </w:rPr>
-        <w:t xml:space="preserve">Abbildung 4: Use-Case-Diagramm RepairFlow</w:t>
+        <w:t>Abbildung 4: Use-Case-Diagramm RepairFlow</w:t>
+      </w:r>
+      <w:r>
+        <w:rPr>
+          <w:i/>
+          <w:iCs/>
+          <w:color w:val="595959"/>
+          <w:sz w:val="18"/>
+          <w:szCs w:val="18"/>
+        </w:rPr>
         <w:br/>
       </w:r>
     </w:p>
@@ -8648,7 +8821,7 @@
         <w:jc w:val="both"/>
       </w:pPr>
       <w:r>
-        <w:t xml:space="preserve">Das Klassendiagramm (Abbildung 5) umfasst 29 Klassen, darunter die abstrakten Klassen Person und Mitarbeiter, sowie sieben Aufzählungen und 40 Assoziationen. Wichtige Entwurfsentscheidungen sind:</w:t>
+        <w:t>Das Klassendiagramm (Abbildung 5) umfasst 29 Klassen, darunter die abstrakten Klassen Person und Mitarbeiter, sowie sieben Aufzählungen und 40 Assoziationen. Wichtige Entwurfsentscheidungen sind:</w:t>
       </w:r>
     </w:p>
     <w:p>
@@ -8748,7 +8921,7 @@
         <w:t xml:space="preserve">Oberflächen als Klassen. </w:t>
       </w:r>
       <w:r>
-        <w:t xml:space="preserve">Zwischen den Benutzern und den Fachobjekten stehen zwei Oberflächenklassen: Der Kunde arbeitet in der KundenApp, die Mitarbeiter in der Werkstattoberfläche. Ihre Methoden entsprechen den Aktionen der Benutzer, zum Beispiel gibKvaFrei() oder meldeFertig(). Ein Benutzer gibt dabei keine Objekte ein, sondern Merkmale wie die Auftragsnummer. Die Oberfläche sucht das Objekt über den Werkstattbetrieb, der als Mandant alle Aufträge und Reklamationen seiner Filialen kennt (sucheAuftrag()), und arbeitet mit dem zurückgegebenen Objekt weiter. Der Kunde findet über sucheAuftrag() nur seine eigenen Aufträge.</w:t>
+        <w:t>Zwischen den Benutzern und den Fachobjekten stehen zwei Oberflächenklassen: Der Kunde arbeitet in der KundenApp, die Mitarbeiter in der Werkstattoberfläche. Ihre Methoden entsprechen den Aktionen der Benutzer, zum Beispiel gibKvaFrei() oder meldeFertig(). Ein Benutzer gibt dabei keine Objekte ein, sondern Merkmale wie die Auftragsnummer. Die Oberfläche sucht das Objekt über den Werkstattbetrieb, der als Mandant alle Aufträge und Reklamationen seiner Filialen kennt (sucheAuftrag()), und arbeitet mit dem zurückgegebenen Objekt weiter. Der Kunde findet über sucheAuftrag() nur seine eigenen Aufträge.</w:t>
       </w:r>
     </w:p>
     <w:p>
@@ -8873,7 +9046,7 @@
         <w:jc w:val="both"/>
       </w:pPr>
       <w:r>
-        <w:t xml:space="preserve">Für sechs Use Cases haben wir Sequenzdiagramme erstellt, gefordert waren fünf (Tabelle 8). Jedes folgt einem Prozess. Die erste Lebenslinie ist die Rolle des Use Case aus Abbildung 4; weitere beteiligte Rollen tragen ihren Namen aus dem Use-Case-Diagramm; der Werkstattleiter, für dessen Freigaben es im Use-Case-Diagramm keine eigene Rolle gibt, erscheint als Objekt seiner Klasse (:Werkstattleiter) mit seinen Operationen. Die Rolle spricht nie direkt mit dem Fachobjekt, sondern immer mit der Oberfläche (:KundenApp oder :Werkstattoberflaeche). Die Oberfläche öffnet das benötigte Objekt über seine Nummer, ruft dessen Operationen auf und zeigt das Ergebnis an (anzeigenErgebnis()). Wo zwischen zwei Schritten Zeit vergeht, etwa nach einer Nacharbeit, wird das Objekt neu gesucht. Der Lieferant liegt außerhalb des Systems, Nachrichten an ihn sind in SD6 Lost bzw. Found Messages. Die übrigen Lebenslinien sind Objekte der Klassen, Botschaften an Objekte sind Operationen des Klassendiagramms. Kombinierte Fragmente bilden Verzweigungen (alt, opt), Schleifen (loop) und Verweise auf andere Use Cases (ref) ab.</w:t>
+        <w:t>Für sechs Use Cases haben wir Sequenzdiagramme erstellt, gefordert waren fünf (Tabelle 8). Jedes folgt einem Prozess. Die erste Lebenslinie ist die Rolle des Use Case aus Abbildung 4; weitere beteiligte Rollen tragen ihren Namen aus dem Use-Case-Diagramm; der Werkstattleiter, für dessen Freigaben es im Use-Case-Diagramm keine eigene Rolle gibt, erscheint als Objekt seiner Klasse (:Werkstattleiter) mit seinen Operationen. Die Rolle spricht nie direkt mit dem Fachobjekt, sondern immer mit der Oberfläche (:KundenApp oder :Werkstattoberflaeche). Die Oberfläche öffnet das benötigte Objekt über seine Nummer, ruft dessen Operationen auf und zeigt das Ergebnis an (anzeigenErgebnis()). Wo zwischen zwei Schritten Zeit vergeht, etwa nach einer Nacharbeit, wird das Objekt neu gesucht. Der Lieferant liegt außerhalb des Systems, Nachrichten an ihn sind in SD6 Lost bzw. Found Messages. Die übrigen Lebenslinien sind Objekte der Klassen, Botschaften an Objekte sind Operationen des Klassendiagramms. Kombinierte Fragmente bilden Verzweigungen (alt, opt), Schleifen (loop) und Verweise auf andere Use Cases (ref) ab.</w:t>
       </w:r>
     </w:p>
     <w:tbl>
@@ -9117,7 +9290,7 @@
                 <w:sz w:val="19"/>
                 <w:szCs w:val="19"/>
               </w:rPr>
-              <w:t xml:space="preserve">Medienprüfung mit Nachreichen; KI-Vorschlag, vorläufiger KVA, Vorreservierung erst nach Bestätigung. Ohne neue Aufnahme, bei Ablehnung oder nach sieben Tagen ohne Antwort wird die Voranmeldung verworfen</w:t>
+              <w:t>Medienprüfung mit Nachreichen; KI-Vorschlag, vorläufiger KVA, Vorreservierung erst nach Bestätigung. Ohne neue Aufnahme, bei Ablehnung oder nach sieben Tagen ohne Antwort wird die Voranmeldung verworfen</w:t>
             </w:r>
           </w:p>
         </w:tc>
@@ -11045,7 +11218,6 @@
         <w:jc w:val="both"/>
       </w:pPr>
       <w:r>
-        <w:rPr/>
         <w:t>Die Fristen sind festgelegt: Ein nicht abgeholtes Gerät wird nach der vierten Erinnerung verwertet, eine offene Rechnung nach der dritten erfolglosen Mahnung an das Inkasso übergeben und eine Bestellung nach der zweiten erfolglosen Liefermahnung storniert. Verwertete Geräte erhalten keinen eigenen Wert in AuftragStatus, weil die Verwertung ein Prozessende in Prozess 08 ist und kein Zustand des Auftrags.</w:t>
       </w:r>
     </w:p>
@@ -11104,7 +11276,7 @@
         <w:t xml:space="preserve">Lücken zwischen den Prozessen. </w:t>
       </w:r>
       <w:r>
-        <w:t xml:space="preserve">Eine Kontrolle am 05.10.2026 zeigte, dass abgelehnte Aufträge nie abgeholt wurden und Warteschleifen keinen Ausstieg hatten. Seitdem läuft jede Rückgabe über Prozess 08, und jede Warteschleife hat einen Ausstieg.</w:t>
+        <w:t>Eine Kontrolle am 05.10.2026 zeigte, dass abgelehnte Aufträge nie abgeholt wurden und Warteschleifen keinen Ausstieg hatten. Seitdem läuft jede Rückgabe über Prozess 08, und jede Warteschleife hat einen Ausstieg.</w:t>
       </w:r>
     </w:p>
     <w:p>
@@ -11137,7 +11309,7 @@
         <w:t xml:space="preserve">Werkzeuge. </w:t>
       </w:r>
       <w:r>
-        <w:t xml:space="preserve">Visual Paradigm war unser größtes Werkzeugproblem. Vier von sechs Gruppenmitgliedern arbeiten mit Firmen-Laptops, auf denen keine zusätzlichen Programme installiert werden dürfen; wir konnten Visual Paradigm nicht nutzen. Die gesamte UML-Arbeit lag damit bei zwei Personen, die übrigen haben die Diagramme anhand der Exporte geprüft. Dazu kommt, dass der Teamwork-Server der DHBW nur über das Lehre-VPN erreichbar ist.</w:t>
+        <w:t>Visual Paradigm war unser größtes Werkzeugproblem. Vier von sechs Gruppenmitgliedern arbeiten mit Firmen-Laptops, auf denen keine zusätzlichen Programme installiert werden dürfen; wir konnten Visual Paradigm nicht nutzen. Die gesamte UML-Arbeit lag damit bei zwei Personen, die übrigen haben die Diagramme anhand der Exporte geprüft. Dazu kommt, dass der Teamwork-Server der DHBW nur über das Lehre-VPN erreichbar ist.</w:t>
       </w:r>
     </w:p>
     <w:p>
@@ -11185,7 +11357,7 @@
         <w:t xml:space="preserve">Zusammenarbeit. </w:t>
       </w:r>
       <w:r>
-        <w:t xml:space="preserve">Am 05.10.2026 legten zwei Pull Requests in unserem privaten Repository parallel eine Entscheidung mit derselben Nummer an. Die Konflikte wurden an zwei Stellen gleichzeitig gelöst. Seitdem holen wir vor jeder neuen Entscheidung den aktuellen Stand und nehmen die nächste freie Nummer.</w:t>
+        <w:t>Am 05.10.2026 legten zwei Pull Requests in unserem privaten Repository parallel eine Entscheidung mit derselben Nummer an. Die Konflikte wurden an zwei Stellen gleichzeitig gelöst. Seitdem holen wir vor jeder neuen Entscheidung den aktuellen Stand und nehmen die nächste freie Nummer.</w:t>
       </w:r>
     </w:p>
     <w:p>
@@ -11222,7 +11394,7 @@
         <w:jc w:val="both"/>
       </w:pPr>
       <w:r>
-        <w:t xml:space="preserve">Im Coaching am 15.10.2026 sah der Dozent das Use-Case-Diagramm als zu stark vernetzt an: Einzelne Akteure hingen an bis zu acht Use Cases. Sein Vorschlag war, je Use Case eine Rolle anzustreben, Akteure bei Bedarf mehrfach darzustellen und die Zuordnung der Rollen zu Personen einem Organigramm zu überlassen. Wir haben das Diagramm auf 15 Mitarbeiterrollen umgebaut und die Rollen in Tabelle 7 den Klassen und Lanes zugeordnet (Abschnitt 5.3).</w:t>
+        <w:t>Im Coaching am 15.10.2026 sah der Dozent das Use-Case-Diagramm als zu stark vernetzt an: Einzelne Akteure hingen an bis zu acht Use Cases. Sein Vorschlag war, je Use Case eine Rolle anzustreben, Akteure bei Bedarf mehrfach darzustellen und die Zuordnung der Rollen zu Personen einem Organigramm zu überlassen. Wir haben das Diagramm auf 15 Mitarbeiterrollen umgebaut und die Rollen in Tabelle 7 den Klassen und Lanes zugeordnet (Abschnitt 5.3).</w:t>
       </w:r>
     </w:p>
     <w:p>
@@ -11239,6 +11411,7 @@
         <w:keepNext/>
       </w:pPr>
       <w:r>
+        <w:lastRenderedPageBreak/>
         <w:t>7.2 Unser Feedback zur Fallstudie</w:t>
       </w:r>
     </w:p>

</xml_diff>